<commit_message>
A new home page: photos, example payment cards, short copy and pricing for schools
Ideas from SchoolPay Nigeria and ParentPay Group: a split hero with a pupil photo
and floating payment and reminder cards, plain facts, cards for proprietors,
bursars and parents, how it works beside a class photo and an example receipt,
a parents band with an example phone, a class photo banner, pricing for schools
(a set-up fee and a pupil fee each term, without figures), a short FAQ and a
sign-up band. Photos are free stock (Unsplash, Pexels), self-hosted as WebP and
credited in the footer. No yearly licence, per the owner.
</commit_message>
<xml_diff>
--- a/docs/product/WardPay - what it does.docx
+++ b/docs/product/WardPay - what it does.docx
@@ -87,7 +87,7 @@
           <w:sz w:val="22"/>
           <w:szCs w:val="22"/>
         </w:rPr>
-        <w:t xml:space="preserve">The school’s money goes straight into the school’s own bank account; WardPay never holds it. Parents use WardPay free; the school pays a set-up fee, a yearly licence and a small fee per pupil each term.</w:t>
+        <w:t xml:space="preserve">The school’s money goes straight into the school’s own bank account; WardPay never holds it. Parents use WardPay free; the school pays a set-up fee and a small fee per pupil each term.</w:t>
       </w:r>
     </w:p>
     <w:p>
@@ -4037,7 +4037,7 @@
                 <w:sz w:val="20"/>
                 <w:szCs w:val="20"/>
               </w:rPr>
-              <w:t xml:space="preserve">Licence</w:t>
+              <w:t xml:space="preserve">Per pupil</w:t>
             </w:r>
           </w:p>
         </w:tc>
@@ -4066,7 +4066,7 @@
                 <w:sz w:val="20"/>
                 <w:szCs w:val="20"/>
               </w:rPr>
-              <w:t xml:space="preserve">Once per school year</w:t>
+              <w:t xml:space="preserve">A third of the yearly fee each term, for the pupils enrolled that term</w:t>
             </w:r>
           </w:p>
         </w:tc>
@@ -4096,7 +4096,7 @@
                 <w:sz w:val="20"/>
                 <w:szCs w:val="20"/>
               </w:rPr>
-              <w:t xml:space="preserve">Per pupil</w:t>
+              <w:t xml:space="preserve">Parents</w:t>
             </w:r>
           </w:p>
         </w:tc>
@@ -4109,66 +4109,6 @@
               <w:bottom w:val="single" w:color="D0D7D3" w:sz="4"/>
               <w:right w:val="single" w:color="D0D7D3" w:sz="4"/>
             </w:tcBorders>
-            <w:tcMar>
-              <w:top w:type="dxa" w:w="80"/>
-              <w:left w:type="dxa" w:w="120"/>
-              <w:bottom w:type="dxa" w:w="80"/>
-              <w:right w:type="dxa" w:w="120"/>
-            </w:tcMar>
-          </w:tcPr>
-          <w:p>
-            <w:r>
-              <w:rPr>
-                <w:b w:val="false"/>
-                <w:bCs w:val="false"/>
-                <w:sz w:val="20"/>
-                <w:szCs w:val="20"/>
-              </w:rPr>
-              <w:t xml:space="preserve">A third of the yearly fee each term, for the pupils enrolled that term</w:t>
-            </w:r>
-          </w:p>
-        </w:tc>
-      </w:tr>
-      <w:tr>
-        <w:tc>
-          <w:tcPr>
-            <w:tcW w:type="dxa" w:w="2600"/>
-            <w:tcBorders>
-              <w:top w:val="single" w:color="D0D7D3" w:sz="4"/>
-              <w:left w:val="single" w:color="D0D7D3" w:sz="4"/>
-              <w:bottom w:val="single" w:color="D0D7D3" w:sz="4"/>
-              <w:right w:val="single" w:color="D0D7D3" w:sz="4"/>
-            </w:tcBorders>
-            <w:shd w:fill="F6F8F7" w:color="auto" w:val="clear"/>
-            <w:tcMar>
-              <w:top w:type="dxa" w:w="80"/>
-              <w:left w:type="dxa" w:w="120"/>
-              <w:bottom w:type="dxa" w:w="80"/>
-              <w:right w:type="dxa" w:w="120"/>
-            </w:tcMar>
-          </w:tcPr>
-          <w:p>
-            <w:r>
-              <w:rPr>
-                <w:b w:val="false"/>
-                <w:bCs w:val="false"/>
-                <w:sz w:val="20"/>
-                <w:szCs w:val="20"/>
-              </w:rPr>
-              <w:t xml:space="preserve">Parents</w:t>
-            </w:r>
-          </w:p>
-        </w:tc>
-        <w:tc>
-          <w:tcPr>
-            <w:tcW w:type="dxa" w:w="7038"/>
-            <w:tcBorders>
-              <w:top w:val="single" w:color="D0D7D3" w:sz="4"/>
-              <w:left w:val="single" w:color="D0D7D3" w:sz="4"/>
-              <w:bottom w:val="single" w:color="D0D7D3" w:sz="4"/>
-              <w:right w:val="single" w:color="D0D7D3" w:sz="4"/>
-            </w:tcBorders>
-            <w:shd w:fill="F6F8F7" w:color="auto" w:val="clear"/>
             <w:tcMar>
               <w:top w:type="dxa" w:w="80"/>
               <w:left w:type="dxa" w:w="120"/>

</xml_diff>

<commit_message>
Schools pay their subscription bill by card
Pay by card on an unpaid bill opens a checkout on the active payment provider for
what's left on it, with no school subaccount, so the money settles to the
platform's own balance. The return page and the webhook both confirm with the
gateway under a row lock; the payment is unique on its gateway reference and one
that doesn't fit the bill is parked for review. Paystack's abandoned status (not
paid yet) now counts as pending, for school-fee checkouts too, so a payment made
after an early check is no longer ignored.
</commit_message>
<xml_diff>
--- a/docs/product/WardPay - what it does.docx
+++ b/docs/product/WardPay - what it does.docx
@@ -3757,7 +3757,7 @@
                 <w:sz w:val="20"/>
                 <w:szCs w:val="20"/>
               </w:rPr>
-              <w:t xml:space="preserve">Bill every school for the term in one click; record their payments; PDF invoices emailed to proprietors</w:t>
+              <w:t xml:space="preserve">Bill every school for the term in one click; schools pay by card from the console, or by transfer that you record; PDF invoices emailed to proprietors</w:t>
             </w:r>
           </w:p>
         </w:tc>
@@ -4288,6 +4288,65 @@
                 <w:sz w:val="20"/>
                 <w:szCs w:val="20"/>
               </w:rPr>
+              <w:t xml:space="preserve">22 Oct 2026</w:t>
+            </w:r>
+          </w:p>
+        </w:tc>
+        <w:tc>
+          <w:tcPr>
+            <w:tcW w:type="dxa" w:w="7838"/>
+            <w:tcBorders>
+              <w:top w:val="single" w:color="D0D7D3" w:sz="4"/>
+              <w:left w:val="single" w:color="D0D7D3" w:sz="4"/>
+              <w:bottom w:val="single" w:color="D0D7D3" w:sz="4"/>
+              <w:right w:val="single" w:color="D0D7D3" w:sz="4"/>
+            </w:tcBorders>
+            <w:tcMar>
+              <w:top w:type="dxa" w:w="80"/>
+              <w:left w:type="dxa" w:w="120"/>
+              <w:bottom w:type="dxa" w:w="80"/>
+              <w:right w:type="dxa" w:w="120"/>
+            </w:tcMar>
+          </w:tcPr>
+          <w:p>
+            <w:r>
+              <w:rPr>
+                <w:b w:val="false"/>
+                <w:bCs w:val="false"/>
+                <w:sz w:val="20"/>
+                <w:szCs w:val="20"/>
+              </w:rPr>
+              <w:t xml:space="preserve">Schools pay their WardPay bill by card from the console; the money goes to the platform’s own account</w:t>
+            </w:r>
+          </w:p>
+        </w:tc>
+      </w:tr>
+      <w:tr>
+        <w:tc>
+          <w:tcPr>
+            <w:tcW w:type="dxa" w:w="1800"/>
+            <w:tcBorders>
+              <w:top w:val="single" w:color="D0D7D3" w:sz="4"/>
+              <w:left w:val="single" w:color="D0D7D3" w:sz="4"/>
+              <w:bottom w:val="single" w:color="D0D7D3" w:sz="4"/>
+              <w:right w:val="single" w:color="D0D7D3" w:sz="4"/>
+            </w:tcBorders>
+            <w:shd w:fill="F6F8F7" w:color="auto" w:val="clear"/>
+            <w:tcMar>
+              <w:top w:type="dxa" w:w="80"/>
+              <w:left w:type="dxa" w:w="120"/>
+              <w:bottom w:type="dxa" w:w="80"/>
+              <w:right w:type="dxa" w:w="120"/>
+            </w:tcMar>
+          </w:tcPr>
+          <w:p>
+            <w:r>
+              <w:rPr>
+                <w:b w:val="false"/>
+                <w:bCs w:val="false"/>
+                <w:sz w:val="20"/>
+                <w:szCs w:val="20"/>
+              </w:rPr>
               <w:t xml:space="preserve">20 Oct 2026</w:t>
             </w:r>
           </w:p>
@@ -4301,6 +4360,7 @@
               <w:bottom w:val="single" w:color="D0D7D3" w:sz="4"/>
               <w:right w:val="single" w:color="D0D7D3" w:sz="4"/>
             </w:tcBorders>
+            <w:shd w:fill="F6F8F7" w:color="auto" w:val="clear"/>
             <w:tcMar>
               <w:top w:type="dxa" w:w="80"/>
               <w:left w:type="dxa" w:w="120"/>
@@ -4331,7 +4391,6 @@
               <w:bottom w:val="single" w:color="D0D7D3" w:sz="4"/>
               <w:right w:val="single" w:color="D0D7D3" w:sz="4"/>
             </w:tcBorders>
-            <w:shd w:fill="F6F8F7" w:color="auto" w:val="clear"/>
             <w:tcMar>
               <w:top w:type="dxa" w:w="80"/>
               <w:left w:type="dxa" w:w="120"/>
@@ -4360,7 +4419,6 @@
               <w:bottom w:val="single" w:color="D0D7D3" w:sz="4"/>
               <w:right w:val="single" w:color="D0D7D3" w:sz="4"/>
             </w:tcBorders>
-            <w:shd w:fill="F6F8F7" w:color="auto" w:val="clear"/>
             <w:tcMar>
               <w:top w:type="dxa" w:w="80"/>
               <w:left w:type="dxa" w:w="120"/>
@@ -4391,6 +4449,7 @@
               <w:bottom w:val="single" w:color="D0D7D3" w:sz="4"/>
               <w:right w:val="single" w:color="D0D7D3" w:sz="4"/>
             </w:tcBorders>
+            <w:shd w:fill="F6F8F7" w:color="auto" w:val="clear"/>
             <w:tcMar>
               <w:top w:type="dxa" w:w="80"/>
               <w:left w:type="dxa" w:w="120"/>
@@ -4419,6 +4478,7 @@
               <w:bottom w:val="single" w:color="D0D7D3" w:sz="4"/>
               <w:right w:val="single" w:color="D0D7D3" w:sz="4"/>
             </w:tcBorders>
+            <w:shd w:fill="F6F8F7" w:color="auto" w:val="clear"/>
             <w:tcMar>
               <w:top w:type="dxa" w:w="80"/>
               <w:left w:type="dxa" w:w="120"/>
@@ -4449,7 +4509,6 @@
               <w:bottom w:val="single" w:color="D0D7D3" w:sz="4"/>
               <w:right w:val="single" w:color="D0D7D3" w:sz="4"/>
             </w:tcBorders>
-            <w:shd w:fill="F6F8F7" w:color="auto" w:val="clear"/>
             <w:tcMar>
               <w:top w:type="dxa" w:w="80"/>
               <w:left w:type="dxa" w:w="120"/>
@@ -4478,7 +4537,6 @@
               <w:bottom w:val="single" w:color="D0D7D3" w:sz="4"/>
               <w:right w:val="single" w:color="D0D7D3" w:sz="4"/>
             </w:tcBorders>
-            <w:shd w:fill="F6F8F7" w:color="auto" w:val="clear"/>
             <w:tcMar>
               <w:top w:type="dxa" w:w="80"/>
               <w:left w:type="dxa" w:w="120"/>
@@ -4509,6 +4567,7 @@
               <w:bottom w:val="single" w:color="D0D7D3" w:sz="4"/>
               <w:right w:val="single" w:color="D0D7D3" w:sz="4"/>
             </w:tcBorders>
+            <w:shd w:fill="F6F8F7" w:color="auto" w:val="clear"/>
             <w:tcMar>
               <w:top w:type="dxa" w:w="80"/>
               <w:left w:type="dxa" w:w="120"/>
@@ -4537,6 +4596,7 @@
               <w:bottom w:val="single" w:color="D0D7D3" w:sz="4"/>
               <w:right w:val="single" w:color="D0D7D3" w:sz="4"/>
             </w:tcBorders>
+            <w:shd w:fill="F6F8F7" w:color="auto" w:val="clear"/>
             <w:tcMar>
               <w:top w:type="dxa" w:w="80"/>
               <w:left w:type="dxa" w:w="120"/>
@@ -4567,7 +4627,6 @@
               <w:bottom w:val="single" w:color="D0D7D3" w:sz="4"/>
               <w:right w:val="single" w:color="D0D7D3" w:sz="4"/>
             </w:tcBorders>
-            <w:shd w:fill="F6F8F7" w:color="auto" w:val="clear"/>
             <w:tcMar>
               <w:top w:type="dxa" w:w="80"/>
               <w:left w:type="dxa" w:w="120"/>
@@ -4596,7 +4655,6 @@
               <w:bottom w:val="single" w:color="D0D7D3" w:sz="4"/>
               <w:right w:val="single" w:color="D0D7D3" w:sz="4"/>
             </w:tcBorders>
-            <w:shd w:fill="F6F8F7" w:color="auto" w:val="clear"/>
             <w:tcMar>
               <w:top w:type="dxa" w:w="80"/>
               <w:left w:type="dxa" w:w="120"/>
@@ -4627,6 +4685,7 @@
               <w:bottom w:val="single" w:color="D0D7D3" w:sz="4"/>
               <w:right w:val="single" w:color="D0D7D3" w:sz="4"/>
             </w:tcBorders>
+            <w:shd w:fill="F6F8F7" w:color="auto" w:val="clear"/>
             <w:tcMar>
               <w:top w:type="dxa" w:w="80"/>
               <w:left w:type="dxa" w:w="120"/>
@@ -4655,6 +4714,7 @@
               <w:bottom w:val="single" w:color="D0D7D3" w:sz="4"/>
               <w:right w:val="single" w:color="D0D7D3" w:sz="4"/>
             </w:tcBorders>
+            <w:shd w:fill="F6F8F7" w:color="auto" w:val="clear"/>
             <w:tcMar>
               <w:top w:type="dxa" w:w="80"/>
               <w:left w:type="dxa" w:w="120"/>
@@ -4685,7 +4745,6 @@
               <w:bottom w:val="single" w:color="D0D7D3" w:sz="4"/>
               <w:right w:val="single" w:color="D0D7D3" w:sz="4"/>
             </w:tcBorders>
-            <w:shd w:fill="F6F8F7" w:color="auto" w:val="clear"/>
             <w:tcMar>
               <w:top w:type="dxa" w:w="80"/>
               <w:left w:type="dxa" w:w="120"/>
@@ -4714,7 +4773,6 @@
               <w:bottom w:val="single" w:color="D0D7D3" w:sz="4"/>
               <w:right w:val="single" w:color="D0D7D3" w:sz="4"/>
             </w:tcBorders>
-            <w:shd w:fill="F6F8F7" w:color="auto" w:val="clear"/>
             <w:tcMar>
               <w:top w:type="dxa" w:w="80"/>
               <w:left w:type="dxa" w:w="120"/>
@@ -4745,6 +4803,7 @@
               <w:bottom w:val="single" w:color="D0D7D3" w:sz="4"/>
               <w:right w:val="single" w:color="D0D7D3" w:sz="4"/>
             </w:tcBorders>
+            <w:shd w:fill="F6F8F7" w:color="auto" w:val="clear"/>
             <w:tcMar>
               <w:top w:type="dxa" w:w="80"/>
               <w:left w:type="dxa" w:w="120"/>
@@ -4773,6 +4832,7 @@
               <w:bottom w:val="single" w:color="D0D7D3" w:sz="4"/>
               <w:right w:val="single" w:color="D0D7D3" w:sz="4"/>
             </w:tcBorders>
+            <w:shd w:fill="F6F8F7" w:color="auto" w:val="clear"/>
             <w:tcMar>
               <w:top w:type="dxa" w:w="80"/>
               <w:left w:type="dxa" w:w="120"/>
@@ -4803,7 +4863,6 @@
               <w:bottom w:val="single" w:color="D0D7D3" w:sz="4"/>
               <w:right w:val="single" w:color="D0D7D3" w:sz="4"/>
             </w:tcBorders>
-            <w:shd w:fill="F6F8F7" w:color="auto" w:val="clear"/>
             <w:tcMar>
               <w:top w:type="dxa" w:w="80"/>
               <w:left w:type="dxa" w:w="120"/>
@@ -4832,7 +4891,6 @@
               <w:bottom w:val="single" w:color="D0D7D3" w:sz="4"/>
               <w:right w:val="single" w:color="D0D7D3" w:sz="4"/>
             </w:tcBorders>
-            <w:shd w:fill="F6F8F7" w:color="auto" w:val="clear"/>
             <w:tcMar>
               <w:top w:type="dxa" w:w="80"/>
               <w:left w:type="dxa" w:w="120"/>
@@ -4863,6 +4921,7 @@
               <w:bottom w:val="single" w:color="D0D7D3" w:sz="4"/>
               <w:right w:val="single" w:color="D0D7D3" w:sz="4"/>
             </w:tcBorders>
+            <w:shd w:fill="F6F8F7" w:color="auto" w:val="clear"/>
             <w:tcMar>
               <w:top w:type="dxa" w:w="80"/>
               <w:left w:type="dxa" w:w="120"/>
@@ -4891,6 +4950,7 @@
               <w:bottom w:val="single" w:color="D0D7D3" w:sz="4"/>
               <w:right w:val="single" w:color="D0D7D3" w:sz="4"/>
             </w:tcBorders>
+            <w:shd w:fill="F6F8F7" w:color="auto" w:val="clear"/>
             <w:tcMar>
               <w:top w:type="dxa" w:w="80"/>
               <w:left w:type="dxa" w:w="120"/>
@@ -4921,7 +4981,6 @@
               <w:bottom w:val="single" w:color="D0D7D3" w:sz="4"/>
               <w:right w:val="single" w:color="D0D7D3" w:sz="4"/>
             </w:tcBorders>
-            <w:shd w:fill="F6F8F7" w:color="auto" w:val="clear"/>
             <w:tcMar>
               <w:top w:type="dxa" w:w="80"/>
               <w:left w:type="dxa" w:w="120"/>
@@ -4950,7 +5009,6 @@
               <w:bottom w:val="single" w:color="D0D7D3" w:sz="4"/>
               <w:right w:val="single" w:color="D0D7D3" w:sz="4"/>
             </w:tcBorders>
-            <w:shd w:fill="F6F8F7" w:color="auto" w:val="clear"/>
             <w:tcMar>
               <w:top w:type="dxa" w:w="80"/>
               <w:left w:type="dxa" w:w="120"/>
@@ -4981,6 +5039,7 @@
               <w:bottom w:val="single" w:color="D0D7D3" w:sz="4"/>
               <w:right w:val="single" w:color="D0D7D3" w:sz="4"/>
             </w:tcBorders>
+            <w:shd w:fill="F6F8F7" w:color="auto" w:val="clear"/>
             <w:tcMar>
               <w:top w:type="dxa" w:w="80"/>
               <w:left w:type="dxa" w:w="120"/>
@@ -5009,6 +5068,7 @@
               <w:bottom w:val="single" w:color="D0D7D3" w:sz="4"/>
               <w:right w:val="single" w:color="D0D7D3" w:sz="4"/>
             </w:tcBorders>
+            <w:shd w:fill="F6F8F7" w:color="auto" w:val="clear"/>
             <w:tcMar>
               <w:top w:type="dxa" w:w="80"/>
               <w:left w:type="dxa" w:w="120"/>
@@ -5039,7 +5099,6 @@
               <w:bottom w:val="single" w:color="D0D7D3" w:sz="4"/>
               <w:right w:val="single" w:color="D0D7D3" w:sz="4"/>
             </w:tcBorders>
-            <w:shd w:fill="F6F8F7" w:color="auto" w:val="clear"/>
             <w:tcMar>
               <w:top w:type="dxa" w:w="80"/>
               <w:left w:type="dxa" w:w="120"/>
@@ -5068,7 +5127,6 @@
               <w:bottom w:val="single" w:color="D0D7D3" w:sz="4"/>
               <w:right w:val="single" w:color="D0D7D3" w:sz="4"/>
             </w:tcBorders>
-            <w:shd w:fill="F6F8F7" w:color="auto" w:val="clear"/>
             <w:tcMar>
               <w:top w:type="dxa" w:w="80"/>
               <w:left w:type="dxa" w:w="120"/>
@@ -5099,6 +5157,7 @@
               <w:bottom w:val="single" w:color="D0D7D3" w:sz="4"/>
               <w:right w:val="single" w:color="D0D7D3" w:sz="4"/>
             </w:tcBorders>
+            <w:shd w:fill="F6F8F7" w:color="auto" w:val="clear"/>
             <w:tcMar>
               <w:top w:type="dxa" w:w="80"/>
               <w:left w:type="dxa" w:w="120"/>
@@ -5127,6 +5186,7 @@
               <w:bottom w:val="single" w:color="D0D7D3" w:sz="4"/>
               <w:right w:val="single" w:color="D0D7D3" w:sz="4"/>
             </w:tcBorders>
+            <w:shd w:fill="F6F8F7" w:color="auto" w:val="clear"/>
             <w:tcMar>
               <w:top w:type="dxa" w:w="80"/>
               <w:left w:type="dxa" w:w="120"/>
@@ -5157,7 +5217,6 @@
               <w:bottom w:val="single" w:color="D0D7D3" w:sz="4"/>
               <w:right w:val="single" w:color="D0D7D3" w:sz="4"/>
             </w:tcBorders>
-            <w:shd w:fill="F6F8F7" w:color="auto" w:val="clear"/>
             <w:tcMar>
               <w:top w:type="dxa" w:w="80"/>
               <w:left w:type="dxa" w:w="120"/>
@@ -5186,7 +5245,6 @@
               <w:bottom w:val="single" w:color="D0D7D3" w:sz="4"/>
               <w:right w:val="single" w:color="D0D7D3" w:sz="4"/>
             </w:tcBorders>
-            <w:shd w:fill="F6F8F7" w:color="auto" w:val="clear"/>
             <w:tcMar>
               <w:top w:type="dxa" w:w="80"/>
               <w:left w:type="dxa" w:w="120"/>
@@ -5217,6 +5275,7 @@
               <w:bottom w:val="single" w:color="D0D7D3" w:sz="4"/>
               <w:right w:val="single" w:color="D0D7D3" w:sz="4"/>
             </w:tcBorders>
+            <w:shd w:fill="F6F8F7" w:color="auto" w:val="clear"/>
             <w:tcMar>
               <w:top w:type="dxa" w:w="80"/>
               <w:left w:type="dxa" w:w="120"/>
@@ -5245,6 +5304,7 @@
               <w:bottom w:val="single" w:color="D0D7D3" w:sz="4"/>
               <w:right w:val="single" w:color="D0D7D3" w:sz="4"/>
             </w:tcBorders>
+            <w:shd w:fill="F6F8F7" w:color="auto" w:val="clear"/>
             <w:tcMar>
               <w:top w:type="dxa" w:w="80"/>
               <w:left w:type="dxa" w:w="120"/>
@@ -5275,7 +5335,6 @@
               <w:bottom w:val="single" w:color="D0D7D3" w:sz="4"/>
               <w:right w:val="single" w:color="D0D7D3" w:sz="4"/>
             </w:tcBorders>
-            <w:shd w:fill="F6F8F7" w:color="auto" w:val="clear"/>
             <w:tcMar>
               <w:top w:type="dxa" w:w="80"/>
               <w:left w:type="dxa" w:w="120"/>
@@ -5304,7 +5363,6 @@
               <w:bottom w:val="single" w:color="D0D7D3" w:sz="4"/>
               <w:right w:val="single" w:color="D0D7D3" w:sz="4"/>
             </w:tcBorders>
-            <w:shd w:fill="F6F8F7" w:color="auto" w:val="clear"/>
             <w:tcMar>
               <w:top w:type="dxa" w:w="80"/>
               <w:left w:type="dxa" w:w="120"/>
@@ -5335,6 +5393,7 @@
               <w:bottom w:val="single" w:color="D0D7D3" w:sz="4"/>
               <w:right w:val="single" w:color="D0D7D3" w:sz="4"/>
             </w:tcBorders>
+            <w:shd w:fill="F6F8F7" w:color="auto" w:val="clear"/>
             <w:tcMar>
               <w:top w:type="dxa" w:w="80"/>
               <w:left w:type="dxa" w:w="120"/>
@@ -5363,6 +5422,7 @@
               <w:bottom w:val="single" w:color="D0D7D3" w:sz="4"/>
               <w:right w:val="single" w:color="D0D7D3" w:sz="4"/>
             </w:tcBorders>
+            <w:shd w:fill="F6F8F7" w:color="auto" w:val="clear"/>
             <w:tcMar>
               <w:top w:type="dxa" w:w="80"/>
               <w:left w:type="dxa" w:w="120"/>
@@ -5393,7 +5453,6 @@
               <w:bottom w:val="single" w:color="D0D7D3" w:sz="4"/>
               <w:right w:val="single" w:color="D0D7D3" w:sz="4"/>
             </w:tcBorders>
-            <w:shd w:fill="F6F8F7" w:color="auto" w:val="clear"/>
             <w:tcMar>
               <w:top w:type="dxa" w:w="80"/>
               <w:left w:type="dxa" w:w="120"/>
@@ -5422,7 +5481,6 @@
               <w:bottom w:val="single" w:color="D0D7D3" w:sz="4"/>
               <w:right w:val="single" w:color="D0D7D3" w:sz="4"/>
             </w:tcBorders>
-            <w:shd w:fill="F6F8F7" w:color="auto" w:val="clear"/>
             <w:tcMar>
               <w:top w:type="dxa" w:w="80"/>
               <w:left w:type="dxa" w:w="120"/>
@@ -5453,6 +5511,7 @@
               <w:bottom w:val="single" w:color="D0D7D3" w:sz="4"/>
               <w:right w:val="single" w:color="D0D7D3" w:sz="4"/>
             </w:tcBorders>
+            <w:shd w:fill="F6F8F7" w:color="auto" w:val="clear"/>
             <w:tcMar>
               <w:top w:type="dxa" w:w="80"/>
               <w:left w:type="dxa" w:w="120"/>
@@ -5481,6 +5540,7 @@
               <w:bottom w:val="single" w:color="D0D7D3" w:sz="4"/>
               <w:right w:val="single" w:color="D0D7D3" w:sz="4"/>
             </w:tcBorders>
+            <w:shd w:fill="F6F8F7" w:color="auto" w:val="clear"/>
             <w:tcMar>
               <w:top w:type="dxa" w:w="80"/>
               <w:left w:type="dxa" w:w="120"/>
@@ -5511,7 +5571,6 @@
               <w:bottom w:val="single" w:color="D0D7D3" w:sz="4"/>
               <w:right w:val="single" w:color="D0D7D3" w:sz="4"/>
             </w:tcBorders>
-            <w:shd w:fill="F6F8F7" w:color="auto" w:val="clear"/>
             <w:tcMar>
               <w:top w:type="dxa" w:w="80"/>
               <w:left w:type="dxa" w:w="120"/>
@@ -5540,7 +5599,6 @@
               <w:bottom w:val="single" w:color="D0D7D3" w:sz="4"/>
               <w:right w:val="single" w:color="D0D7D3" w:sz="4"/>
             </w:tcBorders>
-            <w:shd w:fill="F6F8F7" w:color="auto" w:val="clear"/>
             <w:tcMar>
               <w:top w:type="dxa" w:w="80"/>
               <w:left w:type="dxa" w:w="120"/>
@@ -5571,6 +5629,7 @@
               <w:bottom w:val="single" w:color="D0D7D3" w:sz="4"/>
               <w:right w:val="single" w:color="D0D7D3" w:sz="4"/>
             </w:tcBorders>
+            <w:shd w:fill="F6F8F7" w:color="auto" w:val="clear"/>
             <w:tcMar>
               <w:top w:type="dxa" w:w="80"/>
               <w:left w:type="dxa" w:w="120"/>
@@ -5599,6 +5658,7 @@
               <w:bottom w:val="single" w:color="D0D7D3" w:sz="4"/>
               <w:right w:val="single" w:color="D0D7D3" w:sz="4"/>
             </w:tcBorders>
+            <w:shd w:fill="F6F8F7" w:color="auto" w:val="clear"/>
             <w:tcMar>
               <w:top w:type="dxa" w:w="80"/>
               <w:left w:type="dxa" w:w="120"/>
@@ -5629,7 +5689,6 @@
               <w:bottom w:val="single" w:color="D0D7D3" w:sz="4"/>
               <w:right w:val="single" w:color="D0D7D3" w:sz="4"/>
             </w:tcBorders>
-            <w:shd w:fill="F6F8F7" w:color="auto" w:val="clear"/>
             <w:tcMar>
               <w:top w:type="dxa" w:w="80"/>
               <w:left w:type="dxa" w:w="120"/>
@@ -5658,7 +5717,6 @@
               <w:bottom w:val="single" w:color="D0D7D3" w:sz="4"/>
               <w:right w:val="single" w:color="D0D7D3" w:sz="4"/>
             </w:tcBorders>
-            <w:shd w:fill="F6F8F7" w:color="auto" w:val="clear"/>
             <w:tcMar>
               <w:top w:type="dxa" w:w="80"/>
               <w:left w:type="dxa" w:w="120"/>
@@ -5689,6 +5747,7 @@
               <w:bottom w:val="single" w:color="D0D7D3" w:sz="4"/>
               <w:right w:val="single" w:color="D0D7D3" w:sz="4"/>
             </w:tcBorders>
+            <w:shd w:fill="F6F8F7" w:color="auto" w:val="clear"/>
             <w:tcMar>
               <w:top w:type="dxa" w:w="80"/>
               <w:left w:type="dxa" w:w="120"/>
@@ -5717,6 +5776,7 @@
               <w:bottom w:val="single" w:color="D0D7D3" w:sz="4"/>
               <w:right w:val="single" w:color="D0D7D3" w:sz="4"/>
             </w:tcBorders>
+            <w:shd w:fill="F6F8F7" w:color="auto" w:val="clear"/>
             <w:tcMar>
               <w:top w:type="dxa" w:w="80"/>
               <w:left w:type="dxa" w:w="120"/>
@@ -5747,7 +5807,6 @@
               <w:bottom w:val="single" w:color="D0D7D3" w:sz="4"/>
               <w:right w:val="single" w:color="D0D7D3" w:sz="4"/>
             </w:tcBorders>
-            <w:shd w:fill="F6F8F7" w:color="auto" w:val="clear"/>
             <w:tcMar>
               <w:top w:type="dxa" w:w="80"/>
               <w:left w:type="dxa" w:w="120"/>
@@ -5776,7 +5835,6 @@
               <w:bottom w:val="single" w:color="D0D7D3" w:sz="4"/>
               <w:right w:val="single" w:color="D0D7D3" w:sz="4"/>
             </w:tcBorders>
-            <w:shd w:fill="F6F8F7" w:color="auto" w:val="clear"/>
             <w:tcMar>
               <w:top w:type="dxa" w:w="80"/>
               <w:left w:type="dxa" w:w="120"/>
@@ -5807,6 +5865,7 @@
               <w:bottom w:val="single" w:color="D0D7D3" w:sz="4"/>
               <w:right w:val="single" w:color="D0D7D3" w:sz="4"/>
             </w:tcBorders>
+            <w:shd w:fill="F6F8F7" w:color="auto" w:val="clear"/>
             <w:tcMar>
               <w:top w:type="dxa" w:w="80"/>
               <w:left w:type="dxa" w:w="120"/>
@@ -5835,6 +5894,7 @@
               <w:bottom w:val="single" w:color="D0D7D3" w:sz="4"/>
               <w:right w:val="single" w:color="D0D7D3" w:sz="4"/>
             </w:tcBorders>
+            <w:shd w:fill="F6F8F7" w:color="auto" w:val="clear"/>
             <w:tcMar>
               <w:top w:type="dxa" w:w="80"/>
               <w:left w:type="dxa" w:w="120"/>
@@ -5865,7 +5925,6 @@
               <w:bottom w:val="single" w:color="D0D7D3" w:sz="4"/>
               <w:right w:val="single" w:color="D0D7D3" w:sz="4"/>
             </w:tcBorders>
-            <w:shd w:fill="F6F8F7" w:color="auto" w:val="clear"/>
             <w:tcMar>
               <w:top w:type="dxa" w:w="80"/>
               <w:left w:type="dxa" w:w="120"/>
@@ -5894,7 +5953,6 @@
               <w:bottom w:val="single" w:color="D0D7D3" w:sz="4"/>
               <w:right w:val="single" w:color="D0D7D3" w:sz="4"/>
             </w:tcBorders>
-            <w:shd w:fill="F6F8F7" w:color="auto" w:val="clear"/>
             <w:tcMar>
               <w:top w:type="dxa" w:w="80"/>
               <w:left w:type="dxa" w:w="120"/>
@@ -5925,6 +5983,7 @@
               <w:bottom w:val="single" w:color="D0D7D3" w:sz="4"/>
               <w:right w:val="single" w:color="D0D7D3" w:sz="4"/>
             </w:tcBorders>
+            <w:shd w:fill="F6F8F7" w:color="auto" w:val="clear"/>
             <w:tcMar>
               <w:top w:type="dxa" w:w="80"/>
               <w:left w:type="dxa" w:w="120"/>
@@ -5953,6 +6012,7 @@
               <w:bottom w:val="single" w:color="D0D7D3" w:sz="4"/>
               <w:right w:val="single" w:color="D0D7D3" w:sz="4"/>
             </w:tcBorders>
+            <w:shd w:fill="F6F8F7" w:color="auto" w:val="clear"/>
             <w:tcMar>
               <w:top w:type="dxa" w:w="80"/>
               <w:left w:type="dxa" w:w="120"/>
@@ -5983,7 +6043,6 @@
               <w:bottom w:val="single" w:color="D0D7D3" w:sz="4"/>
               <w:right w:val="single" w:color="D0D7D3" w:sz="4"/>
             </w:tcBorders>
-            <w:shd w:fill="F6F8F7" w:color="auto" w:val="clear"/>
             <w:tcMar>
               <w:top w:type="dxa" w:w="80"/>
               <w:left w:type="dxa" w:w="120"/>
@@ -6012,7 +6071,6 @@
               <w:bottom w:val="single" w:color="D0D7D3" w:sz="4"/>
               <w:right w:val="single" w:color="D0D7D3" w:sz="4"/>
             </w:tcBorders>
-            <w:shd w:fill="F6F8F7" w:color="auto" w:val="clear"/>
             <w:tcMar>
               <w:top w:type="dxa" w:w="80"/>
               <w:left w:type="dxa" w:w="120"/>
@@ -6043,6 +6101,7 @@
               <w:bottom w:val="single" w:color="D0D7D3" w:sz="4"/>
               <w:right w:val="single" w:color="D0D7D3" w:sz="4"/>
             </w:tcBorders>
+            <w:shd w:fill="F6F8F7" w:color="auto" w:val="clear"/>
             <w:tcMar>
               <w:top w:type="dxa" w:w="80"/>
               <w:left w:type="dxa" w:w="120"/>
@@ -6071,6 +6130,7 @@
               <w:bottom w:val="single" w:color="D0D7D3" w:sz="4"/>
               <w:right w:val="single" w:color="D0D7D3" w:sz="4"/>
             </w:tcBorders>
+            <w:shd w:fill="F6F8F7" w:color="auto" w:val="clear"/>
             <w:tcMar>
               <w:top w:type="dxa" w:w="80"/>
               <w:left w:type="dxa" w:w="120"/>
@@ -6101,7 +6161,6 @@
               <w:bottom w:val="single" w:color="D0D7D3" w:sz="4"/>
               <w:right w:val="single" w:color="D0D7D3" w:sz="4"/>
             </w:tcBorders>
-            <w:shd w:fill="F6F8F7" w:color="auto" w:val="clear"/>
             <w:tcMar>
               <w:top w:type="dxa" w:w="80"/>
               <w:left w:type="dxa" w:w="120"/>
@@ -6130,7 +6189,6 @@
               <w:bottom w:val="single" w:color="D0D7D3" w:sz="4"/>
               <w:right w:val="single" w:color="D0D7D3" w:sz="4"/>
             </w:tcBorders>
-            <w:shd w:fill="F6F8F7" w:color="auto" w:val="clear"/>
             <w:tcMar>
               <w:top w:type="dxa" w:w="80"/>
               <w:left w:type="dxa" w:w="120"/>
@@ -6161,6 +6219,7 @@
               <w:bottom w:val="single" w:color="D0D7D3" w:sz="4"/>
               <w:right w:val="single" w:color="D0D7D3" w:sz="4"/>
             </w:tcBorders>
+            <w:shd w:fill="F6F8F7" w:color="auto" w:val="clear"/>
             <w:tcMar>
               <w:top w:type="dxa" w:w="80"/>
               <w:left w:type="dxa" w:w="120"/>
@@ -6189,6 +6248,7 @@
               <w:bottom w:val="single" w:color="D0D7D3" w:sz="4"/>
               <w:right w:val="single" w:color="D0D7D3" w:sz="4"/>
             </w:tcBorders>
+            <w:shd w:fill="F6F8F7" w:color="auto" w:val="clear"/>
             <w:tcMar>
               <w:top w:type="dxa" w:w="80"/>
               <w:left w:type="dxa" w:w="120"/>
@@ -6219,7 +6279,6 @@
               <w:bottom w:val="single" w:color="D0D7D3" w:sz="4"/>
               <w:right w:val="single" w:color="D0D7D3" w:sz="4"/>
             </w:tcBorders>
-            <w:shd w:fill="F6F8F7" w:color="auto" w:val="clear"/>
             <w:tcMar>
               <w:top w:type="dxa" w:w="80"/>
               <w:left w:type="dxa" w:w="120"/>
@@ -6248,7 +6307,6 @@
               <w:bottom w:val="single" w:color="D0D7D3" w:sz="4"/>
               <w:right w:val="single" w:color="D0D7D3" w:sz="4"/>
             </w:tcBorders>
-            <w:shd w:fill="F6F8F7" w:color="auto" w:val="clear"/>
             <w:tcMar>
               <w:top w:type="dxa" w:w="80"/>
               <w:left w:type="dxa" w:w="120"/>

</xml_diff>

<commit_message>
Switch the SMS provider at runtime: Termii or Africa's Talking
Africa's Talking can now send texts (same account as phone calls, optional sender
ID, sandbox username supported). A platform admin chooses between the providers
with keys set (Platform -> Providers, audited); SMS_BACKEND is the default. Each
send reads the choice, cached for 30 seconds. Africa's Talking's replies are
logged without the recipients' phone numbers.
</commit_message>
<xml_diff>
--- a/docs/product/WardPay - what it does.docx
+++ b/docs/product/WardPay - what it does.docx
@@ -4316,6 +4316,66 @@
                 <w:sz w:val="20"/>
                 <w:szCs w:val="20"/>
               </w:rPr>
+              <w:t xml:space="preserve">Texts can go through Termii or Africa’s Talking, switched at any time from the platform console</w:t>
+            </w:r>
+          </w:p>
+        </w:tc>
+      </w:tr>
+      <w:tr>
+        <w:tc>
+          <w:tcPr>
+            <w:tcW w:type="dxa" w:w="1800"/>
+            <w:tcBorders>
+              <w:top w:val="single" w:color="D0D7D3" w:sz="4"/>
+              <w:left w:val="single" w:color="D0D7D3" w:sz="4"/>
+              <w:bottom w:val="single" w:color="D0D7D3" w:sz="4"/>
+              <w:right w:val="single" w:color="D0D7D3" w:sz="4"/>
+            </w:tcBorders>
+            <w:shd w:fill="F6F8F7" w:color="auto" w:val="clear"/>
+            <w:tcMar>
+              <w:top w:type="dxa" w:w="80"/>
+              <w:left w:type="dxa" w:w="120"/>
+              <w:bottom w:type="dxa" w:w="80"/>
+              <w:right w:type="dxa" w:w="120"/>
+            </w:tcMar>
+          </w:tcPr>
+          <w:p>
+            <w:r>
+              <w:rPr>
+                <w:b w:val="false"/>
+                <w:bCs w:val="false"/>
+                <w:sz w:val="20"/>
+                <w:szCs w:val="20"/>
+              </w:rPr>
+              <w:t xml:space="preserve">22 Oct 2026</w:t>
+            </w:r>
+          </w:p>
+        </w:tc>
+        <w:tc>
+          <w:tcPr>
+            <w:tcW w:type="dxa" w:w="7838"/>
+            <w:tcBorders>
+              <w:top w:val="single" w:color="D0D7D3" w:sz="4"/>
+              <w:left w:val="single" w:color="D0D7D3" w:sz="4"/>
+              <w:bottom w:val="single" w:color="D0D7D3" w:sz="4"/>
+              <w:right w:val="single" w:color="D0D7D3" w:sz="4"/>
+            </w:tcBorders>
+            <w:shd w:fill="F6F8F7" w:color="auto" w:val="clear"/>
+            <w:tcMar>
+              <w:top w:type="dxa" w:w="80"/>
+              <w:left w:type="dxa" w:w="120"/>
+              <w:bottom w:type="dxa" w:w="80"/>
+              <w:right w:type="dxa" w:w="120"/>
+            </w:tcMar>
+          </w:tcPr>
+          <w:p>
+            <w:r>
+              <w:rPr>
+                <w:b w:val="false"/>
+                <w:bCs w:val="false"/>
+                <w:sz w:val="20"/>
+                <w:szCs w:val="20"/>
+              </w:rPr>
               <w:t xml:space="preserve">Schools pay their WardPay bill by card from the console; the money goes to the platform’s own account</w:t>
             </w:r>
           </w:p>
@@ -4331,7 +4391,6 @@
               <w:bottom w:val="single" w:color="D0D7D3" w:sz="4"/>
               <w:right w:val="single" w:color="D0D7D3" w:sz="4"/>
             </w:tcBorders>
-            <w:shd w:fill="F6F8F7" w:color="auto" w:val="clear"/>
             <w:tcMar>
               <w:top w:type="dxa" w:w="80"/>
               <w:left w:type="dxa" w:w="120"/>
@@ -4360,7 +4419,6 @@
               <w:bottom w:val="single" w:color="D0D7D3" w:sz="4"/>
               <w:right w:val="single" w:color="D0D7D3" w:sz="4"/>
             </w:tcBorders>
-            <w:shd w:fill="F6F8F7" w:color="auto" w:val="clear"/>
             <w:tcMar>
               <w:top w:type="dxa" w:w="80"/>
               <w:left w:type="dxa" w:w="120"/>
@@ -4391,6 +4449,7 @@
               <w:bottom w:val="single" w:color="D0D7D3" w:sz="4"/>
               <w:right w:val="single" w:color="D0D7D3" w:sz="4"/>
             </w:tcBorders>
+            <w:shd w:fill="F6F8F7" w:color="auto" w:val="clear"/>
             <w:tcMar>
               <w:top w:type="dxa" w:w="80"/>
               <w:left w:type="dxa" w:w="120"/>
@@ -4419,6 +4478,7 @@
               <w:bottom w:val="single" w:color="D0D7D3" w:sz="4"/>
               <w:right w:val="single" w:color="D0D7D3" w:sz="4"/>
             </w:tcBorders>
+            <w:shd w:fill="F6F8F7" w:color="auto" w:val="clear"/>
             <w:tcMar>
               <w:top w:type="dxa" w:w="80"/>
               <w:left w:type="dxa" w:w="120"/>
@@ -4449,7 +4509,6 @@
               <w:bottom w:val="single" w:color="D0D7D3" w:sz="4"/>
               <w:right w:val="single" w:color="D0D7D3" w:sz="4"/>
             </w:tcBorders>
-            <w:shd w:fill="F6F8F7" w:color="auto" w:val="clear"/>
             <w:tcMar>
               <w:top w:type="dxa" w:w="80"/>
               <w:left w:type="dxa" w:w="120"/>
@@ -4478,7 +4537,6 @@
               <w:bottom w:val="single" w:color="D0D7D3" w:sz="4"/>
               <w:right w:val="single" w:color="D0D7D3" w:sz="4"/>
             </w:tcBorders>
-            <w:shd w:fill="F6F8F7" w:color="auto" w:val="clear"/>
             <w:tcMar>
               <w:top w:type="dxa" w:w="80"/>
               <w:left w:type="dxa" w:w="120"/>
@@ -4509,6 +4567,7 @@
               <w:bottom w:val="single" w:color="D0D7D3" w:sz="4"/>
               <w:right w:val="single" w:color="D0D7D3" w:sz="4"/>
             </w:tcBorders>
+            <w:shd w:fill="F6F8F7" w:color="auto" w:val="clear"/>
             <w:tcMar>
               <w:top w:type="dxa" w:w="80"/>
               <w:left w:type="dxa" w:w="120"/>
@@ -4537,6 +4596,7 @@
               <w:bottom w:val="single" w:color="D0D7D3" w:sz="4"/>
               <w:right w:val="single" w:color="D0D7D3" w:sz="4"/>
             </w:tcBorders>
+            <w:shd w:fill="F6F8F7" w:color="auto" w:val="clear"/>
             <w:tcMar>
               <w:top w:type="dxa" w:w="80"/>
               <w:left w:type="dxa" w:w="120"/>
@@ -4567,7 +4627,6 @@
               <w:bottom w:val="single" w:color="D0D7D3" w:sz="4"/>
               <w:right w:val="single" w:color="D0D7D3" w:sz="4"/>
             </w:tcBorders>
-            <w:shd w:fill="F6F8F7" w:color="auto" w:val="clear"/>
             <w:tcMar>
               <w:top w:type="dxa" w:w="80"/>
               <w:left w:type="dxa" w:w="120"/>
@@ -4596,7 +4655,6 @@
               <w:bottom w:val="single" w:color="D0D7D3" w:sz="4"/>
               <w:right w:val="single" w:color="D0D7D3" w:sz="4"/>
             </w:tcBorders>
-            <w:shd w:fill="F6F8F7" w:color="auto" w:val="clear"/>
             <w:tcMar>
               <w:top w:type="dxa" w:w="80"/>
               <w:left w:type="dxa" w:w="120"/>
@@ -4627,6 +4685,7 @@
               <w:bottom w:val="single" w:color="D0D7D3" w:sz="4"/>
               <w:right w:val="single" w:color="D0D7D3" w:sz="4"/>
             </w:tcBorders>
+            <w:shd w:fill="F6F8F7" w:color="auto" w:val="clear"/>
             <w:tcMar>
               <w:top w:type="dxa" w:w="80"/>
               <w:left w:type="dxa" w:w="120"/>
@@ -4655,6 +4714,7 @@
               <w:bottom w:val="single" w:color="D0D7D3" w:sz="4"/>
               <w:right w:val="single" w:color="D0D7D3" w:sz="4"/>
             </w:tcBorders>
+            <w:shd w:fill="F6F8F7" w:color="auto" w:val="clear"/>
             <w:tcMar>
               <w:top w:type="dxa" w:w="80"/>
               <w:left w:type="dxa" w:w="120"/>
@@ -4685,7 +4745,6 @@
               <w:bottom w:val="single" w:color="D0D7D3" w:sz="4"/>
               <w:right w:val="single" w:color="D0D7D3" w:sz="4"/>
             </w:tcBorders>
-            <w:shd w:fill="F6F8F7" w:color="auto" w:val="clear"/>
             <w:tcMar>
               <w:top w:type="dxa" w:w="80"/>
               <w:left w:type="dxa" w:w="120"/>
@@ -4714,7 +4773,6 @@
               <w:bottom w:val="single" w:color="D0D7D3" w:sz="4"/>
               <w:right w:val="single" w:color="D0D7D3" w:sz="4"/>
             </w:tcBorders>
-            <w:shd w:fill="F6F8F7" w:color="auto" w:val="clear"/>
             <w:tcMar>
               <w:top w:type="dxa" w:w="80"/>
               <w:left w:type="dxa" w:w="120"/>
@@ -4745,6 +4803,7 @@
               <w:bottom w:val="single" w:color="D0D7D3" w:sz="4"/>
               <w:right w:val="single" w:color="D0D7D3" w:sz="4"/>
             </w:tcBorders>
+            <w:shd w:fill="F6F8F7" w:color="auto" w:val="clear"/>
             <w:tcMar>
               <w:top w:type="dxa" w:w="80"/>
               <w:left w:type="dxa" w:w="120"/>
@@ -4773,6 +4832,7 @@
               <w:bottom w:val="single" w:color="D0D7D3" w:sz="4"/>
               <w:right w:val="single" w:color="D0D7D3" w:sz="4"/>
             </w:tcBorders>
+            <w:shd w:fill="F6F8F7" w:color="auto" w:val="clear"/>
             <w:tcMar>
               <w:top w:type="dxa" w:w="80"/>
               <w:left w:type="dxa" w:w="120"/>
@@ -4803,7 +4863,6 @@
               <w:bottom w:val="single" w:color="D0D7D3" w:sz="4"/>
               <w:right w:val="single" w:color="D0D7D3" w:sz="4"/>
             </w:tcBorders>
-            <w:shd w:fill="F6F8F7" w:color="auto" w:val="clear"/>
             <w:tcMar>
               <w:top w:type="dxa" w:w="80"/>
               <w:left w:type="dxa" w:w="120"/>
@@ -4832,7 +4891,6 @@
               <w:bottom w:val="single" w:color="D0D7D3" w:sz="4"/>
               <w:right w:val="single" w:color="D0D7D3" w:sz="4"/>
             </w:tcBorders>
-            <w:shd w:fill="F6F8F7" w:color="auto" w:val="clear"/>
             <w:tcMar>
               <w:top w:type="dxa" w:w="80"/>
               <w:left w:type="dxa" w:w="120"/>
@@ -4863,6 +4921,7 @@
               <w:bottom w:val="single" w:color="D0D7D3" w:sz="4"/>
               <w:right w:val="single" w:color="D0D7D3" w:sz="4"/>
             </w:tcBorders>
+            <w:shd w:fill="F6F8F7" w:color="auto" w:val="clear"/>
             <w:tcMar>
               <w:top w:type="dxa" w:w="80"/>
               <w:left w:type="dxa" w:w="120"/>
@@ -4891,6 +4950,7 @@
               <w:bottom w:val="single" w:color="D0D7D3" w:sz="4"/>
               <w:right w:val="single" w:color="D0D7D3" w:sz="4"/>
             </w:tcBorders>
+            <w:shd w:fill="F6F8F7" w:color="auto" w:val="clear"/>
             <w:tcMar>
               <w:top w:type="dxa" w:w="80"/>
               <w:left w:type="dxa" w:w="120"/>
@@ -4921,7 +4981,6 @@
               <w:bottom w:val="single" w:color="D0D7D3" w:sz="4"/>
               <w:right w:val="single" w:color="D0D7D3" w:sz="4"/>
             </w:tcBorders>
-            <w:shd w:fill="F6F8F7" w:color="auto" w:val="clear"/>
             <w:tcMar>
               <w:top w:type="dxa" w:w="80"/>
               <w:left w:type="dxa" w:w="120"/>
@@ -4950,7 +5009,6 @@
               <w:bottom w:val="single" w:color="D0D7D3" w:sz="4"/>
               <w:right w:val="single" w:color="D0D7D3" w:sz="4"/>
             </w:tcBorders>
-            <w:shd w:fill="F6F8F7" w:color="auto" w:val="clear"/>
             <w:tcMar>
               <w:top w:type="dxa" w:w="80"/>
               <w:left w:type="dxa" w:w="120"/>
@@ -4981,6 +5039,7 @@
               <w:bottom w:val="single" w:color="D0D7D3" w:sz="4"/>
               <w:right w:val="single" w:color="D0D7D3" w:sz="4"/>
             </w:tcBorders>
+            <w:shd w:fill="F6F8F7" w:color="auto" w:val="clear"/>
             <w:tcMar>
               <w:top w:type="dxa" w:w="80"/>
               <w:left w:type="dxa" w:w="120"/>
@@ -5009,6 +5068,7 @@
               <w:bottom w:val="single" w:color="D0D7D3" w:sz="4"/>
               <w:right w:val="single" w:color="D0D7D3" w:sz="4"/>
             </w:tcBorders>
+            <w:shd w:fill="F6F8F7" w:color="auto" w:val="clear"/>
             <w:tcMar>
               <w:top w:type="dxa" w:w="80"/>
               <w:left w:type="dxa" w:w="120"/>
@@ -5039,7 +5099,6 @@
               <w:bottom w:val="single" w:color="D0D7D3" w:sz="4"/>
               <w:right w:val="single" w:color="D0D7D3" w:sz="4"/>
             </w:tcBorders>
-            <w:shd w:fill="F6F8F7" w:color="auto" w:val="clear"/>
             <w:tcMar>
               <w:top w:type="dxa" w:w="80"/>
               <w:left w:type="dxa" w:w="120"/>
@@ -5068,7 +5127,6 @@
               <w:bottom w:val="single" w:color="D0D7D3" w:sz="4"/>
               <w:right w:val="single" w:color="D0D7D3" w:sz="4"/>
             </w:tcBorders>
-            <w:shd w:fill="F6F8F7" w:color="auto" w:val="clear"/>
             <w:tcMar>
               <w:top w:type="dxa" w:w="80"/>
               <w:left w:type="dxa" w:w="120"/>
@@ -5099,6 +5157,7 @@
               <w:bottom w:val="single" w:color="D0D7D3" w:sz="4"/>
               <w:right w:val="single" w:color="D0D7D3" w:sz="4"/>
             </w:tcBorders>
+            <w:shd w:fill="F6F8F7" w:color="auto" w:val="clear"/>
             <w:tcMar>
               <w:top w:type="dxa" w:w="80"/>
               <w:left w:type="dxa" w:w="120"/>
@@ -5127,6 +5186,7 @@
               <w:bottom w:val="single" w:color="D0D7D3" w:sz="4"/>
               <w:right w:val="single" w:color="D0D7D3" w:sz="4"/>
             </w:tcBorders>
+            <w:shd w:fill="F6F8F7" w:color="auto" w:val="clear"/>
             <w:tcMar>
               <w:top w:type="dxa" w:w="80"/>
               <w:left w:type="dxa" w:w="120"/>
@@ -5157,7 +5217,6 @@
               <w:bottom w:val="single" w:color="D0D7D3" w:sz="4"/>
               <w:right w:val="single" w:color="D0D7D3" w:sz="4"/>
             </w:tcBorders>
-            <w:shd w:fill="F6F8F7" w:color="auto" w:val="clear"/>
             <w:tcMar>
               <w:top w:type="dxa" w:w="80"/>
               <w:left w:type="dxa" w:w="120"/>
@@ -5186,7 +5245,6 @@
               <w:bottom w:val="single" w:color="D0D7D3" w:sz="4"/>
               <w:right w:val="single" w:color="D0D7D3" w:sz="4"/>
             </w:tcBorders>
-            <w:shd w:fill="F6F8F7" w:color="auto" w:val="clear"/>
             <w:tcMar>
               <w:top w:type="dxa" w:w="80"/>
               <w:left w:type="dxa" w:w="120"/>
@@ -5217,6 +5275,7 @@
               <w:bottom w:val="single" w:color="D0D7D3" w:sz="4"/>
               <w:right w:val="single" w:color="D0D7D3" w:sz="4"/>
             </w:tcBorders>
+            <w:shd w:fill="F6F8F7" w:color="auto" w:val="clear"/>
             <w:tcMar>
               <w:top w:type="dxa" w:w="80"/>
               <w:left w:type="dxa" w:w="120"/>
@@ -5245,6 +5304,7 @@
               <w:bottom w:val="single" w:color="D0D7D3" w:sz="4"/>
               <w:right w:val="single" w:color="D0D7D3" w:sz="4"/>
             </w:tcBorders>
+            <w:shd w:fill="F6F8F7" w:color="auto" w:val="clear"/>
             <w:tcMar>
               <w:top w:type="dxa" w:w="80"/>
               <w:left w:type="dxa" w:w="120"/>
@@ -5275,7 +5335,6 @@
               <w:bottom w:val="single" w:color="D0D7D3" w:sz="4"/>
               <w:right w:val="single" w:color="D0D7D3" w:sz="4"/>
             </w:tcBorders>
-            <w:shd w:fill="F6F8F7" w:color="auto" w:val="clear"/>
             <w:tcMar>
               <w:top w:type="dxa" w:w="80"/>
               <w:left w:type="dxa" w:w="120"/>
@@ -5304,7 +5363,6 @@
               <w:bottom w:val="single" w:color="D0D7D3" w:sz="4"/>
               <w:right w:val="single" w:color="D0D7D3" w:sz="4"/>
             </w:tcBorders>
-            <w:shd w:fill="F6F8F7" w:color="auto" w:val="clear"/>
             <w:tcMar>
               <w:top w:type="dxa" w:w="80"/>
               <w:left w:type="dxa" w:w="120"/>
@@ -5335,6 +5393,7 @@
               <w:bottom w:val="single" w:color="D0D7D3" w:sz="4"/>
               <w:right w:val="single" w:color="D0D7D3" w:sz="4"/>
             </w:tcBorders>
+            <w:shd w:fill="F6F8F7" w:color="auto" w:val="clear"/>
             <w:tcMar>
               <w:top w:type="dxa" w:w="80"/>
               <w:left w:type="dxa" w:w="120"/>
@@ -5363,6 +5422,7 @@
               <w:bottom w:val="single" w:color="D0D7D3" w:sz="4"/>
               <w:right w:val="single" w:color="D0D7D3" w:sz="4"/>
             </w:tcBorders>
+            <w:shd w:fill="F6F8F7" w:color="auto" w:val="clear"/>
             <w:tcMar>
               <w:top w:type="dxa" w:w="80"/>
               <w:left w:type="dxa" w:w="120"/>
@@ -5393,7 +5453,6 @@
               <w:bottom w:val="single" w:color="D0D7D3" w:sz="4"/>
               <w:right w:val="single" w:color="D0D7D3" w:sz="4"/>
             </w:tcBorders>
-            <w:shd w:fill="F6F8F7" w:color="auto" w:val="clear"/>
             <w:tcMar>
               <w:top w:type="dxa" w:w="80"/>
               <w:left w:type="dxa" w:w="120"/>
@@ -5422,7 +5481,6 @@
               <w:bottom w:val="single" w:color="D0D7D3" w:sz="4"/>
               <w:right w:val="single" w:color="D0D7D3" w:sz="4"/>
             </w:tcBorders>
-            <w:shd w:fill="F6F8F7" w:color="auto" w:val="clear"/>
             <w:tcMar>
               <w:top w:type="dxa" w:w="80"/>
               <w:left w:type="dxa" w:w="120"/>
@@ -5453,6 +5511,7 @@
               <w:bottom w:val="single" w:color="D0D7D3" w:sz="4"/>
               <w:right w:val="single" w:color="D0D7D3" w:sz="4"/>
             </w:tcBorders>
+            <w:shd w:fill="F6F8F7" w:color="auto" w:val="clear"/>
             <w:tcMar>
               <w:top w:type="dxa" w:w="80"/>
               <w:left w:type="dxa" w:w="120"/>
@@ -5481,6 +5540,7 @@
               <w:bottom w:val="single" w:color="D0D7D3" w:sz="4"/>
               <w:right w:val="single" w:color="D0D7D3" w:sz="4"/>
             </w:tcBorders>
+            <w:shd w:fill="F6F8F7" w:color="auto" w:val="clear"/>
             <w:tcMar>
               <w:top w:type="dxa" w:w="80"/>
               <w:left w:type="dxa" w:w="120"/>
@@ -5511,7 +5571,6 @@
               <w:bottom w:val="single" w:color="D0D7D3" w:sz="4"/>
               <w:right w:val="single" w:color="D0D7D3" w:sz="4"/>
             </w:tcBorders>
-            <w:shd w:fill="F6F8F7" w:color="auto" w:val="clear"/>
             <w:tcMar>
               <w:top w:type="dxa" w:w="80"/>
               <w:left w:type="dxa" w:w="120"/>
@@ -5540,7 +5599,6 @@
               <w:bottom w:val="single" w:color="D0D7D3" w:sz="4"/>
               <w:right w:val="single" w:color="D0D7D3" w:sz="4"/>
             </w:tcBorders>
-            <w:shd w:fill="F6F8F7" w:color="auto" w:val="clear"/>
             <w:tcMar>
               <w:top w:type="dxa" w:w="80"/>
               <w:left w:type="dxa" w:w="120"/>
@@ -5571,6 +5629,7 @@
               <w:bottom w:val="single" w:color="D0D7D3" w:sz="4"/>
               <w:right w:val="single" w:color="D0D7D3" w:sz="4"/>
             </w:tcBorders>
+            <w:shd w:fill="F6F8F7" w:color="auto" w:val="clear"/>
             <w:tcMar>
               <w:top w:type="dxa" w:w="80"/>
               <w:left w:type="dxa" w:w="120"/>
@@ -5599,6 +5658,7 @@
               <w:bottom w:val="single" w:color="D0D7D3" w:sz="4"/>
               <w:right w:val="single" w:color="D0D7D3" w:sz="4"/>
             </w:tcBorders>
+            <w:shd w:fill="F6F8F7" w:color="auto" w:val="clear"/>
             <w:tcMar>
               <w:top w:type="dxa" w:w="80"/>
               <w:left w:type="dxa" w:w="120"/>
@@ -5629,7 +5689,6 @@
               <w:bottom w:val="single" w:color="D0D7D3" w:sz="4"/>
               <w:right w:val="single" w:color="D0D7D3" w:sz="4"/>
             </w:tcBorders>
-            <w:shd w:fill="F6F8F7" w:color="auto" w:val="clear"/>
             <w:tcMar>
               <w:top w:type="dxa" w:w="80"/>
               <w:left w:type="dxa" w:w="120"/>
@@ -5658,7 +5717,6 @@
               <w:bottom w:val="single" w:color="D0D7D3" w:sz="4"/>
               <w:right w:val="single" w:color="D0D7D3" w:sz="4"/>
             </w:tcBorders>
-            <w:shd w:fill="F6F8F7" w:color="auto" w:val="clear"/>
             <w:tcMar>
               <w:top w:type="dxa" w:w="80"/>
               <w:left w:type="dxa" w:w="120"/>
@@ -5689,6 +5747,7 @@
               <w:bottom w:val="single" w:color="D0D7D3" w:sz="4"/>
               <w:right w:val="single" w:color="D0D7D3" w:sz="4"/>
             </w:tcBorders>
+            <w:shd w:fill="F6F8F7" w:color="auto" w:val="clear"/>
             <w:tcMar>
               <w:top w:type="dxa" w:w="80"/>
               <w:left w:type="dxa" w:w="120"/>
@@ -5717,6 +5776,7 @@
               <w:bottom w:val="single" w:color="D0D7D3" w:sz="4"/>
               <w:right w:val="single" w:color="D0D7D3" w:sz="4"/>
             </w:tcBorders>
+            <w:shd w:fill="F6F8F7" w:color="auto" w:val="clear"/>
             <w:tcMar>
               <w:top w:type="dxa" w:w="80"/>
               <w:left w:type="dxa" w:w="120"/>
@@ -5747,7 +5807,6 @@
               <w:bottom w:val="single" w:color="D0D7D3" w:sz="4"/>
               <w:right w:val="single" w:color="D0D7D3" w:sz="4"/>
             </w:tcBorders>
-            <w:shd w:fill="F6F8F7" w:color="auto" w:val="clear"/>
             <w:tcMar>
               <w:top w:type="dxa" w:w="80"/>
               <w:left w:type="dxa" w:w="120"/>
@@ -5776,7 +5835,6 @@
               <w:bottom w:val="single" w:color="D0D7D3" w:sz="4"/>
               <w:right w:val="single" w:color="D0D7D3" w:sz="4"/>
             </w:tcBorders>
-            <w:shd w:fill="F6F8F7" w:color="auto" w:val="clear"/>
             <w:tcMar>
               <w:top w:type="dxa" w:w="80"/>
               <w:left w:type="dxa" w:w="120"/>
@@ -5807,6 +5865,7 @@
               <w:bottom w:val="single" w:color="D0D7D3" w:sz="4"/>
               <w:right w:val="single" w:color="D0D7D3" w:sz="4"/>
             </w:tcBorders>
+            <w:shd w:fill="F6F8F7" w:color="auto" w:val="clear"/>
             <w:tcMar>
               <w:top w:type="dxa" w:w="80"/>
               <w:left w:type="dxa" w:w="120"/>
@@ -5835,6 +5894,7 @@
               <w:bottom w:val="single" w:color="D0D7D3" w:sz="4"/>
               <w:right w:val="single" w:color="D0D7D3" w:sz="4"/>
             </w:tcBorders>
+            <w:shd w:fill="F6F8F7" w:color="auto" w:val="clear"/>
             <w:tcMar>
               <w:top w:type="dxa" w:w="80"/>
               <w:left w:type="dxa" w:w="120"/>
@@ -5865,7 +5925,6 @@
               <w:bottom w:val="single" w:color="D0D7D3" w:sz="4"/>
               <w:right w:val="single" w:color="D0D7D3" w:sz="4"/>
             </w:tcBorders>
-            <w:shd w:fill="F6F8F7" w:color="auto" w:val="clear"/>
             <w:tcMar>
               <w:top w:type="dxa" w:w="80"/>
               <w:left w:type="dxa" w:w="120"/>
@@ -5894,7 +5953,6 @@
               <w:bottom w:val="single" w:color="D0D7D3" w:sz="4"/>
               <w:right w:val="single" w:color="D0D7D3" w:sz="4"/>
             </w:tcBorders>
-            <w:shd w:fill="F6F8F7" w:color="auto" w:val="clear"/>
             <w:tcMar>
               <w:top w:type="dxa" w:w="80"/>
               <w:left w:type="dxa" w:w="120"/>
@@ -5925,6 +5983,7 @@
               <w:bottom w:val="single" w:color="D0D7D3" w:sz="4"/>
               <w:right w:val="single" w:color="D0D7D3" w:sz="4"/>
             </w:tcBorders>
+            <w:shd w:fill="F6F8F7" w:color="auto" w:val="clear"/>
             <w:tcMar>
               <w:top w:type="dxa" w:w="80"/>
               <w:left w:type="dxa" w:w="120"/>
@@ -5953,6 +6012,7 @@
               <w:bottom w:val="single" w:color="D0D7D3" w:sz="4"/>
               <w:right w:val="single" w:color="D0D7D3" w:sz="4"/>
             </w:tcBorders>
+            <w:shd w:fill="F6F8F7" w:color="auto" w:val="clear"/>
             <w:tcMar>
               <w:top w:type="dxa" w:w="80"/>
               <w:left w:type="dxa" w:w="120"/>
@@ -5983,7 +6043,6 @@
               <w:bottom w:val="single" w:color="D0D7D3" w:sz="4"/>
               <w:right w:val="single" w:color="D0D7D3" w:sz="4"/>
             </w:tcBorders>
-            <w:shd w:fill="F6F8F7" w:color="auto" w:val="clear"/>
             <w:tcMar>
               <w:top w:type="dxa" w:w="80"/>
               <w:left w:type="dxa" w:w="120"/>
@@ -6012,7 +6071,6 @@
               <w:bottom w:val="single" w:color="D0D7D3" w:sz="4"/>
               <w:right w:val="single" w:color="D0D7D3" w:sz="4"/>
             </w:tcBorders>
-            <w:shd w:fill="F6F8F7" w:color="auto" w:val="clear"/>
             <w:tcMar>
               <w:top w:type="dxa" w:w="80"/>
               <w:left w:type="dxa" w:w="120"/>
@@ -6043,6 +6101,7 @@
               <w:bottom w:val="single" w:color="D0D7D3" w:sz="4"/>
               <w:right w:val="single" w:color="D0D7D3" w:sz="4"/>
             </w:tcBorders>
+            <w:shd w:fill="F6F8F7" w:color="auto" w:val="clear"/>
             <w:tcMar>
               <w:top w:type="dxa" w:w="80"/>
               <w:left w:type="dxa" w:w="120"/>
@@ -6071,6 +6130,7 @@
               <w:bottom w:val="single" w:color="D0D7D3" w:sz="4"/>
               <w:right w:val="single" w:color="D0D7D3" w:sz="4"/>
             </w:tcBorders>
+            <w:shd w:fill="F6F8F7" w:color="auto" w:val="clear"/>
             <w:tcMar>
               <w:top w:type="dxa" w:w="80"/>
               <w:left w:type="dxa" w:w="120"/>
@@ -6101,7 +6161,6 @@
               <w:bottom w:val="single" w:color="D0D7D3" w:sz="4"/>
               <w:right w:val="single" w:color="D0D7D3" w:sz="4"/>
             </w:tcBorders>
-            <w:shd w:fill="F6F8F7" w:color="auto" w:val="clear"/>
             <w:tcMar>
               <w:top w:type="dxa" w:w="80"/>
               <w:left w:type="dxa" w:w="120"/>
@@ -6130,7 +6189,6 @@
               <w:bottom w:val="single" w:color="D0D7D3" w:sz="4"/>
               <w:right w:val="single" w:color="D0D7D3" w:sz="4"/>
             </w:tcBorders>
-            <w:shd w:fill="F6F8F7" w:color="auto" w:val="clear"/>
             <w:tcMar>
               <w:top w:type="dxa" w:w="80"/>
               <w:left w:type="dxa" w:w="120"/>
@@ -6161,6 +6219,7 @@
               <w:bottom w:val="single" w:color="D0D7D3" w:sz="4"/>
               <w:right w:val="single" w:color="D0D7D3" w:sz="4"/>
             </w:tcBorders>
+            <w:shd w:fill="F6F8F7" w:color="auto" w:val="clear"/>
             <w:tcMar>
               <w:top w:type="dxa" w:w="80"/>
               <w:left w:type="dxa" w:w="120"/>
@@ -6189,6 +6248,7 @@
               <w:bottom w:val="single" w:color="D0D7D3" w:sz="4"/>
               <w:right w:val="single" w:color="D0D7D3" w:sz="4"/>
             </w:tcBorders>
+            <w:shd w:fill="F6F8F7" w:color="auto" w:val="clear"/>
             <w:tcMar>
               <w:top w:type="dxa" w:w="80"/>
               <w:left w:type="dxa" w:w="120"/>
@@ -6219,7 +6279,6 @@
               <w:bottom w:val="single" w:color="D0D7D3" w:sz="4"/>
               <w:right w:val="single" w:color="D0D7D3" w:sz="4"/>
             </w:tcBorders>
-            <w:shd w:fill="F6F8F7" w:color="auto" w:val="clear"/>
             <w:tcMar>
               <w:top w:type="dxa" w:w="80"/>
               <w:left w:type="dxa" w:w="120"/>
@@ -6248,7 +6307,6 @@
               <w:bottom w:val="single" w:color="D0D7D3" w:sz="4"/>
               <w:right w:val="single" w:color="D0D7D3" w:sz="4"/>
             </w:tcBorders>
-            <w:shd w:fill="F6F8F7" w:color="auto" w:val="clear"/>
             <w:tcMar>
               <w:top w:type="dxa" w:w="80"/>
               <w:left w:type="dxa" w:w="120"/>
@@ -6279,6 +6337,7 @@
               <w:bottom w:val="single" w:color="D0D7D3" w:sz="4"/>
               <w:right w:val="single" w:color="D0D7D3" w:sz="4"/>
             </w:tcBorders>
+            <w:shd w:fill="F6F8F7" w:color="auto" w:val="clear"/>
             <w:tcMar>
               <w:top w:type="dxa" w:w="80"/>
               <w:left w:type="dxa" w:w="120"/>
@@ -6307,6 +6366,7 @@
               <w:bottom w:val="single" w:color="D0D7D3" w:sz="4"/>
               <w:right w:val="single" w:color="D0D7D3" w:sz="4"/>
             </w:tcBorders>
+            <w:shd w:fill="F6F8F7" w:color="auto" w:val="clear"/>
             <w:tcMar>
               <w:top w:type="dxa" w:w="80"/>
               <w:left w:type="dxa" w:w="120"/>

</xml_diff>

<commit_message>
Problems to fix: everything stuck across schools for the platform admin
One page lists payment notifications set aside (retry after fixing the cause, or
resolve with a note), card payments in review (resolve records what was done
without touching money), background tasks that gave up (retry) and messages that
failed in the last 7 days per school. The overview shows how many need a person.
Every action is audited; the page is a fixed number of queries.
</commit_message>
<xml_diff>
--- a/docs/product/WardPay - what it does.docx
+++ b/docs/product/WardPay - what it does.docx
@@ -3816,6 +3816,65 @@
                 <w:sz w:val="20"/>
                 <w:szCs w:val="20"/>
               </w:rPr>
+              <w:t xml:space="preserve">Problems to fix: payments set aside, card payments in review, stuck tasks and failed messages across every school, with retry</w:t>
+            </w:r>
+          </w:p>
+        </w:tc>
+        <w:tc>
+          <w:tcPr>
+            <w:tcW w:type="dxa" w:w="4238"/>
+            <w:tcBorders>
+              <w:top w:val="single" w:color="D0D7D3" w:sz="4"/>
+              <w:left w:val="single" w:color="D0D7D3" w:sz="4"/>
+              <w:bottom w:val="single" w:color="D0D7D3" w:sz="4"/>
+              <w:right w:val="single" w:color="D0D7D3" w:sz="4"/>
+            </w:tcBorders>
+            <w:shd w:fill="F6F8F7" w:color="auto" w:val="clear"/>
+            <w:tcMar>
+              <w:top w:type="dxa" w:w="80"/>
+              <w:left w:type="dxa" w:w="120"/>
+              <w:bottom w:type="dxa" w:w="80"/>
+              <w:right w:type="dxa" w:w="120"/>
+            </w:tcMar>
+          </w:tcPr>
+          <w:p>
+            <w:r>
+              <w:rPr>
+                <w:b w:val="false"/>
+                <w:bCs w:val="false"/>
+                <w:sz w:val="20"/>
+                <w:szCs w:val="20"/>
+              </w:rPr>
+              <w:t xml:space="preserve">Nothing gets lost quietly; problems are found before a school calls</w:t>
+            </w:r>
+          </w:p>
+        </w:tc>
+      </w:tr>
+      <w:tr>
+        <w:tc>
+          <w:tcPr>
+            <w:tcW w:type="dxa" w:w="5400"/>
+            <w:tcBorders>
+              <w:top w:val="single" w:color="D0D7D3" w:sz="4"/>
+              <w:left w:val="single" w:color="D0D7D3" w:sz="4"/>
+              <w:bottom w:val="single" w:color="D0D7D3" w:sz="4"/>
+              <w:right w:val="single" w:color="D0D7D3" w:sz="4"/>
+            </w:tcBorders>
+            <w:tcMar>
+              <w:top w:type="dxa" w:w="80"/>
+              <w:left w:type="dxa" w:w="120"/>
+              <w:bottom w:type="dxa" w:w="80"/>
+              <w:right w:type="dxa" w:w="120"/>
+            </w:tcMar>
+          </w:tcPr>
+          <w:p>
+            <w:r>
+              <w:rPr>
+                <w:b w:val="false"/>
+                <w:bCs w:val="false"/>
+                <w:sz w:val="20"/>
+                <w:szCs w:val="20"/>
+              </w:rPr>
               <w:t xml:space="preserve">Support lookup by school, staff email, payment reference, account number or receipt (children shown as initials only)</w:t>
             </w:r>
           </w:p>
@@ -3829,7 +3888,6 @@
               <w:bottom w:val="single" w:color="D0D7D3" w:sz="4"/>
               <w:right w:val="single" w:color="D0D7D3" w:sz="4"/>
             </w:tcBorders>
-            <w:shd w:fill="F6F8F7" w:color="auto" w:val="clear"/>
             <w:tcMar>
               <w:top w:type="dxa" w:w="80"/>
               <w:left w:type="dxa" w:w="120"/>
@@ -4316,6 +4374,66 @@
                 <w:sz w:val="20"/>
                 <w:szCs w:val="20"/>
               </w:rPr>
+              <w:t xml:space="preserve">Problems to fix: one page for the WardPay team showing everything stuck across schools</w:t>
+            </w:r>
+          </w:p>
+        </w:tc>
+      </w:tr>
+      <w:tr>
+        <w:tc>
+          <w:tcPr>
+            <w:tcW w:type="dxa" w:w="1800"/>
+            <w:tcBorders>
+              <w:top w:val="single" w:color="D0D7D3" w:sz="4"/>
+              <w:left w:val="single" w:color="D0D7D3" w:sz="4"/>
+              <w:bottom w:val="single" w:color="D0D7D3" w:sz="4"/>
+              <w:right w:val="single" w:color="D0D7D3" w:sz="4"/>
+            </w:tcBorders>
+            <w:shd w:fill="F6F8F7" w:color="auto" w:val="clear"/>
+            <w:tcMar>
+              <w:top w:type="dxa" w:w="80"/>
+              <w:left w:type="dxa" w:w="120"/>
+              <w:bottom w:type="dxa" w:w="80"/>
+              <w:right w:type="dxa" w:w="120"/>
+            </w:tcMar>
+          </w:tcPr>
+          <w:p>
+            <w:r>
+              <w:rPr>
+                <w:b w:val="false"/>
+                <w:bCs w:val="false"/>
+                <w:sz w:val="20"/>
+                <w:szCs w:val="20"/>
+              </w:rPr>
+              <w:t xml:space="preserve">22 Oct 2026</w:t>
+            </w:r>
+          </w:p>
+        </w:tc>
+        <w:tc>
+          <w:tcPr>
+            <w:tcW w:type="dxa" w:w="7838"/>
+            <w:tcBorders>
+              <w:top w:val="single" w:color="D0D7D3" w:sz="4"/>
+              <w:left w:val="single" w:color="D0D7D3" w:sz="4"/>
+              <w:bottom w:val="single" w:color="D0D7D3" w:sz="4"/>
+              <w:right w:val="single" w:color="D0D7D3" w:sz="4"/>
+            </w:tcBorders>
+            <w:shd w:fill="F6F8F7" w:color="auto" w:val="clear"/>
+            <w:tcMar>
+              <w:top w:type="dxa" w:w="80"/>
+              <w:left w:type="dxa" w:w="120"/>
+              <w:bottom w:type="dxa" w:w="80"/>
+              <w:right w:type="dxa" w:w="120"/>
+            </w:tcMar>
+          </w:tcPr>
+          <w:p>
+            <w:r>
+              <w:rPr>
+                <w:b w:val="false"/>
+                <w:bCs w:val="false"/>
+                <w:sz w:val="20"/>
+                <w:szCs w:val="20"/>
+              </w:rPr>
               <w:t xml:space="preserve">Texts can go through Termii or Africa’s Talking, switched at any time from the platform console</w:t>
             </w:r>
           </w:p>
@@ -4331,7 +4449,6 @@
               <w:bottom w:val="single" w:color="D0D7D3" w:sz="4"/>
               <w:right w:val="single" w:color="D0D7D3" w:sz="4"/>
             </w:tcBorders>
-            <w:shd w:fill="F6F8F7" w:color="auto" w:val="clear"/>
             <w:tcMar>
               <w:top w:type="dxa" w:w="80"/>
               <w:left w:type="dxa" w:w="120"/>
@@ -4360,7 +4477,6 @@
               <w:bottom w:val="single" w:color="D0D7D3" w:sz="4"/>
               <w:right w:val="single" w:color="D0D7D3" w:sz="4"/>
             </w:tcBorders>
-            <w:shd w:fill="F6F8F7" w:color="auto" w:val="clear"/>
             <w:tcMar>
               <w:top w:type="dxa" w:w="80"/>
               <w:left w:type="dxa" w:w="120"/>
@@ -4391,6 +4507,7 @@
               <w:bottom w:val="single" w:color="D0D7D3" w:sz="4"/>
               <w:right w:val="single" w:color="D0D7D3" w:sz="4"/>
             </w:tcBorders>
+            <w:shd w:fill="F6F8F7" w:color="auto" w:val="clear"/>
             <w:tcMar>
               <w:top w:type="dxa" w:w="80"/>
               <w:left w:type="dxa" w:w="120"/>
@@ -4419,6 +4536,7 @@
               <w:bottom w:val="single" w:color="D0D7D3" w:sz="4"/>
               <w:right w:val="single" w:color="D0D7D3" w:sz="4"/>
             </w:tcBorders>
+            <w:shd w:fill="F6F8F7" w:color="auto" w:val="clear"/>
             <w:tcMar>
               <w:top w:type="dxa" w:w="80"/>
               <w:left w:type="dxa" w:w="120"/>
@@ -4449,7 +4567,6 @@
               <w:bottom w:val="single" w:color="D0D7D3" w:sz="4"/>
               <w:right w:val="single" w:color="D0D7D3" w:sz="4"/>
             </w:tcBorders>
-            <w:shd w:fill="F6F8F7" w:color="auto" w:val="clear"/>
             <w:tcMar>
               <w:top w:type="dxa" w:w="80"/>
               <w:left w:type="dxa" w:w="120"/>
@@ -4478,7 +4595,6 @@
               <w:bottom w:val="single" w:color="D0D7D3" w:sz="4"/>
               <w:right w:val="single" w:color="D0D7D3" w:sz="4"/>
             </w:tcBorders>
-            <w:shd w:fill="F6F8F7" w:color="auto" w:val="clear"/>
             <w:tcMar>
               <w:top w:type="dxa" w:w="80"/>
               <w:left w:type="dxa" w:w="120"/>
@@ -4509,6 +4625,7 @@
               <w:bottom w:val="single" w:color="D0D7D3" w:sz="4"/>
               <w:right w:val="single" w:color="D0D7D3" w:sz="4"/>
             </w:tcBorders>
+            <w:shd w:fill="F6F8F7" w:color="auto" w:val="clear"/>
             <w:tcMar>
               <w:top w:type="dxa" w:w="80"/>
               <w:left w:type="dxa" w:w="120"/>
@@ -4537,6 +4654,7 @@
               <w:bottom w:val="single" w:color="D0D7D3" w:sz="4"/>
               <w:right w:val="single" w:color="D0D7D3" w:sz="4"/>
             </w:tcBorders>
+            <w:shd w:fill="F6F8F7" w:color="auto" w:val="clear"/>
             <w:tcMar>
               <w:top w:type="dxa" w:w="80"/>
               <w:left w:type="dxa" w:w="120"/>
@@ -4567,7 +4685,6 @@
               <w:bottom w:val="single" w:color="D0D7D3" w:sz="4"/>
               <w:right w:val="single" w:color="D0D7D3" w:sz="4"/>
             </w:tcBorders>
-            <w:shd w:fill="F6F8F7" w:color="auto" w:val="clear"/>
             <w:tcMar>
               <w:top w:type="dxa" w:w="80"/>
               <w:left w:type="dxa" w:w="120"/>
@@ -4596,7 +4713,6 @@
               <w:bottom w:val="single" w:color="D0D7D3" w:sz="4"/>
               <w:right w:val="single" w:color="D0D7D3" w:sz="4"/>
             </w:tcBorders>
-            <w:shd w:fill="F6F8F7" w:color="auto" w:val="clear"/>
             <w:tcMar>
               <w:top w:type="dxa" w:w="80"/>
               <w:left w:type="dxa" w:w="120"/>
@@ -4627,6 +4743,7 @@
               <w:bottom w:val="single" w:color="D0D7D3" w:sz="4"/>
               <w:right w:val="single" w:color="D0D7D3" w:sz="4"/>
             </w:tcBorders>
+            <w:shd w:fill="F6F8F7" w:color="auto" w:val="clear"/>
             <w:tcMar>
               <w:top w:type="dxa" w:w="80"/>
               <w:left w:type="dxa" w:w="120"/>
@@ -4655,6 +4772,7 @@
               <w:bottom w:val="single" w:color="D0D7D3" w:sz="4"/>
               <w:right w:val="single" w:color="D0D7D3" w:sz="4"/>
             </w:tcBorders>
+            <w:shd w:fill="F6F8F7" w:color="auto" w:val="clear"/>
             <w:tcMar>
               <w:top w:type="dxa" w:w="80"/>
               <w:left w:type="dxa" w:w="120"/>
@@ -4685,7 +4803,6 @@
               <w:bottom w:val="single" w:color="D0D7D3" w:sz="4"/>
               <w:right w:val="single" w:color="D0D7D3" w:sz="4"/>
             </w:tcBorders>
-            <w:shd w:fill="F6F8F7" w:color="auto" w:val="clear"/>
             <w:tcMar>
               <w:top w:type="dxa" w:w="80"/>
               <w:left w:type="dxa" w:w="120"/>
@@ -4714,7 +4831,6 @@
               <w:bottom w:val="single" w:color="D0D7D3" w:sz="4"/>
               <w:right w:val="single" w:color="D0D7D3" w:sz="4"/>
             </w:tcBorders>
-            <w:shd w:fill="F6F8F7" w:color="auto" w:val="clear"/>
             <w:tcMar>
               <w:top w:type="dxa" w:w="80"/>
               <w:left w:type="dxa" w:w="120"/>
@@ -4745,6 +4861,7 @@
               <w:bottom w:val="single" w:color="D0D7D3" w:sz="4"/>
               <w:right w:val="single" w:color="D0D7D3" w:sz="4"/>
             </w:tcBorders>
+            <w:shd w:fill="F6F8F7" w:color="auto" w:val="clear"/>
             <w:tcMar>
               <w:top w:type="dxa" w:w="80"/>
               <w:left w:type="dxa" w:w="120"/>
@@ -4773,6 +4890,7 @@
               <w:bottom w:val="single" w:color="D0D7D3" w:sz="4"/>
               <w:right w:val="single" w:color="D0D7D3" w:sz="4"/>
             </w:tcBorders>
+            <w:shd w:fill="F6F8F7" w:color="auto" w:val="clear"/>
             <w:tcMar>
               <w:top w:type="dxa" w:w="80"/>
               <w:left w:type="dxa" w:w="120"/>
@@ -4803,7 +4921,6 @@
               <w:bottom w:val="single" w:color="D0D7D3" w:sz="4"/>
               <w:right w:val="single" w:color="D0D7D3" w:sz="4"/>
             </w:tcBorders>
-            <w:shd w:fill="F6F8F7" w:color="auto" w:val="clear"/>
             <w:tcMar>
               <w:top w:type="dxa" w:w="80"/>
               <w:left w:type="dxa" w:w="120"/>
@@ -4832,7 +4949,6 @@
               <w:bottom w:val="single" w:color="D0D7D3" w:sz="4"/>
               <w:right w:val="single" w:color="D0D7D3" w:sz="4"/>
             </w:tcBorders>
-            <w:shd w:fill="F6F8F7" w:color="auto" w:val="clear"/>
             <w:tcMar>
               <w:top w:type="dxa" w:w="80"/>
               <w:left w:type="dxa" w:w="120"/>
@@ -4863,6 +4979,7 @@
               <w:bottom w:val="single" w:color="D0D7D3" w:sz="4"/>
               <w:right w:val="single" w:color="D0D7D3" w:sz="4"/>
             </w:tcBorders>
+            <w:shd w:fill="F6F8F7" w:color="auto" w:val="clear"/>
             <w:tcMar>
               <w:top w:type="dxa" w:w="80"/>
               <w:left w:type="dxa" w:w="120"/>
@@ -4891,6 +5008,7 @@
               <w:bottom w:val="single" w:color="D0D7D3" w:sz="4"/>
               <w:right w:val="single" w:color="D0D7D3" w:sz="4"/>
             </w:tcBorders>
+            <w:shd w:fill="F6F8F7" w:color="auto" w:val="clear"/>
             <w:tcMar>
               <w:top w:type="dxa" w:w="80"/>
               <w:left w:type="dxa" w:w="120"/>
@@ -4921,7 +5039,6 @@
               <w:bottom w:val="single" w:color="D0D7D3" w:sz="4"/>
               <w:right w:val="single" w:color="D0D7D3" w:sz="4"/>
             </w:tcBorders>
-            <w:shd w:fill="F6F8F7" w:color="auto" w:val="clear"/>
             <w:tcMar>
               <w:top w:type="dxa" w:w="80"/>
               <w:left w:type="dxa" w:w="120"/>
@@ -4950,7 +5067,6 @@
               <w:bottom w:val="single" w:color="D0D7D3" w:sz="4"/>
               <w:right w:val="single" w:color="D0D7D3" w:sz="4"/>
             </w:tcBorders>
-            <w:shd w:fill="F6F8F7" w:color="auto" w:val="clear"/>
             <w:tcMar>
               <w:top w:type="dxa" w:w="80"/>
               <w:left w:type="dxa" w:w="120"/>
@@ -4981,6 +5097,7 @@
               <w:bottom w:val="single" w:color="D0D7D3" w:sz="4"/>
               <w:right w:val="single" w:color="D0D7D3" w:sz="4"/>
             </w:tcBorders>
+            <w:shd w:fill="F6F8F7" w:color="auto" w:val="clear"/>
             <w:tcMar>
               <w:top w:type="dxa" w:w="80"/>
               <w:left w:type="dxa" w:w="120"/>
@@ -5009,6 +5126,7 @@
               <w:bottom w:val="single" w:color="D0D7D3" w:sz="4"/>
               <w:right w:val="single" w:color="D0D7D3" w:sz="4"/>
             </w:tcBorders>
+            <w:shd w:fill="F6F8F7" w:color="auto" w:val="clear"/>
             <w:tcMar>
               <w:top w:type="dxa" w:w="80"/>
               <w:left w:type="dxa" w:w="120"/>
@@ -5039,7 +5157,6 @@
               <w:bottom w:val="single" w:color="D0D7D3" w:sz="4"/>
               <w:right w:val="single" w:color="D0D7D3" w:sz="4"/>
             </w:tcBorders>
-            <w:shd w:fill="F6F8F7" w:color="auto" w:val="clear"/>
             <w:tcMar>
               <w:top w:type="dxa" w:w="80"/>
               <w:left w:type="dxa" w:w="120"/>
@@ -5068,7 +5185,6 @@
               <w:bottom w:val="single" w:color="D0D7D3" w:sz="4"/>
               <w:right w:val="single" w:color="D0D7D3" w:sz="4"/>
             </w:tcBorders>
-            <w:shd w:fill="F6F8F7" w:color="auto" w:val="clear"/>
             <w:tcMar>
               <w:top w:type="dxa" w:w="80"/>
               <w:left w:type="dxa" w:w="120"/>
@@ -5099,6 +5215,7 @@
               <w:bottom w:val="single" w:color="D0D7D3" w:sz="4"/>
               <w:right w:val="single" w:color="D0D7D3" w:sz="4"/>
             </w:tcBorders>
+            <w:shd w:fill="F6F8F7" w:color="auto" w:val="clear"/>
             <w:tcMar>
               <w:top w:type="dxa" w:w="80"/>
               <w:left w:type="dxa" w:w="120"/>
@@ -5127,6 +5244,7 @@
               <w:bottom w:val="single" w:color="D0D7D3" w:sz="4"/>
               <w:right w:val="single" w:color="D0D7D3" w:sz="4"/>
             </w:tcBorders>
+            <w:shd w:fill="F6F8F7" w:color="auto" w:val="clear"/>
             <w:tcMar>
               <w:top w:type="dxa" w:w="80"/>
               <w:left w:type="dxa" w:w="120"/>
@@ -5157,7 +5275,6 @@
               <w:bottom w:val="single" w:color="D0D7D3" w:sz="4"/>
               <w:right w:val="single" w:color="D0D7D3" w:sz="4"/>
             </w:tcBorders>
-            <w:shd w:fill="F6F8F7" w:color="auto" w:val="clear"/>
             <w:tcMar>
               <w:top w:type="dxa" w:w="80"/>
               <w:left w:type="dxa" w:w="120"/>
@@ -5186,7 +5303,6 @@
               <w:bottom w:val="single" w:color="D0D7D3" w:sz="4"/>
               <w:right w:val="single" w:color="D0D7D3" w:sz="4"/>
             </w:tcBorders>
-            <w:shd w:fill="F6F8F7" w:color="auto" w:val="clear"/>
             <w:tcMar>
               <w:top w:type="dxa" w:w="80"/>
               <w:left w:type="dxa" w:w="120"/>
@@ -5217,6 +5333,7 @@
               <w:bottom w:val="single" w:color="D0D7D3" w:sz="4"/>
               <w:right w:val="single" w:color="D0D7D3" w:sz="4"/>
             </w:tcBorders>
+            <w:shd w:fill="F6F8F7" w:color="auto" w:val="clear"/>
             <w:tcMar>
               <w:top w:type="dxa" w:w="80"/>
               <w:left w:type="dxa" w:w="120"/>
@@ -5245,6 +5362,7 @@
               <w:bottom w:val="single" w:color="D0D7D3" w:sz="4"/>
               <w:right w:val="single" w:color="D0D7D3" w:sz="4"/>
             </w:tcBorders>
+            <w:shd w:fill="F6F8F7" w:color="auto" w:val="clear"/>
             <w:tcMar>
               <w:top w:type="dxa" w:w="80"/>
               <w:left w:type="dxa" w:w="120"/>
@@ -5275,7 +5393,6 @@
               <w:bottom w:val="single" w:color="D0D7D3" w:sz="4"/>
               <w:right w:val="single" w:color="D0D7D3" w:sz="4"/>
             </w:tcBorders>
-            <w:shd w:fill="F6F8F7" w:color="auto" w:val="clear"/>
             <w:tcMar>
               <w:top w:type="dxa" w:w="80"/>
               <w:left w:type="dxa" w:w="120"/>
@@ -5304,7 +5421,6 @@
               <w:bottom w:val="single" w:color="D0D7D3" w:sz="4"/>
               <w:right w:val="single" w:color="D0D7D3" w:sz="4"/>
             </w:tcBorders>
-            <w:shd w:fill="F6F8F7" w:color="auto" w:val="clear"/>
             <w:tcMar>
               <w:top w:type="dxa" w:w="80"/>
               <w:left w:type="dxa" w:w="120"/>
@@ -5335,6 +5451,7 @@
               <w:bottom w:val="single" w:color="D0D7D3" w:sz="4"/>
               <w:right w:val="single" w:color="D0D7D3" w:sz="4"/>
             </w:tcBorders>
+            <w:shd w:fill="F6F8F7" w:color="auto" w:val="clear"/>
             <w:tcMar>
               <w:top w:type="dxa" w:w="80"/>
               <w:left w:type="dxa" w:w="120"/>
@@ -5363,6 +5480,7 @@
               <w:bottom w:val="single" w:color="D0D7D3" w:sz="4"/>
               <w:right w:val="single" w:color="D0D7D3" w:sz="4"/>
             </w:tcBorders>
+            <w:shd w:fill="F6F8F7" w:color="auto" w:val="clear"/>
             <w:tcMar>
               <w:top w:type="dxa" w:w="80"/>
               <w:left w:type="dxa" w:w="120"/>
@@ -5393,7 +5511,6 @@
               <w:bottom w:val="single" w:color="D0D7D3" w:sz="4"/>
               <w:right w:val="single" w:color="D0D7D3" w:sz="4"/>
             </w:tcBorders>
-            <w:shd w:fill="F6F8F7" w:color="auto" w:val="clear"/>
             <w:tcMar>
               <w:top w:type="dxa" w:w="80"/>
               <w:left w:type="dxa" w:w="120"/>
@@ -5422,7 +5539,6 @@
               <w:bottom w:val="single" w:color="D0D7D3" w:sz="4"/>
               <w:right w:val="single" w:color="D0D7D3" w:sz="4"/>
             </w:tcBorders>
-            <w:shd w:fill="F6F8F7" w:color="auto" w:val="clear"/>
             <w:tcMar>
               <w:top w:type="dxa" w:w="80"/>
               <w:left w:type="dxa" w:w="120"/>
@@ -5453,6 +5569,7 @@
               <w:bottom w:val="single" w:color="D0D7D3" w:sz="4"/>
               <w:right w:val="single" w:color="D0D7D3" w:sz="4"/>
             </w:tcBorders>
+            <w:shd w:fill="F6F8F7" w:color="auto" w:val="clear"/>
             <w:tcMar>
               <w:top w:type="dxa" w:w="80"/>
               <w:left w:type="dxa" w:w="120"/>
@@ -5481,6 +5598,7 @@
               <w:bottom w:val="single" w:color="D0D7D3" w:sz="4"/>
               <w:right w:val="single" w:color="D0D7D3" w:sz="4"/>
             </w:tcBorders>
+            <w:shd w:fill="F6F8F7" w:color="auto" w:val="clear"/>
             <w:tcMar>
               <w:top w:type="dxa" w:w="80"/>
               <w:left w:type="dxa" w:w="120"/>
@@ -5511,7 +5629,6 @@
               <w:bottom w:val="single" w:color="D0D7D3" w:sz="4"/>
               <w:right w:val="single" w:color="D0D7D3" w:sz="4"/>
             </w:tcBorders>
-            <w:shd w:fill="F6F8F7" w:color="auto" w:val="clear"/>
             <w:tcMar>
               <w:top w:type="dxa" w:w="80"/>
               <w:left w:type="dxa" w:w="120"/>
@@ -5540,7 +5657,6 @@
               <w:bottom w:val="single" w:color="D0D7D3" w:sz="4"/>
               <w:right w:val="single" w:color="D0D7D3" w:sz="4"/>
             </w:tcBorders>
-            <w:shd w:fill="F6F8F7" w:color="auto" w:val="clear"/>
             <w:tcMar>
               <w:top w:type="dxa" w:w="80"/>
               <w:left w:type="dxa" w:w="120"/>
@@ -5571,6 +5687,7 @@
               <w:bottom w:val="single" w:color="D0D7D3" w:sz="4"/>
               <w:right w:val="single" w:color="D0D7D3" w:sz="4"/>
             </w:tcBorders>
+            <w:shd w:fill="F6F8F7" w:color="auto" w:val="clear"/>
             <w:tcMar>
               <w:top w:type="dxa" w:w="80"/>
               <w:left w:type="dxa" w:w="120"/>
@@ -5599,6 +5716,7 @@
               <w:bottom w:val="single" w:color="D0D7D3" w:sz="4"/>
               <w:right w:val="single" w:color="D0D7D3" w:sz="4"/>
             </w:tcBorders>
+            <w:shd w:fill="F6F8F7" w:color="auto" w:val="clear"/>
             <w:tcMar>
               <w:top w:type="dxa" w:w="80"/>
               <w:left w:type="dxa" w:w="120"/>
@@ -5629,7 +5747,6 @@
               <w:bottom w:val="single" w:color="D0D7D3" w:sz="4"/>
               <w:right w:val="single" w:color="D0D7D3" w:sz="4"/>
             </w:tcBorders>
-            <w:shd w:fill="F6F8F7" w:color="auto" w:val="clear"/>
             <w:tcMar>
               <w:top w:type="dxa" w:w="80"/>
               <w:left w:type="dxa" w:w="120"/>
@@ -5658,7 +5775,6 @@
               <w:bottom w:val="single" w:color="D0D7D3" w:sz="4"/>
               <w:right w:val="single" w:color="D0D7D3" w:sz="4"/>
             </w:tcBorders>
-            <w:shd w:fill="F6F8F7" w:color="auto" w:val="clear"/>
             <w:tcMar>
               <w:top w:type="dxa" w:w="80"/>
               <w:left w:type="dxa" w:w="120"/>
@@ -5689,6 +5805,7 @@
               <w:bottom w:val="single" w:color="D0D7D3" w:sz="4"/>
               <w:right w:val="single" w:color="D0D7D3" w:sz="4"/>
             </w:tcBorders>
+            <w:shd w:fill="F6F8F7" w:color="auto" w:val="clear"/>
             <w:tcMar>
               <w:top w:type="dxa" w:w="80"/>
               <w:left w:type="dxa" w:w="120"/>
@@ -5717,6 +5834,7 @@
               <w:bottom w:val="single" w:color="D0D7D3" w:sz="4"/>
               <w:right w:val="single" w:color="D0D7D3" w:sz="4"/>
             </w:tcBorders>
+            <w:shd w:fill="F6F8F7" w:color="auto" w:val="clear"/>
             <w:tcMar>
               <w:top w:type="dxa" w:w="80"/>
               <w:left w:type="dxa" w:w="120"/>
@@ -5747,7 +5865,6 @@
               <w:bottom w:val="single" w:color="D0D7D3" w:sz="4"/>
               <w:right w:val="single" w:color="D0D7D3" w:sz="4"/>
             </w:tcBorders>
-            <w:shd w:fill="F6F8F7" w:color="auto" w:val="clear"/>
             <w:tcMar>
               <w:top w:type="dxa" w:w="80"/>
               <w:left w:type="dxa" w:w="120"/>
@@ -5776,7 +5893,6 @@
               <w:bottom w:val="single" w:color="D0D7D3" w:sz="4"/>
               <w:right w:val="single" w:color="D0D7D3" w:sz="4"/>
             </w:tcBorders>
-            <w:shd w:fill="F6F8F7" w:color="auto" w:val="clear"/>
             <w:tcMar>
               <w:top w:type="dxa" w:w="80"/>
               <w:left w:type="dxa" w:w="120"/>
@@ -5807,6 +5923,7 @@
               <w:bottom w:val="single" w:color="D0D7D3" w:sz="4"/>
               <w:right w:val="single" w:color="D0D7D3" w:sz="4"/>
             </w:tcBorders>
+            <w:shd w:fill="F6F8F7" w:color="auto" w:val="clear"/>
             <w:tcMar>
               <w:top w:type="dxa" w:w="80"/>
               <w:left w:type="dxa" w:w="120"/>
@@ -5835,6 +5952,7 @@
               <w:bottom w:val="single" w:color="D0D7D3" w:sz="4"/>
               <w:right w:val="single" w:color="D0D7D3" w:sz="4"/>
             </w:tcBorders>
+            <w:shd w:fill="F6F8F7" w:color="auto" w:val="clear"/>
             <w:tcMar>
               <w:top w:type="dxa" w:w="80"/>
               <w:left w:type="dxa" w:w="120"/>
@@ -5865,7 +5983,6 @@
               <w:bottom w:val="single" w:color="D0D7D3" w:sz="4"/>
               <w:right w:val="single" w:color="D0D7D3" w:sz="4"/>
             </w:tcBorders>
-            <w:shd w:fill="F6F8F7" w:color="auto" w:val="clear"/>
             <w:tcMar>
               <w:top w:type="dxa" w:w="80"/>
               <w:left w:type="dxa" w:w="120"/>
@@ -5894,7 +6011,6 @@
               <w:bottom w:val="single" w:color="D0D7D3" w:sz="4"/>
               <w:right w:val="single" w:color="D0D7D3" w:sz="4"/>
             </w:tcBorders>
-            <w:shd w:fill="F6F8F7" w:color="auto" w:val="clear"/>
             <w:tcMar>
               <w:top w:type="dxa" w:w="80"/>
               <w:left w:type="dxa" w:w="120"/>
@@ -5925,6 +6041,7 @@
               <w:bottom w:val="single" w:color="D0D7D3" w:sz="4"/>
               <w:right w:val="single" w:color="D0D7D3" w:sz="4"/>
             </w:tcBorders>
+            <w:shd w:fill="F6F8F7" w:color="auto" w:val="clear"/>
             <w:tcMar>
               <w:top w:type="dxa" w:w="80"/>
               <w:left w:type="dxa" w:w="120"/>
@@ -5953,6 +6070,7 @@
               <w:bottom w:val="single" w:color="D0D7D3" w:sz="4"/>
               <w:right w:val="single" w:color="D0D7D3" w:sz="4"/>
             </w:tcBorders>
+            <w:shd w:fill="F6F8F7" w:color="auto" w:val="clear"/>
             <w:tcMar>
               <w:top w:type="dxa" w:w="80"/>
               <w:left w:type="dxa" w:w="120"/>
@@ -5983,7 +6101,6 @@
               <w:bottom w:val="single" w:color="D0D7D3" w:sz="4"/>
               <w:right w:val="single" w:color="D0D7D3" w:sz="4"/>
             </w:tcBorders>
-            <w:shd w:fill="F6F8F7" w:color="auto" w:val="clear"/>
             <w:tcMar>
               <w:top w:type="dxa" w:w="80"/>
               <w:left w:type="dxa" w:w="120"/>
@@ -6012,7 +6129,6 @@
               <w:bottom w:val="single" w:color="D0D7D3" w:sz="4"/>
               <w:right w:val="single" w:color="D0D7D3" w:sz="4"/>
             </w:tcBorders>
-            <w:shd w:fill="F6F8F7" w:color="auto" w:val="clear"/>
             <w:tcMar>
               <w:top w:type="dxa" w:w="80"/>
               <w:left w:type="dxa" w:w="120"/>
@@ -6043,6 +6159,7 @@
               <w:bottom w:val="single" w:color="D0D7D3" w:sz="4"/>
               <w:right w:val="single" w:color="D0D7D3" w:sz="4"/>
             </w:tcBorders>
+            <w:shd w:fill="F6F8F7" w:color="auto" w:val="clear"/>
             <w:tcMar>
               <w:top w:type="dxa" w:w="80"/>
               <w:left w:type="dxa" w:w="120"/>
@@ -6071,6 +6188,7 @@
               <w:bottom w:val="single" w:color="D0D7D3" w:sz="4"/>
               <w:right w:val="single" w:color="D0D7D3" w:sz="4"/>
             </w:tcBorders>
+            <w:shd w:fill="F6F8F7" w:color="auto" w:val="clear"/>
             <w:tcMar>
               <w:top w:type="dxa" w:w="80"/>
               <w:left w:type="dxa" w:w="120"/>
@@ -6101,7 +6219,6 @@
               <w:bottom w:val="single" w:color="D0D7D3" w:sz="4"/>
               <w:right w:val="single" w:color="D0D7D3" w:sz="4"/>
             </w:tcBorders>
-            <w:shd w:fill="F6F8F7" w:color="auto" w:val="clear"/>
             <w:tcMar>
               <w:top w:type="dxa" w:w="80"/>
               <w:left w:type="dxa" w:w="120"/>
@@ -6130,7 +6247,6 @@
               <w:bottom w:val="single" w:color="D0D7D3" w:sz="4"/>
               <w:right w:val="single" w:color="D0D7D3" w:sz="4"/>
             </w:tcBorders>
-            <w:shd w:fill="F6F8F7" w:color="auto" w:val="clear"/>
             <w:tcMar>
               <w:top w:type="dxa" w:w="80"/>
               <w:left w:type="dxa" w:w="120"/>
@@ -6161,6 +6277,7 @@
               <w:bottom w:val="single" w:color="D0D7D3" w:sz="4"/>
               <w:right w:val="single" w:color="D0D7D3" w:sz="4"/>
             </w:tcBorders>
+            <w:shd w:fill="F6F8F7" w:color="auto" w:val="clear"/>
             <w:tcMar>
               <w:top w:type="dxa" w:w="80"/>
               <w:left w:type="dxa" w:w="120"/>
@@ -6189,6 +6306,7 @@
               <w:bottom w:val="single" w:color="D0D7D3" w:sz="4"/>
               <w:right w:val="single" w:color="D0D7D3" w:sz="4"/>
             </w:tcBorders>
+            <w:shd w:fill="F6F8F7" w:color="auto" w:val="clear"/>
             <w:tcMar>
               <w:top w:type="dxa" w:w="80"/>
               <w:left w:type="dxa" w:w="120"/>
@@ -6219,7 +6337,6 @@
               <w:bottom w:val="single" w:color="D0D7D3" w:sz="4"/>
               <w:right w:val="single" w:color="D0D7D3" w:sz="4"/>
             </w:tcBorders>
-            <w:shd w:fill="F6F8F7" w:color="auto" w:val="clear"/>
             <w:tcMar>
               <w:top w:type="dxa" w:w="80"/>
               <w:left w:type="dxa" w:w="120"/>
@@ -6248,7 +6365,6 @@
               <w:bottom w:val="single" w:color="D0D7D3" w:sz="4"/>
               <w:right w:val="single" w:color="D0D7D3" w:sz="4"/>
             </w:tcBorders>
-            <w:shd w:fill="F6F8F7" w:color="auto" w:val="clear"/>
             <w:tcMar>
               <w:top w:type="dxa" w:w="80"/>
               <w:left w:type="dxa" w:w="120"/>
@@ -6279,6 +6395,7 @@
               <w:bottom w:val="single" w:color="D0D7D3" w:sz="4"/>
               <w:right w:val="single" w:color="D0D7D3" w:sz="4"/>
             </w:tcBorders>
+            <w:shd w:fill="F6F8F7" w:color="auto" w:val="clear"/>
             <w:tcMar>
               <w:top w:type="dxa" w:w="80"/>
               <w:left w:type="dxa" w:w="120"/>
@@ -6307,6 +6424,7 @@
               <w:bottom w:val="single" w:color="D0D7D3" w:sz="4"/>
               <w:right w:val="single" w:color="D0D7D3" w:sz="4"/>
             </w:tcBorders>
+            <w:shd w:fill="F6F8F7" w:color="auto" w:val="clear"/>
             <w:tcMar>
               <w:top w:type="dxa" w:w="80"/>
               <w:left w:type="dxa" w:w="120"/>
@@ -6337,7 +6455,6 @@
               <w:bottom w:val="single" w:color="D0D7D3" w:sz="4"/>
               <w:right w:val="single" w:color="D0D7D3" w:sz="4"/>
             </w:tcBorders>
-            <w:shd w:fill="F6F8F7" w:color="auto" w:val="clear"/>
             <w:tcMar>
               <w:top w:type="dxa" w:w="80"/>
               <w:left w:type="dxa" w:w="120"/>
@@ -6366,7 +6483,6 @@
               <w:bottom w:val="single" w:color="D0D7D3" w:sz="4"/>
               <w:right w:val="single" w:color="D0D7D3" w:sz="4"/>
             </w:tcBorders>
-            <w:shd w:fill="F6F8F7" w:color="auto" w:val="clear"/>
             <w:tcMar>
               <w:top w:type="dxa" w:w="80"/>
               <w:left w:type="dxa" w:w="120"/>

</xml_diff>

<commit_message>
Platform admins help a school's locked-out staff
From a school's page in the platform console: send a staff member their invite
again or a password-reset link (to their own email, rate limited), and reset
their two-factor sign-in after a lost phone (signed out everywhere, enrol again
at next sign-in). Only active staff of that school; recorded in the school's
activity log and the platform's trail.
</commit_message>
<xml_diff>
--- a/docs/product/WardPay - what it does.docx
+++ b/docs/product/WardPay - what it does.docx
@@ -3816,6 +3816,65 @@
                 <w:sz w:val="20"/>
                 <w:szCs w:val="20"/>
               </w:rPr>
+              <w:t xml:space="preserve">Help a locked-out school: send a staff member their password link again or reset their two-factor sign-in</w:t>
+            </w:r>
+          </w:p>
+        </w:tc>
+        <w:tc>
+          <w:tcPr>
+            <w:tcW w:type="dxa" w:w="4238"/>
+            <w:tcBorders>
+              <w:top w:val="single" w:color="D0D7D3" w:sz="4"/>
+              <w:left w:val="single" w:color="D0D7D3" w:sz="4"/>
+              <w:bottom w:val="single" w:color="D0D7D3" w:sz="4"/>
+              <w:right w:val="single" w:color="D0D7D3" w:sz="4"/>
+            </w:tcBorders>
+            <w:shd w:fill="F6F8F7" w:color="auto" w:val="clear"/>
+            <w:tcMar>
+              <w:top w:type="dxa" w:w="80"/>
+              <w:left w:type="dxa" w:w="120"/>
+              <w:bottom w:type="dxa" w:w="80"/>
+              <w:right w:type="dxa" w:w="120"/>
+            </w:tcMar>
+          </w:tcPr>
+          <w:p>
+            <w:r>
+              <w:rPr>
+                <w:b w:val="false"/>
+                <w:bCs w:val="false"/>
+                <w:sz w:val="20"/>
+                <w:szCs w:val="20"/>
+              </w:rPr>
+              <w:t xml:space="preserve">A proprietor who lost their phone is back in within minutes</w:t>
+            </w:r>
+          </w:p>
+        </w:tc>
+      </w:tr>
+      <w:tr>
+        <w:tc>
+          <w:tcPr>
+            <w:tcW w:type="dxa" w:w="5400"/>
+            <w:tcBorders>
+              <w:top w:val="single" w:color="D0D7D3" w:sz="4"/>
+              <w:left w:val="single" w:color="D0D7D3" w:sz="4"/>
+              <w:bottom w:val="single" w:color="D0D7D3" w:sz="4"/>
+              <w:right w:val="single" w:color="D0D7D3" w:sz="4"/>
+            </w:tcBorders>
+            <w:tcMar>
+              <w:top w:type="dxa" w:w="80"/>
+              <w:left w:type="dxa" w:w="120"/>
+              <w:bottom w:type="dxa" w:w="80"/>
+              <w:right w:type="dxa" w:w="120"/>
+            </w:tcMar>
+          </w:tcPr>
+          <w:p>
+            <w:r>
+              <w:rPr>
+                <w:b w:val="false"/>
+                <w:bCs w:val="false"/>
+                <w:sz w:val="20"/>
+                <w:szCs w:val="20"/>
+              </w:rPr>
               <w:t xml:space="preserve">Problems to fix: payments set aside, card payments in review, stuck tasks and failed messages across every school, with retry</w:t>
             </w:r>
           </w:p>
@@ -3829,7 +3888,6 @@
               <w:bottom w:val="single" w:color="D0D7D3" w:sz="4"/>
               <w:right w:val="single" w:color="D0D7D3" w:sz="4"/>
             </w:tcBorders>
-            <w:shd w:fill="F6F8F7" w:color="auto" w:val="clear"/>
             <w:tcMar>
               <w:top w:type="dxa" w:w="80"/>
               <w:left w:type="dxa" w:w="120"/>
@@ -3860,6 +3918,7 @@
               <w:bottom w:val="single" w:color="D0D7D3" w:sz="4"/>
               <w:right w:val="single" w:color="D0D7D3" w:sz="4"/>
             </w:tcBorders>
+            <w:shd w:fill="F6F8F7" w:color="auto" w:val="clear"/>
             <w:tcMar>
               <w:top w:type="dxa" w:w="80"/>
               <w:left w:type="dxa" w:w="120"/>
@@ -3888,6 +3947,7 @@
               <w:bottom w:val="single" w:color="D0D7D3" w:sz="4"/>
               <w:right w:val="single" w:color="D0D7D3" w:sz="4"/>
             </w:tcBorders>
+            <w:shd w:fill="F6F8F7" w:color="auto" w:val="clear"/>
             <w:tcMar>
               <w:top w:type="dxa" w:w="80"/>
               <w:left w:type="dxa" w:w="120"/>
@@ -4374,6 +4434,66 @@
                 <w:sz w:val="20"/>
                 <w:szCs w:val="20"/>
               </w:rPr>
+              <w:t xml:space="preserve">WardPay team can resend password links and reset two-factor sign-in for a school’s staff</w:t>
+            </w:r>
+          </w:p>
+        </w:tc>
+      </w:tr>
+      <w:tr>
+        <w:tc>
+          <w:tcPr>
+            <w:tcW w:type="dxa" w:w="1800"/>
+            <w:tcBorders>
+              <w:top w:val="single" w:color="D0D7D3" w:sz="4"/>
+              <w:left w:val="single" w:color="D0D7D3" w:sz="4"/>
+              <w:bottom w:val="single" w:color="D0D7D3" w:sz="4"/>
+              <w:right w:val="single" w:color="D0D7D3" w:sz="4"/>
+            </w:tcBorders>
+            <w:shd w:fill="F6F8F7" w:color="auto" w:val="clear"/>
+            <w:tcMar>
+              <w:top w:type="dxa" w:w="80"/>
+              <w:left w:type="dxa" w:w="120"/>
+              <w:bottom w:type="dxa" w:w="80"/>
+              <w:right w:type="dxa" w:w="120"/>
+            </w:tcMar>
+          </w:tcPr>
+          <w:p>
+            <w:r>
+              <w:rPr>
+                <w:b w:val="false"/>
+                <w:bCs w:val="false"/>
+                <w:sz w:val="20"/>
+                <w:szCs w:val="20"/>
+              </w:rPr>
+              <w:t xml:space="preserve">22 Oct 2026</w:t>
+            </w:r>
+          </w:p>
+        </w:tc>
+        <w:tc>
+          <w:tcPr>
+            <w:tcW w:type="dxa" w:w="7838"/>
+            <w:tcBorders>
+              <w:top w:val="single" w:color="D0D7D3" w:sz="4"/>
+              <w:left w:val="single" w:color="D0D7D3" w:sz="4"/>
+              <w:bottom w:val="single" w:color="D0D7D3" w:sz="4"/>
+              <w:right w:val="single" w:color="D0D7D3" w:sz="4"/>
+            </w:tcBorders>
+            <w:shd w:fill="F6F8F7" w:color="auto" w:val="clear"/>
+            <w:tcMar>
+              <w:top w:type="dxa" w:w="80"/>
+              <w:left w:type="dxa" w:w="120"/>
+              <w:bottom w:type="dxa" w:w="80"/>
+              <w:right w:type="dxa" w:w="120"/>
+            </w:tcMar>
+          </w:tcPr>
+          <w:p>
+            <w:r>
+              <w:rPr>
+                <w:b w:val="false"/>
+                <w:bCs w:val="false"/>
+                <w:sz w:val="20"/>
+                <w:szCs w:val="20"/>
+              </w:rPr>
               <w:t xml:space="preserve">Problems to fix: one page for the WardPay team showing everything stuck across schools</w:t>
             </w:r>
           </w:p>
@@ -4389,7 +4509,6 @@
               <w:bottom w:val="single" w:color="D0D7D3" w:sz="4"/>
               <w:right w:val="single" w:color="D0D7D3" w:sz="4"/>
             </w:tcBorders>
-            <w:shd w:fill="F6F8F7" w:color="auto" w:val="clear"/>
             <w:tcMar>
               <w:top w:type="dxa" w:w="80"/>
               <w:left w:type="dxa" w:w="120"/>
@@ -4418,7 +4537,6 @@
               <w:bottom w:val="single" w:color="D0D7D3" w:sz="4"/>
               <w:right w:val="single" w:color="D0D7D3" w:sz="4"/>
             </w:tcBorders>
-            <w:shd w:fill="F6F8F7" w:color="auto" w:val="clear"/>
             <w:tcMar>
               <w:top w:type="dxa" w:w="80"/>
               <w:left w:type="dxa" w:w="120"/>
@@ -4449,6 +4567,7 @@
               <w:bottom w:val="single" w:color="D0D7D3" w:sz="4"/>
               <w:right w:val="single" w:color="D0D7D3" w:sz="4"/>
             </w:tcBorders>
+            <w:shd w:fill="F6F8F7" w:color="auto" w:val="clear"/>
             <w:tcMar>
               <w:top w:type="dxa" w:w="80"/>
               <w:left w:type="dxa" w:w="120"/>
@@ -4477,6 +4596,7 @@
               <w:bottom w:val="single" w:color="D0D7D3" w:sz="4"/>
               <w:right w:val="single" w:color="D0D7D3" w:sz="4"/>
             </w:tcBorders>
+            <w:shd w:fill="F6F8F7" w:color="auto" w:val="clear"/>
             <w:tcMar>
               <w:top w:type="dxa" w:w="80"/>
               <w:left w:type="dxa" w:w="120"/>
@@ -4507,7 +4627,6 @@
               <w:bottom w:val="single" w:color="D0D7D3" w:sz="4"/>
               <w:right w:val="single" w:color="D0D7D3" w:sz="4"/>
             </w:tcBorders>
-            <w:shd w:fill="F6F8F7" w:color="auto" w:val="clear"/>
             <w:tcMar>
               <w:top w:type="dxa" w:w="80"/>
               <w:left w:type="dxa" w:w="120"/>
@@ -4536,7 +4655,6 @@
               <w:bottom w:val="single" w:color="D0D7D3" w:sz="4"/>
               <w:right w:val="single" w:color="D0D7D3" w:sz="4"/>
             </w:tcBorders>
-            <w:shd w:fill="F6F8F7" w:color="auto" w:val="clear"/>
             <w:tcMar>
               <w:top w:type="dxa" w:w="80"/>
               <w:left w:type="dxa" w:w="120"/>
@@ -4567,6 +4685,7 @@
               <w:bottom w:val="single" w:color="D0D7D3" w:sz="4"/>
               <w:right w:val="single" w:color="D0D7D3" w:sz="4"/>
             </w:tcBorders>
+            <w:shd w:fill="F6F8F7" w:color="auto" w:val="clear"/>
             <w:tcMar>
               <w:top w:type="dxa" w:w="80"/>
               <w:left w:type="dxa" w:w="120"/>
@@ -4595,6 +4714,7 @@
               <w:bottom w:val="single" w:color="D0D7D3" w:sz="4"/>
               <w:right w:val="single" w:color="D0D7D3" w:sz="4"/>
             </w:tcBorders>
+            <w:shd w:fill="F6F8F7" w:color="auto" w:val="clear"/>
             <w:tcMar>
               <w:top w:type="dxa" w:w="80"/>
               <w:left w:type="dxa" w:w="120"/>
@@ -4625,7 +4745,6 @@
               <w:bottom w:val="single" w:color="D0D7D3" w:sz="4"/>
               <w:right w:val="single" w:color="D0D7D3" w:sz="4"/>
             </w:tcBorders>
-            <w:shd w:fill="F6F8F7" w:color="auto" w:val="clear"/>
             <w:tcMar>
               <w:top w:type="dxa" w:w="80"/>
               <w:left w:type="dxa" w:w="120"/>
@@ -4654,7 +4773,6 @@
               <w:bottom w:val="single" w:color="D0D7D3" w:sz="4"/>
               <w:right w:val="single" w:color="D0D7D3" w:sz="4"/>
             </w:tcBorders>
-            <w:shd w:fill="F6F8F7" w:color="auto" w:val="clear"/>
             <w:tcMar>
               <w:top w:type="dxa" w:w="80"/>
               <w:left w:type="dxa" w:w="120"/>
@@ -4685,6 +4803,7 @@
               <w:bottom w:val="single" w:color="D0D7D3" w:sz="4"/>
               <w:right w:val="single" w:color="D0D7D3" w:sz="4"/>
             </w:tcBorders>
+            <w:shd w:fill="F6F8F7" w:color="auto" w:val="clear"/>
             <w:tcMar>
               <w:top w:type="dxa" w:w="80"/>
               <w:left w:type="dxa" w:w="120"/>
@@ -4713,6 +4832,7 @@
               <w:bottom w:val="single" w:color="D0D7D3" w:sz="4"/>
               <w:right w:val="single" w:color="D0D7D3" w:sz="4"/>
             </w:tcBorders>
+            <w:shd w:fill="F6F8F7" w:color="auto" w:val="clear"/>
             <w:tcMar>
               <w:top w:type="dxa" w:w="80"/>
               <w:left w:type="dxa" w:w="120"/>
@@ -4743,7 +4863,6 @@
               <w:bottom w:val="single" w:color="D0D7D3" w:sz="4"/>
               <w:right w:val="single" w:color="D0D7D3" w:sz="4"/>
             </w:tcBorders>
-            <w:shd w:fill="F6F8F7" w:color="auto" w:val="clear"/>
             <w:tcMar>
               <w:top w:type="dxa" w:w="80"/>
               <w:left w:type="dxa" w:w="120"/>
@@ -4772,7 +4891,6 @@
               <w:bottom w:val="single" w:color="D0D7D3" w:sz="4"/>
               <w:right w:val="single" w:color="D0D7D3" w:sz="4"/>
             </w:tcBorders>
-            <w:shd w:fill="F6F8F7" w:color="auto" w:val="clear"/>
             <w:tcMar>
               <w:top w:type="dxa" w:w="80"/>
               <w:left w:type="dxa" w:w="120"/>
@@ -4803,6 +4921,7 @@
               <w:bottom w:val="single" w:color="D0D7D3" w:sz="4"/>
               <w:right w:val="single" w:color="D0D7D3" w:sz="4"/>
             </w:tcBorders>
+            <w:shd w:fill="F6F8F7" w:color="auto" w:val="clear"/>
             <w:tcMar>
               <w:top w:type="dxa" w:w="80"/>
               <w:left w:type="dxa" w:w="120"/>
@@ -4831,6 +4950,7 @@
               <w:bottom w:val="single" w:color="D0D7D3" w:sz="4"/>
               <w:right w:val="single" w:color="D0D7D3" w:sz="4"/>
             </w:tcBorders>
+            <w:shd w:fill="F6F8F7" w:color="auto" w:val="clear"/>
             <w:tcMar>
               <w:top w:type="dxa" w:w="80"/>
               <w:left w:type="dxa" w:w="120"/>
@@ -4861,7 +4981,6 @@
               <w:bottom w:val="single" w:color="D0D7D3" w:sz="4"/>
               <w:right w:val="single" w:color="D0D7D3" w:sz="4"/>
             </w:tcBorders>
-            <w:shd w:fill="F6F8F7" w:color="auto" w:val="clear"/>
             <w:tcMar>
               <w:top w:type="dxa" w:w="80"/>
               <w:left w:type="dxa" w:w="120"/>
@@ -4890,7 +5009,6 @@
               <w:bottom w:val="single" w:color="D0D7D3" w:sz="4"/>
               <w:right w:val="single" w:color="D0D7D3" w:sz="4"/>
             </w:tcBorders>
-            <w:shd w:fill="F6F8F7" w:color="auto" w:val="clear"/>
             <w:tcMar>
               <w:top w:type="dxa" w:w="80"/>
               <w:left w:type="dxa" w:w="120"/>
@@ -4921,6 +5039,7 @@
               <w:bottom w:val="single" w:color="D0D7D3" w:sz="4"/>
               <w:right w:val="single" w:color="D0D7D3" w:sz="4"/>
             </w:tcBorders>
+            <w:shd w:fill="F6F8F7" w:color="auto" w:val="clear"/>
             <w:tcMar>
               <w:top w:type="dxa" w:w="80"/>
               <w:left w:type="dxa" w:w="120"/>
@@ -4949,6 +5068,7 @@
               <w:bottom w:val="single" w:color="D0D7D3" w:sz="4"/>
               <w:right w:val="single" w:color="D0D7D3" w:sz="4"/>
             </w:tcBorders>
+            <w:shd w:fill="F6F8F7" w:color="auto" w:val="clear"/>
             <w:tcMar>
               <w:top w:type="dxa" w:w="80"/>
               <w:left w:type="dxa" w:w="120"/>
@@ -4979,7 +5099,6 @@
               <w:bottom w:val="single" w:color="D0D7D3" w:sz="4"/>
               <w:right w:val="single" w:color="D0D7D3" w:sz="4"/>
             </w:tcBorders>
-            <w:shd w:fill="F6F8F7" w:color="auto" w:val="clear"/>
             <w:tcMar>
               <w:top w:type="dxa" w:w="80"/>
               <w:left w:type="dxa" w:w="120"/>
@@ -5008,7 +5127,6 @@
               <w:bottom w:val="single" w:color="D0D7D3" w:sz="4"/>
               <w:right w:val="single" w:color="D0D7D3" w:sz="4"/>
             </w:tcBorders>
-            <w:shd w:fill="F6F8F7" w:color="auto" w:val="clear"/>
             <w:tcMar>
               <w:top w:type="dxa" w:w="80"/>
               <w:left w:type="dxa" w:w="120"/>
@@ -5039,6 +5157,7 @@
               <w:bottom w:val="single" w:color="D0D7D3" w:sz="4"/>
               <w:right w:val="single" w:color="D0D7D3" w:sz="4"/>
             </w:tcBorders>
+            <w:shd w:fill="F6F8F7" w:color="auto" w:val="clear"/>
             <w:tcMar>
               <w:top w:type="dxa" w:w="80"/>
               <w:left w:type="dxa" w:w="120"/>
@@ -5067,6 +5186,7 @@
               <w:bottom w:val="single" w:color="D0D7D3" w:sz="4"/>
               <w:right w:val="single" w:color="D0D7D3" w:sz="4"/>
             </w:tcBorders>
+            <w:shd w:fill="F6F8F7" w:color="auto" w:val="clear"/>
             <w:tcMar>
               <w:top w:type="dxa" w:w="80"/>
               <w:left w:type="dxa" w:w="120"/>
@@ -5097,7 +5217,6 @@
               <w:bottom w:val="single" w:color="D0D7D3" w:sz="4"/>
               <w:right w:val="single" w:color="D0D7D3" w:sz="4"/>
             </w:tcBorders>
-            <w:shd w:fill="F6F8F7" w:color="auto" w:val="clear"/>
             <w:tcMar>
               <w:top w:type="dxa" w:w="80"/>
               <w:left w:type="dxa" w:w="120"/>
@@ -5126,7 +5245,6 @@
               <w:bottom w:val="single" w:color="D0D7D3" w:sz="4"/>
               <w:right w:val="single" w:color="D0D7D3" w:sz="4"/>
             </w:tcBorders>
-            <w:shd w:fill="F6F8F7" w:color="auto" w:val="clear"/>
             <w:tcMar>
               <w:top w:type="dxa" w:w="80"/>
               <w:left w:type="dxa" w:w="120"/>
@@ -5157,6 +5275,7 @@
               <w:bottom w:val="single" w:color="D0D7D3" w:sz="4"/>
               <w:right w:val="single" w:color="D0D7D3" w:sz="4"/>
             </w:tcBorders>
+            <w:shd w:fill="F6F8F7" w:color="auto" w:val="clear"/>
             <w:tcMar>
               <w:top w:type="dxa" w:w="80"/>
               <w:left w:type="dxa" w:w="120"/>
@@ -5185,6 +5304,7 @@
               <w:bottom w:val="single" w:color="D0D7D3" w:sz="4"/>
               <w:right w:val="single" w:color="D0D7D3" w:sz="4"/>
             </w:tcBorders>
+            <w:shd w:fill="F6F8F7" w:color="auto" w:val="clear"/>
             <w:tcMar>
               <w:top w:type="dxa" w:w="80"/>
               <w:left w:type="dxa" w:w="120"/>
@@ -5215,7 +5335,6 @@
               <w:bottom w:val="single" w:color="D0D7D3" w:sz="4"/>
               <w:right w:val="single" w:color="D0D7D3" w:sz="4"/>
             </w:tcBorders>
-            <w:shd w:fill="F6F8F7" w:color="auto" w:val="clear"/>
             <w:tcMar>
               <w:top w:type="dxa" w:w="80"/>
               <w:left w:type="dxa" w:w="120"/>
@@ -5244,7 +5363,6 @@
               <w:bottom w:val="single" w:color="D0D7D3" w:sz="4"/>
               <w:right w:val="single" w:color="D0D7D3" w:sz="4"/>
             </w:tcBorders>
-            <w:shd w:fill="F6F8F7" w:color="auto" w:val="clear"/>
             <w:tcMar>
               <w:top w:type="dxa" w:w="80"/>
               <w:left w:type="dxa" w:w="120"/>
@@ -5275,6 +5393,7 @@
               <w:bottom w:val="single" w:color="D0D7D3" w:sz="4"/>
               <w:right w:val="single" w:color="D0D7D3" w:sz="4"/>
             </w:tcBorders>
+            <w:shd w:fill="F6F8F7" w:color="auto" w:val="clear"/>
             <w:tcMar>
               <w:top w:type="dxa" w:w="80"/>
               <w:left w:type="dxa" w:w="120"/>
@@ -5303,6 +5422,7 @@
               <w:bottom w:val="single" w:color="D0D7D3" w:sz="4"/>
               <w:right w:val="single" w:color="D0D7D3" w:sz="4"/>
             </w:tcBorders>
+            <w:shd w:fill="F6F8F7" w:color="auto" w:val="clear"/>
             <w:tcMar>
               <w:top w:type="dxa" w:w="80"/>
               <w:left w:type="dxa" w:w="120"/>
@@ -5333,7 +5453,6 @@
               <w:bottom w:val="single" w:color="D0D7D3" w:sz="4"/>
               <w:right w:val="single" w:color="D0D7D3" w:sz="4"/>
             </w:tcBorders>
-            <w:shd w:fill="F6F8F7" w:color="auto" w:val="clear"/>
             <w:tcMar>
               <w:top w:type="dxa" w:w="80"/>
               <w:left w:type="dxa" w:w="120"/>
@@ -5362,7 +5481,6 @@
               <w:bottom w:val="single" w:color="D0D7D3" w:sz="4"/>
               <w:right w:val="single" w:color="D0D7D3" w:sz="4"/>
             </w:tcBorders>
-            <w:shd w:fill="F6F8F7" w:color="auto" w:val="clear"/>
             <w:tcMar>
               <w:top w:type="dxa" w:w="80"/>
               <w:left w:type="dxa" w:w="120"/>
@@ -5393,6 +5511,7 @@
               <w:bottom w:val="single" w:color="D0D7D3" w:sz="4"/>
               <w:right w:val="single" w:color="D0D7D3" w:sz="4"/>
             </w:tcBorders>
+            <w:shd w:fill="F6F8F7" w:color="auto" w:val="clear"/>
             <w:tcMar>
               <w:top w:type="dxa" w:w="80"/>
               <w:left w:type="dxa" w:w="120"/>
@@ -5421,6 +5540,7 @@
               <w:bottom w:val="single" w:color="D0D7D3" w:sz="4"/>
               <w:right w:val="single" w:color="D0D7D3" w:sz="4"/>
             </w:tcBorders>
+            <w:shd w:fill="F6F8F7" w:color="auto" w:val="clear"/>
             <w:tcMar>
               <w:top w:type="dxa" w:w="80"/>
               <w:left w:type="dxa" w:w="120"/>
@@ -5451,7 +5571,6 @@
               <w:bottom w:val="single" w:color="D0D7D3" w:sz="4"/>
               <w:right w:val="single" w:color="D0D7D3" w:sz="4"/>
             </w:tcBorders>
-            <w:shd w:fill="F6F8F7" w:color="auto" w:val="clear"/>
             <w:tcMar>
               <w:top w:type="dxa" w:w="80"/>
               <w:left w:type="dxa" w:w="120"/>
@@ -5480,7 +5599,6 @@
               <w:bottom w:val="single" w:color="D0D7D3" w:sz="4"/>
               <w:right w:val="single" w:color="D0D7D3" w:sz="4"/>
             </w:tcBorders>
-            <w:shd w:fill="F6F8F7" w:color="auto" w:val="clear"/>
             <w:tcMar>
               <w:top w:type="dxa" w:w="80"/>
               <w:left w:type="dxa" w:w="120"/>
@@ -5511,6 +5629,7 @@
               <w:bottom w:val="single" w:color="D0D7D3" w:sz="4"/>
               <w:right w:val="single" w:color="D0D7D3" w:sz="4"/>
             </w:tcBorders>
+            <w:shd w:fill="F6F8F7" w:color="auto" w:val="clear"/>
             <w:tcMar>
               <w:top w:type="dxa" w:w="80"/>
               <w:left w:type="dxa" w:w="120"/>
@@ -5539,6 +5658,7 @@
               <w:bottom w:val="single" w:color="D0D7D3" w:sz="4"/>
               <w:right w:val="single" w:color="D0D7D3" w:sz="4"/>
             </w:tcBorders>
+            <w:shd w:fill="F6F8F7" w:color="auto" w:val="clear"/>
             <w:tcMar>
               <w:top w:type="dxa" w:w="80"/>
               <w:left w:type="dxa" w:w="120"/>
@@ -5569,7 +5689,6 @@
               <w:bottom w:val="single" w:color="D0D7D3" w:sz="4"/>
               <w:right w:val="single" w:color="D0D7D3" w:sz="4"/>
             </w:tcBorders>
-            <w:shd w:fill="F6F8F7" w:color="auto" w:val="clear"/>
             <w:tcMar>
               <w:top w:type="dxa" w:w="80"/>
               <w:left w:type="dxa" w:w="120"/>
@@ -5598,7 +5717,6 @@
               <w:bottom w:val="single" w:color="D0D7D3" w:sz="4"/>
               <w:right w:val="single" w:color="D0D7D3" w:sz="4"/>
             </w:tcBorders>
-            <w:shd w:fill="F6F8F7" w:color="auto" w:val="clear"/>
             <w:tcMar>
               <w:top w:type="dxa" w:w="80"/>
               <w:left w:type="dxa" w:w="120"/>
@@ -5629,6 +5747,7 @@
               <w:bottom w:val="single" w:color="D0D7D3" w:sz="4"/>
               <w:right w:val="single" w:color="D0D7D3" w:sz="4"/>
             </w:tcBorders>
+            <w:shd w:fill="F6F8F7" w:color="auto" w:val="clear"/>
             <w:tcMar>
               <w:top w:type="dxa" w:w="80"/>
               <w:left w:type="dxa" w:w="120"/>
@@ -5657,6 +5776,7 @@
               <w:bottom w:val="single" w:color="D0D7D3" w:sz="4"/>
               <w:right w:val="single" w:color="D0D7D3" w:sz="4"/>
             </w:tcBorders>
+            <w:shd w:fill="F6F8F7" w:color="auto" w:val="clear"/>
             <w:tcMar>
               <w:top w:type="dxa" w:w="80"/>
               <w:left w:type="dxa" w:w="120"/>
@@ -5687,7 +5807,6 @@
               <w:bottom w:val="single" w:color="D0D7D3" w:sz="4"/>
               <w:right w:val="single" w:color="D0D7D3" w:sz="4"/>
             </w:tcBorders>
-            <w:shd w:fill="F6F8F7" w:color="auto" w:val="clear"/>
             <w:tcMar>
               <w:top w:type="dxa" w:w="80"/>
               <w:left w:type="dxa" w:w="120"/>
@@ -5716,7 +5835,6 @@
               <w:bottom w:val="single" w:color="D0D7D3" w:sz="4"/>
               <w:right w:val="single" w:color="D0D7D3" w:sz="4"/>
             </w:tcBorders>
-            <w:shd w:fill="F6F8F7" w:color="auto" w:val="clear"/>
             <w:tcMar>
               <w:top w:type="dxa" w:w="80"/>
               <w:left w:type="dxa" w:w="120"/>
@@ -5747,6 +5865,7 @@
               <w:bottom w:val="single" w:color="D0D7D3" w:sz="4"/>
               <w:right w:val="single" w:color="D0D7D3" w:sz="4"/>
             </w:tcBorders>
+            <w:shd w:fill="F6F8F7" w:color="auto" w:val="clear"/>
             <w:tcMar>
               <w:top w:type="dxa" w:w="80"/>
               <w:left w:type="dxa" w:w="120"/>
@@ -5775,6 +5894,7 @@
               <w:bottom w:val="single" w:color="D0D7D3" w:sz="4"/>
               <w:right w:val="single" w:color="D0D7D3" w:sz="4"/>
             </w:tcBorders>
+            <w:shd w:fill="F6F8F7" w:color="auto" w:val="clear"/>
             <w:tcMar>
               <w:top w:type="dxa" w:w="80"/>
               <w:left w:type="dxa" w:w="120"/>
@@ -5805,7 +5925,6 @@
               <w:bottom w:val="single" w:color="D0D7D3" w:sz="4"/>
               <w:right w:val="single" w:color="D0D7D3" w:sz="4"/>
             </w:tcBorders>
-            <w:shd w:fill="F6F8F7" w:color="auto" w:val="clear"/>
             <w:tcMar>
               <w:top w:type="dxa" w:w="80"/>
               <w:left w:type="dxa" w:w="120"/>
@@ -5834,7 +5953,6 @@
               <w:bottom w:val="single" w:color="D0D7D3" w:sz="4"/>
               <w:right w:val="single" w:color="D0D7D3" w:sz="4"/>
             </w:tcBorders>
-            <w:shd w:fill="F6F8F7" w:color="auto" w:val="clear"/>
             <w:tcMar>
               <w:top w:type="dxa" w:w="80"/>
               <w:left w:type="dxa" w:w="120"/>
@@ -5865,6 +5983,7 @@
               <w:bottom w:val="single" w:color="D0D7D3" w:sz="4"/>
               <w:right w:val="single" w:color="D0D7D3" w:sz="4"/>
             </w:tcBorders>
+            <w:shd w:fill="F6F8F7" w:color="auto" w:val="clear"/>
             <w:tcMar>
               <w:top w:type="dxa" w:w="80"/>
               <w:left w:type="dxa" w:w="120"/>
@@ -5893,6 +6012,7 @@
               <w:bottom w:val="single" w:color="D0D7D3" w:sz="4"/>
               <w:right w:val="single" w:color="D0D7D3" w:sz="4"/>
             </w:tcBorders>
+            <w:shd w:fill="F6F8F7" w:color="auto" w:val="clear"/>
             <w:tcMar>
               <w:top w:type="dxa" w:w="80"/>
               <w:left w:type="dxa" w:w="120"/>
@@ -5923,7 +6043,6 @@
               <w:bottom w:val="single" w:color="D0D7D3" w:sz="4"/>
               <w:right w:val="single" w:color="D0D7D3" w:sz="4"/>
             </w:tcBorders>
-            <w:shd w:fill="F6F8F7" w:color="auto" w:val="clear"/>
             <w:tcMar>
               <w:top w:type="dxa" w:w="80"/>
               <w:left w:type="dxa" w:w="120"/>
@@ -5952,7 +6071,6 @@
               <w:bottom w:val="single" w:color="D0D7D3" w:sz="4"/>
               <w:right w:val="single" w:color="D0D7D3" w:sz="4"/>
             </w:tcBorders>
-            <w:shd w:fill="F6F8F7" w:color="auto" w:val="clear"/>
             <w:tcMar>
               <w:top w:type="dxa" w:w="80"/>
               <w:left w:type="dxa" w:w="120"/>
@@ -5983,6 +6101,7 @@
               <w:bottom w:val="single" w:color="D0D7D3" w:sz="4"/>
               <w:right w:val="single" w:color="D0D7D3" w:sz="4"/>
             </w:tcBorders>
+            <w:shd w:fill="F6F8F7" w:color="auto" w:val="clear"/>
             <w:tcMar>
               <w:top w:type="dxa" w:w="80"/>
               <w:left w:type="dxa" w:w="120"/>
@@ -6011,6 +6130,7 @@
               <w:bottom w:val="single" w:color="D0D7D3" w:sz="4"/>
               <w:right w:val="single" w:color="D0D7D3" w:sz="4"/>
             </w:tcBorders>
+            <w:shd w:fill="F6F8F7" w:color="auto" w:val="clear"/>
             <w:tcMar>
               <w:top w:type="dxa" w:w="80"/>
               <w:left w:type="dxa" w:w="120"/>
@@ -6041,7 +6161,6 @@
               <w:bottom w:val="single" w:color="D0D7D3" w:sz="4"/>
               <w:right w:val="single" w:color="D0D7D3" w:sz="4"/>
             </w:tcBorders>
-            <w:shd w:fill="F6F8F7" w:color="auto" w:val="clear"/>
             <w:tcMar>
               <w:top w:type="dxa" w:w="80"/>
               <w:left w:type="dxa" w:w="120"/>
@@ -6070,7 +6189,6 @@
               <w:bottom w:val="single" w:color="D0D7D3" w:sz="4"/>
               <w:right w:val="single" w:color="D0D7D3" w:sz="4"/>
             </w:tcBorders>
-            <w:shd w:fill="F6F8F7" w:color="auto" w:val="clear"/>
             <w:tcMar>
               <w:top w:type="dxa" w:w="80"/>
               <w:left w:type="dxa" w:w="120"/>
@@ -6101,6 +6219,7 @@
               <w:bottom w:val="single" w:color="D0D7D3" w:sz="4"/>
               <w:right w:val="single" w:color="D0D7D3" w:sz="4"/>
             </w:tcBorders>
+            <w:shd w:fill="F6F8F7" w:color="auto" w:val="clear"/>
             <w:tcMar>
               <w:top w:type="dxa" w:w="80"/>
               <w:left w:type="dxa" w:w="120"/>
@@ -6129,6 +6248,7 @@
               <w:bottom w:val="single" w:color="D0D7D3" w:sz="4"/>
               <w:right w:val="single" w:color="D0D7D3" w:sz="4"/>
             </w:tcBorders>
+            <w:shd w:fill="F6F8F7" w:color="auto" w:val="clear"/>
             <w:tcMar>
               <w:top w:type="dxa" w:w="80"/>
               <w:left w:type="dxa" w:w="120"/>
@@ -6159,7 +6279,6 @@
               <w:bottom w:val="single" w:color="D0D7D3" w:sz="4"/>
               <w:right w:val="single" w:color="D0D7D3" w:sz="4"/>
             </w:tcBorders>
-            <w:shd w:fill="F6F8F7" w:color="auto" w:val="clear"/>
             <w:tcMar>
               <w:top w:type="dxa" w:w="80"/>
               <w:left w:type="dxa" w:w="120"/>
@@ -6188,7 +6307,6 @@
               <w:bottom w:val="single" w:color="D0D7D3" w:sz="4"/>
               <w:right w:val="single" w:color="D0D7D3" w:sz="4"/>
             </w:tcBorders>
-            <w:shd w:fill="F6F8F7" w:color="auto" w:val="clear"/>
             <w:tcMar>
               <w:top w:type="dxa" w:w="80"/>
               <w:left w:type="dxa" w:w="120"/>
@@ -6219,6 +6337,7 @@
               <w:bottom w:val="single" w:color="D0D7D3" w:sz="4"/>
               <w:right w:val="single" w:color="D0D7D3" w:sz="4"/>
             </w:tcBorders>
+            <w:shd w:fill="F6F8F7" w:color="auto" w:val="clear"/>
             <w:tcMar>
               <w:top w:type="dxa" w:w="80"/>
               <w:left w:type="dxa" w:w="120"/>
@@ -6247,6 +6366,7 @@
               <w:bottom w:val="single" w:color="D0D7D3" w:sz="4"/>
               <w:right w:val="single" w:color="D0D7D3" w:sz="4"/>
             </w:tcBorders>
+            <w:shd w:fill="F6F8F7" w:color="auto" w:val="clear"/>
             <w:tcMar>
               <w:top w:type="dxa" w:w="80"/>
               <w:left w:type="dxa" w:w="120"/>
@@ -6277,7 +6397,6 @@
               <w:bottom w:val="single" w:color="D0D7D3" w:sz="4"/>
               <w:right w:val="single" w:color="D0D7D3" w:sz="4"/>
             </w:tcBorders>
-            <w:shd w:fill="F6F8F7" w:color="auto" w:val="clear"/>
             <w:tcMar>
               <w:top w:type="dxa" w:w="80"/>
               <w:left w:type="dxa" w:w="120"/>
@@ -6306,7 +6425,6 @@
               <w:bottom w:val="single" w:color="D0D7D3" w:sz="4"/>
               <w:right w:val="single" w:color="D0D7D3" w:sz="4"/>
             </w:tcBorders>
-            <w:shd w:fill="F6F8F7" w:color="auto" w:val="clear"/>
             <w:tcMar>
               <w:top w:type="dxa" w:w="80"/>
               <w:left w:type="dxa" w:w="120"/>
@@ -6337,6 +6455,7 @@
               <w:bottom w:val="single" w:color="D0D7D3" w:sz="4"/>
               <w:right w:val="single" w:color="D0D7D3" w:sz="4"/>
             </w:tcBorders>
+            <w:shd w:fill="F6F8F7" w:color="auto" w:val="clear"/>
             <w:tcMar>
               <w:top w:type="dxa" w:w="80"/>
               <w:left w:type="dxa" w:w="120"/>
@@ -6365,6 +6484,7 @@
               <w:bottom w:val="single" w:color="D0D7D3" w:sz="4"/>
               <w:right w:val="single" w:color="D0D7D3" w:sz="4"/>
             </w:tcBorders>
+            <w:shd w:fill="F6F8F7" w:color="auto" w:val="clear"/>
             <w:tcMar>
               <w:top w:type="dxa" w:w="80"/>
               <w:left w:type="dxa" w:w="120"/>
@@ -6395,7 +6515,6 @@
               <w:bottom w:val="single" w:color="D0D7D3" w:sz="4"/>
               <w:right w:val="single" w:color="D0D7D3" w:sz="4"/>
             </w:tcBorders>
-            <w:shd w:fill="F6F8F7" w:color="auto" w:val="clear"/>
             <w:tcMar>
               <w:top w:type="dxa" w:w="80"/>
               <w:left w:type="dxa" w:w="120"/>
@@ -6424,7 +6543,6 @@
               <w:bottom w:val="single" w:color="D0D7D3" w:sz="4"/>
               <w:right w:val="single" w:color="D0D7D3" w:sz="4"/>
             </w:tcBorders>
-            <w:shd w:fill="F6F8F7" w:color="auto" w:val="clear"/>
             <w:tcMar>
               <w:top w:type="dxa" w:w="80"/>
               <w:left w:type="dxa" w:w="120"/>
@@ -6455,6 +6573,7 @@
               <w:bottom w:val="single" w:color="D0D7D3" w:sz="4"/>
               <w:right w:val="single" w:color="D0D7D3" w:sz="4"/>
             </w:tcBorders>
+            <w:shd w:fill="F6F8F7" w:color="auto" w:val="clear"/>
             <w:tcMar>
               <w:top w:type="dxa" w:w="80"/>
               <w:left w:type="dxa" w:w="120"/>
@@ -6483,6 +6602,7 @@
               <w:bottom w:val="single" w:color="D0D7D3" w:sz="4"/>
               <w:right w:val="single" w:color="D0D7D3" w:sz="4"/>
             </w:tcBorders>
+            <w:shd w:fill="F6F8F7" w:color="auto" w:val="clear"/>
             <w:tcMar>
               <w:top w:type="dxa" w:w="80"/>
               <w:left w:type="dxa" w:w="120"/>

</xml_diff>

<commit_message>
Trends: the platform month by month for the WardPay team
The platform overview now opens with 12 months of bars, with tabs for your
subscription income, money parents paid schools through WardPay, and schools
joined less schools suspended. GET /platform/trends serves up to 36 months in
four grouped queries; empty months are zeros.
</commit_message>
<xml_diff>
--- a/docs/product/WardPay - what it does.docx
+++ b/docs/product/WardPay - what it does.docx
@@ -3698,7 +3698,7 @@
                 <w:sz w:val="20"/>
                 <w:szCs w:val="20"/>
               </w:rPr>
-              <w:t xml:space="preserve">Platform overview: active schools, new sign-ups, pupils, money processed, subscription income owed</w:t>
+              <w:t xml:space="preserve">Platform overview: active schools, new sign-ups, pupils, money processed, subscription income owed, and 12-month charts of income and schools</w:t>
             </w:r>
           </w:p>
         </w:tc>
@@ -4406,6 +4406,65 @@
                 <w:sz w:val="20"/>
                 <w:szCs w:val="20"/>
               </w:rPr>
+              <w:t xml:space="preserve">23 Oct 2026</w:t>
+            </w:r>
+          </w:p>
+        </w:tc>
+        <w:tc>
+          <w:tcPr>
+            <w:tcW w:type="dxa" w:w="7838"/>
+            <w:tcBorders>
+              <w:top w:val="single" w:color="D0D7D3" w:sz="4"/>
+              <w:left w:val="single" w:color="D0D7D3" w:sz="4"/>
+              <w:bottom w:val="single" w:color="D0D7D3" w:sz="4"/>
+              <w:right w:val="single" w:color="D0D7D3" w:sz="4"/>
+            </w:tcBorders>
+            <w:tcMar>
+              <w:top w:type="dxa" w:w="80"/>
+              <w:left w:type="dxa" w:w="120"/>
+              <w:bottom w:type="dxa" w:w="80"/>
+              <w:right w:type="dxa" w:w="120"/>
+            </w:tcMar>
+          </w:tcPr>
+          <w:p>
+            <w:r>
+              <w:rPr>
+                <w:b w:val="false"/>
+                <w:bCs w:val="false"/>
+                <w:sz w:val="20"/>
+                <w:szCs w:val="20"/>
+              </w:rPr>
+              <w:t xml:space="preserve">Month-by-month charts for the WardPay team: income, money through WardPay, schools joining</w:t>
+            </w:r>
+          </w:p>
+        </w:tc>
+      </w:tr>
+      <w:tr>
+        <w:tc>
+          <w:tcPr>
+            <w:tcW w:type="dxa" w:w="1800"/>
+            <w:tcBorders>
+              <w:top w:val="single" w:color="D0D7D3" w:sz="4"/>
+              <w:left w:val="single" w:color="D0D7D3" w:sz="4"/>
+              <w:bottom w:val="single" w:color="D0D7D3" w:sz="4"/>
+              <w:right w:val="single" w:color="D0D7D3" w:sz="4"/>
+            </w:tcBorders>
+            <w:shd w:fill="F6F8F7" w:color="auto" w:val="clear"/>
+            <w:tcMar>
+              <w:top w:type="dxa" w:w="80"/>
+              <w:left w:type="dxa" w:w="120"/>
+              <w:bottom w:type="dxa" w:w="80"/>
+              <w:right w:type="dxa" w:w="120"/>
+            </w:tcMar>
+          </w:tcPr>
+          <w:p>
+            <w:r>
+              <w:rPr>
+                <w:b w:val="false"/>
+                <w:bCs w:val="false"/>
+                <w:sz w:val="20"/>
+                <w:szCs w:val="20"/>
+              </w:rPr>
               <w:t xml:space="preserve">22 Oct 2026</w:t>
             </w:r>
           </w:p>
@@ -4419,6 +4478,7 @@
               <w:bottom w:val="single" w:color="D0D7D3" w:sz="4"/>
               <w:right w:val="single" w:color="D0D7D3" w:sz="4"/>
             </w:tcBorders>
+            <w:shd w:fill="F6F8F7" w:color="auto" w:val="clear"/>
             <w:tcMar>
               <w:top w:type="dxa" w:w="80"/>
               <w:left w:type="dxa" w:w="120"/>
@@ -4449,7 +4509,6 @@
               <w:bottom w:val="single" w:color="D0D7D3" w:sz="4"/>
               <w:right w:val="single" w:color="D0D7D3" w:sz="4"/>
             </w:tcBorders>
-            <w:shd w:fill="F6F8F7" w:color="auto" w:val="clear"/>
             <w:tcMar>
               <w:top w:type="dxa" w:w="80"/>
               <w:left w:type="dxa" w:w="120"/>
@@ -4478,7 +4537,6 @@
               <w:bottom w:val="single" w:color="D0D7D3" w:sz="4"/>
               <w:right w:val="single" w:color="D0D7D3" w:sz="4"/>
             </w:tcBorders>
-            <w:shd w:fill="F6F8F7" w:color="auto" w:val="clear"/>
             <w:tcMar>
               <w:top w:type="dxa" w:w="80"/>
               <w:left w:type="dxa" w:w="120"/>
@@ -4509,6 +4567,7 @@
               <w:bottom w:val="single" w:color="D0D7D3" w:sz="4"/>
               <w:right w:val="single" w:color="D0D7D3" w:sz="4"/>
             </w:tcBorders>
+            <w:shd w:fill="F6F8F7" w:color="auto" w:val="clear"/>
             <w:tcMar>
               <w:top w:type="dxa" w:w="80"/>
               <w:left w:type="dxa" w:w="120"/>
@@ -4537,6 +4596,7 @@
               <w:bottom w:val="single" w:color="D0D7D3" w:sz="4"/>
               <w:right w:val="single" w:color="D0D7D3" w:sz="4"/>
             </w:tcBorders>
+            <w:shd w:fill="F6F8F7" w:color="auto" w:val="clear"/>
             <w:tcMar>
               <w:top w:type="dxa" w:w="80"/>
               <w:left w:type="dxa" w:w="120"/>
@@ -4567,7 +4627,6 @@
               <w:bottom w:val="single" w:color="D0D7D3" w:sz="4"/>
               <w:right w:val="single" w:color="D0D7D3" w:sz="4"/>
             </w:tcBorders>
-            <w:shd w:fill="F6F8F7" w:color="auto" w:val="clear"/>
             <w:tcMar>
               <w:top w:type="dxa" w:w="80"/>
               <w:left w:type="dxa" w:w="120"/>
@@ -4596,7 +4655,6 @@
               <w:bottom w:val="single" w:color="D0D7D3" w:sz="4"/>
               <w:right w:val="single" w:color="D0D7D3" w:sz="4"/>
             </w:tcBorders>
-            <w:shd w:fill="F6F8F7" w:color="auto" w:val="clear"/>
             <w:tcMar>
               <w:top w:type="dxa" w:w="80"/>
               <w:left w:type="dxa" w:w="120"/>
@@ -4627,6 +4685,7 @@
               <w:bottom w:val="single" w:color="D0D7D3" w:sz="4"/>
               <w:right w:val="single" w:color="D0D7D3" w:sz="4"/>
             </w:tcBorders>
+            <w:shd w:fill="F6F8F7" w:color="auto" w:val="clear"/>
             <w:tcMar>
               <w:top w:type="dxa" w:w="80"/>
               <w:left w:type="dxa" w:w="120"/>
@@ -4655,6 +4714,7 @@
               <w:bottom w:val="single" w:color="D0D7D3" w:sz="4"/>
               <w:right w:val="single" w:color="D0D7D3" w:sz="4"/>
             </w:tcBorders>
+            <w:shd w:fill="F6F8F7" w:color="auto" w:val="clear"/>
             <w:tcMar>
               <w:top w:type="dxa" w:w="80"/>
               <w:left w:type="dxa" w:w="120"/>
@@ -4685,7 +4745,6 @@
               <w:bottom w:val="single" w:color="D0D7D3" w:sz="4"/>
               <w:right w:val="single" w:color="D0D7D3" w:sz="4"/>
             </w:tcBorders>
-            <w:shd w:fill="F6F8F7" w:color="auto" w:val="clear"/>
             <w:tcMar>
               <w:top w:type="dxa" w:w="80"/>
               <w:left w:type="dxa" w:w="120"/>
@@ -4714,7 +4773,6 @@
               <w:bottom w:val="single" w:color="D0D7D3" w:sz="4"/>
               <w:right w:val="single" w:color="D0D7D3" w:sz="4"/>
             </w:tcBorders>
-            <w:shd w:fill="F6F8F7" w:color="auto" w:val="clear"/>
             <w:tcMar>
               <w:top w:type="dxa" w:w="80"/>
               <w:left w:type="dxa" w:w="120"/>
@@ -4745,6 +4803,7 @@
               <w:bottom w:val="single" w:color="D0D7D3" w:sz="4"/>
               <w:right w:val="single" w:color="D0D7D3" w:sz="4"/>
             </w:tcBorders>
+            <w:shd w:fill="F6F8F7" w:color="auto" w:val="clear"/>
             <w:tcMar>
               <w:top w:type="dxa" w:w="80"/>
               <w:left w:type="dxa" w:w="120"/>
@@ -4773,6 +4832,7 @@
               <w:bottom w:val="single" w:color="D0D7D3" w:sz="4"/>
               <w:right w:val="single" w:color="D0D7D3" w:sz="4"/>
             </w:tcBorders>
+            <w:shd w:fill="F6F8F7" w:color="auto" w:val="clear"/>
             <w:tcMar>
               <w:top w:type="dxa" w:w="80"/>
               <w:left w:type="dxa" w:w="120"/>
@@ -4803,7 +4863,6 @@
               <w:bottom w:val="single" w:color="D0D7D3" w:sz="4"/>
               <w:right w:val="single" w:color="D0D7D3" w:sz="4"/>
             </w:tcBorders>
-            <w:shd w:fill="F6F8F7" w:color="auto" w:val="clear"/>
             <w:tcMar>
               <w:top w:type="dxa" w:w="80"/>
               <w:left w:type="dxa" w:w="120"/>
@@ -4832,7 +4891,6 @@
               <w:bottom w:val="single" w:color="D0D7D3" w:sz="4"/>
               <w:right w:val="single" w:color="D0D7D3" w:sz="4"/>
             </w:tcBorders>
-            <w:shd w:fill="F6F8F7" w:color="auto" w:val="clear"/>
             <w:tcMar>
               <w:top w:type="dxa" w:w="80"/>
               <w:left w:type="dxa" w:w="120"/>
@@ -4863,6 +4921,7 @@
               <w:bottom w:val="single" w:color="D0D7D3" w:sz="4"/>
               <w:right w:val="single" w:color="D0D7D3" w:sz="4"/>
             </w:tcBorders>
+            <w:shd w:fill="F6F8F7" w:color="auto" w:val="clear"/>
             <w:tcMar>
               <w:top w:type="dxa" w:w="80"/>
               <w:left w:type="dxa" w:w="120"/>
@@ -4891,6 +4950,7 @@
               <w:bottom w:val="single" w:color="D0D7D3" w:sz="4"/>
               <w:right w:val="single" w:color="D0D7D3" w:sz="4"/>
             </w:tcBorders>
+            <w:shd w:fill="F6F8F7" w:color="auto" w:val="clear"/>
             <w:tcMar>
               <w:top w:type="dxa" w:w="80"/>
               <w:left w:type="dxa" w:w="120"/>
@@ -4921,7 +4981,6 @@
               <w:bottom w:val="single" w:color="D0D7D3" w:sz="4"/>
               <w:right w:val="single" w:color="D0D7D3" w:sz="4"/>
             </w:tcBorders>
-            <w:shd w:fill="F6F8F7" w:color="auto" w:val="clear"/>
             <w:tcMar>
               <w:top w:type="dxa" w:w="80"/>
               <w:left w:type="dxa" w:w="120"/>
@@ -4950,7 +5009,6 @@
               <w:bottom w:val="single" w:color="D0D7D3" w:sz="4"/>
               <w:right w:val="single" w:color="D0D7D3" w:sz="4"/>
             </w:tcBorders>
-            <w:shd w:fill="F6F8F7" w:color="auto" w:val="clear"/>
             <w:tcMar>
               <w:top w:type="dxa" w:w="80"/>
               <w:left w:type="dxa" w:w="120"/>
@@ -4981,6 +5039,7 @@
               <w:bottom w:val="single" w:color="D0D7D3" w:sz="4"/>
               <w:right w:val="single" w:color="D0D7D3" w:sz="4"/>
             </w:tcBorders>
+            <w:shd w:fill="F6F8F7" w:color="auto" w:val="clear"/>
             <w:tcMar>
               <w:top w:type="dxa" w:w="80"/>
               <w:left w:type="dxa" w:w="120"/>
@@ -5009,6 +5068,7 @@
               <w:bottom w:val="single" w:color="D0D7D3" w:sz="4"/>
               <w:right w:val="single" w:color="D0D7D3" w:sz="4"/>
             </w:tcBorders>
+            <w:shd w:fill="F6F8F7" w:color="auto" w:val="clear"/>
             <w:tcMar>
               <w:top w:type="dxa" w:w="80"/>
               <w:left w:type="dxa" w:w="120"/>
@@ -5039,7 +5099,6 @@
               <w:bottom w:val="single" w:color="D0D7D3" w:sz="4"/>
               <w:right w:val="single" w:color="D0D7D3" w:sz="4"/>
             </w:tcBorders>
-            <w:shd w:fill="F6F8F7" w:color="auto" w:val="clear"/>
             <w:tcMar>
               <w:top w:type="dxa" w:w="80"/>
               <w:left w:type="dxa" w:w="120"/>
@@ -5068,7 +5127,6 @@
               <w:bottom w:val="single" w:color="D0D7D3" w:sz="4"/>
               <w:right w:val="single" w:color="D0D7D3" w:sz="4"/>
             </w:tcBorders>
-            <w:shd w:fill="F6F8F7" w:color="auto" w:val="clear"/>
             <w:tcMar>
               <w:top w:type="dxa" w:w="80"/>
               <w:left w:type="dxa" w:w="120"/>
@@ -5099,6 +5157,7 @@
               <w:bottom w:val="single" w:color="D0D7D3" w:sz="4"/>
               <w:right w:val="single" w:color="D0D7D3" w:sz="4"/>
             </w:tcBorders>
+            <w:shd w:fill="F6F8F7" w:color="auto" w:val="clear"/>
             <w:tcMar>
               <w:top w:type="dxa" w:w="80"/>
               <w:left w:type="dxa" w:w="120"/>
@@ -5127,6 +5186,7 @@
               <w:bottom w:val="single" w:color="D0D7D3" w:sz="4"/>
               <w:right w:val="single" w:color="D0D7D3" w:sz="4"/>
             </w:tcBorders>
+            <w:shd w:fill="F6F8F7" w:color="auto" w:val="clear"/>
             <w:tcMar>
               <w:top w:type="dxa" w:w="80"/>
               <w:left w:type="dxa" w:w="120"/>
@@ -5157,7 +5217,6 @@
               <w:bottom w:val="single" w:color="D0D7D3" w:sz="4"/>
               <w:right w:val="single" w:color="D0D7D3" w:sz="4"/>
             </w:tcBorders>
-            <w:shd w:fill="F6F8F7" w:color="auto" w:val="clear"/>
             <w:tcMar>
               <w:top w:type="dxa" w:w="80"/>
               <w:left w:type="dxa" w:w="120"/>
@@ -5186,7 +5245,6 @@
               <w:bottom w:val="single" w:color="D0D7D3" w:sz="4"/>
               <w:right w:val="single" w:color="D0D7D3" w:sz="4"/>
             </w:tcBorders>
-            <w:shd w:fill="F6F8F7" w:color="auto" w:val="clear"/>
             <w:tcMar>
               <w:top w:type="dxa" w:w="80"/>
               <w:left w:type="dxa" w:w="120"/>
@@ -5217,6 +5275,7 @@
               <w:bottom w:val="single" w:color="D0D7D3" w:sz="4"/>
               <w:right w:val="single" w:color="D0D7D3" w:sz="4"/>
             </w:tcBorders>
+            <w:shd w:fill="F6F8F7" w:color="auto" w:val="clear"/>
             <w:tcMar>
               <w:top w:type="dxa" w:w="80"/>
               <w:left w:type="dxa" w:w="120"/>
@@ -5245,6 +5304,7 @@
               <w:bottom w:val="single" w:color="D0D7D3" w:sz="4"/>
               <w:right w:val="single" w:color="D0D7D3" w:sz="4"/>
             </w:tcBorders>
+            <w:shd w:fill="F6F8F7" w:color="auto" w:val="clear"/>
             <w:tcMar>
               <w:top w:type="dxa" w:w="80"/>
               <w:left w:type="dxa" w:w="120"/>
@@ -5275,7 +5335,6 @@
               <w:bottom w:val="single" w:color="D0D7D3" w:sz="4"/>
               <w:right w:val="single" w:color="D0D7D3" w:sz="4"/>
             </w:tcBorders>
-            <w:shd w:fill="F6F8F7" w:color="auto" w:val="clear"/>
             <w:tcMar>
               <w:top w:type="dxa" w:w="80"/>
               <w:left w:type="dxa" w:w="120"/>
@@ -5304,7 +5363,6 @@
               <w:bottom w:val="single" w:color="D0D7D3" w:sz="4"/>
               <w:right w:val="single" w:color="D0D7D3" w:sz="4"/>
             </w:tcBorders>
-            <w:shd w:fill="F6F8F7" w:color="auto" w:val="clear"/>
             <w:tcMar>
               <w:top w:type="dxa" w:w="80"/>
               <w:left w:type="dxa" w:w="120"/>
@@ -5335,6 +5393,7 @@
               <w:bottom w:val="single" w:color="D0D7D3" w:sz="4"/>
               <w:right w:val="single" w:color="D0D7D3" w:sz="4"/>
             </w:tcBorders>
+            <w:shd w:fill="F6F8F7" w:color="auto" w:val="clear"/>
             <w:tcMar>
               <w:top w:type="dxa" w:w="80"/>
               <w:left w:type="dxa" w:w="120"/>
@@ -5363,6 +5422,7 @@
               <w:bottom w:val="single" w:color="D0D7D3" w:sz="4"/>
               <w:right w:val="single" w:color="D0D7D3" w:sz="4"/>
             </w:tcBorders>
+            <w:shd w:fill="F6F8F7" w:color="auto" w:val="clear"/>
             <w:tcMar>
               <w:top w:type="dxa" w:w="80"/>
               <w:left w:type="dxa" w:w="120"/>
@@ -5393,7 +5453,6 @@
               <w:bottom w:val="single" w:color="D0D7D3" w:sz="4"/>
               <w:right w:val="single" w:color="D0D7D3" w:sz="4"/>
             </w:tcBorders>
-            <w:shd w:fill="F6F8F7" w:color="auto" w:val="clear"/>
             <w:tcMar>
               <w:top w:type="dxa" w:w="80"/>
               <w:left w:type="dxa" w:w="120"/>
@@ -5422,7 +5481,6 @@
               <w:bottom w:val="single" w:color="D0D7D3" w:sz="4"/>
               <w:right w:val="single" w:color="D0D7D3" w:sz="4"/>
             </w:tcBorders>
-            <w:shd w:fill="F6F8F7" w:color="auto" w:val="clear"/>
             <w:tcMar>
               <w:top w:type="dxa" w:w="80"/>
               <w:left w:type="dxa" w:w="120"/>
@@ -5453,6 +5511,7 @@
               <w:bottom w:val="single" w:color="D0D7D3" w:sz="4"/>
               <w:right w:val="single" w:color="D0D7D3" w:sz="4"/>
             </w:tcBorders>
+            <w:shd w:fill="F6F8F7" w:color="auto" w:val="clear"/>
             <w:tcMar>
               <w:top w:type="dxa" w:w="80"/>
               <w:left w:type="dxa" w:w="120"/>
@@ -5481,6 +5540,7 @@
               <w:bottom w:val="single" w:color="D0D7D3" w:sz="4"/>
               <w:right w:val="single" w:color="D0D7D3" w:sz="4"/>
             </w:tcBorders>
+            <w:shd w:fill="F6F8F7" w:color="auto" w:val="clear"/>
             <w:tcMar>
               <w:top w:type="dxa" w:w="80"/>
               <w:left w:type="dxa" w:w="120"/>
@@ -5511,7 +5571,6 @@
               <w:bottom w:val="single" w:color="D0D7D3" w:sz="4"/>
               <w:right w:val="single" w:color="D0D7D3" w:sz="4"/>
             </w:tcBorders>
-            <w:shd w:fill="F6F8F7" w:color="auto" w:val="clear"/>
             <w:tcMar>
               <w:top w:type="dxa" w:w="80"/>
               <w:left w:type="dxa" w:w="120"/>
@@ -5540,7 +5599,6 @@
               <w:bottom w:val="single" w:color="D0D7D3" w:sz="4"/>
               <w:right w:val="single" w:color="D0D7D3" w:sz="4"/>
             </w:tcBorders>
-            <w:shd w:fill="F6F8F7" w:color="auto" w:val="clear"/>
             <w:tcMar>
               <w:top w:type="dxa" w:w="80"/>
               <w:left w:type="dxa" w:w="120"/>
@@ -5571,6 +5629,7 @@
               <w:bottom w:val="single" w:color="D0D7D3" w:sz="4"/>
               <w:right w:val="single" w:color="D0D7D3" w:sz="4"/>
             </w:tcBorders>
+            <w:shd w:fill="F6F8F7" w:color="auto" w:val="clear"/>
             <w:tcMar>
               <w:top w:type="dxa" w:w="80"/>
               <w:left w:type="dxa" w:w="120"/>
@@ -5599,6 +5658,7 @@
               <w:bottom w:val="single" w:color="D0D7D3" w:sz="4"/>
               <w:right w:val="single" w:color="D0D7D3" w:sz="4"/>
             </w:tcBorders>
+            <w:shd w:fill="F6F8F7" w:color="auto" w:val="clear"/>
             <w:tcMar>
               <w:top w:type="dxa" w:w="80"/>
               <w:left w:type="dxa" w:w="120"/>
@@ -5629,7 +5689,6 @@
               <w:bottom w:val="single" w:color="D0D7D3" w:sz="4"/>
               <w:right w:val="single" w:color="D0D7D3" w:sz="4"/>
             </w:tcBorders>
-            <w:shd w:fill="F6F8F7" w:color="auto" w:val="clear"/>
             <w:tcMar>
               <w:top w:type="dxa" w:w="80"/>
               <w:left w:type="dxa" w:w="120"/>
@@ -5658,7 +5717,6 @@
               <w:bottom w:val="single" w:color="D0D7D3" w:sz="4"/>
               <w:right w:val="single" w:color="D0D7D3" w:sz="4"/>
             </w:tcBorders>
-            <w:shd w:fill="F6F8F7" w:color="auto" w:val="clear"/>
             <w:tcMar>
               <w:top w:type="dxa" w:w="80"/>
               <w:left w:type="dxa" w:w="120"/>
@@ -5689,6 +5747,7 @@
               <w:bottom w:val="single" w:color="D0D7D3" w:sz="4"/>
               <w:right w:val="single" w:color="D0D7D3" w:sz="4"/>
             </w:tcBorders>
+            <w:shd w:fill="F6F8F7" w:color="auto" w:val="clear"/>
             <w:tcMar>
               <w:top w:type="dxa" w:w="80"/>
               <w:left w:type="dxa" w:w="120"/>
@@ -5717,6 +5776,7 @@
               <w:bottom w:val="single" w:color="D0D7D3" w:sz="4"/>
               <w:right w:val="single" w:color="D0D7D3" w:sz="4"/>
             </w:tcBorders>
+            <w:shd w:fill="F6F8F7" w:color="auto" w:val="clear"/>
             <w:tcMar>
               <w:top w:type="dxa" w:w="80"/>
               <w:left w:type="dxa" w:w="120"/>
@@ -5747,7 +5807,6 @@
               <w:bottom w:val="single" w:color="D0D7D3" w:sz="4"/>
               <w:right w:val="single" w:color="D0D7D3" w:sz="4"/>
             </w:tcBorders>
-            <w:shd w:fill="F6F8F7" w:color="auto" w:val="clear"/>
             <w:tcMar>
               <w:top w:type="dxa" w:w="80"/>
               <w:left w:type="dxa" w:w="120"/>
@@ -5776,7 +5835,6 @@
               <w:bottom w:val="single" w:color="D0D7D3" w:sz="4"/>
               <w:right w:val="single" w:color="D0D7D3" w:sz="4"/>
             </w:tcBorders>
-            <w:shd w:fill="F6F8F7" w:color="auto" w:val="clear"/>
             <w:tcMar>
               <w:top w:type="dxa" w:w="80"/>
               <w:left w:type="dxa" w:w="120"/>
@@ -5807,6 +5865,7 @@
               <w:bottom w:val="single" w:color="D0D7D3" w:sz="4"/>
               <w:right w:val="single" w:color="D0D7D3" w:sz="4"/>
             </w:tcBorders>
+            <w:shd w:fill="F6F8F7" w:color="auto" w:val="clear"/>
             <w:tcMar>
               <w:top w:type="dxa" w:w="80"/>
               <w:left w:type="dxa" w:w="120"/>
@@ -5835,6 +5894,7 @@
               <w:bottom w:val="single" w:color="D0D7D3" w:sz="4"/>
               <w:right w:val="single" w:color="D0D7D3" w:sz="4"/>
             </w:tcBorders>
+            <w:shd w:fill="F6F8F7" w:color="auto" w:val="clear"/>
             <w:tcMar>
               <w:top w:type="dxa" w:w="80"/>
               <w:left w:type="dxa" w:w="120"/>
@@ -5865,7 +5925,6 @@
               <w:bottom w:val="single" w:color="D0D7D3" w:sz="4"/>
               <w:right w:val="single" w:color="D0D7D3" w:sz="4"/>
             </w:tcBorders>
-            <w:shd w:fill="F6F8F7" w:color="auto" w:val="clear"/>
             <w:tcMar>
               <w:top w:type="dxa" w:w="80"/>
               <w:left w:type="dxa" w:w="120"/>
@@ -5894,7 +5953,6 @@
               <w:bottom w:val="single" w:color="D0D7D3" w:sz="4"/>
               <w:right w:val="single" w:color="D0D7D3" w:sz="4"/>
             </w:tcBorders>
-            <w:shd w:fill="F6F8F7" w:color="auto" w:val="clear"/>
             <w:tcMar>
               <w:top w:type="dxa" w:w="80"/>
               <w:left w:type="dxa" w:w="120"/>
@@ -5925,6 +5983,7 @@
               <w:bottom w:val="single" w:color="D0D7D3" w:sz="4"/>
               <w:right w:val="single" w:color="D0D7D3" w:sz="4"/>
             </w:tcBorders>
+            <w:shd w:fill="F6F8F7" w:color="auto" w:val="clear"/>
             <w:tcMar>
               <w:top w:type="dxa" w:w="80"/>
               <w:left w:type="dxa" w:w="120"/>
@@ -5953,6 +6012,7 @@
               <w:bottom w:val="single" w:color="D0D7D3" w:sz="4"/>
               <w:right w:val="single" w:color="D0D7D3" w:sz="4"/>
             </w:tcBorders>
+            <w:shd w:fill="F6F8F7" w:color="auto" w:val="clear"/>
             <w:tcMar>
               <w:top w:type="dxa" w:w="80"/>
               <w:left w:type="dxa" w:w="120"/>
@@ -5983,7 +6043,6 @@
               <w:bottom w:val="single" w:color="D0D7D3" w:sz="4"/>
               <w:right w:val="single" w:color="D0D7D3" w:sz="4"/>
             </w:tcBorders>
-            <w:shd w:fill="F6F8F7" w:color="auto" w:val="clear"/>
             <w:tcMar>
               <w:top w:type="dxa" w:w="80"/>
               <w:left w:type="dxa" w:w="120"/>
@@ -6012,7 +6071,6 @@
               <w:bottom w:val="single" w:color="D0D7D3" w:sz="4"/>
               <w:right w:val="single" w:color="D0D7D3" w:sz="4"/>
             </w:tcBorders>
-            <w:shd w:fill="F6F8F7" w:color="auto" w:val="clear"/>
             <w:tcMar>
               <w:top w:type="dxa" w:w="80"/>
               <w:left w:type="dxa" w:w="120"/>
@@ -6043,6 +6101,7 @@
               <w:bottom w:val="single" w:color="D0D7D3" w:sz="4"/>
               <w:right w:val="single" w:color="D0D7D3" w:sz="4"/>
             </w:tcBorders>
+            <w:shd w:fill="F6F8F7" w:color="auto" w:val="clear"/>
             <w:tcMar>
               <w:top w:type="dxa" w:w="80"/>
               <w:left w:type="dxa" w:w="120"/>
@@ -6071,6 +6130,7 @@
               <w:bottom w:val="single" w:color="D0D7D3" w:sz="4"/>
               <w:right w:val="single" w:color="D0D7D3" w:sz="4"/>
             </w:tcBorders>
+            <w:shd w:fill="F6F8F7" w:color="auto" w:val="clear"/>
             <w:tcMar>
               <w:top w:type="dxa" w:w="80"/>
               <w:left w:type="dxa" w:w="120"/>
@@ -6101,7 +6161,6 @@
               <w:bottom w:val="single" w:color="D0D7D3" w:sz="4"/>
               <w:right w:val="single" w:color="D0D7D3" w:sz="4"/>
             </w:tcBorders>
-            <w:shd w:fill="F6F8F7" w:color="auto" w:val="clear"/>
             <w:tcMar>
               <w:top w:type="dxa" w:w="80"/>
               <w:left w:type="dxa" w:w="120"/>
@@ -6130,7 +6189,6 @@
               <w:bottom w:val="single" w:color="D0D7D3" w:sz="4"/>
               <w:right w:val="single" w:color="D0D7D3" w:sz="4"/>
             </w:tcBorders>
-            <w:shd w:fill="F6F8F7" w:color="auto" w:val="clear"/>
             <w:tcMar>
               <w:top w:type="dxa" w:w="80"/>
               <w:left w:type="dxa" w:w="120"/>
@@ -6161,6 +6219,7 @@
               <w:bottom w:val="single" w:color="D0D7D3" w:sz="4"/>
               <w:right w:val="single" w:color="D0D7D3" w:sz="4"/>
             </w:tcBorders>
+            <w:shd w:fill="F6F8F7" w:color="auto" w:val="clear"/>
             <w:tcMar>
               <w:top w:type="dxa" w:w="80"/>
               <w:left w:type="dxa" w:w="120"/>
@@ -6189,6 +6248,7 @@
               <w:bottom w:val="single" w:color="D0D7D3" w:sz="4"/>
               <w:right w:val="single" w:color="D0D7D3" w:sz="4"/>
             </w:tcBorders>
+            <w:shd w:fill="F6F8F7" w:color="auto" w:val="clear"/>
             <w:tcMar>
               <w:top w:type="dxa" w:w="80"/>
               <w:left w:type="dxa" w:w="120"/>
@@ -6219,7 +6279,6 @@
               <w:bottom w:val="single" w:color="D0D7D3" w:sz="4"/>
               <w:right w:val="single" w:color="D0D7D3" w:sz="4"/>
             </w:tcBorders>
-            <w:shd w:fill="F6F8F7" w:color="auto" w:val="clear"/>
             <w:tcMar>
               <w:top w:type="dxa" w:w="80"/>
               <w:left w:type="dxa" w:w="120"/>
@@ -6248,7 +6307,6 @@
               <w:bottom w:val="single" w:color="D0D7D3" w:sz="4"/>
               <w:right w:val="single" w:color="D0D7D3" w:sz="4"/>
             </w:tcBorders>
-            <w:shd w:fill="F6F8F7" w:color="auto" w:val="clear"/>
             <w:tcMar>
               <w:top w:type="dxa" w:w="80"/>
               <w:left w:type="dxa" w:w="120"/>
@@ -6279,6 +6337,7 @@
               <w:bottom w:val="single" w:color="D0D7D3" w:sz="4"/>
               <w:right w:val="single" w:color="D0D7D3" w:sz="4"/>
             </w:tcBorders>
+            <w:shd w:fill="F6F8F7" w:color="auto" w:val="clear"/>
             <w:tcMar>
               <w:top w:type="dxa" w:w="80"/>
               <w:left w:type="dxa" w:w="120"/>
@@ -6307,6 +6366,7 @@
               <w:bottom w:val="single" w:color="D0D7D3" w:sz="4"/>
               <w:right w:val="single" w:color="D0D7D3" w:sz="4"/>
             </w:tcBorders>
+            <w:shd w:fill="F6F8F7" w:color="auto" w:val="clear"/>
             <w:tcMar>
               <w:top w:type="dxa" w:w="80"/>
               <w:left w:type="dxa" w:w="120"/>
@@ -6337,7 +6397,6 @@
               <w:bottom w:val="single" w:color="D0D7D3" w:sz="4"/>
               <w:right w:val="single" w:color="D0D7D3" w:sz="4"/>
             </w:tcBorders>
-            <w:shd w:fill="F6F8F7" w:color="auto" w:val="clear"/>
             <w:tcMar>
               <w:top w:type="dxa" w:w="80"/>
               <w:left w:type="dxa" w:w="120"/>
@@ -6366,7 +6425,6 @@
               <w:bottom w:val="single" w:color="D0D7D3" w:sz="4"/>
               <w:right w:val="single" w:color="D0D7D3" w:sz="4"/>
             </w:tcBorders>
-            <w:shd w:fill="F6F8F7" w:color="auto" w:val="clear"/>
             <w:tcMar>
               <w:top w:type="dxa" w:w="80"/>
               <w:left w:type="dxa" w:w="120"/>
@@ -6397,6 +6455,7 @@
               <w:bottom w:val="single" w:color="D0D7D3" w:sz="4"/>
               <w:right w:val="single" w:color="D0D7D3" w:sz="4"/>
             </w:tcBorders>
+            <w:shd w:fill="F6F8F7" w:color="auto" w:val="clear"/>
             <w:tcMar>
               <w:top w:type="dxa" w:w="80"/>
               <w:left w:type="dxa" w:w="120"/>
@@ -6425,6 +6484,7 @@
               <w:bottom w:val="single" w:color="D0D7D3" w:sz="4"/>
               <w:right w:val="single" w:color="D0D7D3" w:sz="4"/>
             </w:tcBorders>
+            <w:shd w:fill="F6F8F7" w:color="auto" w:val="clear"/>
             <w:tcMar>
               <w:top w:type="dxa" w:w="80"/>
               <w:left w:type="dxa" w:w="120"/>
@@ -6455,7 +6515,6 @@
               <w:bottom w:val="single" w:color="D0D7D3" w:sz="4"/>
               <w:right w:val="single" w:color="D0D7D3" w:sz="4"/>
             </w:tcBorders>
-            <w:shd w:fill="F6F8F7" w:color="auto" w:val="clear"/>
             <w:tcMar>
               <w:top w:type="dxa" w:w="80"/>
               <w:left w:type="dxa" w:w="120"/>
@@ -6484,7 +6543,6 @@
               <w:bottom w:val="single" w:color="D0D7D3" w:sz="4"/>
               <w:right w:val="single" w:color="D0D7D3" w:sz="4"/>
             </w:tcBorders>
-            <w:shd w:fill="F6F8F7" w:color="auto" w:val="clear"/>
             <w:tcMar>
               <w:top w:type="dxa" w:w="80"/>
               <w:left w:type="dxa" w:w="120"/>
@@ -6515,6 +6573,7 @@
               <w:bottom w:val="single" w:color="D0D7D3" w:sz="4"/>
               <w:right w:val="single" w:color="D0D7D3" w:sz="4"/>
             </w:tcBorders>
+            <w:shd w:fill="F6F8F7" w:color="auto" w:val="clear"/>
             <w:tcMar>
               <w:top w:type="dxa" w:w="80"/>
               <w:left w:type="dxa" w:w="120"/>
@@ -6543,6 +6602,7 @@
               <w:bottom w:val="single" w:color="D0D7D3" w:sz="4"/>
               <w:right w:val="single" w:color="D0D7D3" w:sz="4"/>
             </w:tcBorders>
+            <w:shd w:fill="F6F8F7" w:color="auto" w:val="clear"/>
             <w:tcMar>
               <w:top w:type="dxa" w:w="80"/>
               <w:left w:type="dxa" w:w="120"/>
@@ -6573,7 +6633,6 @@
               <w:bottom w:val="single" w:color="D0D7D3" w:sz="4"/>
               <w:right w:val="single" w:color="D0D7D3" w:sz="4"/>
             </w:tcBorders>
-            <w:shd w:fill="F6F8F7" w:color="auto" w:val="clear"/>
             <w:tcMar>
               <w:top w:type="dxa" w:w="80"/>
               <w:left w:type="dxa" w:w="120"/>
@@ -6602,7 +6661,6 @@
               <w:bottom w:val="single" w:color="D0D7D3" w:sz="4"/>
               <w:right w:val="single" w:color="D0D7D3" w:sz="4"/>
             </w:tcBorders>
-            <w:shd w:fill="F6F8F7" w:color="auto" w:val="clear"/>
             <w:tcMar>
               <w:top w:type="dxa" w:w="80"/>
               <w:left w:type="dxa" w:w="120"/>

</xml_diff>

<commit_message>
Platform admins adjust a school's subscription bill
Adjust on a bill gives a discount with a reason shown on the bill (a new
negative discount line, at most what's still owed; the database allows only
discount lines to be negative), with a one-click waiver of the set-up fee, or
moves the due date (not before issue). Both are audited for the school and the
platform.
</commit_message>
<xml_diff>
--- a/docs/product/WardPay - what it does.docx
+++ b/docs/product/WardPay - what it does.docx
@@ -3757,7 +3757,7 @@
                 <w:sz w:val="20"/>
                 <w:szCs w:val="20"/>
               </w:rPr>
-              <w:t xml:space="preserve">Bill every school for the term in one click; schools pay by card from the console, or by transfer that you record; PDF invoices emailed to proprietors</w:t>
+              <w:t xml:space="preserve">Bill every school for the term in one click; schools pay by card from the console, or by transfer that you record; waive the set-up fee, give a discount or more time; PDF invoices emailed to proprietors</w:t>
             </w:r>
           </w:p>
         </w:tc>
@@ -4434,6 +4434,66 @@
                 <w:sz w:val="20"/>
                 <w:szCs w:val="20"/>
               </w:rPr>
+              <w:t xml:space="preserve">WardPay team can discount a school’s bill (e.g. waive the set-up fee) or move its due date</w:t>
+            </w:r>
+          </w:p>
+        </w:tc>
+      </w:tr>
+      <w:tr>
+        <w:tc>
+          <w:tcPr>
+            <w:tcW w:type="dxa" w:w="1800"/>
+            <w:tcBorders>
+              <w:top w:val="single" w:color="D0D7D3" w:sz="4"/>
+              <w:left w:val="single" w:color="D0D7D3" w:sz="4"/>
+              <w:bottom w:val="single" w:color="D0D7D3" w:sz="4"/>
+              <w:right w:val="single" w:color="D0D7D3" w:sz="4"/>
+            </w:tcBorders>
+            <w:shd w:fill="F6F8F7" w:color="auto" w:val="clear"/>
+            <w:tcMar>
+              <w:top w:type="dxa" w:w="80"/>
+              <w:left w:type="dxa" w:w="120"/>
+              <w:bottom w:type="dxa" w:w="80"/>
+              <w:right w:type="dxa" w:w="120"/>
+            </w:tcMar>
+          </w:tcPr>
+          <w:p>
+            <w:r>
+              <w:rPr>
+                <w:b w:val="false"/>
+                <w:bCs w:val="false"/>
+                <w:sz w:val="20"/>
+                <w:szCs w:val="20"/>
+              </w:rPr>
+              <w:t xml:space="preserve">23 Oct 2026</w:t>
+            </w:r>
+          </w:p>
+        </w:tc>
+        <w:tc>
+          <w:tcPr>
+            <w:tcW w:type="dxa" w:w="7838"/>
+            <w:tcBorders>
+              <w:top w:val="single" w:color="D0D7D3" w:sz="4"/>
+              <w:left w:val="single" w:color="D0D7D3" w:sz="4"/>
+              <w:bottom w:val="single" w:color="D0D7D3" w:sz="4"/>
+              <w:right w:val="single" w:color="D0D7D3" w:sz="4"/>
+            </w:tcBorders>
+            <w:shd w:fill="F6F8F7" w:color="auto" w:val="clear"/>
+            <w:tcMar>
+              <w:top w:type="dxa" w:w="80"/>
+              <w:left w:type="dxa" w:w="120"/>
+              <w:bottom w:type="dxa" w:w="80"/>
+              <w:right w:type="dxa" w:w="120"/>
+            </w:tcMar>
+          </w:tcPr>
+          <w:p>
+            <w:r>
+              <w:rPr>
+                <w:b w:val="false"/>
+                <w:bCs w:val="false"/>
+                <w:sz w:val="20"/>
+                <w:szCs w:val="20"/>
+              </w:rPr>
               <w:t xml:space="preserve">Month-by-month charts for the WardPay team: income, money through WardPay, schools joining</w:t>
             </w:r>
           </w:p>
@@ -4449,7 +4509,6 @@
               <w:bottom w:val="single" w:color="D0D7D3" w:sz="4"/>
               <w:right w:val="single" w:color="D0D7D3" w:sz="4"/>
             </w:tcBorders>
-            <w:shd w:fill="F6F8F7" w:color="auto" w:val="clear"/>
             <w:tcMar>
               <w:top w:type="dxa" w:w="80"/>
               <w:left w:type="dxa" w:w="120"/>
@@ -4478,7 +4537,6 @@
               <w:bottom w:val="single" w:color="D0D7D3" w:sz="4"/>
               <w:right w:val="single" w:color="D0D7D3" w:sz="4"/>
             </w:tcBorders>
-            <w:shd w:fill="F6F8F7" w:color="auto" w:val="clear"/>
             <w:tcMar>
               <w:top w:type="dxa" w:w="80"/>
               <w:left w:type="dxa" w:w="120"/>
@@ -4509,6 +4567,7 @@
               <w:bottom w:val="single" w:color="D0D7D3" w:sz="4"/>
               <w:right w:val="single" w:color="D0D7D3" w:sz="4"/>
             </w:tcBorders>
+            <w:shd w:fill="F6F8F7" w:color="auto" w:val="clear"/>
             <w:tcMar>
               <w:top w:type="dxa" w:w="80"/>
               <w:left w:type="dxa" w:w="120"/>
@@ -4537,6 +4596,7 @@
               <w:bottom w:val="single" w:color="D0D7D3" w:sz="4"/>
               <w:right w:val="single" w:color="D0D7D3" w:sz="4"/>
             </w:tcBorders>
+            <w:shd w:fill="F6F8F7" w:color="auto" w:val="clear"/>
             <w:tcMar>
               <w:top w:type="dxa" w:w="80"/>
               <w:left w:type="dxa" w:w="120"/>
@@ -4567,7 +4627,6 @@
               <w:bottom w:val="single" w:color="D0D7D3" w:sz="4"/>
               <w:right w:val="single" w:color="D0D7D3" w:sz="4"/>
             </w:tcBorders>
-            <w:shd w:fill="F6F8F7" w:color="auto" w:val="clear"/>
             <w:tcMar>
               <w:top w:type="dxa" w:w="80"/>
               <w:left w:type="dxa" w:w="120"/>
@@ -4596,7 +4655,6 @@
               <w:bottom w:val="single" w:color="D0D7D3" w:sz="4"/>
               <w:right w:val="single" w:color="D0D7D3" w:sz="4"/>
             </w:tcBorders>
-            <w:shd w:fill="F6F8F7" w:color="auto" w:val="clear"/>
             <w:tcMar>
               <w:top w:type="dxa" w:w="80"/>
               <w:left w:type="dxa" w:w="120"/>
@@ -4627,6 +4685,7 @@
               <w:bottom w:val="single" w:color="D0D7D3" w:sz="4"/>
               <w:right w:val="single" w:color="D0D7D3" w:sz="4"/>
             </w:tcBorders>
+            <w:shd w:fill="F6F8F7" w:color="auto" w:val="clear"/>
             <w:tcMar>
               <w:top w:type="dxa" w:w="80"/>
               <w:left w:type="dxa" w:w="120"/>
@@ -4655,6 +4714,7 @@
               <w:bottom w:val="single" w:color="D0D7D3" w:sz="4"/>
               <w:right w:val="single" w:color="D0D7D3" w:sz="4"/>
             </w:tcBorders>
+            <w:shd w:fill="F6F8F7" w:color="auto" w:val="clear"/>
             <w:tcMar>
               <w:top w:type="dxa" w:w="80"/>
               <w:left w:type="dxa" w:w="120"/>
@@ -4685,7 +4745,6 @@
               <w:bottom w:val="single" w:color="D0D7D3" w:sz="4"/>
               <w:right w:val="single" w:color="D0D7D3" w:sz="4"/>
             </w:tcBorders>
-            <w:shd w:fill="F6F8F7" w:color="auto" w:val="clear"/>
             <w:tcMar>
               <w:top w:type="dxa" w:w="80"/>
               <w:left w:type="dxa" w:w="120"/>
@@ -4714,7 +4773,6 @@
               <w:bottom w:val="single" w:color="D0D7D3" w:sz="4"/>
               <w:right w:val="single" w:color="D0D7D3" w:sz="4"/>
             </w:tcBorders>
-            <w:shd w:fill="F6F8F7" w:color="auto" w:val="clear"/>
             <w:tcMar>
               <w:top w:type="dxa" w:w="80"/>
               <w:left w:type="dxa" w:w="120"/>
@@ -4745,6 +4803,7 @@
               <w:bottom w:val="single" w:color="D0D7D3" w:sz="4"/>
               <w:right w:val="single" w:color="D0D7D3" w:sz="4"/>
             </w:tcBorders>
+            <w:shd w:fill="F6F8F7" w:color="auto" w:val="clear"/>
             <w:tcMar>
               <w:top w:type="dxa" w:w="80"/>
               <w:left w:type="dxa" w:w="120"/>
@@ -4773,6 +4832,7 @@
               <w:bottom w:val="single" w:color="D0D7D3" w:sz="4"/>
               <w:right w:val="single" w:color="D0D7D3" w:sz="4"/>
             </w:tcBorders>
+            <w:shd w:fill="F6F8F7" w:color="auto" w:val="clear"/>
             <w:tcMar>
               <w:top w:type="dxa" w:w="80"/>
               <w:left w:type="dxa" w:w="120"/>
@@ -4803,7 +4863,6 @@
               <w:bottom w:val="single" w:color="D0D7D3" w:sz="4"/>
               <w:right w:val="single" w:color="D0D7D3" w:sz="4"/>
             </w:tcBorders>
-            <w:shd w:fill="F6F8F7" w:color="auto" w:val="clear"/>
             <w:tcMar>
               <w:top w:type="dxa" w:w="80"/>
               <w:left w:type="dxa" w:w="120"/>
@@ -4832,7 +4891,6 @@
               <w:bottom w:val="single" w:color="D0D7D3" w:sz="4"/>
               <w:right w:val="single" w:color="D0D7D3" w:sz="4"/>
             </w:tcBorders>
-            <w:shd w:fill="F6F8F7" w:color="auto" w:val="clear"/>
             <w:tcMar>
               <w:top w:type="dxa" w:w="80"/>
               <w:left w:type="dxa" w:w="120"/>
@@ -4863,6 +4921,7 @@
               <w:bottom w:val="single" w:color="D0D7D3" w:sz="4"/>
               <w:right w:val="single" w:color="D0D7D3" w:sz="4"/>
             </w:tcBorders>
+            <w:shd w:fill="F6F8F7" w:color="auto" w:val="clear"/>
             <w:tcMar>
               <w:top w:type="dxa" w:w="80"/>
               <w:left w:type="dxa" w:w="120"/>
@@ -4891,6 +4950,7 @@
               <w:bottom w:val="single" w:color="D0D7D3" w:sz="4"/>
               <w:right w:val="single" w:color="D0D7D3" w:sz="4"/>
             </w:tcBorders>
+            <w:shd w:fill="F6F8F7" w:color="auto" w:val="clear"/>
             <w:tcMar>
               <w:top w:type="dxa" w:w="80"/>
               <w:left w:type="dxa" w:w="120"/>
@@ -4921,7 +4981,6 @@
               <w:bottom w:val="single" w:color="D0D7D3" w:sz="4"/>
               <w:right w:val="single" w:color="D0D7D3" w:sz="4"/>
             </w:tcBorders>
-            <w:shd w:fill="F6F8F7" w:color="auto" w:val="clear"/>
             <w:tcMar>
               <w:top w:type="dxa" w:w="80"/>
               <w:left w:type="dxa" w:w="120"/>
@@ -4950,7 +5009,6 @@
               <w:bottom w:val="single" w:color="D0D7D3" w:sz="4"/>
               <w:right w:val="single" w:color="D0D7D3" w:sz="4"/>
             </w:tcBorders>
-            <w:shd w:fill="F6F8F7" w:color="auto" w:val="clear"/>
             <w:tcMar>
               <w:top w:type="dxa" w:w="80"/>
               <w:left w:type="dxa" w:w="120"/>
@@ -4981,6 +5039,7 @@
               <w:bottom w:val="single" w:color="D0D7D3" w:sz="4"/>
               <w:right w:val="single" w:color="D0D7D3" w:sz="4"/>
             </w:tcBorders>
+            <w:shd w:fill="F6F8F7" w:color="auto" w:val="clear"/>
             <w:tcMar>
               <w:top w:type="dxa" w:w="80"/>
               <w:left w:type="dxa" w:w="120"/>
@@ -5009,6 +5068,7 @@
               <w:bottom w:val="single" w:color="D0D7D3" w:sz="4"/>
               <w:right w:val="single" w:color="D0D7D3" w:sz="4"/>
             </w:tcBorders>
+            <w:shd w:fill="F6F8F7" w:color="auto" w:val="clear"/>
             <w:tcMar>
               <w:top w:type="dxa" w:w="80"/>
               <w:left w:type="dxa" w:w="120"/>
@@ -5039,7 +5099,6 @@
               <w:bottom w:val="single" w:color="D0D7D3" w:sz="4"/>
               <w:right w:val="single" w:color="D0D7D3" w:sz="4"/>
             </w:tcBorders>
-            <w:shd w:fill="F6F8F7" w:color="auto" w:val="clear"/>
             <w:tcMar>
               <w:top w:type="dxa" w:w="80"/>
               <w:left w:type="dxa" w:w="120"/>
@@ -5068,7 +5127,6 @@
               <w:bottom w:val="single" w:color="D0D7D3" w:sz="4"/>
               <w:right w:val="single" w:color="D0D7D3" w:sz="4"/>
             </w:tcBorders>
-            <w:shd w:fill="F6F8F7" w:color="auto" w:val="clear"/>
             <w:tcMar>
               <w:top w:type="dxa" w:w="80"/>
               <w:left w:type="dxa" w:w="120"/>
@@ -5099,6 +5157,7 @@
               <w:bottom w:val="single" w:color="D0D7D3" w:sz="4"/>
               <w:right w:val="single" w:color="D0D7D3" w:sz="4"/>
             </w:tcBorders>
+            <w:shd w:fill="F6F8F7" w:color="auto" w:val="clear"/>
             <w:tcMar>
               <w:top w:type="dxa" w:w="80"/>
               <w:left w:type="dxa" w:w="120"/>
@@ -5127,6 +5186,7 @@
               <w:bottom w:val="single" w:color="D0D7D3" w:sz="4"/>
               <w:right w:val="single" w:color="D0D7D3" w:sz="4"/>
             </w:tcBorders>
+            <w:shd w:fill="F6F8F7" w:color="auto" w:val="clear"/>
             <w:tcMar>
               <w:top w:type="dxa" w:w="80"/>
               <w:left w:type="dxa" w:w="120"/>
@@ -5157,7 +5217,6 @@
               <w:bottom w:val="single" w:color="D0D7D3" w:sz="4"/>
               <w:right w:val="single" w:color="D0D7D3" w:sz="4"/>
             </w:tcBorders>
-            <w:shd w:fill="F6F8F7" w:color="auto" w:val="clear"/>
             <w:tcMar>
               <w:top w:type="dxa" w:w="80"/>
               <w:left w:type="dxa" w:w="120"/>
@@ -5186,7 +5245,6 @@
               <w:bottom w:val="single" w:color="D0D7D3" w:sz="4"/>
               <w:right w:val="single" w:color="D0D7D3" w:sz="4"/>
             </w:tcBorders>
-            <w:shd w:fill="F6F8F7" w:color="auto" w:val="clear"/>
             <w:tcMar>
               <w:top w:type="dxa" w:w="80"/>
               <w:left w:type="dxa" w:w="120"/>
@@ -5217,6 +5275,7 @@
               <w:bottom w:val="single" w:color="D0D7D3" w:sz="4"/>
               <w:right w:val="single" w:color="D0D7D3" w:sz="4"/>
             </w:tcBorders>
+            <w:shd w:fill="F6F8F7" w:color="auto" w:val="clear"/>
             <w:tcMar>
               <w:top w:type="dxa" w:w="80"/>
               <w:left w:type="dxa" w:w="120"/>
@@ -5245,6 +5304,7 @@
               <w:bottom w:val="single" w:color="D0D7D3" w:sz="4"/>
               <w:right w:val="single" w:color="D0D7D3" w:sz="4"/>
             </w:tcBorders>
+            <w:shd w:fill="F6F8F7" w:color="auto" w:val="clear"/>
             <w:tcMar>
               <w:top w:type="dxa" w:w="80"/>
               <w:left w:type="dxa" w:w="120"/>
@@ -5275,7 +5335,6 @@
               <w:bottom w:val="single" w:color="D0D7D3" w:sz="4"/>
               <w:right w:val="single" w:color="D0D7D3" w:sz="4"/>
             </w:tcBorders>
-            <w:shd w:fill="F6F8F7" w:color="auto" w:val="clear"/>
             <w:tcMar>
               <w:top w:type="dxa" w:w="80"/>
               <w:left w:type="dxa" w:w="120"/>
@@ -5304,7 +5363,6 @@
               <w:bottom w:val="single" w:color="D0D7D3" w:sz="4"/>
               <w:right w:val="single" w:color="D0D7D3" w:sz="4"/>
             </w:tcBorders>
-            <w:shd w:fill="F6F8F7" w:color="auto" w:val="clear"/>
             <w:tcMar>
               <w:top w:type="dxa" w:w="80"/>
               <w:left w:type="dxa" w:w="120"/>
@@ -5335,6 +5393,7 @@
               <w:bottom w:val="single" w:color="D0D7D3" w:sz="4"/>
               <w:right w:val="single" w:color="D0D7D3" w:sz="4"/>
             </w:tcBorders>
+            <w:shd w:fill="F6F8F7" w:color="auto" w:val="clear"/>
             <w:tcMar>
               <w:top w:type="dxa" w:w="80"/>
               <w:left w:type="dxa" w:w="120"/>
@@ -5363,6 +5422,7 @@
               <w:bottom w:val="single" w:color="D0D7D3" w:sz="4"/>
               <w:right w:val="single" w:color="D0D7D3" w:sz="4"/>
             </w:tcBorders>
+            <w:shd w:fill="F6F8F7" w:color="auto" w:val="clear"/>
             <w:tcMar>
               <w:top w:type="dxa" w:w="80"/>
               <w:left w:type="dxa" w:w="120"/>
@@ -5393,7 +5453,6 @@
               <w:bottom w:val="single" w:color="D0D7D3" w:sz="4"/>
               <w:right w:val="single" w:color="D0D7D3" w:sz="4"/>
             </w:tcBorders>
-            <w:shd w:fill="F6F8F7" w:color="auto" w:val="clear"/>
             <w:tcMar>
               <w:top w:type="dxa" w:w="80"/>
               <w:left w:type="dxa" w:w="120"/>
@@ -5422,7 +5481,6 @@
               <w:bottom w:val="single" w:color="D0D7D3" w:sz="4"/>
               <w:right w:val="single" w:color="D0D7D3" w:sz="4"/>
             </w:tcBorders>
-            <w:shd w:fill="F6F8F7" w:color="auto" w:val="clear"/>
             <w:tcMar>
               <w:top w:type="dxa" w:w="80"/>
               <w:left w:type="dxa" w:w="120"/>
@@ -5453,6 +5511,7 @@
               <w:bottom w:val="single" w:color="D0D7D3" w:sz="4"/>
               <w:right w:val="single" w:color="D0D7D3" w:sz="4"/>
             </w:tcBorders>
+            <w:shd w:fill="F6F8F7" w:color="auto" w:val="clear"/>
             <w:tcMar>
               <w:top w:type="dxa" w:w="80"/>
               <w:left w:type="dxa" w:w="120"/>
@@ -5481,6 +5540,7 @@
               <w:bottom w:val="single" w:color="D0D7D3" w:sz="4"/>
               <w:right w:val="single" w:color="D0D7D3" w:sz="4"/>
             </w:tcBorders>
+            <w:shd w:fill="F6F8F7" w:color="auto" w:val="clear"/>
             <w:tcMar>
               <w:top w:type="dxa" w:w="80"/>
               <w:left w:type="dxa" w:w="120"/>
@@ -5511,7 +5571,6 @@
               <w:bottom w:val="single" w:color="D0D7D3" w:sz="4"/>
               <w:right w:val="single" w:color="D0D7D3" w:sz="4"/>
             </w:tcBorders>
-            <w:shd w:fill="F6F8F7" w:color="auto" w:val="clear"/>
             <w:tcMar>
               <w:top w:type="dxa" w:w="80"/>
               <w:left w:type="dxa" w:w="120"/>
@@ -5540,7 +5599,6 @@
               <w:bottom w:val="single" w:color="D0D7D3" w:sz="4"/>
               <w:right w:val="single" w:color="D0D7D3" w:sz="4"/>
             </w:tcBorders>
-            <w:shd w:fill="F6F8F7" w:color="auto" w:val="clear"/>
             <w:tcMar>
               <w:top w:type="dxa" w:w="80"/>
               <w:left w:type="dxa" w:w="120"/>
@@ -5571,6 +5629,7 @@
               <w:bottom w:val="single" w:color="D0D7D3" w:sz="4"/>
               <w:right w:val="single" w:color="D0D7D3" w:sz="4"/>
             </w:tcBorders>
+            <w:shd w:fill="F6F8F7" w:color="auto" w:val="clear"/>
             <w:tcMar>
               <w:top w:type="dxa" w:w="80"/>
               <w:left w:type="dxa" w:w="120"/>
@@ -5599,6 +5658,7 @@
               <w:bottom w:val="single" w:color="D0D7D3" w:sz="4"/>
               <w:right w:val="single" w:color="D0D7D3" w:sz="4"/>
             </w:tcBorders>
+            <w:shd w:fill="F6F8F7" w:color="auto" w:val="clear"/>
             <w:tcMar>
               <w:top w:type="dxa" w:w="80"/>
               <w:left w:type="dxa" w:w="120"/>
@@ -5629,7 +5689,6 @@
               <w:bottom w:val="single" w:color="D0D7D3" w:sz="4"/>
               <w:right w:val="single" w:color="D0D7D3" w:sz="4"/>
             </w:tcBorders>
-            <w:shd w:fill="F6F8F7" w:color="auto" w:val="clear"/>
             <w:tcMar>
               <w:top w:type="dxa" w:w="80"/>
               <w:left w:type="dxa" w:w="120"/>
@@ -5658,7 +5717,6 @@
               <w:bottom w:val="single" w:color="D0D7D3" w:sz="4"/>
               <w:right w:val="single" w:color="D0D7D3" w:sz="4"/>
             </w:tcBorders>
-            <w:shd w:fill="F6F8F7" w:color="auto" w:val="clear"/>
             <w:tcMar>
               <w:top w:type="dxa" w:w="80"/>
               <w:left w:type="dxa" w:w="120"/>
@@ -5689,6 +5747,7 @@
               <w:bottom w:val="single" w:color="D0D7D3" w:sz="4"/>
               <w:right w:val="single" w:color="D0D7D3" w:sz="4"/>
             </w:tcBorders>
+            <w:shd w:fill="F6F8F7" w:color="auto" w:val="clear"/>
             <w:tcMar>
               <w:top w:type="dxa" w:w="80"/>
               <w:left w:type="dxa" w:w="120"/>
@@ -5717,6 +5776,7 @@
               <w:bottom w:val="single" w:color="D0D7D3" w:sz="4"/>
               <w:right w:val="single" w:color="D0D7D3" w:sz="4"/>
             </w:tcBorders>
+            <w:shd w:fill="F6F8F7" w:color="auto" w:val="clear"/>
             <w:tcMar>
               <w:top w:type="dxa" w:w="80"/>
               <w:left w:type="dxa" w:w="120"/>
@@ -5747,7 +5807,6 @@
               <w:bottom w:val="single" w:color="D0D7D3" w:sz="4"/>
               <w:right w:val="single" w:color="D0D7D3" w:sz="4"/>
             </w:tcBorders>
-            <w:shd w:fill="F6F8F7" w:color="auto" w:val="clear"/>
             <w:tcMar>
               <w:top w:type="dxa" w:w="80"/>
               <w:left w:type="dxa" w:w="120"/>
@@ -5776,7 +5835,6 @@
               <w:bottom w:val="single" w:color="D0D7D3" w:sz="4"/>
               <w:right w:val="single" w:color="D0D7D3" w:sz="4"/>
             </w:tcBorders>
-            <w:shd w:fill="F6F8F7" w:color="auto" w:val="clear"/>
             <w:tcMar>
               <w:top w:type="dxa" w:w="80"/>
               <w:left w:type="dxa" w:w="120"/>
@@ -5807,6 +5865,7 @@
               <w:bottom w:val="single" w:color="D0D7D3" w:sz="4"/>
               <w:right w:val="single" w:color="D0D7D3" w:sz="4"/>
             </w:tcBorders>
+            <w:shd w:fill="F6F8F7" w:color="auto" w:val="clear"/>
             <w:tcMar>
               <w:top w:type="dxa" w:w="80"/>
               <w:left w:type="dxa" w:w="120"/>
@@ -5835,6 +5894,7 @@
               <w:bottom w:val="single" w:color="D0D7D3" w:sz="4"/>
               <w:right w:val="single" w:color="D0D7D3" w:sz="4"/>
             </w:tcBorders>
+            <w:shd w:fill="F6F8F7" w:color="auto" w:val="clear"/>
             <w:tcMar>
               <w:top w:type="dxa" w:w="80"/>
               <w:left w:type="dxa" w:w="120"/>
@@ -5865,7 +5925,6 @@
               <w:bottom w:val="single" w:color="D0D7D3" w:sz="4"/>
               <w:right w:val="single" w:color="D0D7D3" w:sz="4"/>
             </w:tcBorders>
-            <w:shd w:fill="F6F8F7" w:color="auto" w:val="clear"/>
             <w:tcMar>
               <w:top w:type="dxa" w:w="80"/>
               <w:left w:type="dxa" w:w="120"/>
@@ -5894,7 +5953,6 @@
               <w:bottom w:val="single" w:color="D0D7D3" w:sz="4"/>
               <w:right w:val="single" w:color="D0D7D3" w:sz="4"/>
             </w:tcBorders>
-            <w:shd w:fill="F6F8F7" w:color="auto" w:val="clear"/>
             <w:tcMar>
               <w:top w:type="dxa" w:w="80"/>
               <w:left w:type="dxa" w:w="120"/>
@@ -5925,6 +5983,7 @@
               <w:bottom w:val="single" w:color="D0D7D3" w:sz="4"/>
               <w:right w:val="single" w:color="D0D7D3" w:sz="4"/>
             </w:tcBorders>
+            <w:shd w:fill="F6F8F7" w:color="auto" w:val="clear"/>
             <w:tcMar>
               <w:top w:type="dxa" w:w="80"/>
               <w:left w:type="dxa" w:w="120"/>
@@ -5953,6 +6012,7 @@
               <w:bottom w:val="single" w:color="D0D7D3" w:sz="4"/>
               <w:right w:val="single" w:color="D0D7D3" w:sz="4"/>
             </w:tcBorders>
+            <w:shd w:fill="F6F8F7" w:color="auto" w:val="clear"/>
             <w:tcMar>
               <w:top w:type="dxa" w:w="80"/>
               <w:left w:type="dxa" w:w="120"/>
@@ -5983,7 +6043,6 @@
               <w:bottom w:val="single" w:color="D0D7D3" w:sz="4"/>
               <w:right w:val="single" w:color="D0D7D3" w:sz="4"/>
             </w:tcBorders>
-            <w:shd w:fill="F6F8F7" w:color="auto" w:val="clear"/>
             <w:tcMar>
               <w:top w:type="dxa" w:w="80"/>
               <w:left w:type="dxa" w:w="120"/>
@@ -6012,7 +6071,6 @@
               <w:bottom w:val="single" w:color="D0D7D3" w:sz="4"/>
               <w:right w:val="single" w:color="D0D7D3" w:sz="4"/>
             </w:tcBorders>
-            <w:shd w:fill="F6F8F7" w:color="auto" w:val="clear"/>
             <w:tcMar>
               <w:top w:type="dxa" w:w="80"/>
               <w:left w:type="dxa" w:w="120"/>
@@ -6043,6 +6101,7 @@
               <w:bottom w:val="single" w:color="D0D7D3" w:sz="4"/>
               <w:right w:val="single" w:color="D0D7D3" w:sz="4"/>
             </w:tcBorders>
+            <w:shd w:fill="F6F8F7" w:color="auto" w:val="clear"/>
             <w:tcMar>
               <w:top w:type="dxa" w:w="80"/>
               <w:left w:type="dxa" w:w="120"/>
@@ -6071,6 +6130,7 @@
               <w:bottom w:val="single" w:color="D0D7D3" w:sz="4"/>
               <w:right w:val="single" w:color="D0D7D3" w:sz="4"/>
             </w:tcBorders>
+            <w:shd w:fill="F6F8F7" w:color="auto" w:val="clear"/>
             <w:tcMar>
               <w:top w:type="dxa" w:w="80"/>
               <w:left w:type="dxa" w:w="120"/>
@@ -6101,7 +6161,6 @@
               <w:bottom w:val="single" w:color="D0D7D3" w:sz="4"/>
               <w:right w:val="single" w:color="D0D7D3" w:sz="4"/>
             </w:tcBorders>
-            <w:shd w:fill="F6F8F7" w:color="auto" w:val="clear"/>
             <w:tcMar>
               <w:top w:type="dxa" w:w="80"/>
               <w:left w:type="dxa" w:w="120"/>
@@ -6130,7 +6189,6 @@
               <w:bottom w:val="single" w:color="D0D7D3" w:sz="4"/>
               <w:right w:val="single" w:color="D0D7D3" w:sz="4"/>
             </w:tcBorders>
-            <w:shd w:fill="F6F8F7" w:color="auto" w:val="clear"/>
             <w:tcMar>
               <w:top w:type="dxa" w:w="80"/>
               <w:left w:type="dxa" w:w="120"/>
@@ -6161,6 +6219,7 @@
               <w:bottom w:val="single" w:color="D0D7D3" w:sz="4"/>
               <w:right w:val="single" w:color="D0D7D3" w:sz="4"/>
             </w:tcBorders>
+            <w:shd w:fill="F6F8F7" w:color="auto" w:val="clear"/>
             <w:tcMar>
               <w:top w:type="dxa" w:w="80"/>
               <w:left w:type="dxa" w:w="120"/>
@@ -6189,6 +6248,7 @@
               <w:bottom w:val="single" w:color="D0D7D3" w:sz="4"/>
               <w:right w:val="single" w:color="D0D7D3" w:sz="4"/>
             </w:tcBorders>
+            <w:shd w:fill="F6F8F7" w:color="auto" w:val="clear"/>
             <w:tcMar>
               <w:top w:type="dxa" w:w="80"/>
               <w:left w:type="dxa" w:w="120"/>
@@ -6219,7 +6279,6 @@
               <w:bottom w:val="single" w:color="D0D7D3" w:sz="4"/>
               <w:right w:val="single" w:color="D0D7D3" w:sz="4"/>
             </w:tcBorders>
-            <w:shd w:fill="F6F8F7" w:color="auto" w:val="clear"/>
             <w:tcMar>
               <w:top w:type="dxa" w:w="80"/>
               <w:left w:type="dxa" w:w="120"/>
@@ -6248,7 +6307,6 @@
               <w:bottom w:val="single" w:color="D0D7D3" w:sz="4"/>
               <w:right w:val="single" w:color="D0D7D3" w:sz="4"/>
             </w:tcBorders>
-            <w:shd w:fill="F6F8F7" w:color="auto" w:val="clear"/>
             <w:tcMar>
               <w:top w:type="dxa" w:w="80"/>
               <w:left w:type="dxa" w:w="120"/>
@@ -6279,6 +6337,7 @@
               <w:bottom w:val="single" w:color="D0D7D3" w:sz="4"/>
               <w:right w:val="single" w:color="D0D7D3" w:sz="4"/>
             </w:tcBorders>
+            <w:shd w:fill="F6F8F7" w:color="auto" w:val="clear"/>
             <w:tcMar>
               <w:top w:type="dxa" w:w="80"/>
               <w:left w:type="dxa" w:w="120"/>
@@ -6307,6 +6366,7 @@
               <w:bottom w:val="single" w:color="D0D7D3" w:sz="4"/>
               <w:right w:val="single" w:color="D0D7D3" w:sz="4"/>
             </w:tcBorders>
+            <w:shd w:fill="F6F8F7" w:color="auto" w:val="clear"/>
             <w:tcMar>
               <w:top w:type="dxa" w:w="80"/>
               <w:left w:type="dxa" w:w="120"/>
@@ -6337,7 +6397,6 @@
               <w:bottom w:val="single" w:color="D0D7D3" w:sz="4"/>
               <w:right w:val="single" w:color="D0D7D3" w:sz="4"/>
             </w:tcBorders>
-            <w:shd w:fill="F6F8F7" w:color="auto" w:val="clear"/>
             <w:tcMar>
               <w:top w:type="dxa" w:w="80"/>
               <w:left w:type="dxa" w:w="120"/>
@@ -6366,7 +6425,6 @@
               <w:bottom w:val="single" w:color="D0D7D3" w:sz="4"/>
               <w:right w:val="single" w:color="D0D7D3" w:sz="4"/>
             </w:tcBorders>
-            <w:shd w:fill="F6F8F7" w:color="auto" w:val="clear"/>
             <w:tcMar>
               <w:top w:type="dxa" w:w="80"/>
               <w:left w:type="dxa" w:w="120"/>
@@ -6397,6 +6455,7 @@
               <w:bottom w:val="single" w:color="D0D7D3" w:sz="4"/>
               <w:right w:val="single" w:color="D0D7D3" w:sz="4"/>
             </w:tcBorders>
+            <w:shd w:fill="F6F8F7" w:color="auto" w:val="clear"/>
             <w:tcMar>
               <w:top w:type="dxa" w:w="80"/>
               <w:left w:type="dxa" w:w="120"/>
@@ -6425,6 +6484,7 @@
               <w:bottom w:val="single" w:color="D0D7D3" w:sz="4"/>
               <w:right w:val="single" w:color="D0D7D3" w:sz="4"/>
             </w:tcBorders>
+            <w:shd w:fill="F6F8F7" w:color="auto" w:val="clear"/>
             <w:tcMar>
               <w:top w:type="dxa" w:w="80"/>
               <w:left w:type="dxa" w:w="120"/>
@@ -6455,7 +6515,6 @@
               <w:bottom w:val="single" w:color="D0D7D3" w:sz="4"/>
               <w:right w:val="single" w:color="D0D7D3" w:sz="4"/>
             </w:tcBorders>
-            <w:shd w:fill="F6F8F7" w:color="auto" w:val="clear"/>
             <w:tcMar>
               <w:top w:type="dxa" w:w="80"/>
               <w:left w:type="dxa" w:w="120"/>
@@ -6484,7 +6543,6 @@
               <w:bottom w:val="single" w:color="D0D7D3" w:sz="4"/>
               <w:right w:val="single" w:color="D0D7D3" w:sz="4"/>
             </w:tcBorders>
-            <w:shd w:fill="F6F8F7" w:color="auto" w:val="clear"/>
             <w:tcMar>
               <w:top w:type="dxa" w:w="80"/>
               <w:left w:type="dxa" w:w="120"/>
@@ -6515,6 +6573,7 @@
               <w:bottom w:val="single" w:color="D0D7D3" w:sz="4"/>
               <w:right w:val="single" w:color="D0D7D3" w:sz="4"/>
             </w:tcBorders>
+            <w:shd w:fill="F6F8F7" w:color="auto" w:val="clear"/>
             <w:tcMar>
               <w:top w:type="dxa" w:w="80"/>
               <w:left w:type="dxa" w:w="120"/>
@@ -6543,6 +6602,7 @@
               <w:bottom w:val="single" w:color="D0D7D3" w:sz="4"/>
               <w:right w:val="single" w:color="D0D7D3" w:sz="4"/>
             </w:tcBorders>
+            <w:shd w:fill="F6F8F7" w:color="auto" w:val="clear"/>
             <w:tcMar>
               <w:top w:type="dxa" w:w="80"/>
               <w:left w:type="dxa" w:w="120"/>
@@ -6573,7 +6633,6 @@
               <w:bottom w:val="single" w:color="D0D7D3" w:sz="4"/>
               <w:right w:val="single" w:color="D0D7D3" w:sz="4"/>
             </w:tcBorders>
-            <w:shd w:fill="F6F8F7" w:color="auto" w:val="clear"/>
             <w:tcMar>
               <w:top w:type="dxa" w:w="80"/>
               <w:left w:type="dxa" w:w="120"/>
@@ -6602,7 +6661,6 @@
               <w:bottom w:val="single" w:color="D0D7D3" w:sz="4"/>
               <w:right w:val="single" w:color="D0D7D3" w:sz="4"/>
             </w:tcBorders>
-            <w:shd w:fill="F6F8F7" w:color="auto" w:val="clear"/>
             <w:tcMar>
               <w:top w:type="dxa" w:w="80"/>
               <w:left w:type="dxa" w:w="120"/>
@@ -6633,6 +6691,7 @@
               <w:bottom w:val="single" w:color="D0D7D3" w:sz="4"/>
               <w:right w:val="single" w:color="D0D7D3" w:sz="4"/>
             </w:tcBorders>
+            <w:shd w:fill="F6F8F7" w:color="auto" w:val="clear"/>
             <w:tcMar>
               <w:top w:type="dxa" w:w="80"/>
               <w:left w:type="dxa" w:w="120"/>
@@ -6661,6 +6720,7 @@
               <w:bottom w:val="single" w:color="D0D7D3" w:sz="4"/>
               <w:right w:val="single" w:color="D0D7D3" w:sz="4"/>
             </w:tcBorders>
+            <w:shd w:fill="F6F8F7" w:color="auto" w:val="clear"/>
             <w:tcMar>
               <w:top w:type="dxa" w:w="80"/>
               <w:left w:type="dxa" w:w="120"/>

</xml_diff>

<commit_message>
One tap pays for all of a family's children; each school chooses how a smaller amount is shared
The family payment link (sent in WhatsApp and text reminders) now opens on one
button that pays everything due now on the provider's page. A parent paying less
types one amount and sees how it will be shared before paying; the share follows
the school's rule, chosen by the proprietor under Payment settings: old balances
first then clear as many children as possible (default), proportional, eldest
first or youngest first. Each share is its own payment and receipt. Choosing the
amount per child is still available. The portal's pay-for-all works the same.
</commit_message>
<xml_diff>
--- a/docs/product/WardPay - what it does.docx
+++ b/docs/product/WardPay - what it does.docx
@@ -4434,6 +4434,66 @@
                 <w:sz w:val="20"/>
                 <w:szCs w:val="20"/>
               </w:rPr>
+              <w:t xml:space="preserve">Parents pay for all their children with one tap from their WhatsApp or text link; the school chooses how a smaller amount is shared</w:t>
+            </w:r>
+          </w:p>
+        </w:tc>
+      </w:tr>
+      <w:tr>
+        <w:tc>
+          <w:tcPr>
+            <w:tcW w:type="dxa" w:w="1800"/>
+            <w:tcBorders>
+              <w:top w:val="single" w:color="D0D7D3" w:sz="4"/>
+              <w:left w:val="single" w:color="D0D7D3" w:sz="4"/>
+              <w:bottom w:val="single" w:color="D0D7D3" w:sz="4"/>
+              <w:right w:val="single" w:color="D0D7D3" w:sz="4"/>
+            </w:tcBorders>
+            <w:shd w:fill="F6F8F7" w:color="auto" w:val="clear"/>
+            <w:tcMar>
+              <w:top w:type="dxa" w:w="80"/>
+              <w:left w:type="dxa" w:w="120"/>
+              <w:bottom w:type="dxa" w:w="80"/>
+              <w:right w:type="dxa" w:w="120"/>
+            </w:tcMar>
+          </w:tcPr>
+          <w:p>
+            <w:r>
+              <w:rPr>
+                <w:b w:val="false"/>
+                <w:bCs w:val="false"/>
+                <w:sz w:val="20"/>
+                <w:szCs w:val="20"/>
+              </w:rPr>
+              <w:t xml:space="preserve">23 Oct 2026</w:t>
+            </w:r>
+          </w:p>
+        </w:tc>
+        <w:tc>
+          <w:tcPr>
+            <w:tcW w:type="dxa" w:w="7838"/>
+            <w:tcBorders>
+              <w:top w:val="single" w:color="D0D7D3" w:sz="4"/>
+              <w:left w:val="single" w:color="D0D7D3" w:sz="4"/>
+              <w:bottom w:val="single" w:color="D0D7D3" w:sz="4"/>
+              <w:right w:val="single" w:color="D0D7D3" w:sz="4"/>
+            </w:tcBorders>
+            <w:shd w:fill="F6F8F7" w:color="auto" w:val="clear"/>
+            <w:tcMar>
+              <w:top w:type="dxa" w:w="80"/>
+              <w:left w:type="dxa" w:w="120"/>
+              <w:bottom w:type="dxa" w:w="80"/>
+              <w:right w:type="dxa" w:w="120"/>
+            </w:tcMar>
+          </w:tcPr>
+          <w:p>
+            <w:r>
+              <w:rPr>
+                <w:b w:val="false"/>
+                <w:bCs w:val="false"/>
+                <w:sz w:val="20"/>
+                <w:szCs w:val="20"/>
+              </w:rPr>
               <w:t xml:space="preserve">WardPay team can discount a school’s bill (e.g. waive the set-up fee) or move its due date</w:t>
             </w:r>
           </w:p>
@@ -4449,7 +4509,6 @@
               <w:bottom w:val="single" w:color="D0D7D3" w:sz="4"/>
               <w:right w:val="single" w:color="D0D7D3" w:sz="4"/>
             </w:tcBorders>
-            <w:shd w:fill="F6F8F7" w:color="auto" w:val="clear"/>
             <w:tcMar>
               <w:top w:type="dxa" w:w="80"/>
               <w:left w:type="dxa" w:w="120"/>
@@ -4478,7 +4537,6 @@
               <w:bottom w:val="single" w:color="D0D7D3" w:sz="4"/>
               <w:right w:val="single" w:color="D0D7D3" w:sz="4"/>
             </w:tcBorders>
-            <w:shd w:fill="F6F8F7" w:color="auto" w:val="clear"/>
             <w:tcMar>
               <w:top w:type="dxa" w:w="80"/>
               <w:left w:type="dxa" w:w="120"/>
@@ -4509,6 +4567,7 @@
               <w:bottom w:val="single" w:color="D0D7D3" w:sz="4"/>
               <w:right w:val="single" w:color="D0D7D3" w:sz="4"/>
             </w:tcBorders>
+            <w:shd w:fill="F6F8F7" w:color="auto" w:val="clear"/>
             <w:tcMar>
               <w:top w:type="dxa" w:w="80"/>
               <w:left w:type="dxa" w:w="120"/>
@@ -4537,6 +4596,7 @@
               <w:bottom w:val="single" w:color="D0D7D3" w:sz="4"/>
               <w:right w:val="single" w:color="D0D7D3" w:sz="4"/>
             </w:tcBorders>
+            <w:shd w:fill="F6F8F7" w:color="auto" w:val="clear"/>
             <w:tcMar>
               <w:top w:type="dxa" w:w="80"/>
               <w:left w:type="dxa" w:w="120"/>
@@ -4567,7 +4627,6 @@
               <w:bottom w:val="single" w:color="D0D7D3" w:sz="4"/>
               <w:right w:val="single" w:color="D0D7D3" w:sz="4"/>
             </w:tcBorders>
-            <w:shd w:fill="F6F8F7" w:color="auto" w:val="clear"/>
             <w:tcMar>
               <w:top w:type="dxa" w:w="80"/>
               <w:left w:type="dxa" w:w="120"/>
@@ -4596,7 +4655,6 @@
               <w:bottom w:val="single" w:color="D0D7D3" w:sz="4"/>
               <w:right w:val="single" w:color="D0D7D3" w:sz="4"/>
             </w:tcBorders>
-            <w:shd w:fill="F6F8F7" w:color="auto" w:val="clear"/>
             <w:tcMar>
               <w:top w:type="dxa" w:w="80"/>
               <w:left w:type="dxa" w:w="120"/>
@@ -4627,6 +4685,7 @@
               <w:bottom w:val="single" w:color="D0D7D3" w:sz="4"/>
               <w:right w:val="single" w:color="D0D7D3" w:sz="4"/>
             </w:tcBorders>
+            <w:shd w:fill="F6F8F7" w:color="auto" w:val="clear"/>
             <w:tcMar>
               <w:top w:type="dxa" w:w="80"/>
               <w:left w:type="dxa" w:w="120"/>
@@ -4655,6 +4714,7 @@
               <w:bottom w:val="single" w:color="D0D7D3" w:sz="4"/>
               <w:right w:val="single" w:color="D0D7D3" w:sz="4"/>
             </w:tcBorders>
+            <w:shd w:fill="F6F8F7" w:color="auto" w:val="clear"/>
             <w:tcMar>
               <w:top w:type="dxa" w:w="80"/>
               <w:left w:type="dxa" w:w="120"/>
@@ -4685,7 +4745,6 @@
               <w:bottom w:val="single" w:color="D0D7D3" w:sz="4"/>
               <w:right w:val="single" w:color="D0D7D3" w:sz="4"/>
             </w:tcBorders>
-            <w:shd w:fill="F6F8F7" w:color="auto" w:val="clear"/>
             <w:tcMar>
               <w:top w:type="dxa" w:w="80"/>
               <w:left w:type="dxa" w:w="120"/>
@@ -4714,7 +4773,6 @@
               <w:bottom w:val="single" w:color="D0D7D3" w:sz="4"/>
               <w:right w:val="single" w:color="D0D7D3" w:sz="4"/>
             </w:tcBorders>
-            <w:shd w:fill="F6F8F7" w:color="auto" w:val="clear"/>
             <w:tcMar>
               <w:top w:type="dxa" w:w="80"/>
               <w:left w:type="dxa" w:w="120"/>
@@ -4745,6 +4803,7 @@
               <w:bottom w:val="single" w:color="D0D7D3" w:sz="4"/>
               <w:right w:val="single" w:color="D0D7D3" w:sz="4"/>
             </w:tcBorders>
+            <w:shd w:fill="F6F8F7" w:color="auto" w:val="clear"/>
             <w:tcMar>
               <w:top w:type="dxa" w:w="80"/>
               <w:left w:type="dxa" w:w="120"/>
@@ -4773,6 +4832,7 @@
               <w:bottom w:val="single" w:color="D0D7D3" w:sz="4"/>
               <w:right w:val="single" w:color="D0D7D3" w:sz="4"/>
             </w:tcBorders>
+            <w:shd w:fill="F6F8F7" w:color="auto" w:val="clear"/>
             <w:tcMar>
               <w:top w:type="dxa" w:w="80"/>
               <w:left w:type="dxa" w:w="120"/>
@@ -4803,7 +4863,6 @@
               <w:bottom w:val="single" w:color="D0D7D3" w:sz="4"/>
               <w:right w:val="single" w:color="D0D7D3" w:sz="4"/>
             </w:tcBorders>
-            <w:shd w:fill="F6F8F7" w:color="auto" w:val="clear"/>
             <w:tcMar>
               <w:top w:type="dxa" w:w="80"/>
               <w:left w:type="dxa" w:w="120"/>
@@ -4832,7 +4891,6 @@
               <w:bottom w:val="single" w:color="D0D7D3" w:sz="4"/>
               <w:right w:val="single" w:color="D0D7D3" w:sz="4"/>
             </w:tcBorders>
-            <w:shd w:fill="F6F8F7" w:color="auto" w:val="clear"/>
             <w:tcMar>
               <w:top w:type="dxa" w:w="80"/>
               <w:left w:type="dxa" w:w="120"/>
@@ -4863,6 +4921,7 @@
               <w:bottom w:val="single" w:color="D0D7D3" w:sz="4"/>
               <w:right w:val="single" w:color="D0D7D3" w:sz="4"/>
             </w:tcBorders>
+            <w:shd w:fill="F6F8F7" w:color="auto" w:val="clear"/>
             <w:tcMar>
               <w:top w:type="dxa" w:w="80"/>
               <w:left w:type="dxa" w:w="120"/>
@@ -4891,6 +4950,7 @@
               <w:bottom w:val="single" w:color="D0D7D3" w:sz="4"/>
               <w:right w:val="single" w:color="D0D7D3" w:sz="4"/>
             </w:tcBorders>
+            <w:shd w:fill="F6F8F7" w:color="auto" w:val="clear"/>
             <w:tcMar>
               <w:top w:type="dxa" w:w="80"/>
               <w:left w:type="dxa" w:w="120"/>
@@ -4921,7 +4981,6 @@
               <w:bottom w:val="single" w:color="D0D7D3" w:sz="4"/>
               <w:right w:val="single" w:color="D0D7D3" w:sz="4"/>
             </w:tcBorders>
-            <w:shd w:fill="F6F8F7" w:color="auto" w:val="clear"/>
             <w:tcMar>
               <w:top w:type="dxa" w:w="80"/>
               <w:left w:type="dxa" w:w="120"/>
@@ -4950,7 +5009,6 @@
               <w:bottom w:val="single" w:color="D0D7D3" w:sz="4"/>
               <w:right w:val="single" w:color="D0D7D3" w:sz="4"/>
             </w:tcBorders>
-            <w:shd w:fill="F6F8F7" w:color="auto" w:val="clear"/>
             <w:tcMar>
               <w:top w:type="dxa" w:w="80"/>
               <w:left w:type="dxa" w:w="120"/>
@@ -4981,6 +5039,7 @@
               <w:bottom w:val="single" w:color="D0D7D3" w:sz="4"/>
               <w:right w:val="single" w:color="D0D7D3" w:sz="4"/>
             </w:tcBorders>
+            <w:shd w:fill="F6F8F7" w:color="auto" w:val="clear"/>
             <w:tcMar>
               <w:top w:type="dxa" w:w="80"/>
               <w:left w:type="dxa" w:w="120"/>
@@ -5009,6 +5068,7 @@
               <w:bottom w:val="single" w:color="D0D7D3" w:sz="4"/>
               <w:right w:val="single" w:color="D0D7D3" w:sz="4"/>
             </w:tcBorders>
+            <w:shd w:fill="F6F8F7" w:color="auto" w:val="clear"/>
             <w:tcMar>
               <w:top w:type="dxa" w:w="80"/>
               <w:left w:type="dxa" w:w="120"/>
@@ -5039,7 +5099,6 @@
               <w:bottom w:val="single" w:color="D0D7D3" w:sz="4"/>
               <w:right w:val="single" w:color="D0D7D3" w:sz="4"/>
             </w:tcBorders>
-            <w:shd w:fill="F6F8F7" w:color="auto" w:val="clear"/>
             <w:tcMar>
               <w:top w:type="dxa" w:w="80"/>
               <w:left w:type="dxa" w:w="120"/>
@@ -5068,7 +5127,6 @@
               <w:bottom w:val="single" w:color="D0D7D3" w:sz="4"/>
               <w:right w:val="single" w:color="D0D7D3" w:sz="4"/>
             </w:tcBorders>
-            <w:shd w:fill="F6F8F7" w:color="auto" w:val="clear"/>
             <w:tcMar>
               <w:top w:type="dxa" w:w="80"/>
               <w:left w:type="dxa" w:w="120"/>
@@ -5099,6 +5157,7 @@
               <w:bottom w:val="single" w:color="D0D7D3" w:sz="4"/>
               <w:right w:val="single" w:color="D0D7D3" w:sz="4"/>
             </w:tcBorders>
+            <w:shd w:fill="F6F8F7" w:color="auto" w:val="clear"/>
             <w:tcMar>
               <w:top w:type="dxa" w:w="80"/>
               <w:left w:type="dxa" w:w="120"/>
@@ -5127,6 +5186,7 @@
               <w:bottom w:val="single" w:color="D0D7D3" w:sz="4"/>
               <w:right w:val="single" w:color="D0D7D3" w:sz="4"/>
             </w:tcBorders>
+            <w:shd w:fill="F6F8F7" w:color="auto" w:val="clear"/>
             <w:tcMar>
               <w:top w:type="dxa" w:w="80"/>
               <w:left w:type="dxa" w:w="120"/>
@@ -5157,7 +5217,6 @@
               <w:bottom w:val="single" w:color="D0D7D3" w:sz="4"/>
               <w:right w:val="single" w:color="D0D7D3" w:sz="4"/>
             </w:tcBorders>
-            <w:shd w:fill="F6F8F7" w:color="auto" w:val="clear"/>
             <w:tcMar>
               <w:top w:type="dxa" w:w="80"/>
               <w:left w:type="dxa" w:w="120"/>
@@ -5186,7 +5245,6 @@
               <w:bottom w:val="single" w:color="D0D7D3" w:sz="4"/>
               <w:right w:val="single" w:color="D0D7D3" w:sz="4"/>
             </w:tcBorders>
-            <w:shd w:fill="F6F8F7" w:color="auto" w:val="clear"/>
             <w:tcMar>
               <w:top w:type="dxa" w:w="80"/>
               <w:left w:type="dxa" w:w="120"/>
@@ -5217,6 +5275,7 @@
               <w:bottom w:val="single" w:color="D0D7D3" w:sz="4"/>
               <w:right w:val="single" w:color="D0D7D3" w:sz="4"/>
             </w:tcBorders>
+            <w:shd w:fill="F6F8F7" w:color="auto" w:val="clear"/>
             <w:tcMar>
               <w:top w:type="dxa" w:w="80"/>
               <w:left w:type="dxa" w:w="120"/>
@@ -5245,6 +5304,7 @@
               <w:bottom w:val="single" w:color="D0D7D3" w:sz="4"/>
               <w:right w:val="single" w:color="D0D7D3" w:sz="4"/>
             </w:tcBorders>
+            <w:shd w:fill="F6F8F7" w:color="auto" w:val="clear"/>
             <w:tcMar>
               <w:top w:type="dxa" w:w="80"/>
               <w:left w:type="dxa" w:w="120"/>
@@ -5275,7 +5335,6 @@
               <w:bottom w:val="single" w:color="D0D7D3" w:sz="4"/>
               <w:right w:val="single" w:color="D0D7D3" w:sz="4"/>
             </w:tcBorders>
-            <w:shd w:fill="F6F8F7" w:color="auto" w:val="clear"/>
             <w:tcMar>
               <w:top w:type="dxa" w:w="80"/>
               <w:left w:type="dxa" w:w="120"/>
@@ -5304,7 +5363,6 @@
               <w:bottom w:val="single" w:color="D0D7D3" w:sz="4"/>
               <w:right w:val="single" w:color="D0D7D3" w:sz="4"/>
             </w:tcBorders>
-            <w:shd w:fill="F6F8F7" w:color="auto" w:val="clear"/>
             <w:tcMar>
               <w:top w:type="dxa" w:w="80"/>
               <w:left w:type="dxa" w:w="120"/>
@@ -5335,6 +5393,7 @@
               <w:bottom w:val="single" w:color="D0D7D3" w:sz="4"/>
               <w:right w:val="single" w:color="D0D7D3" w:sz="4"/>
             </w:tcBorders>
+            <w:shd w:fill="F6F8F7" w:color="auto" w:val="clear"/>
             <w:tcMar>
               <w:top w:type="dxa" w:w="80"/>
               <w:left w:type="dxa" w:w="120"/>
@@ -5363,6 +5422,7 @@
               <w:bottom w:val="single" w:color="D0D7D3" w:sz="4"/>
               <w:right w:val="single" w:color="D0D7D3" w:sz="4"/>
             </w:tcBorders>
+            <w:shd w:fill="F6F8F7" w:color="auto" w:val="clear"/>
             <w:tcMar>
               <w:top w:type="dxa" w:w="80"/>
               <w:left w:type="dxa" w:w="120"/>
@@ -5393,7 +5453,6 @@
               <w:bottom w:val="single" w:color="D0D7D3" w:sz="4"/>
               <w:right w:val="single" w:color="D0D7D3" w:sz="4"/>
             </w:tcBorders>
-            <w:shd w:fill="F6F8F7" w:color="auto" w:val="clear"/>
             <w:tcMar>
               <w:top w:type="dxa" w:w="80"/>
               <w:left w:type="dxa" w:w="120"/>
@@ -5422,7 +5481,6 @@
               <w:bottom w:val="single" w:color="D0D7D3" w:sz="4"/>
               <w:right w:val="single" w:color="D0D7D3" w:sz="4"/>
             </w:tcBorders>
-            <w:shd w:fill="F6F8F7" w:color="auto" w:val="clear"/>
             <w:tcMar>
               <w:top w:type="dxa" w:w="80"/>
               <w:left w:type="dxa" w:w="120"/>
@@ -5453,6 +5511,7 @@
               <w:bottom w:val="single" w:color="D0D7D3" w:sz="4"/>
               <w:right w:val="single" w:color="D0D7D3" w:sz="4"/>
             </w:tcBorders>
+            <w:shd w:fill="F6F8F7" w:color="auto" w:val="clear"/>
             <w:tcMar>
               <w:top w:type="dxa" w:w="80"/>
               <w:left w:type="dxa" w:w="120"/>
@@ -5481,6 +5540,7 @@
               <w:bottom w:val="single" w:color="D0D7D3" w:sz="4"/>
               <w:right w:val="single" w:color="D0D7D3" w:sz="4"/>
             </w:tcBorders>
+            <w:shd w:fill="F6F8F7" w:color="auto" w:val="clear"/>
             <w:tcMar>
               <w:top w:type="dxa" w:w="80"/>
               <w:left w:type="dxa" w:w="120"/>
@@ -5511,7 +5571,6 @@
               <w:bottom w:val="single" w:color="D0D7D3" w:sz="4"/>
               <w:right w:val="single" w:color="D0D7D3" w:sz="4"/>
             </w:tcBorders>
-            <w:shd w:fill="F6F8F7" w:color="auto" w:val="clear"/>
             <w:tcMar>
               <w:top w:type="dxa" w:w="80"/>
               <w:left w:type="dxa" w:w="120"/>
@@ -5540,7 +5599,6 @@
               <w:bottom w:val="single" w:color="D0D7D3" w:sz="4"/>
               <w:right w:val="single" w:color="D0D7D3" w:sz="4"/>
             </w:tcBorders>
-            <w:shd w:fill="F6F8F7" w:color="auto" w:val="clear"/>
             <w:tcMar>
               <w:top w:type="dxa" w:w="80"/>
               <w:left w:type="dxa" w:w="120"/>
@@ -5571,6 +5629,7 @@
               <w:bottom w:val="single" w:color="D0D7D3" w:sz="4"/>
               <w:right w:val="single" w:color="D0D7D3" w:sz="4"/>
             </w:tcBorders>
+            <w:shd w:fill="F6F8F7" w:color="auto" w:val="clear"/>
             <w:tcMar>
               <w:top w:type="dxa" w:w="80"/>
               <w:left w:type="dxa" w:w="120"/>
@@ -5599,6 +5658,7 @@
               <w:bottom w:val="single" w:color="D0D7D3" w:sz="4"/>
               <w:right w:val="single" w:color="D0D7D3" w:sz="4"/>
             </w:tcBorders>
+            <w:shd w:fill="F6F8F7" w:color="auto" w:val="clear"/>
             <w:tcMar>
               <w:top w:type="dxa" w:w="80"/>
               <w:left w:type="dxa" w:w="120"/>
@@ -5629,7 +5689,6 @@
               <w:bottom w:val="single" w:color="D0D7D3" w:sz="4"/>
               <w:right w:val="single" w:color="D0D7D3" w:sz="4"/>
             </w:tcBorders>
-            <w:shd w:fill="F6F8F7" w:color="auto" w:val="clear"/>
             <w:tcMar>
               <w:top w:type="dxa" w:w="80"/>
               <w:left w:type="dxa" w:w="120"/>
@@ -5658,7 +5717,6 @@
               <w:bottom w:val="single" w:color="D0D7D3" w:sz="4"/>
               <w:right w:val="single" w:color="D0D7D3" w:sz="4"/>
             </w:tcBorders>
-            <w:shd w:fill="F6F8F7" w:color="auto" w:val="clear"/>
             <w:tcMar>
               <w:top w:type="dxa" w:w="80"/>
               <w:left w:type="dxa" w:w="120"/>
@@ -5689,6 +5747,7 @@
               <w:bottom w:val="single" w:color="D0D7D3" w:sz="4"/>
               <w:right w:val="single" w:color="D0D7D3" w:sz="4"/>
             </w:tcBorders>
+            <w:shd w:fill="F6F8F7" w:color="auto" w:val="clear"/>
             <w:tcMar>
               <w:top w:type="dxa" w:w="80"/>
               <w:left w:type="dxa" w:w="120"/>
@@ -5717,6 +5776,7 @@
               <w:bottom w:val="single" w:color="D0D7D3" w:sz="4"/>
               <w:right w:val="single" w:color="D0D7D3" w:sz="4"/>
             </w:tcBorders>
+            <w:shd w:fill="F6F8F7" w:color="auto" w:val="clear"/>
             <w:tcMar>
               <w:top w:type="dxa" w:w="80"/>
               <w:left w:type="dxa" w:w="120"/>
@@ -5747,7 +5807,6 @@
               <w:bottom w:val="single" w:color="D0D7D3" w:sz="4"/>
               <w:right w:val="single" w:color="D0D7D3" w:sz="4"/>
             </w:tcBorders>
-            <w:shd w:fill="F6F8F7" w:color="auto" w:val="clear"/>
             <w:tcMar>
               <w:top w:type="dxa" w:w="80"/>
               <w:left w:type="dxa" w:w="120"/>
@@ -5776,7 +5835,6 @@
               <w:bottom w:val="single" w:color="D0D7D3" w:sz="4"/>
               <w:right w:val="single" w:color="D0D7D3" w:sz="4"/>
             </w:tcBorders>
-            <w:shd w:fill="F6F8F7" w:color="auto" w:val="clear"/>
             <w:tcMar>
               <w:top w:type="dxa" w:w="80"/>
               <w:left w:type="dxa" w:w="120"/>
@@ -5807,6 +5865,7 @@
               <w:bottom w:val="single" w:color="D0D7D3" w:sz="4"/>
               <w:right w:val="single" w:color="D0D7D3" w:sz="4"/>
             </w:tcBorders>
+            <w:shd w:fill="F6F8F7" w:color="auto" w:val="clear"/>
             <w:tcMar>
               <w:top w:type="dxa" w:w="80"/>
               <w:left w:type="dxa" w:w="120"/>
@@ -5835,6 +5894,7 @@
               <w:bottom w:val="single" w:color="D0D7D3" w:sz="4"/>
               <w:right w:val="single" w:color="D0D7D3" w:sz="4"/>
             </w:tcBorders>
+            <w:shd w:fill="F6F8F7" w:color="auto" w:val="clear"/>
             <w:tcMar>
               <w:top w:type="dxa" w:w="80"/>
               <w:left w:type="dxa" w:w="120"/>
@@ -5865,7 +5925,6 @@
               <w:bottom w:val="single" w:color="D0D7D3" w:sz="4"/>
               <w:right w:val="single" w:color="D0D7D3" w:sz="4"/>
             </w:tcBorders>
-            <w:shd w:fill="F6F8F7" w:color="auto" w:val="clear"/>
             <w:tcMar>
               <w:top w:type="dxa" w:w="80"/>
               <w:left w:type="dxa" w:w="120"/>
@@ -5894,7 +5953,6 @@
               <w:bottom w:val="single" w:color="D0D7D3" w:sz="4"/>
               <w:right w:val="single" w:color="D0D7D3" w:sz="4"/>
             </w:tcBorders>
-            <w:shd w:fill="F6F8F7" w:color="auto" w:val="clear"/>
             <w:tcMar>
               <w:top w:type="dxa" w:w="80"/>
               <w:left w:type="dxa" w:w="120"/>
@@ -5925,6 +5983,7 @@
               <w:bottom w:val="single" w:color="D0D7D3" w:sz="4"/>
               <w:right w:val="single" w:color="D0D7D3" w:sz="4"/>
             </w:tcBorders>
+            <w:shd w:fill="F6F8F7" w:color="auto" w:val="clear"/>
             <w:tcMar>
               <w:top w:type="dxa" w:w="80"/>
               <w:left w:type="dxa" w:w="120"/>
@@ -5953,6 +6012,7 @@
               <w:bottom w:val="single" w:color="D0D7D3" w:sz="4"/>
               <w:right w:val="single" w:color="D0D7D3" w:sz="4"/>
             </w:tcBorders>
+            <w:shd w:fill="F6F8F7" w:color="auto" w:val="clear"/>
             <w:tcMar>
               <w:top w:type="dxa" w:w="80"/>
               <w:left w:type="dxa" w:w="120"/>
@@ -5983,7 +6043,6 @@
               <w:bottom w:val="single" w:color="D0D7D3" w:sz="4"/>
               <w:right w:val="single" w:color="D0D7D3" w:sz="4"/>
             </w:tcBorders>
-            <w:shd w:fill="F6F8F7" w:color="auto" w:val="clear"/>
             <w:tcMar>
               <w:top w:type="dxa" w:w="80"/>
               <w:left w:type="dxa" w:w="120"/>
@@ -6012,7 +6071,6 @@
               <w:bottom w:val="single" w:color="D0D7D3" w:sz="4"/>
               <w:right w:val="single" w:color="D0D7D3" w:sz="4"/>
             </w:tcBorders>
-            <w:shd w:fill="F6F8F7" w:color="auto" w:val="clear"/>
             <w:tcMar>
               <w:top w:type="dxa" w:w="80"/>
               <w:left w:type="dxa" w:w="120"/>
@@ -6043,6 +6101,7 @@
               <w:bottom w:val="single" w:color="D0D7D3" w:sz="4"/>
               <w:right w:val="single" w:color="D0D7D3" w:sz="4"/>
             </w:tcBorders>
+            <w:shd w:fill="F6F8F7" w:color="auto" w:val="clear"/>
             <w:tcMar>
               <w:top w:type="dxa" w:w="80"/>
               <w:left w:type="dxa" w:w="120"/>
@@ -6071,6 +6130,7 @@
               <w:bottom w:val="single" w:color="D0D7D3" w:sz="4"/>
               <w:right w:val="single" w:color="D0D7D3" w:sz="4"/>
             </w:tcBorders>
+            <w:shd w:fill="F6F8F7" w:color="auto" w:val="clear"/>
             <w:tcMar>
               <w:top w:type="dxa" w:w="80"/>
               <w:left w:type="dxa" w:w="120"/>
@@ -6101,7 +6161,6 @@
               <w:bottom w:val="single" w:color="D0D7D3" w:sz="4"/>
               <w:right w:val="single" w:color="D0D7D3" w:sz="4"/>
             </w:tcBorders>
-            <w:shd w:fill="F6F8F7" w:color="auto" w:val="clear"/>
             <w:tcMar>
               <w:top w:type="dxa" w:w="80"/>
               <w:left w:type="dxa" w:w="120"/>
@@ -6130,7 +6189,6 @@
               <w:bottom w:val="single" w:color="D0D7D3" w:sz="4"/>
               <w:right w:val="single" w:color="D0D7D3" w:sz="4"/>
             </w:tcBorders>
-            <w:shd w:fill="F6F8F7" w:color="auto" w:val="clear"/>
             <w:tcMar>
               <w:top w:type="dxa" w:w="80"/>
               <w:left w:type="dxa" w:w="120"/>
@@ -6161,6 +6219,7 @@
               <w:bottom w:val="single" w:color="D0D7D3" w:sz="4"/>
               <w:right w:val="single" w:color="D0D7D3" w:sz="4"/>
             </w:tcBorders>
+            <w:shd w:fill="F6F8F7" w:color="auto" w:val="clear"/>
             <w:tcMar>
               <w:top w:type="dxa" w:w="80"/>
               <w:left w:type="dxa" w:w="120"/>
@@ -6189,6 +6248,7 @@
               <w:bottom w:val="single" w:color="D0D7D3" w:sz="4"/>
               <w:right w:val="single" w:color="D0D7D3" w:sz="4"/>
             </w:tcBorders>
+            <w:shd w:fill="F6F8F7" w:color="auto" w:val="clear"/>
             <w:tcMar>
               <w:top w:type="dxa" w:w="80"/>
               <w:left w:type="dxa" w:w="120"/>
@@ -6219,7 +6279,6 @@
               <w:bottom w:val="single" w:color="D0D7D3" w:sz="4"/>
               <w:right w:val="single" w:color="D0D7D3" w:sz="4"/>
             </w:tcBorders>
-            <w:shd w:fill="F6F8F7" w:color="auto" w:val="clear"/>
             <w:tcMar>
               <w:top w:type="dxa" w:w="80"/>
               <w:left w:type="dxa" w:w="120"/>
@@ -6248,7 +6307,6 @@
               <w:bottom w:val="single" w:color="D0D7D3" w:sz="4"/>
               <w:right w:val="single" w:color="D0D7D3" w:sz="4"/>
             </w:tcBorders>
-            <w:shd w:fill="F6F8F7" w:color="auto" w:val="clear"/>
             <w:tcMar>
               <w:top w:type="dxa" w:w="80"/>
               <w:left w:type="dxa" w:w="120"/>
@@ -6279,6 +6337,7 @@
               <w:bottom w:val="single" w:color="D0D7D3" w:sz="4"/>
               <w:right w:val="single" w:color="D0D7D3" w:sz="4"/>
             </w:tcBorders>
+            <w:shd w:fill="F6F8F7" w:color="auto" w:val="clear"/>
             <w:tcMar>
               <w:top w:type="dxa" w:w="80"/>
               <w:left w:type="dxa" w:w="120"/>
@@ -6307,6 +6366,7 @@
               <w:bottom w:val="single" w:color="D0D7D3" w:sz="4"/>
               <w:right w:val="single" w:color="D0D7D3" w:sz="4"/>
             </w:tcBorders>
+            <w:shd w:fill="F6F8F7" w:color="auto" w:val="clear"/>
             <w:tcMar>
               <w:top w:type="dxa" w:w="80"/>
               <w:left w:type="dxa" w:w="120"/>
@@ -6337,7 +6397,6 @@
               <w:bottom w:val="single" w:color="D0D7D3" w:sz="4"/>
               <w:right w:val="single" w:color="D0D7D3" w:sz="4"/>
             </w:tcBorders>
-            <w:shd w:fill="F6F8F7" w:color="auto" w:val="clear"/>
             <w:tcMar>
               <w:top w:type="dxa" w:w="80"/>
               <w:left w:type="dxa" w:w="120"/>
@@ -6366,7 +6425,6 @@
               <w:bottom w:val="single" w:color="D0D7D3" w:sz="4"/>
               <w:right w:val="single" w:color="D0D7D3" w:sz="4"/>
             </w:tcBorders>
-            <w:shd w:fill="F6F8F7" w:color="auto" w:val="clear"/>
             <w:tcMar>
               <w:top w:type="dxa" w:w="80"/>
               <w:left w:type="dxa" w:w="120"/>
@@ -6397,6 +6455,7 @@
               <w:bottom w:val="single" w:color="D0D7D3" w:sz="4"/>
               <w:right w:val="single" w:color="D0D7D3" w:sz="4"/>
             </w:tcBorders>
+            <w:shd w:fill="F6F8F7" w:color="auto" w:val="clear"/>
             <w:tcMar>
               <w:top w:type="dxa" w:w="80"/>
               <w:left w:type="dxa" w:w="120"/>
@@ -6425,6 +6484,7 @@
               <w:bottom w:val="single" w:color="D0D7D3" w:sz="4"/>
               <w:right w:val="single" w:color="D0D7D3" w:sz="4"/>
             </w:tcBorders>
+            <w:shd w:fill="F6F8F7" w:color="auto" w:val="clear"/>
             <w:tcMar>
               <w:top w:type="dxa" w:w="80"/>
               <w:left w:type="dxa" w:w="120"/>
@@ -6455,7 +6515,6 @@
               <w:bottom w:val="single" w:color="D0D7D3" w:sz="4"/>
               <w:right w:val="single" w:color="D0D7D3" w:sz="4"/>
             </w:tcBorders>
-            <w:shd w:fill="F6F8F7" w:color="auto" w:val="clear"/>
             <w:tcMar>
               <w:top w:type="dxa" w:w="80"/>
               <w:left w:type="dxa" w:w="120"/>
@@ -6484,7 +6543,6 @@
               <w:bottom w:val="single" w:color="D0D7D3" w:sz="4"/>
               <w:right w:val="single" w:color="D0D7D3" w:sz="4"/>
             </w:tcBorders>
-            <w:shd w:fill="F6F8F7" w:color="auto" w:val="clear"/>
             <w:tcMar>
               <w:top w:type="dxa" w:w="80"/>
               <w:left w:type="dxa" w:w="120"/>
@@ -6515,6 +6573,7 @@
               <w:bottom w:val="single" w:color="D0D7D3" w:sz="4"/>
               <w:right w:val="single" w:color="D0D7D3" w:sz="4"/>
             </w:tcBorders>
+            <w:shd w:fill="F6F8F7" w:color="auto" w:val="clear"/>
             <w:tcMar>
               <w:top w:type="dxa" w:w="80"/>
               <w:left w:type="dxa" w:w="120"/>
@@ -6543,6 +6602,7 @@
               <w:bottom w:val="single" w:color="D0D7D3" w:sz="4"/>
               <w:right w:val="single" w:color="D0D7D3" w:sz="4"/>
             </w:tcBorders>
+            <w:shd w:fill="F6F8F7" w:color="auto" w:val="clear"/>
             <w:tcMar>
               <w:top w:type="dxa" w:w="80"/>
               <w:left w:type="dxa" w:w="120"/>
@@ -6573,7 +6633,6 @@
               <w:bottom w:val="single" w:color="D0D7D3" w:sz="4"/>
               <w:right w:val="single" w:color="D0D7D3" w:sz="4"/>
             </w:tcBorders>
-            <w:shd w:fill="F6F8F7" w:color="auto" w:val="clear"/>
             <w:tcMar>
               <w:top w:type="dxa" w:w="80"/>
               <w:left w:type="dxa" w:w="120"/>
@@ -6602,7 +6661,6 @@
               <w:bottom w:val="single" w:color="D0D7D3" w:sz="4"/>
               <w:right w:val="single" w:color="D0D7D3" w:sz="4"/>
             </w:tcBorders>
-            <w:shd w:fill="F6F8F7" w:color="auto" w:val="clear"/>
             <w:tcMar>
               <w:top w:type="dxa" w:w="80"/>
               <w:left w:type="dxa" w:w="120"/>
@@ -6633,6 +6691,7 @@
               <w:bottom w:val="single" w:color="D0D7D3" w:sz="4"/>
               <w:right w:val="single" w:color="D0D7D3" w:sz="4"/>
             </w:tcBorders>
+            <w:shd w:fill="F6F8F7" w:color="auto" w:val="clear"/>
             <w:tcMar>
               <w:top w:type="dxa" w:w="80"/>
               <w:left w:type="dxa" w:w="120"/>
@@ -6661,6 +6720,7 @@
               <w:bottom w:val="single" w:color="D0D7D3" w:sz="4"/>
               <w:right w:val="single" w:color="D0D7D3" w:sz="4"/>
             </w:tcBorders>
+            <w:shd w:fill="F6F8F7" w:color="auto" w:val="clear"/>
             <w:tcMar>
               <w:top w:type="dxa" w:w="80"/>
               <w:left w:type="dxa" w:w="120"/>
@@ -6691,7 +6751,6 @@
               <w:bottom w:val="single" w:color="D0D7D3" w:sz="4"/>
               <w:right w:val="single" w:color="D0D7D3" w:sz="4"/>
             </w:tcBorders>
-            <w:shd w:fill="F6F8F7" w:color="auto" w:val="clear"/>
             <w:tcMar>
               <w:top w:type="dxa" w:w="80"/>
               <w:left w:type="dxa" w:w="120"/>
@@ -6720,7 +6779,6 @@
               <w:bottom w:val="single" w:color="D0D7D3" w:sz="4"/>
               <w:right w:val="single" w:color="D0D7D3" w:sz="4"/>
             </w:tcBorders>
-            <w:shd w:fill="F6F8F7" w:color="auto" w:val="clear"/>
             <w:tcMar>
               <w:top w:type="dxa" w:w="80"/>
               <w:left w:type="dxa" w:w="120"/>

</xml_diff>

<commit_message>
Cash book: what should be in the drawer, banking checked by a second person, daily counts
The cash book tracks cash taken (approved or awaiting approval, less reversals)
and cash taken to the bank, recorded with its teller number and checked against
the bank statement by someone else; a rejected banking entry counts as still
held. Closing a day keeps the drawer count beside what the system expected,
shows any shortage, and flags cash or banking recorded for that day afterwards.
Per-staff totals, a fixed number of queries, banking that can't be deleted and
closes that can't be changed, every step audited. New console page: Cash book.
</commit_message>
<xml_diff>
--- a/docs/product/WardPay - what it does.docx
+++ b/docs/product/WardPay - what it does.docx
@@ -4406,6 +4406,65 @@
                 <w:sz w:val="20"/>
                 <w:szCs w:val="20"/>
               </w:rPr>
+              <w:t xml:space="preserve">24 Oct 2026</w:t>
+            </w:r>
+          </w:p>
+        </w:tc>
+        <w:tc>
+          <w:tcPr>
+            <w:tcW w:type="dxa" w:w="7838"/>
+            <w:tcBorders>
+              <w:top w:val="single" w:color="D0D7D3" w:sz="4"/>
+              <w:left w:val="single" w:color="D0D7D3" w:sz="4"/>
+              <w:bottom w:val="single" w:color="D0D7D3" w:sz="4"/>
+              <w:right w:val="single" w:color="D0D7D3" w:sz="4"/>
+            </w:tcBorders>
+            <w:tcMar>
+              <w:top w:type="dxa" w:w="80"/>
+              <w:left w:type="dxa" w:w="120"/>
+              <w:bottom w:type="dxa" w:w="80"/>
+              <w:right w:type="dxa" w:w="120"/>
+            </w:tcMar>
+          </w:tcPr>
+          <w:p>
+            <w:r>
+              <w:rPr>
+                <w:b w:val="false"/>
+                <w:bCs w:val="false"/>
+                <w:sz w:val="20"/>
+                <w:szCs w:val="20"/>
+              </w:rPr>
+              <w:t xml:space="preserve">Cash book: what should be in the drawer, cash banked (checked by a second person), daily cash counts and late entries flagged</w:t>
+            </w:r>
+          </w:p>
+        </w:tc>
+      </w:tr>
+      <w:tr>
+        <w:tc>
+          <w:tcPr>
+            <w:tcW w:type="dxa" w:w="1800"/>
+            <w:tcBorders>
+              <w:top w:val="single" w:color="D0D7D3" w:sz="4"/>
+              <w:left w:val="single" w:color="D0D7D3" w:sz="4"/>
+              <w:bottom w:val="single" w:color="D0D7D3" w:sz="4"/>
+              <w:right w:val="single" w:color="D0D7D3" w:sz="4"/>
+            </w:tcBorders>
+            <w:shd w:fill="F6F8F7" w:color="auto" w:val="clear"/>
+            <w:tcMar>
+              <w:top w:type="dxa" w:w="80"/>
+              <w:left w:type="dxa" w:w="120"/>
+              <w:bottom w:type="dxa" w:w="80"/>
+              <w:right w:type="dxa" w:w="120"/>
+            </w:tcMar>
+          </w:tcPr>
+          <w:p>
+            <w:r>
+              <w:rPr>
+                <w:b w:val="false"/>
+                <w:bCs w:val="false"/>
+                <w:sz w:val="20"/>
+                <w:szCs w:val="20"/>
+              </w:rPr>
               <w:t xml:space="preserve">23 Oct 2026</w:t>
             </w:r>
           </w:p>
@@ -4419,6 +4478,7 @@
               <w:bottom w:val="single" w:color="D0D7D3" w:sz="4"/>
               <w:right w:val="single" w:color="D0D7D3" w:sz="4"/>
             </w:tcBorders>
+            <w:shd w:fill="F6F8F7" w:color="auto" w:val="clear"/>
             <w:tcMar>
               <w:top w:type="dxa" w:w="80"/>
               <w:left w:type="dxa" w:w="120"/>
@@ -4449,7 +4509,6 @@
               <w:bottom w:val="single" w:color="D0D7D3" w:sz="4"/>
               <w:right w:val="single" w:color="D0D7D3" w:sz="4"/>
             </w:tcBorders>
-            <w:shd w:fill="F6F8F7" w:color="auto" w:val="clear"/>
             <w:tcMar>
               <w:top w:type="dxa" w:w="80"/>
               <w:left w:type="dxa" w:w="120"/>
@@ -4478,7 +4537,6 @@
               <w:bottom w:val="single" w:color="D0D7D3" w:sz="4"/>
               <w:right w:val="single" w:color="D0D7D3" w:sz="4"/>
             </w:tcBorders>
-            <w:shd w:fill="F6F8F7" w:color="auto" w:val="clear"/>
             <w:tcMar>
               <w:top w:type="dxa" w:w="80"/>
               <w:left w:type="dxa" w:w="120"/>
@@ -4509,6 +4567,7 @@
               <w:bottom w:val="single" w:color="D0D7D3" w:sz="4"/>
               <w:right w:val="single" w:color="D0D7D3" w:sz="4"/>
             </w:tcBorders>
+            <w:shd w:fill="F6F8F7" w:color="auto" w:val="clear"/>
             <w:tcMar>
               <w:top w:type="dxa" w:w="80"/>
               <w:left w:type="dxa" w:w="120"/>
@@ -4537,6 +4596,7 @@
               <w:bottom w:val="single" w:color="D0D7D3" w:sz="4"/>
               <w:right w:val="single" w:color="D0D7D3" w:sz="4"/>
             </w:tcBorders>
+            <w:shd w:fill="F6F8F7" w:color="auto" w:val="clear"/>
             <w:tcMar>
               <w:top w:type="dxa" w:w="80"/>
               <w:left w:type="dxa" w:w="120"/>
@@ -4567,7 +4627,6 @@
               <w:bottom w:val="single" w:color="D0D7D3" w:sz="4"/>
               <w:right w:val="single" w:color="D0D7D3" w:sz="4"/>
             </w:tcBorders>
-            <w:shd w:fill="F6F8F7" w:color="auto" w:val="clear"/>
             <w:tcMar>
               <w:top w:type="dxa" w:w="80"/>
               <w:left w:type="dxa" w:w="120"/>
@@ -4596,7 +4655,6 @@
               <w:bottom w:val="single" w:color="D0D7D3" w:sz="4"/>
               <w:right w:val="single" w:color="D0D7D3" w:sz="4"/>
             </w:tcBorders>
-            <w:shd w:fill="F6F8F7" w:color="auto" w:val="clear"/>
             <w:tcMar>
               <w:top w:type="dxa" w:w="80"/>
               <w:left w:type="dxa" w:w="120"/>
@@ -4627,6 +4685,7 @@
               <w:bottom w:val="single" w:color="D0D7D3" w:sz="4"/>
               <w:right w:val="single" w:color="D0D7D3" w:sz="4"/>
             </w:tcBorders>
+            <w:shd w:fill="F6F8F7" w:color="auto" w:val="clear"/>
             <w:tcMar>
               <w:top w:type="dxa" w:w="80"/>
               <w:left w:type="dxa" w:w="120"/>
@@ -4655,6 +4714,7 @@
               <w:bottom w:val="single" w:color="D0D7D3" w:sz="4"/>
               <w:right w:val="single" w:color="D0D7D3" w:sz="4"/>
             </w:tcBorders>
+            <w:shd w:fill="F6F8F7" w:color="auto" w:val="clear"/>
             <w:tcMar>
               <w:top w:type="dxa" w:w="80"/>
               <w:left w:type="dxa" w:w="120"/>
@@ -4685,7 +4745,6 @@
               <w:bottom w:val="single" w:color="D0D7D3" w:sz="4"/>
               <w:right w:val="single" w:color="D0D7D3" w:sz="4"/>
             </w:tcBorders>
-            <w:shd w:fill="F6F8F7" w:color="auto" w:val="clear"/>
             <w:tcMar>
               <w:top w:type="dxa" w:w="80"/>
               <w:left w:type="dxa" w:w="120"/>
@@ -4714,7 +4773,6 @@
               <w:bottom w:val="single" w:color="D0D7D3" w:sz="4"/>
               <w:right w:val="single" w:color="D0D7D3" w:sz="4"/>
             </w:tcBorders>
-            <w:shd w:fill="F6F8F7" w:color="auto" w:val="clear"/>
             <w:tcMar>
               <w:top w:type="dxa" w:w="80"/>
               <w:left w:type="dxa" w:w="120"/>
@@ -4745,6 +4803,7 @@
               <w:bottom w:val="single" w:color="D0D7D3" w:sz="4"/>
               <w:right w:val="single" w:color="D0D7D3" w:sz="4"/>
             </w:tcBorders>
+            <w:shd w:fill="F6F8F7" w:color="auto" w:val="clear"/>
             <w:tcMar>
               <w:top w:type="dxa" w:w="80"/>
               <w:left w:type="dxa" w:w="120"/>
@@ -4773,6 +4832,7 @@
               <w:bottom w:val="single" w:color="D0D7D3" w:sz="4"/>
               <w:right w:val="single" w:color="D0D7D3" w:sz="4"/>
             </w:tcBorders>
+            <w:shd w:fill="F6F8F7" w:color="auto" w:val="clear"/>
             <w:tcMar>
               <w:top w:type="dxa" w:w="80"/>
               <w:left w:type="dxa" w:w="120"/>
@@ -4803,7 +4863,6 @@
               <w:bottom w:val="single" w:color="D0D7D3" w:sz="4"/>
               <w:right w:val="single" w:color="D0D7D3" w:sz="4"/>
             </w:tcBorders>
-            <w:shd w:fill="F6F8F7" w:color="auto" w:val="clear"/>
             <w:tcMar>
               <w:top w:type="dxa" w:w="80"/>
               <w:left w:type="dxa" w:w="120"/>
@@ -4832,7 +4891,6 @@
               <w:bottom w:val="single" w:color="D0D7D3" w:sz="4"/>
               <w:right w:val="single" w:color="D0D7D3" w:sz="4"/>
             </w:tcBorders>
-            <w:shd w:fill="F6F8F7" w:color="auto" w:val="clear"/>
             <w:tcMar>
               <w:top w:type="dxa" w:w="80"/>
               <w:left w:type="dxa" w:w="120"/>
@@ -4863,6 +4921,7 @@
               <w:bottom w:val="single" w:color="D0D7D3" w:sz="4"/>
               <w:right w:val="single" w:color="D0D7D3" w:sz="4"/>
             </w:tcBorders>
+            <w:shd w:fill="F6F8F7" w:color="auto" w:val="clear"/>
             <w:tcMar>
               <w:top w:type="dxa" w:w="80"/>
               <w:left w:type="dxa" w:w="120"/>
@@ -4891,6 +4950,7 @@
               <w:bottom w:val="single" w:color="D0D7D3" w:sz="4"/>
               <w:right w:val="single" w:color="D0D7D3" w:sz="4"/>
             </w:tcBorders>
+            <w:shd w:fill="F6F8F7" w:color="auto" w:val="clear"/>
             <w:tcMar>
               <w:top w:type="dxa" w:w="80"/>
               <w:left w:type="dxa" w:w="120"/>
@@ -4921,7 +4981,6 @@
               <w:bottom w:val="single" w:color="D0D7D3" w:sz="4"/>
               <w:right w:val="single" w:color="D0D7D3" w:sz="4"/>
             </w:tcBorders>
-            <w:shd w:fill="F6F8F7" w:color="auto" w:val="clear"/>
             <w:tcMar>
               <w:top w:type="dxa" w:w="80"/>
               <w:left w:type="dxa" w:w="120"/>
@@ -4950,7 +5009,6 @@
               <w:bottom w:val="single" w:color="D0D7D3" w:sz="4"/>
               <w:right w:val="single" w:color="D0D7D3" w:sz="4"/>
             </w:tcBorders>
-            <w:shd w:fill="F6F8F7" w:color="auto" w:val="clear"/>
             <w:tcMar>
               <w:top w:type="dxa" w:w="80"/>
               <w:left w:type="dxa" w:w="120"/>
@@ -4981,6 +5039,7 @@
               <w:bottom w:val="single" w:color="D0D7D3" w:sz="4"/>
               <w:right w:val="single" w:color="D0D7D3" w:sz="4"/>
             </w:tcBorders>
+            <w:shd w:fill="F6F8F7" w:color="auto" w:val="clear"/>
             <w:tcMar>
               <w:top w:type="dxa" w:w="80"/>
               <w:left w:type="dxa" w:w="120"/>
@@ -5009,6 +5068,7 @@
               <w:bottom w:val="single" w:color="D0D7D3" w:sz="4"/>
               <w:right w:val="single" w:color="D0D7D3" w:sz="4"/>
             </w:tcBorders>
+            <w:shd w:fill="F6F8F7" w:color="auto" w:val="clear"/>
             <w:tcMar>
               <w:top w:type="dxa" w:w="80"/>
               <w:left w:type="dxa" w:w="120"/>
@@ -5039,7 +5099,6 @@
               <w:bottom w:val="single" w:color="D0D7D3" w:sz="4"/>
               <w:right w:val="single" w:color="D0D7D3" w:sz="4"/>
             </w:tcBorders>
-            <w:shd w:fill="F6F8F7" w:color="auto" w:val="clear"/>
             <w:tcMar>
               <w:top w:type="dxa" w:w="80"/>
               <w:left w:type="dxa" w:w="120"/>
@@ -5068,7 +5127,6 @@
               <w:bottom w:val="single" w:color="D0D7D3" w:sz="4"/>
               <w:right w:val="single" w:color="D0D7D3" w:sz="4"/>
             </w:tcBorders>
-            <w:shd w:fill="F6F8F7" w:color="auto" w:val="clear"/>
             <w:tcMar>
               <w:top w:type="dxa" w:w="80"/>
               <w:left w:type="dxa" w:w="120"/>
@@ -5099,6 +5157,7 @@
               <w:bottom w:val="single" w:color="D0D7D3" w:sz="4"/>
               <w:right w:val="single" w:color="D0D7D3" w:sz="4"/>
             </w:tcBorders>
+            <w:shd w:fill="F6F8F7" w:color="auto" w:val="clear"/>
             <w:tcMar>
               <w:top w:type="dxa" w:w="80"/>
               <w:left w:type="dxa" w:w="120"/>
@@ -5127,6 +5186,7 @@
               <w:bottom w:val="single" w:color="D0D7D3" w:sz="4"/>
               <w:right w:val="single" w:color="D0D7D3" w:sz="4"/>
             </w:tcBorders>
+            <w:shd w:fill="F6F8F7" w:color="auto" w:val="clear"/>
             <w:tcMar>
               <w:top w:type="dxa" w:w="80"/>
               <w:left w:type="dxa" w:w="120"/>
@@ -5157,7 +5217,6 @@
               <w:bottom w:val="single" w:color="D0D7D3" w:sz="4"/>
               <w:right w:val="single" w:color="D0D7D3" w:sz="4"/>
             </w:tcBorders>
-            <w:shd w:fill="F6F8F7" w:color="auto" w:val="clear"/>
             <w:tcMar>
               <w:top w:type="dxa" w:w="80"/>
               <w:left w:type="dxa" w:w="120"/>
@@ -5186,7 +5245,6 @@
               <w:bottom w:val="single" w:color="D0D7D3" w:sz="4"/>
               <w:right w:val="single" w:color="D0D7D3" w:sz="4"/>
             </w:tcBorders>
-            <w:shd w:fill="F6F8F7" w:color="auto" w:val="clear"/>
             <w:tcMar>
               <w:top w:type="dxa" w:w="80"/>
               <w:left w:type="dxa" w:w="120"/>
@@ -5217,6 +5275,7 @@
               <w:bottom w:val="single" w:color="D0D7D3" w:sz="4"/>
               <w:right w:val="single" w:color="D0D7D3" w:sz="4"/>
             </w:tcBorders>
+            <w:shd w:fill="F6F8F7" w:color="auto" w:val="clear"/>
             <w:tcMar>
               <w:top w:type="dxa" w:w="80"/>
               <w:left w:type="dxa" w:w="120"/>
@@ -5245,6 +5304,7 @@
               <w:bottom w:val="single" w:color="D0D7D3" w:sz="4"/>
               <w:right w:val="single" w:color="D0D7D3" w:sz="4"/>
             </w:tcBorders>
+            <w:shd w:fill="F6F8F7" w:color="auto" w:val="clear"/>
             <w:tcMar>
               <w:top w:type="dxa" w:w="80"/>
               <w:left w:type="dxa" w:w="120"/>
@@ -5275,7 +5335,6 @@
               <w:bottom w:val="single" w:color="D0D7D3" w:sz="4"/>
               <w:right w:val="single" w:color="D0D7D3" w:sz="4"/>
             </w:tcBorders>
-            <w:shd w:fill="F6F8F7" w:color="auto" w:val="clear"/>
             <w:tcMar>
               <w:top w:type="dxa" w:w="80"/>
               <w:left w:type="dxa" w:w="120"/>
@@ -5304,7 +5363,6 @@
               <w:bottom w:val="single" w:color="D0D7D3" w:sz="4"/>
               <w:right w:val="single" w:color="D0D7D3" w:sz="4"/>
             </w:tcBorders>
-            <w:shd w:fill="F6F8F7" w:color="auto" w:val="clear"/>
             <w:tcMar>
               <w:top w:type="dxa" w:w="80"/>
               <w:left w:type="dxa" w:w="120"/>
@@ -5335,6 +5393,7 @@
               <w:bottom w:val="single" w:color="D0D7D3" w:sz="4"/>
               <w:right w:val="single" w:color="D0D7D3" w:sz="4"/>
             </w:tcBorders>
+            <w:shd w:fill="F6F8F7" w:color="auto" w:val="clear"/>
             <w:tcMar>
               <w:top w:type="dxa" w:w="80"/>
               <w:left w:type="dxa" w:w="120"/>
@@ -5363,6 +5422,7 @@
               <w:bottom w:val="single" w:color="D0D7D3" w:sz="4"/>
               <w:right w:val="single" w:color="D0D7D3" w:sz="4"/>
             </w:tcBorders>
+            <w:shd w:fill="F6F8F7" w:color="auto" w:val="clear"/>
             <w:tcMar>
               <w:top w:type="dxa" w:w="80"/>
               <w:left w:type="dxa" w:w="120"/>
@@ -5393,7 +5453,6 @@
               <w:bottom w:val="single" w:color="D0D7D3" w:sz="4"/>
               <w:right w:val="single" w:color="D0D7D3" w:sz="4"/>
             </w:tcBorders>
-            <w:shd w:fill="F6F8F7" w:color="auto" w:val="clear"/>
             <w:tcMar>
               <w:top w:type="dxa" w:w="80"/>
               <w:left w:type="dxa" w:w="120"/>
@@ -5422,7 +5481,6 @@
               <w:bottom w:val="single" w:color="D0D7D3" w:sz="4"/>
               <w:right w:val="single" w:color="D0D7D3" w:sz="4"/>
             </w:tcBorders>
-            <w:shd w:fill="F6F8F7" w:color="auto" w:val="clear"/>
             <w:tcMar>
               <w:top w:type="dxa" w:w="80"/>
               <w:left w:type="dxa" w:w="120"/>
@@ -5453,6 +5511,7 @@
               <w:bottom w:val="single" w:color="D0D7D3" w:sz="4"/>
               <w:right w:val="single" w:color="D0D7D3" w:sz="4"/>
             </w:tcBorders>
+            <w:shd w:fill="F6F8F7" w:color="auto" w:val="clear"/>
             <w:tcMar>
               <w:top w:type="dxa" w:w="80"/>
               <w:left w:type="dxa" w:w="120"/>
@@ -5481,6 +5540,7 @@
               <w:bottom w:val="single" w:color="D0D7D3" w:sz="4"/>
               <w:right w:val="single" w:color="D0D7D3" w:sz="4"/>
             </w:tcBorders>
+            <w:shd w:fill="F6F8F7" w:color="auto" w:val="clear"/>
             <w:tcMar>
               <w:top w:type="dxa" w:w="80"/>
               <w:left w:type="dxa" w:w="120"/>
@@ -5511,7 +5571,6 @@
               <w:bottom w:val="single" w:color="D0D7D3" w:sz="4"/>
               <w:right w:val="single" w:color="D0D7D3" w:sz="4"/>
             </w:tcBorders>
-            <w:shd w:fill="F6F8F7" w:color="auto" w:val="clear"/>
             <w:tcMar>
               <w:top w:type="dxa" w:w="80"/>
               <w:left w:type="dxa" w:w="120"/>
@@ -5540,7 +5599,6 @@
               <w:bottom w:val="single" w:color="D0D7D3" w:sz="4"/>
               <w:right w:val="single" w:color="D0D7D3" w:sz="4"/>
             </w:tcBorders>
-            <w:shd w:fill="F6F8F7" w:color="auto" w:val="clear"/>
             <w:tcMar>
               <w:top w:type="dxa" w:w="80"/>
               <w:left w:type="dxa" w:w="120"/>
@@ -5571,6 +5629,7 @@
               <w:bottom w:val="single" w:color="D0D7D3" w:sz="4"/>
               <w:right w:val="single" w:color="D0D7D3" w:sz="4"/>
             </w:tcBorders>
+            <w:shd w:fill="F6F8F7" w:color="auto" w:val="clear"/>
             <w:tcMar>
               <w:top w:type="dxa" w:w="80"/>
               <w:left w:type="dxa" w:w="120"/>
@@ -5599,6 +5658,7 @@
               <w:bottom w:val="single" w:color="D0D7D3" w:sz="4"/>
               <w:right w:val="single" w:color="D0D7D3" w:sz="4"/>
             </w:tcBorders>
+            <w:shd w:fill="F6F8F7" w:color="auto" w:val="clear"/>
             <w:tcMar>
               <w:top w:type="dxa" w:w="80"/>
               <w:left w:type="dxa" w:w="120"/>
@@ -5629,7 +5689,6 @@
               <w:bottom w:val="single" w:color="D0D7D3" w:sz="4"/>
               <w:right w:val="single" w:color="D0D7D3" w:sz="4"/>
             </w:tcBorders>
-            <w:shd w:fill="F6F8F7" w:color="auto" w:val="clear"/>
             <w:tcMar>
               <w:top w:type="dxa" w:w="80"/>
               <w:left w:type="dxa" w:w="120"/>
@@ -5658,7 +5717,6 @@
               <w:bottom w:val="single" w:color="D0D7D3" w:sz="4"/>
               <w:right w:val="single" w:color="D0D7D3" w:sz="4"/>
             </w:tcBorders>
-            <w:shd w:fill="F6F8F7" w:color="auto" w:val="clear"/>
             <w:tcMar>
               <w:top w:type="dxa" w:w="80"/>
               <w:left w:type="dxa" w:w="120"/>
@@ -5689,6 +5747,7 @@
               <w:bottom w:val="single" w:color="D0D7D3" w:sz="4"/>
               <w:right w:val="single" w:color="D0D7D3" w:sz="4"/>
             </w:tcBorders>
+            <w:shd w:fill="F6F8F7" w:color="auto" w:val="clear"/>
             <w:tcMar>
               <w:top w:type="dxa" w:w="80"/>
               <w:left w:type="dxa" w:w="120"/>
@@ -5717,6 +5776,7 @@
               <w:bottom w:val="single" w:color="D0D7D3" w:sz="4"/>
               <w:right w:val="single" w:color="D0D7D3" w:sz="4"/>
             </w:tcBorders>
+            <w:shd w:fill="F6F8F7" w:color="auto" w:val="clear"/>
             <w:tcMar>
               <w:top w:type="dxa" w:w="80"/>
               <w:left w:type="dxa" w:w="120"/>
@@ -5747,7 +5807,6 @@
               <w:bottom w:val="single" w:color="D0D7D3" w:sz="4"/>
               <w:right w:val="single" w:color="D0D7D3" w:sz="4"/>
             </w:tcBorders>
-            <w:shd w:fill="F6F8F7" w:color="auto" w:val="clear"/>
             <w:tcMar>
               <w:top w:type="dxa" w:w="80"/>
               <w:left w:type="dxa" w:w="120"/>
@@ -5776,7 +5835,6 @@
               <w:bottom w:val="single" w:color="D0D7D3" w:sz="4"/>
               <w:right w:val="single" w:color="D0D7D3" w:sz="4"/>
             </w:tcBorders>
-            <w:shd w:fill="F6F8F7" w:color="auto" w:val="clear"/>
             <w:tcMar>
               <w:top w:type="dxa" w:w="80"/>
               <w:left w:type="dxa" w:w="120"/>
@@ -5807,6 +5865,7 @@
               <w:bottom w:val="single" w:color="D0D7D3" w:sz="4"/>
               <w:right w:val="single" w:color="D0D7D3" w:sz="4"/>
             </w:tcBorders>
+            <w:shd w:fill="F6F8F7" w:color="auto" w:val="clear"/>
             <w:tcMar>
               <w:top w:type="dxa" w:w="80"/>
               <w:left w:type="dxa" w:w="120"/>
@@ -5835,6 +5894,7 @@
               <w:bottom w:val="single" w:color="D0D7D3" w:sz="4"/>
               <w:right w:val="single" w:color="D0D7D3" w:sz="4"/>
             </w:tcBorders>
+            <w:shd w:fill="F6F8F7" w:color="auto" w:val="clear"/>
             <w:tcMar>
               <w:top w:type="dxa" w:w="80"/>
               <w:left w:type="dxa" w:w="120"/>
@@ -5865,7 +5925,6 @@
               <w:bottom w:val="single" w:color="D0D7D3" w:sz="4"/>
               <w:right w:val="single" w:color="D0D7D3" w:sz="4"/>
             </w:tcBorders>
-            <w:shd w:fill="F6F8F7" w:color="auto" w:val="clear"/>
             <w:tcMar>
               <w:top w:type="dxa" w:w="80"/>
               <w:left w:type="dxa" w:w="120"/>
@@ -5894,7 +5953,6 @@
               <w:bottom w:val="single" w:color="D0D7D3" w:sz="4"/>
               <w:right w:val="single" w:color="D0D7D3" w:sz="4"/>
             </w:tcBorders>
-            <w:shd w:fill="F6F8F7" w:color="auto" w:val="clear"/>
             <w:tcMar>
               <w:top w:type="dxa" w:w="80"/>
               <w:left w:type="dxa" w:w="120"/>
@@ -5925,6 +5983,7 @@
               <w:bottom w:val="single" w:color="D0D7D3" w:sz="4"/>
               <w:right w:val="single" w:color="D0D7D3" w:sz="4"/>
             </w:tcBorders>
+            <w:shd w:fill="F6F8F7" w:color="auto" w:val="clear"/>
             <w:tcMar>
               <w:top w:type="dxa" w:w="80"/>
               <w:left w:type="dxa" w:w="120"/>
@@ -5953,6 +6012,7 @@
               <w:bottom w:val="single" w:color="D0D7D3" w:sz="4"/>
               <w:right w:val="single" w:color="D0D7D3" w:sz="4"/>
             </w:tcBorders>
+            <w:shd w:fill="F6F8F7" w:color="auto" w:val="clear"/>
             <w:tcMar>
               <w:top w:type="dxa" w:w="80"/>
               <w:left w:type="dxa" w:w="120"/>
@@ -5983,7 +6043,6 @@
               <w:bottom w:val="single" w:color="D0D7D3" w:sz="4"/>
               <w:right w:val="single" w:color="D0D7D3" w:sz="4"/>
             </w:tcBorders>
-            <w:shd w:fill="F6F8F7" w:color="auto" w:val="clear"/>
             <w:tcMar>
               <w:top w:type="dxa" w:w="80"/>
               <w:left w:type="dxa" w:w="120"/>
@@ -6012,7 +6071,6 @@
               <w:bottom w:val="single" w:color="D0D7D3" w:sz="4"/>
               <w:right w:val="single" w:color="D0D7D3" w:sz="4"/>
             </w:tcBorders>
-            <w:shd w:fill="F6F8F7" w:color="auto" w:val="clear"/>
             <w:tcMar>
               <w:top w:type="dxa" w:w="80"/>
               <w:left w:type="dxa" w:w="120"/>
@@ -6043,6 +6101,7 @@
               <w:bottom w:val="single" w:color="D0D7D3" w:sz="4"/>
               <w:right w:val="single" w:color="D0D7D3" w:sz="4"/>
             </w:tcBorders>
+            <w:shd w:fill="F6F8F7" w:color="auto" w:val="clear"/>
             <w:tcMar>
               <w:top w:type="dxa" w:w="80"/>
               <w:left w:type="dxa" w:w="120"/>
@@ -6071,6 +6130,7 @@
               <w:bottom w:val="single" w:color="D0D7D3" w:sz="4"/>
               <w:right w:val="single" w:color="D0D7D3" w:sz="4"/>
             </w:tcBorders>
+            <w:shd w:fill="F6F8F7" w:color="auto" w:val="clear"/>
             <w:tcMar>
               <w:top w:type="dxa" w:w="80"/>
               <w:left w:type="dxa" w:w="120"/>
@@ -6101,7 +6161,6 @@
               <w:bottom w:val="single" w:color="D0D7D3" w:sz="4"/>
               <w:right w:val="single" w:color="D0D7D3" w:sz="4"/>
             </w:tcBorders>
-            <w:shd w:fill="F6F8F7" w:color="auto" w:val="clear"/>
             <w:tcMar>
               <w:top w:type="dxa" w:w="80"/>
               <w:left w:type="dxa" w:w="120"/>
@@ -6130,7 +6189,6 @@
               <w:bottom w:val="single" w:color="D0D7D3" w:sz="4"/>
               <w:right w:val="single" w:color="D0D7D3" w:sz="4"/>
             </w:tcBorders>
-            <w:shd w:fill="F6F8F7" w:color="auto" w:val="clear"/>
             <w:tcMar>
               <w:top w:type="dxa" w:w="80"/>
               <w:left w:type="dxa" w:w="120"/>
@@ -6161,6 +6219,7 @@
               <w:bottom w:val="single" w:color="D0D7D3" w:sz="4"/>
               <w:right w:val="single" w:color="D0D7D3" w:sz="4"/>
             </w:tcBorders>
+            <w:shd w:fill="F6F8F7" w:color="auto" w:val="clear"/>
             <w:tcMar>
               <w:top w:type="dxa" w:w="80"/>
               <w:left w:type="dxa" w:w="120"/>
@@ -6189,6 +6248,7 @@
               <w:bottom w:val="single" w:color="D0D7D3" w:sz="4"/>
               <w:right w:val="single" w:color="D0D7D3" w:sz="4"/>
             </w:tcBorders>
+            <w:shd w:fill="F6F8F7" w:color="auto" w:val="clear"/>
             <w:tcMar>
               <w:top w:type="dxa" w:w="80"/>
               <w:left w:type="dxa" w:w="120"/>
@@ -6219,7 +6279,6 @@
               <w:bottom w:val="single" w:color="D0D7D3" w:sz="4"/>
               <w:right w:val="single" w:color="D0D7D3" w:sz="4"/>
             </w:tcBorders>
-            <w:shd w:fill="F6F8F7" w:color="auto" w:val="clear"/>
             <w:tcMar>
               <w:top w:type="dxa" w:w="80"/>
               <w:left w:type="dxa" w:w="120"/>
@@ -6248,7 +6307,6 @@
               <w:bottom w:val="single" w:color="D0D7D3" w:sz="4"/>
               <w:right w:val="single" w:color="D0D7D3" w:sz="4"/>
             </w:tcBorders>
-            <w:shd w:fill="F6F8F7" w:color="auto" w:val="clear"/>
             <w:tcMar>
               <w:top w:type="dxa" w:w="80"/>
               <w:left w:type="dxa" w:w="120"/>
@@ -6279,6 +6337,7 @@
               <w:bottom w:val="single" w:color="D0D7D3" w:sz="4"/>
               <w:right w:val="single" w:color="D0D7D3" w:sz="4"/>
             </w:tcBorders>
+            <w:shd w:fill="F6F8F7" w:color="auto" w:val="clear"/>
             <w:tcMar>
               <w:top w:type="dxa" w:w="80"/>
               <w:left w:type="dxa" w:w="120"/>
@@ -6307,6 +6366,7 @@
               <w:bottom w:val="single" w:color="D0D7D3" w:sz="4"/>
               <w:right w:val="single" w:color="D0D7D3" w:sz="4"/>
             </w:tcBorders>
+            <w:shd w:fill="F6F8F7" w:color="auto" w:val="clear"/>
             <w:tcMar>
               <w:top w:type="dxa" w:w="80"/>
               <w:left w:type="dxa" w:w="120"/>
@@ -6337,7 +6397,6 @@
               <w:bottom w:val="single" w:color="D0D7D3" w:sz="4"/>
               <w:right w:val="single" w:color="D0D7D3" w:sz="4"/>
             </w:tcBorders>
-            <w:shd w:fill="F6F8F7" w:color="auto" w:val="clear"/>
             <w:tcMar>
               <w:top w:type="dxa" w:w="80"/>
               <w:left w:type="dxa" w:w="120"/>
@@ -6366,7 +6425,6 @@
               <w:bottom w:val="single" w:color="D0D7D3" w:sz="4"/>
               <w:right w:val="single" w:color="D0D7D3" w:sz="4"/>
             </w:tcBorders>
-            <w:shd w:fill="F6F8F7" w:color="auto" w:val="clear"/>
             <w:tcMar>
               <w:top w:type="dxa" w:w="80"/>
               <w:left w:type="dxa" w:w="120"/>
@@ -6397,6 +6455,7 @@
               <w:bottom w:val="single" w:color="D0D7D3" w:sz="4"/>
               <w:right w:val="single" w:color="D0D7D3" w:sz="4"/>
             </w:tcBorders>
+            <w:shd w:fill="F6F8F7" w:color="auto" w:val="clear"/>
             <w:tcMar>
               <w:top w:type="dxa" w:w="80"/>
               <w:left w:type="dxa" w:w="120"/>
@@ -6425,6 +6484,7 @@
               <w:bottom w:val="single" w:color="D0D7D3" w:sz="4"/>
               <w:right w:val="single" w:color="D0D7D3" w:sz="4"/>
             </w:tcBorders>
+            <w:shd w:fill="F6F8F7" w:color="auto" w:val="clear"/>
             <w:tcMar>
               <w:top w:type="dxa" w:w="80"/>
               <w:left w:type="dxa" w:w="120"/>
@@ -6455,7 +6515,6 @@
               <w:bottom w:val="single" w:color="D0D7D3" w:sz="4"/>
               <w:right w:val="single" w:color="D0D7D3" w:sz="4"/>
             </w:tcBorders>
-            <w:shd w:fill="F6F8F7" w:color="auto" w:val="clear"/>
             <w:tcMar>
               <w:top w:type="dxa" w:w="80"/>
               <w:left w:type="dxa" w:w="120"/>
@@ -6484,7 +6543,6 @@
               <w:bottom w:val="single" w:color="D0D7D3" w:sz="4"/>
               <w:right w:val="single" w:color="D0D7D3" w:sz="4"/>
             </w:tcBorders>
-            <w:shd w:fill="F6F8F7" w:color="auto" w:val="clear"/>
             <w:tcMar>
               <w:top w:type="dxa" w:w="80"/>
               <w:left w:type="dxa" w:w="120"/>
@@ -6515,6 +6573,7 @@
               <w:bottom w:val="single" w:color="D0D7D3" w:sz="4"/>
               <w:right w:val="single" w:color="D0D7D3" w:sz="4"/>
             </w:tcBorders>
+            <w:shd w:fill="F6F8F7" w:color="auto" w:val="clear"/>
             <w:tcMar>
               <w:top w:type="dxa" w:w="80"/>
               <w:left w:type="dxa" w:w="120"/>
@@ -6543,6 +6602,7 @@
               <w:bottom w:val="single" w:color="D0D7D3" w:sz="4"/>
               <w:right w:val="single" w:color="D0D7D3" w:sz="4"/>
             </w:tcBorders>
+            <w:shd w:fill="F6F8F7" w:color="auto" w:val="clear"/>
             <w:tcMar>
               <w:top w:type="dxa" w:w="80"/>
               <w:left w:type="dxa" w:w="120"/>
@@ -6573,7 +6633,6 @@
               <w:bottom w:val="single" w:color="D0D7D3" w:sz="4"/>
               <w:right w:val="single" w:color="D0D7D3" w:sz="4"/>
             </w:tcBorders>
-            <w:shd w:fill="F6F8F7" w:color="auto" w:val="clear"/>
             <w:tcMar>
               <w:top w:type="dxa" w:w="80"/>
               <w:left w:type="dxa" w:w="120"/>
@@ -6602,7 +6661,6 @@
               <w:bottom w:val="single" w:color="D0D7D3" w:sz="4"/>
               <w:right w:val="single" w:color="D0D7D3" w:sz="4"/>
             </w:tcBorders>
-            <w:shd w:fill="F6F8F7" w:color="auto" w:val="clear"/>
             <w:tcMar>
               <w:top w:type="dxa" w:w="80"/>
               <w:left w:type="dxa" w:w="120"/>
@@ -6633,6 +6691,7 @@
               <w:bottom w:val="single" w:color="D0D7D3" w:sz="4"/>
               <w:right w:val="single" w:color="D0D7D3" w:sz="4"/>
             </w:tcBorders>
+            <w:shd w:fill="F6F8F7" w:color="auto" w:val="clear"/>
             <w:tcMar>
               <w:top w:type="dxa" w:w="80"/>
               <w:left w:type="dxa" w:w="120"/>
@@ -6661,6 +6720,7 @@
               <w:bottom w:val="single" w:color="D0D7D3" w:sz="4"/>
               <w:right w:val="single" w:color="D0D7D3" w:sz="4"/>
             </w:tcBorders>
+            <w:shd w:fill="F6F8F7" w:color="auto" w:val="clear"/>
             <w:tcMar>
               <w:top w:type="dxa" w:w="80"/>
               <w:left w:type="dxa" w:w="120"/>
@@ -6691,7 +6751,6 @@
               <w:bottom w:val="single" w:color="D0D7D3" w:sz="4"/>
               <w:right w:val="single" w:color="D0D7D3" w:sz="4"/>
             </w:tcBorders>
-            <w:shd w:fill="F6F8F7" w:color="auto" w:val="clear"/>
             <w:tcMar>
               <w:top w:type="dxa" w:w="80"/>
               <w:left w:type="dxa" w:w="120"/>
@@ -6720,7 +6779,6 @@
               <w:bottom w:val="single" w:color="D0D7D3" w:sz="4"/>
               <w:right w:val="single" w:color="D0D7D3" w:sz="4"/>
             </w:tcBorders>
-            <w:shd w:fill="F6F8F7" w:color="auto" w:val="clear"/>
             <w:tcMar>
               <w:top w:type="dxa" w:w="80"/>
               <w:left w:type="dxa" w:w="120"/>
@@ -6751,6 +6809,7 @@
               <w:bottom w:val="single" w:color="D0D7D3" w:sz="4"/>
               <w:right w:val="single" w:color="D0D7D3" w:sz="4"/>
             </w:tcBorders>
+            <w:shd w:fill="F6F8F7" w:color="auto" w:val="clear"/>
             <w:tcMar>
               <w:top w:type="dxa" w:w="80"/>
               <w:left w:type="dxa" w:w="120"/>
@@ -6779,6 +6838,7 @@
               <w:bottom w:val="single" w:color="D0D7D3" w:sz="4"/>
               <w:right w:val="single" w:color="D0D7D3" w:sz="4"/>
             </w:tcBorders>
+            <w:shd w:fill="F6F8F7" w:color="auto" w:val="clear"/>
             <w:tcMar>
               <w:top w:type="dxa" w:w="80"/>
               <w:left w:type="dxa" w:w="120"/>

</xml_diff>

<commit_message>
Expenses and income against expenditure
Schools record what they spend by category (defaults made on first look, their
own added, renamed or retired), who was paid, what for and from where (cash,
bank or card). One person records, another approves or rejects; an approved
expense that was wrong is voided with a reason and nothing is deleted. Cash
spending comes off what the cash book says should be in the drawer, with its own
column, per-staff total and late-entry flag. The income and expenditure report
sets money received by method against approved spending by category, with the
surplus or deficit and what awaits approval. New console page: Expenses.
</commit_message>
<xml_diff>
--- a/docs/product/WardPay - what it does.docx
+++ b/docs/product/WardPay - what it does.docx
@@ -4434,6 +4434,66 @@
                 <w:sz w:val="20"/>
                 <w:szCs w:val="20"/>
               </w:rPr>
+              <w:t xml:space="preserve">Expenses with a second person’s approval, cash spending off the drawer, and income against expenditure</w:t>
+            </w:r>
+          </w:p>
+        </w:tc>
+      </w:tr>
+      <w:tr>
+        <w:tc>
+          <w:tcPr>
+            <w:tcW w:type="dxa" w:w="1800"/>
+            <w:tcBorders>
+              <w:top w:val="single" w:color="D0D7D3" w:sz="4"/>
+              <w:left w:val="single" w:color="D0D7D3" w:sz="4"/>
+              <w:bottom w:val="single" w:color="D0D7D3" w:sz="4"/>
+              <w:right w:val="single" w:color="D0D7D3" w:sz="4"/>
+            </w:tcBorders>
+            <w:shd w:fill="F6F8F7" w:color="auto" w:val="clear"/>
+            <w:tcMar>
+              <w:top w:type="dxa" w:w="80"/>
+              <w:left w:type="dxa" w:w="120"/>
+              <w:bottom w:type="dxa" w:w="80"/>
+              <w:right w:type="dxa" w:w="120"/>
+            </w:tcMar>
+          </w:tcPr>
+          <w:p>
+            <w:r>
+              <w:rPr>
+                <w:b w:val="false"/>
+                <w:bCs w:val="false"/>
+                <w:sz w:val="20"/>
+                <w:szCs w:val="20"/>
+              </w:rPr>
+              <w:t xml:space="preserve">24 Oct 2026</w:t>
+            </w:r>
+          </w:p>
+        </w:tc>
+        <w:tc>
+          <w:tcPr>
+            <w:tcW w:type="dxa" w:w="7838"/>
+            <w:tcBorders>
+              <w:top w:val="single" w:color="D0D7D3" w:sz="4"/>
+              <w:left w:val="single" w:color="D0D7D3" w:sz="4"/>
+              <w:bottom w:val="single" w:color="D0D7D3" w:sz="4"/>
+              <w:right w:val="single" w:color="D0D7D3" w:sz="4"/>
+            </w:tcBorders>
+            <w:shd w:fill="F6F8F7" w:color="auto" w:val="clear"/>
+            <w:tcMar>
+              <w:top w:type="dxa" w:w="80"/>
+              <w:left w:type="dxa" w:w="120"/>
+              <w:bottom w:type="dxa" w:w="80"/>
+              <w:right w:type="dxa" w:w="120"/>
+            </w:tcMar>
+          </w:tcPr>
+          <w:p>
+            <w:r>
+              <w:rPr>
+                <w:b w:val="false"/>
+                <w:bCs w:val="false"/>
+                <w:sz w:val="20"/>
+                <w:szCs w:val="20"/>
+              </w:rPr>
               <w:t xml:space="preserve">Cash book: what should be in the drawer, cash banked (checked by a second person), daily cash counts and late entries flagged</w:t>
             </w:r>
           </w:p>
@@ -4449,7 +4509,6 @@
               <w:bottom w:val="single" w:color="D0D7D3" w:sz="4"/>
               <w:right w:val="single" w:color="D0D7D3" w:sz="4"/>
             </w:tcBorders>
-            <w:shd w:fill="F6F8F7" w:color="auto" w:val="clear"/>
             <w:tcMar>
               <w:top w:type="dxa" w:w="80"/>
               <w:left w:type="dxa" w:w="120"/>
@@ -4478,7 +4537,6 @@
               <w:bottom w:val="single" w:color="D0D7D3" w:sz="4"/>
               <w:right w:val="single" w:color="D0D7D3" w:sz="4"/>
             </w:tcBorders>
-            <w:shd w:fill="F6F8F7" w:color="auto" w:val="clear"/>
             <w:tcMar>
               <w:top w:type="dxa" w:w="80"/>
               <w:left w:type="dxa" w:w="120"/>
@@ -4509,6 +4567,7 @@
               <w:bottom w:val="single" w:color="D0D7D3" w:sz="4"/>
               <w:right w:val="single" w:color="D0D7D3" w:sz="4"/>
             </w:tcBorders>
+            <w:shd w:fill="F6F8F7" w:color="auto" w:val="clear"/>
             <w:tcMar>
               <w:top w:type="dxa" w:w="80"/>
               <w:left w:type="dxa" w:w="120"/>
@@ -4537,6 +4596,7 @@
               <w:bottom w:val="single" w:color="D0D7D3" w:sz="4"/>
               <w:right w:val="single" w:color="D0D7D3" w:sz="4"/>
             </w:tcBorders>
+            <w:shd w:fill="F6F8F7" w:color="auto" w:val="clear"/>
             <w:tcMar>
               <w:top w:type="dxa" w:w="80"/>
               <w:left w:type="dxa" w:w="120"/>
@@ -4567,7 +4627,6 @@
               <w:bottom w:val="single" w:color="D0D7D3" w:sz="4"/>
               <w:right w:val="single" w:color="D0D7D3" w:sz="4"/>
             </w:tcBorders>
-            <w:shd w:fill="F6F8F7" w:color="auto" w:val="clear"/>
             <w:tcMar>
               <w:top w:type="dxa" w:w="80"/>
               <w:left w:type="dxa" w:w="120"/>
@@ -4596,7 +4655,6 @@
               <w:bottom w:val="single" w:color="D0D7D3" w:sz="4"/>
               <w:right w:val="single" w:color="D0D7D3" w:sz="4"/>
             </w:tcBorders>
-            <w:shd w:fill="F6F8F7" w:color="auto" w:val="clear"/>
             <w:tcMar>
               <w:top w:type="dxa" w:w="80"/>
               <w:left w:type="dxa" w:w="120"/>
@@ -4627,6 +4685,7 @@
               <w:bottom w:val="single" w:color="D0D7D3" w:sz="4"/>
               <w:right w:val="single" w:color="D0D7D3" w:sz="4"/>
             </w:tcBorders>
+            <w:shd w:fill="F6F8F7" w:color="auto" w:val="clear"/>
             <w:tcMar>
               <w:top w:type="dxa" w:w="80"/>
               <w:left w:type="dxa" w:w="120"/>
@@ -4655,6 +4714,7 @@
               <w:bottom w:val="single" w:color="D0D7D3" w:sz="4"/>
               <w:right w:val="single" w:color="D0D7D3" w:sz="4"/>
             </w:tcBorders>
+            <w:shd w:fill="F6F8F7" w:color="auto" w:val="clear"/>
             <w:tcMar>
               <w:top w:type="dxa" w:w="80"/>
               <w:left w:type="dxa" w:w="120"/>
@@ -4685,7 +4745,6 @@
               <w:bottom w:val="single" w:color="D0D7D3" w:sz="4"/>
               <w:right w:val="single" w:color="D0D7D3" w:sz="4"/>
             </w:tcBorders>
-            <w:shd w:fill="F6F8F7" w:color="auto" w:val="clear"/>
             <w:tcMar>
               <w:top w:type="dxa" w:w="80"/>
               <w:left w:type="dxa" w:w="120"/>
@@ -4714,7 +4773,6 @@
               <w:bottom w:val="single" w:color="D0D7D3" w:sz="4"/>
               <w:right w:val="single" w:color="D0D7D3" w:sz="4"/>
             </w:tcBorders>
-            <w:shd w:fill="F6F8F7" w:color="auto" w:val="clear"/>
             <w:tcMar>
               <w:top w:type="dxa" w:w="80"/>
               <w:left w:type="dxa" w:w="120"/>
@@ -4745,6 +4803,7 @@
               <w:bottom w:val="single" w:color="D0D7D3" w:sz="4"/>
               <w:right w:val="single" w:color="D0D7D3" w:sz="4"/>
             </w:tcBorders>
+            <w:shd w:fill="F6F8F7" w:color="auto" w:val="clear"/>
             <w:tcMar>
               <w:top w:type="dxa" w:w="80"/>
               <w:left w:type="dxa" w:w="120"/>
@@ -4773,6 +4832,7 @@
               <w:bottom w:val="single" w:color="D0D7D3" w:sz="4"/>
               <w:right w:val="single" w:color="D0D7D3" w:sz="4"/>
             </w:tcBorders>
+            <w:shd w:fill="F6F8F7" w:color="auto" w:val="clear"/>
             <w:tcMar>
               <w:top w:type="dxa" w:w="80"/>
               <w:left w:type="dxa" w:w="120"/>
@@ -4803,7 +4863,6 @@
               <w:bottom w:val="single" w:color="D0D7D3" w:sz="4"/>
               <w:right w:val="single" w:color="D0D7D3" w:sz="4"/>
             </w:tcBorders>
-            <w:shd w:fill="F6F8F7" w:color="auto" w:val="clear"/>
             <w:tcMar>
               <w:top w:type="dxa" w:w="80"/>
               <w:left w:type="dxa" w:w="120"/>
@@ -4832,7 +4891,6 @@
               <w:bottom w:val="single" w:color="D0D7D3" w:sz="4"/>
               <w:right w:val="single" w:color="D0D7D3" w:sz="4"/>
             </w:tcBorders>
-            <w:shd w:fill="F6F8F7" w:color="auto" w:val="clear"/>
             <w:tcMar>
               <w:top w:type="dxa" w:w="80"/>
               <w:left w:type="dxa" w:w="120"/>
@@ -4863,6 +4921,7 @@
               <w:bottom w:val="single" w:color="D0D7D3" w:sz="4"/>
               <w:right w:val="single" w:color="D0D7D3" w:sz="4"/>
             </w:tcBorders>
+            <w:shd w:fill="F6F8F7" w:color="auto" w:val="clear"/>
             <w:tcMar>
               <w:top w:type="dxa" w:w="80"/>
               <w:left w:type="dxa" w:w="120"/>
@@ -4891,6 +4950,7 @@
               <w:bottom w:val="single" w:color="D0D7D3" w:sz="4"/>
               <w:right w:val="single" w:color="D0D7D3" w:sz="4"/>
             </w:tcBorders>
+            <w:shd w:fill="F6F8F7" w:color="auto" w:val="clear"/>
             <w:tcMar>
               <w:top w:type="dxa" w:w="80"/>
               <w:left w:type="dxa" w:w="120"/>
@@ -4921,7 +4981,6 @@
               <w:bottom w:val="single" w:color="D0D7D3" w:sz="4"/>
               <w:right w:val="single" w:color="D0D7D3" w:sz="4"/>
             </w:tcBorders>
-            <w:shd w:fill="F6F8F7" w:color="auto" w:val="clear"/>
             <w:tcMar>
               <w:top w:type="dxa" w:w="80"/>
               <w:left w:type="dxa" w:w="120"/>
@@ -4950,7 +5009,6 @@
               <w:bottom w:val="single" w:color="D0D7D3" w:sz="4"/>
               <w:right w:val="single" w:color="D0D7D3" w:sz="4"/>
             </w:tcBorders>
-            <w:shd w:fill="F6F8F7" w:color="auto" w:val="clear"/>
             <w:tcMar>
               <w:top w:type="dxa" w:w="80"/>
               <w:left w:type="dxa" w:w="120"/>
@@ -4981,6 +5039,7 @@
               <w:bottom w:val="single" w:color="D0D7D3" w:sz="4"/>
               <w:right w:val="single" w:color="D0D7D3" w:sz="4"/>
             </w:tcBorders>
+            <w:shd w:fill="F6F8F7" w:color="auto" w:val="clear"/>
             <w:tcMar>
               <w:top w:type="dxa" w:w="80"/>
               <w:left w:type="dxa" w:w="120"/>
@@ -5009,6 +5068,7 @@
               <w:bottom w:val="single" w:color="D0D7D3" w:sz="4"/>
               <w:right w:val="single" w:color="D0D7D3" w:sz="4"/>
             </w:tcBorders>
+            <w:shd w:fill="F6F8F7" w:color="auto" w:val="clear"/>
             <w:tcMar>
               <w:top w:type="dxa" w:w="80"/>
               <w:left w:type="dxa" w:w="120"/>
@@ -5039,7 +5099,6 @@
               <w:bottom w:val="single" w:color="D0D7D3" w:sz="4"/>
               <w:right w:val="single" w:color="D0D7D3" w:sz="4"/>
             </w:tcBorders>
-            <w:shd w:fill="F6F8F7" w:color="auto" w:val="clear"/>
             <w:tcMar>
               <w:top w:type="dxa" w:w="80"/>
               <w:left w:type="dxa" w:w="120"/>
@@ -5068,7 +5127,6 @@
               <w:bottom w:val="single" w:color="D0D7D3" w:sz="4"/>
               <w:right w:val="single" w:color="D0D7D3" w:sz="4"/>
             </w:tcBorders>
-            <w:shd w:fill="F6F8F7" w:color="auto" w:val="clear"/>
             <w:tcMar>
               <w:top w:type="dxa" w:w="80"/>
               <w:left w:type="dxa" w:w="120"/>
@@ -5099,6 +5157,7 @@
               <w:bottom w:val="single" w:color="D0D7D3" w:sz="4"/>
               <w:right w:val="single" w:color="D0D7D3" w:sz="4"/>
             </w:tcBorders>
+            <w:shd w:fill="F6F8F7" w:color="auto" w:val="clear"/>
             <w:tcMar>
               <w:top w:type="dxa" w:w="80"/>
               <w:left w:type="dxa" w:w="120"/>
@@ -5127,6 +5186,7 @@
               <w:bottom w:val="single" w:color="D0D7D3" w:sz="4"/>
               <w:right w:val="single" w:color="D0D7D3" w:sz="4"/>
             </w:tcBorders>
+            <w:shd w:fill="F6F8F7" w:color="auto" w:val="clear"/>
             <w:tcMar>
               <w:top w:type="dxa" w:w="80"/>
               <w:left w:type="dxa" w:w="120"/>
@@ -5157,7 +5217,6 @@
               <w:bottom w:val="single" w:color="D0D7D3" w:sz="4"/>
               <w:right w:val="single" w:color="D0D7D3" w:sz="4"/>
             </w:tcBorders>
-            <w:shd w:fill="F6F8F7" w:color="auto" w:val="clear"/>
             <w:tcMar>
               <w:top w:type="dxa" w:w="80"/>
               <w:left w:type="dxa" w:w="120"/>
@@ -5186,7 +5245,6 @@
               <w:bottom w:val="single" w:color="D0D7D3" w:sz="4"/>
               <w:right w:val="single" w:color="D0D7D3" w:sz="4"/>
             </w:tcBorders>
-            <w:shd w:fill="F6F8F7" w:color="auto" w:val="clear"/>
             <w:tcMar>
               <w:top w:type="dxa" w:w="80"/>
               <w:left w:type="dxa" w:w="120"/>
@@ -5217,6 +5275,7 @@
               <w:bottom w:val="single" w:color="D0D7D3" w:sz="4"/>
               <w:right w:val="single" w:color="D0D7D3" w:sz="4"/>
             </w:tcBorders>
+            <w:shd w:fill="F6F8F7" w:color="auto" w:val="clear"/>
             <w:tcMar>
               <w:top w:type="dxa" w:w="80"/>
               <w:left w:type="dxa" w:w="120"/>
@@ -5245,6 +5304,7 @@
               <w:bottom w:val="single" w:color="D0D7D3" w:sz="4"/>
               <w:right w:val="single" w:color="D0D7D3" w:sz="4"/>
             </w:tcBorders>
+            <w:shd w:fill="F6F8F7" w:color="auto" w:val="clear"/>
             <w:tcMar>
               <w:top w:type="dxa" w:w="80"/>
               <w:left w:type="dxa" w:w="120"/>
@@ -5275,7 +5335,6 @@
               <w:bottom w:val="single" w:color="D0D7D3" w:sz="4"/>
               <w:right w:val="single" w:color="D0D7D3" w:sz="4"/>
             </w:tcBorders>
-            <w:shd w:fill="F6F8F7" w:color="auto" w:val="clear"/>
             <w:tcMar>
               <w:top w:type="dxa" w:w="80"/>
               <w:left w:type="dxa" w:w="120"/>
@@ -5304,7 +5363,6 @@
               <w:bottom w:val="single" w:color="D0D7D3" w:sz="4"/>
               <w:right w:val="single" w:color="D0D7D3" w:sz="4"/>
             </w:tcBorders>
-            <w:shd w:fill="F6F8F7" w:color="auto" w:val="clear"/>
             <w:tcMar>
               <w:top w:type="dxa" w:w="80"/>
               <w:left w:type="dxa" w:w="120"/>
@@ -5335,6 +5393,7 @@
               <w:bottom w:val="single" w:color="D0D7D3" w:sz="4"/>
               <w:right w:val="single" w:color="D0D7D3" w:sz="4"/>
             </w:tcBorders>
+            <w:shd w:fill="F6F8F7" w:color="auto" w:val="clear"/>
             <w:tcMar>
               <w:top w:type="dxa" w:w="80"/>
               <w:left w:type="dxa" w:w="120"/>
@@ -5363,6 +5422,7 @@
               <w:bottom w:val="single" w:color="D0D7D3" w:sz="4"/>
               <w:right w:val="single" w:color="D0D7D3" w:sz="4"/>
             </w:tcBorders>
+            <w:shd w:fill="F6F8F7" w:color="auto" w:val="clear"/>
             <w:tcMar>
               <w:top w:type="dxa" w:w="80"/>
               <w:left w:type="dxa" w:w="120"/>
@@ -5393,7 +5453,6 @@
               <w:bottom w:val="single" w:color="D0D7D3" w:sz="4"/>
               <w:right w:val="single" w:color="D0D7D3" w:sz="4"/>
             </w:tcBorders>
-            <w:shd w:fill="F6F8F7" w:color="auto" w:val="clear"/>
             <w:tcMar>
               <w:top w:type="dxa" w:w="80"/>
               <w:left w:type="dxa" w:w="120"/>
@@ -5422,7 +5481,6 @@
               <w:bottom w:val="single" w:color="D0D7D3" w:sz="4"/>
               <w:right w:val="single" w:color="D0D7D3" w:sz="4"/>
             </w:tcBorders>
-            <w:shd w:fill="F6F8F7" w:color="auto" w:val="clear"/>
             <w:tcMar>
               <w:top w:type="dxa" w:w="80"/>
               <w:left w:type="dxa" w:w="120"/>
@@ -5453,6 +5511,7 @@
               <w:bottom w:val="single" w:color="D0D7D3" w:sz="4"/>
               <w:right w:val="single" w:color="D0D7D3" w:sz="4"/>
             </w:tcBorders>
+            <w:shd w:fill="F6F8F7" w:color="auto" w:val="clear"/>
             <w:tcMar>
               <w:top w:type="dxa" w:w="80"/>
               <w:left w:type="dxa" w:w="120"/>
@@ -5481,6 +5540,7 @@
               <w:bottom w:val="single" w:color="D0D7D3" w:sz="4"/>
               <w:right w:val="single" w:color="D0D7D3" w:sz="4"/>
             </w:tcBorders>
+            <w:shd w:fill="F6F8F7" w:color="auto" w:val="clear"/>
             <w:tcMar>
               <w:top w:type="dxa" w:w="80"/>
               <w:left w:type="dxa" w:w="120"/>
@@ -5511,7 +5571,6 @@
               <w:bottom w:val="single" w:color="D0D7D3" w:sz="4"/>
               <w:right w:val="single" w:color="D0D7D3" w:sz="4"/>
             </w:tcBorders>
-            <w:shd w:fill="F6F8F7" w:color="auto" w:val="clear"/>
             <w:tcMar>
               <w:top w:type="dxa" w:w="80"/>
               <w:left w:type="dxa" w:w="120"/>
@@ -5540,7 +5599,6 @@
               <w:bottom w:val="single" w:color="D0D7D3" w:sz="4"/>
               <w:right w:val="single" w:color="D0D7D3" w:sz="4"/>
             </w:tcBorders>
-            <w:shd w:fill="F6F8F7" w:color="auto" w:val="clear"/>
             <w:tcMar>
               <w:top w:type="dxa" w:w="80"/>
               <w:left w:type="dxa" w:w="120"/>
@@ -5571,6 +5629,7 @@
               <w:bottom w:val="single" w:color="D0D7D3" w:sz="4"/>
               <w:right w:val="single" w:color="D0D7D3" w:sz="4"/>
             </w:tcBorders>
+            <w:shd w:fill="F6F8F7" w:color="auto" w:val="clear"/>
             <w:tcMar>
               <w:top w:type="dxa" w:w="80"/>
               <w:left w:type="dxa" w:w="120"/>
@@ -5599,6 +5658,7 @@
               <w:bottom w:val="single" w:color="D0D7D3" w:sz="4"/>
               <w:right w:val="single" w:color="D0D7D3" w:sz="4"/>
             </w:tcBorders>
+            <w:shd w:fill="F6F8F7" w:color="auto" w:val="clear"/>
             <w:tcMar>
               <w:top w:type="dxa" w:w="80"/>
               <w:left w:type="dxa" w:w="120"/>
@@ -5629,7 +5689,6 @@
               <w:bottom w:val="single" w:color="D0D7D3" w:sz="4"/>
               <w:right w:val="single" w:color="D0D7D3" w:sz="4"/>
             </w:tcBorders>
-            <w:shd w:fill="F6F8F7" w:color="auto" w:val="clear"/>
             <w:tcMar>
               <w:top w:type="dxa" w:w="80"/>
               <w:left w:type="dxa" w:w="120"/>
@@ -5658,7 +5717,6 @@
               <w:bottom w:val="single" w:color="D0D7D3" w:sz="4"/>
               <w:right w:val="single" w:color="D0D7D3" w:sz="4"/>
             </w:tcBorders>
-            <w:shd w:fill="F6F8F7" w:color="auto" w:val="clear"/>
             <w:tcMar>
               <w:top w:type="dxa" w:w="80"/>
               <w:left w:type="dxa" w:w="120"/>
@@ -5689,6 +5747,7 @@
               <w:bottom w:val="single" w:color="D0D7D3" w:sz="4"/>
               <w:right w:val="single" w:color="D0D7D3" w:sz="4"/>
             </w:tcBorders>
+            <w:shd w:fill="F6F8F7" w:color="auto" w:val="clear"/>
             <w:tcMar>
               <w:top w:type="dxa" w:w="80"/>
               <w:left w:type="dxa" w:w="120"/>
@@ -5717,6 +5776,7 @@
               <w:bottom w:val="single" w:color="D0D7D3" w:sz="4"/>
               <w:right w:val="single" w:color="D0D7D3" w:sz="4"/>
             </w:tcBorders>
+            <w:shd w:fill="F6F8F7" w:color="auto" w:val="clear"/>
             <w:tcMar>
               <w:top w:type="dxa" w:w="80"/>
               <w:left w:type="dxa" w:w="120"/>
@@ -5747,7 +5807,6 @@
               <w:bottom w:val="single" w:color="D0D7D3" w:sz="4"/>
               <w:right w:val="single" w:color="D0D7D3" w:sz="4"/>
             </w:tcBorders>
-            <w:shd w:fill="F6F8F7" w:color="auto" w:val="clear"/>
             <w:tcMar>
               <w:top w:type="dxa" w:w="80"/>
               <w:left w:type="dxa" w:w="120"/>
@@ -5776,7 +5835,6 @@
               <w:bottom w:val="single" w:color="D0D7D3" w:sz="4"/>
               <w:right w:val="single" w:color="D0D7D3" w:sz="4"/>
             </w:tcBorders>
-            <w:shd w:fill="F6F8F7" w:color="auto" w:val="clear"/>
             <w:tcMar>
               <w:top w:type="dxa" w:w="80"/>
               <w:left w:type="dxa" w:w="120"/>
@@ -5807,6 +5865,7 @@
               <w:bottom w:val="single" w:color="D0D7D3" w:sz="4"/>
               <w:right w:val="single" w:color="D0D7D3" w:sz="4"/>
             </w:tcBorders>
+            <w:shd w:fill="F6F8F7" w:color="auto" w:val="clear"/>
             <w:tcMar>
               <w:top w:type="dxa" w:w="80"/>
               <w:left w:type="dxa" w:w="120"/>
@@ -5835,6 +5894,7 @@
               <w:bottom w:val="single" w:color="D0D7D3" w:sz="4"/>
               <w:right w:val="single" w:color="D0D7D3" w:sz="4"/>
             </w:tcBorders>
+            <w:shd w:fill="F6F8F7" w:color="auto" w:val="clear"/>
             <w:tcMar>
               <w:top w:type="dxa" w:w="80"/>
               <w:left w:type="dxa" w:w="120"/>
@@ -5865,7 +5925,6 @@
               <w:bottom w:val="single" w:color="D0D7D3" w:sz="4"/>
               <w:right w:val="single" w:color="D0D7D3" w:sz="4"/>
             </w:tcBorders>
-            <w:shd w:fill="F6F8F7" w:color="auto" w:val="clear"/>
             <w:tcMar>
               <w:top w:type="dxa" w:w="80"/>
               <w:left w:type="dxa" w:w="120"/>
@@ -5894,7 +5953,6 @@
               <w:bottom w:val="single" w:color="D0D7D3" w:sz="4"/>
               <w:right w:val="single" w:color="D0D7D3" w:sz="4"/>
             </w:tcBorders>
-            <w:shd w:fill="F6F8F7" w:color="auto" w:val="clear"/>
             <w:tcMar>
               <w:top w:type="dxa" w:w="80"/>
               <w:left w:type="dxa" w:w="120"/>
@@ -5925,6 +5983,7 @@
               <w:bottom w:val="single" w:color="D0D7D3" w:sz="4"/>
               <w:right w:val="single" w:color="D0D7D3" w:sz="4"/>
             </w:tcBorders>
+            <w:shd w:fill="F6F8F7" w:color="auto" w:val="clear"/>
             <w:tcMar>
               <w:top w:type="dxa" w:w="80"/>
               <w:left w:type="dxa" w:w="120"/>
@@ -5953,6 +6012,7 @@
               <w:bottom w:val="single" w:color="D0D7D3" w:sz="4"/>
               <w:right w:val="single" w:color="D0D7D3" w:sz="4"/>
             </w:tcBorders>
+            <w:shd w:fill="F6F8F7" w:color="auto" w:val="clear"/>
             <w:tcMar>
               <w:top w:type="dxa" w:w="80"/>
               <w:left w:type="dxa" w:w="120"/>
@@ -5983,7 +6043,6 @@
               <w:bottom w:val="single" w:color="D0D7D3" w:sz="4"/>
               <w:right w:val="single" w:color="D0D7D3" w:sz="4"/>
             </w:tcBorders>
-            <w:shd w:fill="F6F8F7" w:color="auto" w:val="clear"/>
             <w:tcMar>
               <w:top w:type="dxa" w:w="80"/>
               <w:left w:type="dxa" w:w="120"/>
@@ -6012,7 +6071,6 @@
               <w:bottom w:val="single" w:color="D0D7D3" w:sz="4"/>
               <w:right w:val="single" w:color="D0D7D3" w:sz="4"/>
             </w:tcBorders>
-            <w:shd w:fill="F6F8F7" w:color="auto" w:val="clear"/>
             <w:tcMar>
               <w:top w:type="dxa" w:w="80"/>
               <w:left w:type="dxa" w:w="120"/>
@@ -6043,6 +6101,7 @@
               <w:bottom w:val="single" w:color="D0D7D3" w:sz="4"/>
               <w:right w:val="single" w:color="D0D7D3" w:sz="4"/>
             </w:tcBorders>
+            <w:shd w:fill="F6F8F7" w:color="auto" w:val="clear"/>
             <w:tcMar>
               <w:top w:type="dxa" w:w="80"/>
               <w:left w:type="dxa" w:w="120"/>
@@ -6071,6 +6130,7 @@
               <w:bottom w:val="single" w:color="D0D7D3" w:sz="4"/>
               <w:right w:val="single" w:color="D0D7D3" w:sz="4"/>
             </w:tcBorders>
+            <w:shd w:fill="F6F8F7" w:color="auto" w:val="clear"/>
             <w:tcMar>
               <w:top w:type="dxa" w:w="80"/>
               <w:left w:type="dxa" w:w="120"/>
@@ -6101,7 +6161,6 @@
               <w:bottom w:val="single" w:color="D0D7D3" w:sz="4"/>
               <w:right w:val="single" w:color="D0D7D3" w:sz="4"/>
             </w:tcBorders>
-            <w:shd w:fill="F6F8F7" w:color="auto" w:val="clear"/>
             <w:tcMar>
               <w:top w:type="dxa" w:w="80"/>
               <w:left w:type="dxa" w:w="120"/>
@@ -6130,7 +6189,6 @@
               <w:bottom w:val="single" w:color="D0D7D3" w:sz="4"/>
               <w:right w:val="single" w:color="D0D7D3" w:sz="4"/>
             </w:tcBorders>
-            <w:shd w:fill="F6F8F7" w:color="auto" w:val="clear"/>
             <w:tcMar>
               <w:top w:type="dxa" w:w="80"/>
               <w:left w:type="dxa" w:w="120"/>
@@ -6161,6 +6219,7 @@
               <w:bottom w:val="single" w:color="D0D7D3" w:sz="4"/>
               <w:right w:val="single" w:color="D0D7D3" w:sz="4"/>
             </w:tcBorders>
+            <w:shd w:fill="F6F8F7" w:color="auto" w:val="clear"/>
             <w:tcMar>
               <w:top w:type="dxa" w:w="80"/>
               <w:left w:type="dxa" w:w="120"/>
@@ -6189,6 +6248,7 @@
               <w:bottom w:val="single" w:color="D0D7D3" w:sz="4"/>
               <w:right w:val="single" w:color="D0D7D3" w:sz="4"/>
             </w:tcBorders>
+            <w:shd w:fill="F6F8F7" w:color="auto" w:val="clear"/>
             <w:tcMar>
               <w:top w:type="dxa" w:w="80"/>
               <w:left w:type="dxa" w:w="120"/>
@@ -6219,7 +6279,6 @@
               <w:bottom w:val="single" w:color="D0D7D3" w:sz="4"/>
               <w:right w:val="single" w:color="D0D7D3" w:sz="4"/>
             </w:tcBorders>
-            <w:shd w:fill="F6F8F7" w:color="auto" w:val="clear"/>
             <w:tcMar>
               <w:top w:type="dxa" w:w="80"/>
               <w:left w:type="dxa" w:w="120"/>
@@ -6248,7 +6307,6 @@
               <w:bottom w:val="single" w:color="D0D7D3" w:sz="4"/>
               <w:right w:val="single" w:color="D0D7D3" w:sz="4"/>
             </w:tcBorders>
-            <w:shd w:fill="F6F8F7" w:color="auto" w:val="clear"/>
             <w:tcMar>
               <w:top w:type="dxa" w:w="80"/>
               <w:left w:type="dxa" w:w="120"/>
@@ -6279,6 +6337,7 @@
               <w:bottom w:val="single" w:color="D0D7D3" w:sz="4"/>
               <w:right w:val="single" w:color="D0D7D3" w:sz="4"/>
             </w:tcBorders>
+            <w:shd w:fill="F6F8F7" w:color="auto" w:val="clear"/>
             <w:tcMar>
               <w:top w:type="dxa" w:w="80"/>
               <w:left w:type="dxa" w:w="120"/>
@@ -6307,6 +6366,7 @@
               <w:bottom w:val="single" w:color="D0D7D3" w:sz="4"/>
               <w:right w:val="single" w:color="D0D7D3" w:sz="4"/>
             </w:tcBorders>
+            <w:shd w:fill="F6F8F7" w:color="auto" w:val="clear"/>
             <w:tcMar>
               <w:top w:type="dxa" w:w="80"/>
               <w:left w:type="dxa" w:w="120"/>
@@ -6337,7 +6397,6 @@
               <w:bottom w:val="single" w:color="D0D7D3" w:sz="4"/>
               <w:right w:val="single" w:color="D0D7D3" w:sz="4"/>
             </w:tcBorders>
-            <w:shd w:fill="F6F8F7" w:color="auto" w:val="clear"/>
             <w:tcMar>
               <w:top w:type="dxa" w:w="80"/>
               <w:left w:type="dxa" w:w="120"/>
@@ -6366,7 +6425,6 @@
               <w:bottom w:val="single" w:color="D0D7D3" w:sz="4"/>
               <w:right w:val="single" w:color="D0D7D3" w:sz="4"/>
             </w:tcBorders>
-            <w:shd w:fill="F6F8F7" w:color="auto" w:val="clear"/>
             <w:tcMar>
               <w:top w:type="dxa" w:w="80"/>
               <w:left w:type="dxa" w:w="120"/>
@@ -6397,6 +6455,7 @@
               <w:bottom w:val="single" w:color="D0D7D3" w:sz="4"/>
               <w:right w:val="single" w:color="D0D7D3" w:sz="4"/>
             </w:tcBorders>
+            <w:shd w:fill="F6F8F7" w:color="auto" w:val="clear"/>
             <w:tcMar>
               <w:top w:type="dxa" w:w="80"/>
               <w:left w:type="dxa" w:w="120"/>
@@ -6425,6 +6484,7 @@
               <w:bottom w:val="single" w:color="D0D7D3" w:sz="4"/>
               <w:right w:val="single" w:color="D0D7D3" w:sz="4"/>
             </w:tcBorders>
+            <w:shd w:fill="F6F8F7" w:color="auto" w:val="clear"/>
             <w:tcMar>
               <w:top w:type="dxa" w:w="80"/>
               <w:left w:type="dxa" w:w="120"/>
@@ -6455,7 +6515,6 @@
               <w:bottom w:val="single" w:color="D0D7D3" w:sz="4"/>
               <w:right w:val="single" w:color="D0D7D3" w:sz="4"/>
             </w:tcBorders>
-            <w:shd w:fill="F6F8F7" w:color="auto" w:val="clear"/>
             <w:tcMar>
               <w:top w:type="dxa" w:w="80"/>
               <w:left w:type="dxa" w:w="120"/>
@@ -6484,7 +6543,6 @@
               <w:bottom w:val="single" w:color="D0D7D3" w:sz="4"/>
               <w:right w:val="single" w:color="D0D7D3" w:sz="4"/>
             </w:tcBorders>
-            <w:shd w:fill="F6F8F7" w:color="auto" w:val="clear"/>
             <w:tcMar>
               <w:top w:type="dxa" w:w="80"/>
               <w:left w:type="dxa" w:w="120"/>
@@ -6515,6 +6573,7 @@
               <w:bottom w:val="single" w:color="D0D7D3" w:sz="4"/>
               <w:right w:val="single" w:color="D0D7D3" w:sz="4"/>
             </w:tcBorders>
+            <w:shd w:fill="F6F8F7" w:color="auto" w:val="clear"/>
             <w:tcMar>
               <w:top w:type="dxa" w:w="80"/>
               <w:left w:type="dxa" w:w="120"/>
@@ -6543,6 +6602,7 @@
               <w:bottom w:val="single" w:color="D0D7D3" w:sz="4"/>
               <w:right w:val="single" w:color="D0D7D3" w:sz="4"/>
             </w:tcBorders>
+            <w:shd w:fill="F6F8F7" w:color="auto" w:val="clear"/>
             <w:tcMar>
               <w:top w:type="dxa" w:w="80"/>
               <w:left w:type="dxa" w:w="120"/>
@@ -6573,7 +6633,6 @@
               <w:bottom w:val="single" w:color="D0D7D3" w:sz="4"/>
               <w:right w:val="single" w:color="D0D7D3" w:sz="4"/>
             </w:tcBorders>
-            <w:shd w:fill="F6F8F7" w:color="auto" w:val="clear"/>
             <w:tcMar>
               <w:top w:type="dxa" w:w="80"/>
               <w:left w:type="dxa" w:w="120"/>
@@ -6602,7 +6661,6 @@
               <w:bottom w:val="single" w:color="D0D7D3" w:sz="4"/>
               <w:right w:val="single" w:color="D0D7D3" w:sz="4"/>
             </w:tcBorders>
-            <w:shd w:fill="F6F8F7" w:color="auto" w:val="clear"/>
             <w:tcMar>
               <w:top w:type="dxa" w:w="80"/>
               <w:left w:type="dxa" w:w="120"/>
@@ -6633,6 +6691,7 @@
               <w:bottom w:val="single" w:color="D0D7D3" w:sz="4"/>
               <w:right w:val="single" w:color="D0D7D3" w:sz="4"/>
             </w:tcBorders>
+            <w:shd w:fill="F6F8F7" w:color="auto" w:val="clear"/>
             <w:tcMar>
               <w:top w:type="dxa" w:w="80"/>
               <w:left w:type="dxa" w:w="120"/>
@@ -6661,6 +6720,7 @@
               <w:bottom w:val="single" w:color="D0D7D3" w:sz="4"/>
               <w:right w:val="single" w:color="D0D7D3" w:sz="4"/>
             </w:tcBorders>
+            <w:shd w:fill="F6F8F7" w:color="auto" w:val="clear"/>
             <w:tcMar>
               <w:top w:type="dxa" w:w="80"/>
               <w:left w:type="dxa" w:w="120"/>
@@ -6691,7 +6751,6 @@
               <w:bottom w:val="single" w:color="D0D7D3" w:sz="4"/>
               <w:right w:val="single" w:color="D0D7D3" w:sz="4"/>
             </w:tcBorders>
-            <w:shd w:fill="F6F8F7" w:color="auto" w:val="clear"/>
             <w:tcMar>
               <w:top w:type="dxa" w:w="80"/>
               <w:left w:type="dxa" w:w="120"/>
@@ -6720,7 +6779,6 @@
               <w:bottom w:val="single" w:color="D0D7D3" w:sz="4"/>
               <w:right w:val="single" w:color="D0D7D3" w:sz="4"/>
             </w:tcBorders>
-            <w:shd w:fill="F6F8F7" w:color="auto" w:val="clear"/>
             <w:tcMar>
               <w:top w:type="dxa" w:w="80"/>
               <w:left w:type="dxa" w:w="120"/>
@@ -6751,6 +6809,7 @@
               <w:bottom w:val="single" w:color="D0D7D3" w:sz="4"/>
               <w:right w:val="single" w:color="D0D7D3" w:sz="4"/>
             </w:tcBorders>
+            <w:shd w:fill="F6F8F7" w:color="auto" w:val="clear"/>
             <w:tcMar>
               <w:top w:type="dxa" w:w="80"/>
               <w:left w:type="dxa" w:w="120"/>
@@ -6779,6 +6838,7 @@
               <w:bottom w:val="single" w:color="D0D7D3" w:sz="4"/>
               <w:right w:val="single" w:color="D0D7D3" w:sz="4"/>
             </w:tcBorders>
+            <w:shd w:fill="F6F8F7" w:color="auto" w:val="clear"/>
             <w:tcMar>
               <w:top w:type="dxa" w:w="80"/>
               <w:left w:type="dxa" w:w="120"/>
@@ -6809,7 +6869,6 @@
               <w:bottom w:val="single" w:color="D0D7D3" w:sz="4"/>
               <w:right w:val="single" w:color="D0D7D3" w:sz="4"/>
             </w:tcBorders>
-            <w:shd w:fill="F6F8F7" w:color="auto" w:val="clear"/>
             <w:tcMar>
               <w:top w:type="dxa" w:w="80"/>
               <w:left w:type="dxa" w:w="120"/>
@@ -6838,7 +6897,6 @@
               <w:bottom w:val="single" w:color="D0D7D3" w:sz="4"/>
               <w:right w:val="single" w:color="D0D7D3" w:sz="4"/>
             </w:tcBorders>
-            <w:shd w:fill="F6F8F7" w:color="auto" w:val="clear"/>
             <w:tcMar>
               <w:top w:type="dxa" w:w="80"/>
               <w:left w:type="dxa" w:w="120"/>

</xml_diff>

<commit_message>
Collection curve against last term and a 30/60/90-day cash forecast on the dashboard
</commit_message>
<xml_diff>
--- a/docs/product/WardPay - what it does.docx
+++ b/docs/product/WardPay - what it does.docx
@@ -264,6 +264,65 @@
                 <w:sz w:val="20"/>
                 <w:szCs w:val="20"/>
               </w:rPr>
+              <w:t xml:space="preserve">This term against last term at the same point, and what falls due in the next 30, 60 and 90 days</w:t>
+            </w:r>
+          </w:p>
+        </w:tc>
+        <w:tc>
+          <w:tcPr>
+            <w:tcW w:type="dxa" w:w="4238"/>
+            <w:tcBorders>
+              <w:top w:val="single" w:color="D0D7D3" w:sz="4"/>
+              <w:left w:val="single" w:color="D0D7D3" w:sz="4"/>
+              <w:bottom w:val="single" w:color="D0D7D3" w:sz="4"/>
+              <w:right w:val="single" w:color="D0D7D3" w:sz="4"/>
+            </w:tcBorders>
+            <w:shd w:fill="F6F8F7" w:color="auto" w:val="clear"/>
+            <w:tcMar>
+              <w:top w:type="dxa" w:w="80"/>
+              <w:left w:type="dxa" w:w="120"/>
+              <w:bottom w:type="dxa" w:w="80"/>
+              <w:right w:type="dxa" w:w="120"/>
+            </w:tcMar>
+          </w:tcPr>
+          <w:p>
+            <w:r>
+              <w:rPr>
+                <w:b w:val="false"/>
+                <w:bCs w:val="false"/>
+                <w:sz w:val="20"/>
+                <w:szCs w:val="20"/>
+              </w:rPr>
+              <w:t xml:space="preserve">See early whether collections are behind, and plan salaries and suppliers around money that is actually coming</w:t>
+            </w:r>
+          </w:p>
+        </w:tc>
+      </w:tr>
+      <w:tr>
+        <w:tc>
+          <w:tcPr>
+            <w:tcW w:type="dxa" w:w="5400"/>
+            <w:tcBorders>
+              <w:top w:val="single" w:color="D0D7D3" w:sz="4"/>
+              <w:left w:val="single" w:color="D0D7D3" w:sz="4"/>
+              <w:bottom w:val="single" w:color="D0D7D3" w:sz="4"/>
+              <w:right w:val="single" w:color="D0D7D3" w:sz="4"/>
+            </w:tcBorders>
+            <w:tcMar>
+              <w:top w:type="dxa" w:w="80"/>
+              <w:left w:type="dxa" w:w="120"/>
+              <w:bottom w:type="dxa" w:w="80"/>
+              <w:right w:type="dxa" w:w="120"/>
+            </w:tcMar>
+          </w:tcPr>
+          <w:p>
+            <w:r>
+              <w:rPr>
+                <w:b w:val="false"/>
+                <w:bCs w:val="false"/>
+                <w:sz w:val="20"/>
+                <w:szCs w:val="20"/>
+              </w:rPr>
               <w:t xml:space="preserve">Money received per day and how parents paid (transfer, card, cash, teller, POS)</w:t>
             </w:r>
           </w:p>
@@ -277,7 +336,6 @@
               <w:bottom w:val="single" w:color="D0D7D3" w:sz="4"/>
               <w:right w:val="single" w:color="D0D7D3" w:sz="4"/>
             </w:tcBorders>
-            <w:shd w:fill="F6F8F7" w:color="auto" w:val="clear"/>
             <w:tcMar>
               <w:top w:type="dxa" w:w="80"/>
               <w:left w:type="dxa" w:w="120"/>
@@ -308,6 +366,7 @@
               <w:bottom w:val="single" w:color="D0D7D3" w:sz="4"/>
               <w:right w:val="single" w:color="D0D7D3" w:sz="4"/>
             </w:tcBorders>
+            <w:shd w:fill="F6F8F7" w:color="auto" w:val="clear"/>
             <w:tcMar>
               <w:top w:type="dxa" w:w="80"/>
               <w:left w:type="dxa" w:w="120"/>
@@ -336,6 +395,7 @@
               <w:bottom w:val="single" w:color="D0D7D3" w:sz="4"/>
               <w:right w:val="single" w:color="D0D7D3" w:sz="4"/>
             </w:tcBorders>
+            <w:shd w:fill="F6F8F7" w:color="auto" w:val="clear"/>
             <w:tcMar>
               <w:top w:type="dxa" w:w="80"/>
               <w:left w:type="dxa" w:w="120"/>
@@ -366,7 +426,6 @@
               <w:bottom w:val="single" w:color="D0D7D3" w:sz="4"/>
               <w:right w:val="single" w:color="D0D7D3" w:sz="4"/>
             </w:tcBorders>
-            <w:shd w:fill="F6F8F7" w:color="auto" w:val="clear"/>
             <w:tcMar>
               <w:top w:type="dxa" w:w="80"/>
               <w:left w:type="dxa" w:w="120"/>
@@ -395,7 +454,6 @@
               <w:bottom w:val="single" w:color="D0D7D3" w:sz="4"/>
               <w:right w:val="single" w:color="D0D7D3" w:sz="4"/>
             </w:tcBorders>
-            <w:shd w:fill="F6F8F7" w:color="auto" w:val="clear"/>
             <w:tcMar>
               <w:top w:type="dxa" w:w="80"/>
               <w:left w:type="dxa" w:w="120"/>
@@ -426,6 +484,7 @@
               <w:bottom w:val="single" w:color="D0D7D3" w:sz="4"/>
               <w:right w:val="single" w:color="D0D7D3" w:sz="4"/>
             </w:tcBorders>
+            <w:shd w:fill="F6F8F7" w:color="auto" w:val="clear"/>
             <w:tcMar>
               <w:top w:type="dxa" w:w="80"/>
               <w:left w:type="dxa" w:w="120"/>
@@ -454,6 +513,7 @@
               <w:bottom w:val="single" w:color="D0D7D3" w:sz="4"/>
               <w:right w:val="single" w:color="D0D7D3" w:sz="4"/>
             </w:tcBorders>
+            <w:shd w:fill="F6F8F7" w:color="auto" w:val="clear"/>
             <w:tcMar>
               <w:top w:type="dxa" w:w="80"/>
               <w:left w:type="dxa" w:w="120"/>
@@ -484,7 +544,6 @@
               <w:bottom w:val="single" w:color="D0D7D3" w:sz="4"/>
               <w:right w:val="single" w:color="D0D7D3" w:sz="4"/>
             </w:tcBorders>
-            <w:shd w:fill="F6F8F7" w:color="auto" w:val="clear"/>
             <w:tcMar>
               <w:top w:type="dxa" w:w="80"/>
               <w:left w:type="dxa" w:w="120"/>
@@ -513,7 +572,6 @@
               <w:bottom w:val="single" w:color="D0D7D3" w:sz="4"/>
               <w:right w:val="single" w:color="D0D7D3" w:sz="4"/>
             </w:tcBorders>
-            <w:shd w:fill="F6F8F7" w:color="auto" w:val="clear"/>
             <w:tcMar>
               <w:top w:type="dxa" w:w="80"/>
               <w:left w:type="dxa" w:w="120"/>
@@ -544,6 +602,7 @@
               <w:bottom w:val="single" w:color="D0D7D3" w:sz="4"/>
               <w:right w:val="single" w:color="D0D7D3" w:sz="4"/>
             </w:tcBorders>
+            <w:shd w:fill="F6F8F7" w:color="auto" w:val="clear"/>
             <w:tcMar>
               <w:top w:type="dxa" w:w="80"/>
               <w:left w:type="dxa" w:w="120"/>
@@ -572,6 +631,7 @@
               <w:bottom w:val="single" w:color="D0D7D3" w:sz="4"/>
               <w:right w:val="single" w:color="D0D7D3" w:sz="4"/>
             </w:tcBorders>
+            <w:shd w:fill="F6F8F7" w:color="auto" w:val="clear"/>
             <w:tcMar>
               <w:top w:type="dxa" w:w="80"/>
               <w:left w:type="dxa" w:w="120"/>
@@ -4434,6 +4494,66 @@
                 <w:sz w:val="20"/>
                 <w:szCs w:val="20"/>
               </w:rPr>
+              <w:t xml:space="preserve">Pace and forecast on the dashboard: this term against last at the same point, and what falls due in the next 30, 60 and 90 days</w:t>
+            </w:r>
+          </w:p>
+        </w:tc>
+      </w:tr>
+      <w:tr>
+        <w:tc>
+          <w:tcPr>
+            <w:tcW w:type="dxa" w:w="1800"/>
+            <w:tcBorders>
+              <w:top w:val="single" w:color="D0D7D3" w:sz="4"/>
+              <w:left w:val="single" w:color="D0D7D3" w:sz="4"/>
+              <w:bottom w:val="single" w:color="D0D7D3" w:sz="4"/>
+              <w:right w:val="single" w:color="D0D7D3" w:sz="4"/>
+            </w:tcBorders>
+            <w:shd w:fill="F6F8F7" w:color="auto" w:val="clear"/>
+            <w:tcMar>
+              <w:top w:type="dxa" w:w="80"/>
+              <w:left w:type="dxa" w:w="120"/>
+              <w:bottom w:type="dxa" w:w="80"/>
+              <w:right w:type="dxa" w:w="120"/>
+            </w:tcMar>
+          </w:tcPr>
+          <w:p>
+            <w:r>
+              <w:rPr>
+                <w:b w:val="false"/>
+                <w:bCs w:val="false"/>
+                <w:sz w:val="20"/>
+                <w:szCs w:val="20"/>
+              </w:rPr>
+              <w:t xml:space="preserve">24 Oct 2026</w:t>
+            </w:r>
+          </w:p>
+        </w:tc>
+        <w:tc>
+          <w:tcPr>
+            <w:tcW w:type="dxa" w:w="7838"/>
+            <w:tcBorders>
+              <w:top w:val="single" w:color="D0D7D3" w:sz="4"/>
+              <w:left w:val="single" w:color="D0D7D3" w:sz="4"/>
+              <w:bottom w:val="single" w:color="D0D7D3" w:sz="4"/>
+              <w:right w:val="single" w:color="D0D7D3" w:sz="4"/>
+            </w:tcBorders>
+            <w:shd w:fill="F6F8F7" w:color="auto" w:val="clear"/>
+            <w:tcMar>
+              <w:top w:type="dxa" w:w="80"/>
+              <w:left w:type="dxa" w:w="120"/>
+              <w:bottom w:type="dxa" w:w="80"/>
+              <w:right w:type="dxa" w:w="120"/>
+            </w:tcMar>
+          </w:tcPr>
+          <w:p>
+            <w:r>
+              <w:rPr>
+                <w:b w:val="false"/>
+                <w:bCs w:val="false"/>
+                <w:sz w:val="20"/>
+                <w:szCs w:val="20"/>
+              </w:rPr>
               <w:t xml:space="preserve">Expenses with a second person’s approval, cash spending off the drawer, and income against expenditure</w:t>
             </w:r>
           </w:p>
@@ -4449,7 +4569,6 @@
               <w:bottom w:val="single" w:color="D0D7D3" w:sz="4"/>
               <w:right w:val="single" w:color="D0D7D3" w:sz="4"/>
             </w:tcBorders>
-            <w:shd w:fill="F6F8F7" w:color="auto" w:val="clear"/>
             <w:tcMar>
               <w:top w:type="dxa" w:w="80"/>
               <w:left w:type="dxa" w:w="120"/>
@@ -4478,7 +4597,6 @@
               <w:bottom w:val="single" w:color="D0D7D3" w:sz="4"/>
               <w:right w:val="single" w:color="D0D7D3" w:sz="4"/>
             </w:tcBorders>
-            <w:shd w:fill="F6F8F7" w:color="auto" w:val="clear"/>
             <w:tcMar>
               <w:top w:type="dxa" w:w="80"/>
               <w:left w:type="dxa" w:w="120"/>
@@ -4509,6 +4627,7 @@
               <w:bottom w:val="single" w:color="D0D7D3" w:sz="4"/>
               <w:right w:val="single" w:color="D0D7D3" w:sz="4"/>
             </w:tcBorders>
+            <w:shd w:fill="F6F8F7" w:color="auto" w:val="clear"/>
             <w:tcMar>
               <w:top w:type="dxa" w:w="80"/>
               <w:left w:type="dxa" w:w="120"/>
@@ -4537,6 +4656,7 @@
               <w:bottom w:val="single" w:color="D0D7D3" w:sz="4"/>
               <w:right w:val="single" w:color="D0D7D3" w:sz="4"/>
             </w:tcBorders>
+            <w:shd w:fill="F6F8F7" w:color="auto" w:val="clear"/>
             <w:tcMar>
               <w:top w:type="dxa" w:w="80"/>
               <w:left w:type="dxa" w:w="120"/>
@@ -4567,7 +4687,6 @@
               <w:bottom w:val="single" w:color="D0D7D3" w:sz="4"/>
               <w:right w:val="single" w:color="D0D7D3" w:sz="4"/>
             </w:tcBorders>
-            <w:shd w:fill="F6F8F7" w:color="auto" w:val="clear"/>
             <w:tcMar>
               <w:top w:type="dxa" w:w="80"/>
               <w:left w:type="dxa" w:w="120"/>
@@ -4596,7 +4715,6 @@
               <w:bottom w:val="single" w:color="D0D7D3" w:sz="4"/>
               <w:right w:val="single" w:color="D0D7D3" w:sz="4"/>
             </w:tcBorders>
-            <w:shd w:fill="F6F8F7" w:color="auto" w:val="clear"/>
             <w:tcMar>
               <w:top w:type="dxa" w:w="80"/>
               <w:left w:type="dxa" w:w="120"/>
@@ -4627,6 +4745,7 @@
               <w:bottom w:val="single" w:color="D0D7D3" w:sz="4"/>
               <w:right w:val="single" w:color="D0D7D3" w:sz="4"/>
             </w:tcBorders>
+            <w:shd w:fill="F6F8F7" w:color="auto" w:val="clear"/>
             <w:tcMar>
               <w:top w:type="dxa" w:w="80"/>
               <w:left w:type="dxa" w:w="120"/>
@@ -4655,6 +4774,7 @@
               <w:bottom w:val="single" w:color="D0D7D3" w:sz="4"/>
               <w:right w:val="single" w:color="D0D7D3" w:sz="4"/>
             </w:tcBorders>
+            <w:shd w:fill="F6F8F7" w:color="auto" w:val="clear"/>
             <w:tcMar>
               <w:top w:type="dxa" w:w="80"/>
               <w:left w:type="dxa" w:w="120"/>
@@ -4685,7 +4805,6 @@
               <w:bottom w:val="single" w:color="D0D7D3" w:sz="4"/>
               <w:right w:val="single" w:color="D0D7D3" w:sz="4"/>
             </w:tcBorders>
-            <w:shd w:fill="F6F8F7" w:color="auto" w:val="clear"/>
             <w:tcMar>
               <w:top w:type="dxa" w:w="80"/>
               <w:left w:type="dxa" w:w="120"/>
@@ -4714,7 +4833,6 @@
               <w:bottom w:val="single" w:color="D0D7D3" w:sz="4"/>
               <w:right w:val="single" w:color="D0D7D3" w:sz="4"/>
             </w:tcBorders>
-            <w:shd w:fill="F6F8F7" w:color="auto" w:val="clear"/>
             <w:tcMar>
               <w:top w:type="dxa" w:w="80"/>
               <w:left w:type="dxa" w:w="120"/>
@@ -4745,6 +4863,7 @@
               <w:bottom w:val="single" w:color="D0D7D3" w:sz="4"/>
               <w:right w:val="single" w:color="D0D7D3" w:sz="4"/>
             </w:tcBorders>
+            <w:shd w:fill="F6F8F7" w:color="auto" w:val="clear"/>
             <w:tcMar>
               <w:top w:type="dxa" w:w="80"/>
               <w:left w:type="dxa" w:w="120"/>
@@ -4773,6 +4892,7 @@
               <w:bottom w:val="single" w:color="D0D7D3" w:sz="4"/>
               <w:right w:val="single" w:color="D0D7D3" w:sz="4"/>
             </w:tcBorders>
+            <w:shd w:fill="F6F8F7" w:color="auto" w:val="clear"/>
             <w:tcMar>
               <w:top w:type="dxa" w:w="80"/>
               <w:left w:type="dxa" w:w="120"/>
@@ -4803,7 +4923,6 @@
               <w:bottom w:val="single" w:color="D0D7D3" w:sz="4"/>
               <w:right w:val="single" w:color="D0D7D3" w:sz="4"/>
             </w:tcBorders>
-            <w:shd w:fill="F6F8F7" w:color="auto" w:val="clear"/>
             <w:tcMar>
               <w:top w:type="dxa" w:w="80"/>
               <w:left w:type="dxa" w:w="120"/>
@@ -4832,7 +4951,6 @@
               <w:bottom w:val="single" w:color="D0D7D3" w:sz="4"/>
               <w:right w:val="single" w:color="D0D7D3" w:sz="4"/>
             </w:tcBorders>
-            <w:shd w:fill="F6F8F7" w:color="auto" w:val="clear"/>
             <w:tcMar>
               <w:top w:type="dxa" w:w="80"/>
               <w:left w:type="dxa" w:w="120"/>
@@ -4863,6 +4981,7 @@
               <w:bottom w:val="single" w:color="D0D7D3" w:sz="4"/>
               <w:right w:val="single" w:color="D0D7D3" w:sz="4"/>
             </w:tcBorders>
+            <w:shd w:fill="F6F8F7" w:color="auto" w:val="clear"/>
             <w:tcMar>
               <w:top w:type="dxa" w:w="80"/>
               <w:left w:type="dxa" w:w="120"/>
@@ -4891,6 +5010,7 @@
               <w:bottom w:val="single" w:color="D0D7D3" w:sz="4"/>
               <w:right w:val="single" w:color="D0D7D3" w:sz="4"/>
             </w:tcBorders>
+            <w:shd w:fill="F6F8F7" w:color="auto" w:val="clear"/>
             <w:tcMar>
               <w:top w:type="dxa" w:w="80"/>
               <w:left w:type="dxa" w:w="120"/>
@@ -4921,7 +5041,6 @@
               <w:bottom w:val="single" w:color="D0D7D3" w:sz="4"/>
               <w:right w:val="single" w:color="D0D7D3" w:sz="4"/>
             </w:tcBorders>
-            <w:shd w:fill="F6F8F7" w:color="auto" w:val="clear"/>
             <w:tcMar>
               <w:top w:type="dxa" w:w="80"/>
               <w:left w:type="dxa" w:w="120"/>
@@ -4950,7 +5069,6 @@
               <w:bottom w:val="single" w:color="D0D7D3" w:sz="4"/>
               <w:right w:val="single" w:color="D0D7D3" w:sz="4"/>
             </w:tcBorders>
-            <w:shd w:fill="F6F8F7" w:color="auto" w:val="clear"/>
             <w:tcMar>
               <w:top w:type="dxa" w:w="80"/>
               <w:left w:type="dxa" w:w="120"/>
@@ -4981,6 +5099,7 @@
               <w:bottom w:val="single" w:color="D0D7D3" w:sz="4"/>
               <w:right w:val="single" w:color="D0D7D3" w:sz="4"/>
             </w:tcBorders>
+            <w:shd w:fill="F6F8F7" w:color="auto" w:val="clear"/>
             <w:tcMar>
               <w:top w:type="dxa" w:w="80"/>
               <w:left w:type="dxa" w:w="120"/>
@@ -5009,6 +5128,7 @@
               <w:bottom w:val="single" w:color="D0D7D3" w:sz="4"/>
               <w:right w:val="single" w:color="D0D7D3" w:sz="4"/>
             </w:tcBorders>
+            <w:shd w:fill="F6F8F7" w:color="auto" w:val="clear"/>
             <w:tcMar>
               <w:top w:type="dxa" w:w="80"/>
               <w:left w:type="dxa" w:w="120"/>
@@ -5039,7 +5159,6 @@
               <w:bottom w:val="single" w:color="D0D7D3" w:sz="4"/>
               <w:right w:val="single" w:color="D0D7D3" w:sz="4"/>
             </w:tcBorders>
-            <w:shd w:fill="F6F8F7" w:color="auto" w:val="clear"/>
             <w:tcMar>
               <w:top w:type="dxa" w:w="80"/>
               <w:left w:type="dxa" w:w="120"/>
@@ -5068,7 +5187,6 @@
               <w:bottom w:val="single" w:color="D0D7D3" w:sz="4"/>
               <w:right w:val="single" w:color="D0D7D3" w:sz="4"/>
             </w:tcBorders>
-            <w:shd w:fill="F6F8F7" w:color="auto" w:val="clear"/>
             <w:tcMar>
               <w:top w:type="dxa" w:w="80"/>
               <w:left w:type="dxa" w:w="120"/>
@@ -5099,6 +5217,7 @@
               <w:bottom w:val="single" w:color="D0D7D3" w:sz="4"/>
               <w:right w:val="single" w:color="D0D7D3" w:sz="4"/>
             </w:tcBorders>
+            <w:shd w:fill="F6F8F7" w:color="auto" w:val="clear"/>
             <w:tcMar>
               <w:top w:type="dxa" w:w="80"/>
               <w:left w:type="dxa" w:w="120"/>
@@ -5127,6 +5246,7 @@
               <w:bottom w:val="single" w:color="D0D7D3" w:sz="4"/>
               <w:right w:val="single" w:color="D0D7D3" w:sz="4"/>
             </w:tcBorders>
+            <w:shd w:fill="F6F8F7" w:color="auto" w:val="clear"/>
             <w:tcMar>
               <w:top w:type="dxa" w:w="80"/>
               <w:left w:type="dxa" w:w="120"/>
@@ -5157,7 +5277,6 @@
               <w:bottom w:val="single" w:color="D0D7D3" w:sz="4"/>
               <w:right w:val="single" w:color="D0D7D3" w:sz="4"/>
             </w:tcBorders>
-            <w:shd w:fill="F6F8F7" w:color="auto" w:val="clear"/>
             <w:tcMar>
               <w:top w:type="dxa" w:w="80"/>
               <w:left w:type="dxa" w:w="120"/>
@@ -5186,7 +5305,6 @@
               <w:bottom w:val="single" w:color="D0D7D3" w:sz="4"/>
               <w:right w:val="single" w:color="D0D7D3" w:sz="4"/>
             </w:tcBorders>
-            <w:shd w:fill="F6F8F7" w:color="auto" w:val="clear"/>
             <w:tcMar>
               <w:top w:type="dxa" w:w="80"/>
               <w:left w:type="dxa" w:w="120"/>
@@ -5217,6 +5335,7 @@
               <w:bottom w:val="single" w:color="D0D7D3" w:sz="4"/>
               <w:right w:val="single" w:color="D0D7D3" w:sz="4"/>
             </w:tcBorders>
+            <w:shd w:fill="F6F8F7" w:color="auto" w:val="clear"/>
             <w:tcMar>
               <w:top w:type="dxa" w:w="80"/>
               <w:left w:type="dxa" w:w="120"/>
@@ -5245,6 +5364,7 @@
               <w:bottom w:val="single" w:color="D0D7D3" w:sz="4"/>
               <w:right w:val="single" w:color="D0D7D3" w:sz="4"/>
             </w:tcBorders>
+            <w:shd w:fill="F6F8F7" w:color="auto" w:val="clear"/>
             <w:tcMar>
               <w:top w:type="dxa" w:w="80"/>
               <w:left w:type="dxa" w:w="120"/>
@@ -5275,7 +5395,6 @@
               <w:bottom w:val="single" w:color="D0D7D3" w:sz="4"/>
               <w:right w:val="single" w:color="D0D7D3" w:sz="4"/>
             </w:tcBorders>
-            <w:shd w:fill="F6F8F7" w:color="auto" w:val="clear"/>
             <w:tcMar>
               <w:top w:type="dxa" w:w="80"/>
               <w:left w:type="dxa" w:w="120"/>
@@ -5304,7 +5423,6 @@
               <w:bottom w:val="single" w:color="D0D7D3" w:sz="4"/>
               <w:right w:val="single" w:color="D0D7D3" w:sz="4"/>
             </w:tcBorders>
-            <w:shd w:fill="F6F8F7" w:color="auto" w:val="clear"/>
             <w:tcMar>
               <w:top w:type="dxa" w:w="80"/>
               <w:left w:type="dxa" w:w="120"/>
@@ -5335,6 +5453,7 @@
               <w:bottom w:val="single" w:color="D0D7D3" w:sz="4"/>
               <w:right w:val="single" w:color="D0D7D3" w:sz="4"/>
             </w:tcBorders>
+            <w:shd w:fill="F6F8F7" w:color="auto" w:val="clear"/>
             <w:tcMar>
               <w:top w:type="dxa" w:w="80"/>
               <w:left w:type="dxa" w:w="120"/>
@@ -5363,6 +5482,7 @@
               <w:bottom w:val="single" w:color="D0D7D3" w:sz="4"/>
               <w:right w:val="single" w:color="D0D7D3" w:sz="4"/>
             </w:tcBorders>
+            <w:shd w:fill="F6F8F7" w:color="auto" w:val="clear"/>
             <w:tcMar>
               <w:top w:type="dxa" w:w="80"/>
               <w:left w:type="dxa" w:w="120"/>
@@ -5393,7 +5513,6 @@
               <w:bottom w:val="single" w:color="D0D7D3" w:sz="4"/>
               <w:right w:val="single" w:color="D0D7D3" w:sz="4"/>
             </w:tcBorders>
-            <w:shd w:fill="F6F8F7" w:color="auto" w:val="clear"/>
             <w:tcMar>
               <w:top w:type="dxa" w:w="80"/>
               <w:left w:type="dxa" w:w="120"/>
@@ -5422,7 +5541,6 @@
               <w:bottom w:val="single" w:color="D0D7D3" w:sz="4"/>
               <w:right w:val="single" w:color="D0D7D3" w:sz="4"/>
             </w:tcBorders>
-            <w:shd w:fill="F6F8F7" w:color="auto" w:val="clear"/>
             <w:tcMar>
               <w:top w:type="dxa" w:w="80"/>
               <w:left w:type="dxa" w:w="120"/>
@@ -5453,6 +5571,7 @@
               <w:bottom w:val="single" w:color="D0D7D3" w:sz="4"/>
               <w:right w:val="single" w:color="D0D7D3" w:sz="4"/>
             </w:tcBorders>
+            <w:shd w:fill="F6F8F7" w:color="auto" w:val="clear"/>
             <w:tcMar>
               <w:top w:type="dxa" w:w="80"/>
               <w:left w:type="dxa" w:w="120"/>
@@ -5481,6 +5600,7 @@
               <w:bottom w:val="single" w:color="D0D7D3" w:sz="4"/>
               <w:right w:val="single" w:color="D0D7D3" w:sz="4"/>
             </w:tcBorders>
+            <w:shd w:fill="F6F8F7" w:color="auto" w:val="clear"/>
             <w:tcMar>
               <w:top w:type="dxa" w:w="80"/>
               <w:left w:type="dxa" w:w="120"/>
@@ -5511,7 +5631,6 @@
               <w:bottom w:val="single" w:color="D0D7D3" w:sz="4"/>
               <w:right w:val="single" w:color="D0D7D3" w:sz="4"/>
             </w:tcBorders>
-            <w:shd w:fill="F6F8F7" w:color="auto" w:val="clear"/>
             <w:tcMar>
               <w:top w:type="dxa" w:w="80"/>
               <w:left w:type="dxa" w:w="120"/>
@@ -5540,7 +5659,6 @@
               <w:bottom w:val="single" w:color="D0D7D3" w:sz="4"/>
               <w:right w:val="single" w:color="D0D7D3" w:sz="4"/>
             </w:tcBorders>
-            <w:shd w:fill="F6F8F7" w:color="auto" w:val="clear"/>
             <w:tcMar>
               <w:top w:type="dxa" w:w="80"/>
               <w:left w:type="dxa" w:w="120"/>
@@ -5571,6 +5689,7 @@
               <w:bottom w:val="single" w:color="D0D7D3" w:sz="4"/>
               <w:right w:val="single" w:color="D0D7D3" w:sz="4"/>
             </w:tcBorders>
+            <w:shd w:fill="F6F8F7" w:color="auto" w:val="clear"/>
             <w:tcMar>
               <w:top w:type="dxa" w:w="80"/>
               <w:left w:type="dxa" w:w="120"/>
@@ -5599,6 +5718,7 @@
               <w:bottom w:val="single" w:color="D0D7D3" w:sz="4"/>
               <w:right w:val="single" w:color="D0D7D3" w:sz="4"/>
             </w:tcBorders>
+            <w:shd w:fill="F6F8F7" w:color="auto" w:val="clear"/>
             <w:tcMar>
               <w:top w:type="dxa" w:w="80"/>
               <w:left w:type="dxa" w:w="120"/>
@@ -5629,7 +5749,6 @@
               <w:bottom w:val="single" w:color="D0D7D3" w:sz="4"/>
               <w:right w:val="single" w:color="D0D7D3" w:sz="4"/>
             </w:tcBorders>
-            <w:shd w:fill="F6F8F7" w:color="auto" w:val="clear"/>
             <w:tcMar>
               <w:top w:type="dxa" w:w="80"/>
               <w:left w:type="dxa" w:w="120"/>
@@ -5658,7 +5777,6 @@
               <w:bottom w:val="single" w:color="D0D7D3" w:sz="4"/>
               <w:right w:val="single" w:color="D0D7D3" w:sz="4"/>
             </w:tcBorders>
-            <w:shd w:fill="F6F8F7" w:color="auto" w:val="clear"/>
             <w:tcMar>
               <w:top w:type="dxa" w:w="80"/>
               <w:left w:type="dxa" w:w="120"/>
@@ -5689,6 +5807,7 @@
               <w:bottom w:val="single" w:color="D0D7D3" w:sz="4"/>
               <w:right w:val="single" w:color="D0D7D3" w:sz="4"/>
             </w:tcBorders>
+            <w:shd w:fill="F6F8F7" w:color="auto" w:val="clear"/>
             <w:tcMar>
               <w:top w:type="dxa" w:w="80"/>
               <w:left w:type="dxa" w:w="120"/>
@@ -5717,6 +5836,7 @@
               <w:bottom w:val="single" w:color="D0D7D3" w:sz="4"/>
               <w:right w:val="single" w:color="D0D7D3" w:sz="4"/>
             </w:tcBorders>
+            <w:shd w:fill="F6F8F7" w:color="auto" w:val="clear"/>
             <w:tcMar>
               <w:top w:type="dxa" w:w="80"/>
               <w:left w:type="dxa" w:w="120"/>
@@ -5747,7 +5867,6 @@
               <w:bottom w:val="single" w:color="D0D7D3" w:sz="4"/>
               <w:right w:val="single" w:color="D0D7D3" w:sz="4"/>
             </w:tcBorders>
-            <w:shd w:fill="F6F8F7" w:color="auto" w:val="clear"/>
             <w:tcMar>
               <w:top w:type="dxa" w:w="80"/>
               <w:left w:type="dxa" w:w="120"/>
@@ -5776,7 +5895,6 @@
               <w:bottom w:val="single" w:color="D0D7D3" w:sz="4"/>
               <w:right w:val="single" w:color="D0D7D3" w:sz="4"/>
             </w:tcBorders>
-            <w:shd w:fill="F6F8F7" w:color="auto" w:val="clear"/>
             <w:tcMar>
               <w:top w:type="dxa" w:w="80"/>
               <w:left w:type="dxa" w:w="120"/>
@@ -5807,6 +5925,7 @@
               <w:bottom w:val="single" w:color="D0D7D3" w:sz="4"/>
               <w:right w:val="single" w:color="D0D7D3" w:sz="4"/>
             </w:tcBorders>
+            <w:shd w:fill="F6F8F7" w:color="auto" w:val="clear"/>
             <w:tcMar>
               <w:top w:type="dxa" w:w="80"/>
               <w:left w:type="dxa" w:w="120"/>
@@ -5835,6 +5954,7 @@
               <w:bottom w:val="single" w:color="D0D7D3" w:sz="4"/>
               <w:right w:val="single" w:color="D0D7D3" w:sz="4"/>
             </w:tcBorders>
+            <w:shd w:fill="F6F8F7" w:color="auto" w:val="clear"/>
             <w:tcMar>
               <w:top w:type="dxa" w:w="80"/>
               <w:left w:type="dxa" w:w="120"/>
@@ -5865,7 +5985,6 @@
               <w:bottom w:val="single" w:color="D0D7D3" w:sz="4"/>
               <w:right w:val="single" w:color="D0D7D3" w:sz="4"/>
             </w:tcBorders>
-            <w:shd w:fill="F6F8F7" w:color="auto" w:val="clear"/>
             <w:tcMar>
               <w:top w:type="dxa" w:w="80"/>
               <w:left w:type="dxa" w:w="120"/>
@@ -5894,7 +6013,6 @@
               <w:bottom w:val="single" w:color="D0D7D3" w:sz="4"/>
               <w:right w:val="single" w:color="D0D7D3" w:sz="4"/>
             </w:tcBorders>
-            <w:shd w:fill="F6F8F7" w:color="auto" w:val="clear"/>
             <w:tcMar>
               <w:top w:type="dxa" w:w="80"/>
               <w:left w:type="dxa" w:w="120"/>
@@ -5925,6 +6043,7 @@
               <w:bottom w:val="single" w:color="D0D7D3" w:sz="4"/>
               <w:right w:val="single" w:color="D0D7D3" w:sz="4"/>
             </w:tcBorders>
+            <w:shd w:fill="F6F8F7" w:color="auto" w:val="clear"/>
             <w:tcMar>
               <w:top w:type="dxa" w:w="80"/>
               <w:left w:type="dxa" w:w="120"/>
@@ -5953,6 +6072,7 @@
               <w:bottom w:val="single" w:color="D0D7D3" w:sz="4"/>
               <w:right w:val="single" w:color="D0D7D3" w:sz="4"/>
             </w:tcBorders>
+            <w:shd w:fill="F6F8F7" w:color="auto" w:val="clear"/>
             <w:tcMar>
               <w:top w:type="dxa" w:w="80"/>
               <w:left w:type="dxa" w:w="120"/>
@@ -5983,7 +6103,6 @@
               <w:bottom w:val="single" w:color="D0D7D3" w:sz="4"/>
               <w:right w:val="single" w:color="D0D7D3" w:sz="4"/>
             </w:tcBorders>
-            <w:shd w:fill="F6F8F7" w:color="auto" w:val="clear"/>
             <w:tcMar>
               <w:top w:type="dxa" w:w="80"/>
               <w:left w:type="dxa" w:w="120"/>
@@ -6012,7 +6131,6 @@
               <w:bottom w:val="single" w:color="D0D7D3" w:sz="4"/>
               <w:right w:val="single" w:color="D0D7D3" w:sz="4"/>
             </w:tcBorders>
-            <w:shd w:fill="F6F8F7" w:color="auto" w:val="clear"/>
             <w:tcMar>
               <w:top w:type="dxa" w:w="80"/>
               <w:left w:type="dxa" w:w="120"/>
@@ -6043,6 +6161,7 @@
               <w:bottom w:val="single" w:color="D0D7D3" w:sz="4"/>
               <w:right w:val="single" w:color="D0D7D3" w:sz="4"/>
             </w:tcBorders>
+            <w:shd w:fill="F6F8F7" w:color="auto" w:val="clear"/>
             <w:tcMar>
               <w:top w:type="dxa" w:w="80"/>
               <w:left w:type="dxa" w:w="120"/>
@@ -6071,6 +6190,7 @@
               <w:bottom w:val="single" w:color="D0D7D3" w:sz="4"/>
               <w:right w:val="single" w:color="D0D7D3" w:sz="4"/>
             </w:tcBorders>
+            <w:shd w:fill="F6F8F7" w:color="auto" w:val="clear"/>
             <w:tcMar>
               <w:top w:type="dxa" w:w="80"/>
               <w:left w:type="dxa" w:w="120"/>
@@ -6101,7 +6221,6 @@
               <w:bottom w:val="single" w:color="D0D7D3" w:sz="4"/>
               <w:right w:val="single" w:color="D0D7D3" w:sz="4"/>
             </w:tcBorders>
-            <w:shd w:fill="F6F8F7" w:color="auto" w:val="clear"/>
             <w:tcMar>
               <w:top w:type="dxa" w:w="80"/>
               <w:left w:type="dxa" w:w="120"/>
@@ -6130,7 +6249,6 @@
               <w:bottom w:val="single" w:color="D0D7D3" w:sz="4"/>
               <w:right w:val="single" w:color="D0D7D3" w:sz="4"/>
             </w:tcBorders>
-            <w:shd w:fill="F6F8F7" w:color="auto" w:val="clear"/>
             <w:tcMar>
               <w:top w:type="dxa" w:w="80"/>
               <w:left w:type="dxa" w:w="120"/>
@@ -6161,6 +6279,7 @@
               <w:bottom w:val="single" w:color="D0D7D3" w:sz="4"/>
               <w:right w:val="single" w:color="D0D7D3" w:sz="4"/>
             </w:tcBorders>
+            <w:shd w:fill="F6F8F7" w:color="auto" w:val="clear"/>
             <w:tcMar>
               <w:top w:type="dxa" w:w="80"/>
               <w:left w:type="dxa" w:w="120"/>
@@ -6189,6 +6308,7 @@
               <w:bottom w:val="single" w:color="D0D7D3" w:sz="4"/>
               <w:right w:val="single" w:color="D0D7D3" w:sz="4"/>
             </w:tcBorders>
+            <w:shd w:fill="F6F8F7" w:color="auto" w:val="clear"/>
             <w:tcMar>
               <w:top w:type="dxa" w:w="80"/>
               <w:left w:type="dxa" w:w="120"/>
@@ -6219,7 +6339,6 @@
               <w:bottom w:val="single" w:color="D0D7D3" w:sz="4"/>
               <w:right w:val="single" w:color="D0D7D3" w:sz="4"/>
             </w:tcBorders>
-            <w:shd w:fill="F6F8F7" w:color="auto" w:val="clear"/>
             <w:tcMar>
               <w:top w:type="dxa" w:w="80"/>
               <w:left w:type="dxa" w:w="120"/>
@@ -6248,7 +6367,6 @@
               <w:bottom w:val="single" w:color="D0D7D3" w:sz="4"/>
               <w:right w:val="single" w:color="D0D7D3" w:sz="4"/>
             </w:tcBorders>
-            <w:shd w:fill="F6F8F7" w:color="auto" w:val="clear"/>
             <w:tcMar>
               <w:top w:type="dxa" w:w="80"/>
               <w:left w:type="dxa" w:w="120"/>
@@ -6279,6 +6397,7 @@
               <w:bottom w:val="single" w:color="D0D7D3" w:sz="4"/>
               <w:right w:val="single" w:color="D0D7D3" w:sz="4"/>
             </w:tcBorders>
+            <w:shd w:fill="F6F8F7" w:color="auto" w:val="clear"/>
             <w:tcMar>
               <w:top w:type="dxa" w:w="80"/>
               <w:left w:type="dxa" w:w="120"/>
@@ -6307,6 +6426,7 @@
               <w:bottom w:val="single" w:color="D0D7D3" w:sz="4"/>
               <w:right w:val="single" w:color="D0D7D3" w:sz="4"/>
             </w:tcBorders>
+            <w:shd w:fill="F6F8F7" w:color="auto" w:val="clear"/>
             <w:tcMar>
               <w:top w:type="dxa" w:w="80"/>
               <w:left w:type="dxa" w:w="120"/>
@@ -6337,7 +6457,6 @@
               <w:bottom w:val="single" w:color="D0D7D3" w:sz="4"/>
               <w:right w:val="single" w:color="D0D7D3" w:sz="4"/>
             </w:tcBorders>
-            <w:shd w:fill="F6F8F7" w:color="auto" w:val="clear"/>
             <w:tcMar>
               <w:top w:type="dxa" w:w="80"/>
               <w:left w:type="dxa" w:w="120"/>
@@ -6366,7 +6485,6 @@
               <w:bottom w:val="single" w:color="D0D7D3" w:sz="4"/>
               <w:right w:val="single" w:color="D0D7D3" w:sz="4"/>
             </w:tcBorders>
-            <w:shd w:fill="F6F8F7" w:color="auto" w:val="clear"/>
             <w:tcMar>
               <w:top w:type="dxa" w:w="80"/>
               <w:left w:type="dxa" w:w="120"/>
@@ -6397,6 +6515,7 @@
               <w:bottom w:val="single" w:color="D0D7D3" w:sz="4"/>
               <w:right w:val="single" w:color="D0D7D3" w:sz="4"/>
             </w:tcBorders>
+            <w:shd w:fill="F6F8F7" w:color="auto" w:val="clear"/>
             <w:tcMar>
               <w:top w:type="dxa" w:w="80"/>
               <w:left w:type="dxa" w:w="120"/>
@@ -6425,6 +6544,7 @@
               <w:bottom w:val="single" w:color="D0D7D3" w:sz="4"/>
               <w:right w:val="single" w:color="D0D7D3" w:sz="4"/>
             </w:tcBorders>
+            <w:shd w:fill="F6F8F7" w:color="auto" w:val="clear"/>
             <w:tcMar>
               <w:top w:type="dxa" w:w="80"/>
               <w:left w:type="dxa" w:w="120"/>
@@ -6455,7 +6575,6 @@
               <w:bottom w:val="single" w:color="D0D7D3" w:sz="4"/>
               <w:right w:val="single" w:color="D0D7D3" w:sz="4"/>
             </w:tcBorders>
-            <w:shd w:fill="F6F8F7" w:color="auto" w:val="clear"/>
             <w:tcMar>
               <w:top w:type="dxa" w:w="80"/>
               <w:left w:type="dxa" w:w="120"/>
@@ -6484,7 +6603,6 @@
               <w:bottom w:val="single" w:color="D0D7D3" w:sz="4"/>
               <w:right w:val="single" w:color="D0D7D3" w:sz="4"/>
             </w:tcBorders>
-            <w:shd w:fill="F6F8F7" w:color="auto" w:val="clear"/>
             <w:tcMar>
               <w:top w:type="dxa" w:w="80"/>
               <w:left w:type="dxa" w:w="120"/>
@@ -6515,6 +6633,7 @@
               <w:bottom w:val="single" w:color="D0D7D3" w:sz="4"/>
               <w:right w:val="single" w:color="D0D7D3" w:sz="4"/>
             </w:tcBorders>
+            <w:shd w:fill="F6F8F7" w:color="auto" w:val="clear"/>
             <w:tcMar>
               <w:top w:type="dxa" w:w="80"/>
               <w:left w:type="dxa" w:w="120"/>
@@ -6543,6 +6662,7 @@
               <w:bottom w:val="single" w:color="D0D7D3" w:sz="4"/>
               <w:right w:val="single" w:color="D0D7D3" w:sz="4"/>
             </w:tcBorders>
+            <w:shd w:fill="F6F8F7" w:color="auto" w:val="clear"/>
             <w:tcMar>
               <w:top w:type="dxa" w:w="80"/>
               <w:left w:type="dxa" w:w="120"/>
@@ -6573,7 +6693,6 @@
               <w:bottom w:val="single" w:color="D0D7D3" w:sz="4"/>
               <w:right w:val="single" w:color="D0D7D3" w:sz="4"/>
             </w:tcBorders>
-            <w:shd w:fill="F6F8F7" w:color="auto" w:val="clear"/>
             <w:tcMar>
               <w:top w:type="dxa" w:w="80"/>
               <w:left w:type="dxa" w:w="120"/>
@@ -6602,7 +6721,6 @@
               <w:bottom w:val="single" w:color="D0D7D3" w:sz="4"/>
               <w:right w:val="single" w:color="D0D7D3" w:sz="4"/>
             </w:tcBorders>
-            <w:shd w:fill="F6F8F7" w:color="auto" w:val="clear"/>
             <w:tcMar>
               <w:top w:type="dxa" w:w="80"/>
               <w:left w:type="dxa" w:w="120"/>
@@ -6633,6 +6751,7 @@
               <w:bottom w:val="single" w:color="D0D7D3" w:sz="4"/>
               <w:right w:val="single" w:color="D0D7D3" w:sz="4"/>
             </w:tcBorders>
+            <w:shd w:fill="F6F8F7" w:color="auto" w:val="clear"/>
             <w:tcMar>
               <w:top w:type="dxa" w:w="80"/>
               <w:left w:type="dxa" w:w="120"/>
@@ -6661,6 +6780,7 @@
               <w:bottom w:val="single" w:color="D0D7D3" w:sz="4"/>
               <w:right w:val="single" w:color="D0D7D3" w:sz="4"/>
             </w:tcBorders>
+            <w:shd w:fill="F6F8F7" w:color="auto" w:val="clear"/>
             <w:tcMar>
               <w:top w:type="dxa" w:w="80"/>
               <w:left w:type="dxa" w:w="120"/>
@@ -6691,7 +6811,6 @@
               <w:bottom w:val="single" w:color="D0D7D3" w:sz="4"/>
               <w:right w:val="single" w:color="D0D7D3" w:sz="4"/>
             </w:tcBorders>
-            <w:shd w:fill="F6F8F7" w:color="auto" w:val="clear"/>
             <w:tcMar>
               <w:top w:type="dxa" w:w="80"/>
               <w:left w:type="dxa" w:w="120"/>
@@ -6720,7 +6839,6 @@
               <w:bottom w:val="single" w:color="D0D7D3" w:sz="4"/>
               <w:right w:val="single" w:color="D0D7D3" w:sz="4"/>
             </w:tcBorders>
-            <w:shd w:fill="F6F8F7" w:color="auto" w:val="clear"/>
             <w:tcMar>
               <w:top w:type="dxa" w:w="80"/>
               <w:left w:type="dxa" w:w="120"/>
@@ -6751,6 +6869,7 @@
               <w:bottom w:val="single" w:color="D0D7D3" w:sz="4"/>
               <w:right w:val="single" w:color="D0D7D3" w:sz="4"/>
             </w:tcBorders>
+            <w:shd w:fill="F6F8F7" w:color="auto" w:val="clear"/>
             <w:tcMar>
               <w:top w:type="dxa" w:w="80"/>
               <w:left w:type="dxa" w:w="120"/>
@@ -6779,6 +6898,7 @@
               <w:bottom w:val="single" w:color="D0D7D3" w:sz="4"/>
               <w:right w:val="single" w:color="D0D7D3" w:sz="4"/>
             </w:tcBorders>
+            <w:shd w:fill="F6F8F7" w:color="auto" w:val="clear"/>
             <w:tcMar>
               <w:top w:type="dxa" w:w="80"/>
               <w:left w:type="dxa" w:w="120"/>
@@ -6809,7 +6929,6 @@
               <w:bottom w:val="single" w:color="D0D7D3" w:sz="4"/>
               <w:right w:val="single" w:color="D0D7D3" w:sz="4"/>
             </w:tcBorders>
-            <w:shd w:fill="F6F8F7" w:color="auto" w:val="clear"/>
             <w:tcMar>
               <w:top w:type="dxa" w:w="80"/>
               <w:left w:type="dxa" w:w="120"/>
@@ -6838,7 +6957,6 @@
               <w:bottom w:val="single" w:color="D0D7D3" w:sz="4"/>
               <w:right w:val="single" w:color="D0D7D3" w:sz="4"/>
             </w:tcBorders>
-            <w:shd w:fill="F6F8F7" w:color="auto" w:val="clear"/>
             <w:tcMar>
               <w:top w:type="dxa" w:w="80"/>
               <w:left w:type="dxa" w:w="120"/>
@@ -6869,6 +6987,7 @@
               <w:bottom w:val="single" w:color="D0D7D3" w:sz="4"/>
               <w:right w:val="single" w:color="D0D7D3" w:sz="4"/>
             </w:tcBorders>
+            <w:shd w:fill="F6F8F7" w:color="auto" w:val="clear"/>
             <w:tcMar>
               <w:top w:type="dxa" w:w="80"/>
               <w:left w:type="dxa" w:w="120"/>
@@ -6897,6 +7016,7 @@
               <w:bottom w:val="single" w:color="D0D7D3" w:sz="4"/>
               <w:right w:val="single" w:color="D0D7D3" w:sz="4"/>
             </w:tcBorders>
+            <w:shd w:fill="F6F8F7" w:color="auto" w:val="clear"/>
             <w:tcMar>
               <w:top w:type="dxa" w:w="80"/>
               <w:left w:type="dxa" w:w="120"/>

</xml_diff>

<commit_message>
General journal for the accountant, with the school's own account codes
</commit_message>
<xml_diff>
--- a/docs/product/WardPay - what it does.docx
+++ b/docs/product/WardPay - what it does.docx
@@ -264,6 +264,65 @@
                 <w:sz w:val="20"/>
                 <w:szCs w:val="20"/>
               </w:rPr>
+              <w:t xml:space="preserve">A general journal for your accountant: every bill, payment, banking and approved expense as double entries, in Excel or CSV</w:t>
+            </w:r>
+          </w:p>
+        </w:tc>
+        <w:tc>
+          <w:tcPr>
+            <w:tcW w:type="dxa" w:w="4238"/>
+            <w:tcBorders>
+              <w:top w:val="single" w:color="D0D7D3" w:sz="4"/>
+              <w:left w:val="single" w:color="D0D7D3" w:sz="4"/>
+              <w:bottom w:val="single" w:color="D0D7D3" w:sz="4"/>
+              <w:right w:val="single" w:color="D0D7D3" w:sz="4"/>
+            </w:tcBorders>
+            <w:shd w:fill="F6F8F7" w:color="auto" w:val="clear"/>
+            <w:tcMar>
+              <w:top w:type="dxa" w:w="80"/>
+              <w:left w:type="dxa" w:w="120"/>
+              <w:bottom w:type="dxa" w:w="80"/>
+              <w:right w:type="dxa" w:w="120"/>
+            </w:tcMar>
+          </w:tcPr>
+          <w:p>
+            <w:r>
+              <w:rPr>
+                <w:b w:val="false"/>
+                <w:bCs w:val="false"/>
+                <w:sz w:val="20"/>
+                <w:szCs w:val="20"/>
+              </w:rPr>
+              <w:t xml:space="preserve">The accountant gets clean books without retyping receipts, using the account codes they already use</w:t>
+            </w:r>
+          </w:p>
+        </w:tc>
+      </w:tr>
+      <w:tr>
+        <w:tc>
+          <w:tcPr>
+            <w:tcW w:type="dxa" w:w="5400"/>
+            <w:tcBorders>
+              <w:top w:val="single" w:color="D0D7D3" w:sz="4"/>
+              <w:left w:val="single" w:color="D0D7D3" w:sz="4"/>
+              <w:bottom w:val="single" w:color="D0D7D3" w:sz="4"/>
+              <w:right w:val="single" w:color="D0D7D3" w:sz="4"/>
+            </w:tcBorders>
+            <w:tcMar>
+              <w:top w:type="dxa" w:w="80"/>
+              <w:left w:type="dxa" w:w="120"/>
+              <w:bottom w:type="dxa" w:w="80"/>
+              <w:right w:type="dxa" w:w="120"/>
+            </w:tcMar>
+          </w:tcPr>
+          <w:p>
+            <w:r>
+              <w:rPr>
+                <w:b w:val="false"/>
+                <w:bCs w:val="false"/>
+                <w:sz w:val="20"/>
+                <w:szCs w:val="20"/>
+              </w:rPr>
               <w:t xml:space="preserve">This term against last term at the same point, and what falls due in the next 30, 60 and 90 days</w:t>
             </w:r>
           </w:p>
@@ -277,7 +336,6 @@
               <w:bottom w:val="single" w:color="D0D7D3" w:sz="4"/>
               <w:right w:val="single" w:color="D0D7D3" w:sz="4"/>
             </w:tcBorders>
-            <w:shd w:fill="F6F8F7" w:color="auto" w:val="clear"/>
             <w:tcMar>
               <w:top w:type="dxa" w:w="80"/>
               <w:left w:type="dxa" w:w="120"/>
@@ -308,6 +366,7 @@
               <w:bottom w:val="single" w:color="D0D7D3" w:sz="4"/>
               <w:right w:val="single" w:color="D0D7D3" w:sz="4"/>
             </w:tcBorders>
+            <w:shd w:fill="F6F8F7" w:color="auto" w:val="clear"/>
             <w:tcMar>
               <w:top w:type="dxa" w:w="80"/>
               <w:left w:type="dxa" w:w="120"/>
@@ -336,6 +395,7 @@
               <w:bottom w:val="single" w:color="D0D7D3" w:sz="4"/>
               <w:right w:val="single" w:color="D0D7D3" w:sz="4"/>
             </w:tcBorders>
+            <w:shd w:fill="F6F8F7" w:color="auto" w:val="clear"/>
             <w:tcMar>
               <w:top w:type="dxa" w:w="80"/>
               <w:left w:type="dxa" w:w="120"/>
@@ -366,7 +426,6 @@
               <w:bottom w:val="single" w:color="D0D7D3" w:sz="4"/>
               <w:right w:val="single" w:color="D0D7D3" w:sz="4"/>
             </w:tcBorders>
-            <w:shd w:fill="F6F8F7" w:color="auto" w:val="clear"/>
             <w:tcMar>
               <w:top w:type="dxa" w:w="80"/>
               <w:left w:type="dxa" w:w="120"/>
@@ -395,7 +454,6 @@
               <w:bottom w:val="single" w:color="D0D7D3" w:sz="4"/>
               <w:right w:val="single" w:color="D0D7D3" w:sz="4"/>
             </w:tcBorders>
-            <w:shd w:fill="F6F8F7" w:color="auto" w:val="clear"/>
             <w:tcMar>
               <w:top w:type="dxa" w:w="80"/>
               <w:left w:type="dxa" w:w="120"/>
@@ -426,6 +484,7 @@
               <w:bottom w:val="single" w:color="D0D7D3" w:sz="4"/>
               <w:right w:val="single" w:color="D0D7D3" w:sz="4"/>
             </w:tcBorders>
+            <w:shd w:fill="F6F8F7" w:color="auto" w:val="clear"/>
             <w:tcMar>
               <w:top w:type="dxa" w:w="80"/>
               <w:left w:type="dxa" w:w="120"/>
@@ -454,6 +513,7 @@
               <w:bottom w:val="single" w:color="D0D7D3" w:sz="4"/>
               <w:right w:val="single" w:color="D0D7D3" w:sz="4"/>
             </w:tcBorders>
+            <w:shd w:fill="F6F8F7" w:color="auto" w:val="clear"/>
             <w:tcMar>
               <w:top w:type="dxa" w:w="80"/>
               <w:left w:type="dxa" w:w="120"/>
@@ -484,7 +544,6 @@
               <w:bottom w:val="single" w:color="D0D7D3" w:sz="4"/>
               <w:right w:val="single" w:color="D0D7D3" w:sz="4"/>
             </w:tcBorders>
-            <w:shd w:fill="F6F8F7" w:color="auto" w:val="clear"/>
             <w:tcMar>
               <w:top w:type="dxa" w:w="80"/>
               <w:left w:type="dxa" w:w="120"/>
@@ -513,7 +572,6 @@
               <w:bottom w:val="single" w:color="D0D7D3" w:sz="4"/>
               <w:right w:val="single" w:color="D0D7D3" w:sz="4"/>
             </w:tcBorders>
-            <w:shd w:fill="F6F8F7" w:color="auto" w:val="clear"/>
             <w:tcMar>
               <w:top w:type="dxa" w:w="80"/>
               <w:left w:type="dxa" w:w="120"/>
@@ -544,6 +602,7 @@
               <w:bottom w:val="single" w:color="D0D7D3" w:sz="4"/>
               <w:right w:val="single" w:color="D0D7D3" w:sz="4"/>
             </w:tcBorders>
+            <w:shd w:fill="F6F8F7" w:color="auto" w:val="clear"/>
             <w:tcMar>
               <w:top w:type="dxa" w:w="80"/>
               <w:left w:type="dxa" w:w="120"/>
@@ -572,6 +631,7 @@
               <w:bottom w:val="single" w:color="D0D7D3" w:sz="4"/>
               <w:right w:val="single" w:color="D0D7D3" w:sz="4"/>
             </w:tcBorders>
+            <w:shd w:fill="F6F8F7" w:color="auto" w:val="clear"/>
             <w:tcMar>
               <w:top w:type="dxa" w:w="80"/>
               <w:left w:type="dxa" w:w="120"/>
@@ -602,7 +662,6 @@
               <w:bottom w:val="single" w:color="D0D7D3" w:sz="4"/>
               <w:right w:val="single" w:color="D0D7D3" w:sz="4"/>
             </w:tcBorders>
-            <w:shd w:fill="F6F8F7" w:color="auto" w:val="clear"/>
             <w:tcMar>
               <w:top w:type="dxa" w:w="80"/>
               <w:left w:type="dxa" w:w="120"/>
@@ -631,7 +690,6 @@
               <w:bottom w:val="single" w:color="D0D7D3" w:sz="4"/>
               <w:right w:val="single" w:color="D0D7D3" w:sz="4"/>
             </w:tcBorders>
-            <w:shd w:fill="F6F8F7" w:color="auto" w:val="clear"/>
             <w:tcMar>
               <w:top w:type="dxa" w:w="80"/>
               <w:left w:type="dxa" w:w="120"/>
@@ -4494,6 +4552,66 @@
                 <w:sz w:val="20"/>
                 <w:szCs w:val="20"/>
               </w:rPr>
+              <w:t xml:space="preserve">A general journal for the accountant (Excel or CSV) with the school’s own account codes</w:t>
+            </w:r>
+          </w:p>
+        </w:tc>
+      </w:tr>
+      <w:tr>
+        <w:tc>
+          <w:tcPr>
+            <w:tcW w:type="dxa" w:w="1800"/>
+            <w:tcBorders>
+              <w:top w:val="single" w:color="D0D7D3" w:sz="4"/>
+              <w:left w:val="single" w:color="D0D7D3" w:sz="4"/>
+              <w:bottom w:val="single" w:color="D0D7D3" w:sz="4"/>
+              <w:right w:val="single" w:color="D0D7D3" w:sz="4"/>
+            </w:tcBorders>
+            <w:shd w:fill="F6F8F7" w:color="auto" w:val="clear"/>
+            <w:tcMar>
+              <w:top w:type="dxa" w:w="80"/>
+              <w:left w:type="dxa" w:w="120"/>
+              <w:bottom w:type="dxa" w:w="80"/>
+              <w:right w:type="dxa" w:w="120"/>
+            </w:tcMar>
+          </w:tcPr>
+          <w:p>
+            <w:r>
+              <w:rPr>
+                <w:b w:val="false"/>
+                <w:bCs w:val="false"/>
+                <w:sz w:val="20"/>
+                <w:szCs w:val="20"/>
+              </w:rPr>
+              <w:t xml:space="preserve">24 Oct 2026</w:t>
+            </w:r>
+          </w:p>
+        </w:tc>
+        <w:tc>
+          <w:tcPr>
+            <w:tcW w:type="dxa" w:w="7838"/>
+            <w:tcBorders>
+              <w:top w:val="single" w:color="D0D7D3" w:sz="4"/>
+              <w:left w:val="single" w:color="D0D7D3" w:sz="4"/>
+              <w:bottom w:val="single" w:color="D0D7D3" w:sz="4"/>
+              <w:right w:val="single" w:color="D0D7D3" w:sz="4"/>
+            </w:tcBorders>
+            <w:shd w:fill="F6F8F7" w:color="auto" w:val="clear"/>
+            <w:tcMar>
+              <w:top w:type="dxa" w:w="80"/>
+              <w:left w:type="dxa" w:w="120"/>
+              <w:bottom w:type="dxa" w:w="80"/>
+              <w:right w:type="dxa" w:w="120"/>
+            </w:tcMar>
+          </w:tcPr>
+          <w:p>
+            <w:r>
+              <w:rPr>
+                <w:b w:val="false"/>
+                <w:bCs w:val="false"/>
+                <w:sz w:val="20"/>
+                <w:szCs w:val="20"/>
+              </w:rPr>
               <w:t xml:space="preserve">Pace and forecast on the dashboard: this term against last at the same point, and what falls due in the next 30, 60 and 90 days</w:t>
             </w:r>
           </w:p>
@@ -4509,7 +4627,6 @@
               <w:bottom w:val="single" w:color="D0D7D3" w:sz="4"/>
               <w:right w:val="single" w:color="D0D7D3" w:sz="4"/>
             </w:tcBorders>
-            <w:shd w:fill="F6F8F7" w:color="auto" w:val="clear"/>
             <w:tcMar>
               <w:top w:type="dxa" w:w="80"/>
               <w:left w:type="dxa" w:w="120"/>
@@ -4538,7 +4655,6 @@
               <w:bottom w:val="single" w:color="D0D7D3" w:sz="4"/>
               <w:right w:val="single" w:color="D0D7D3" w:sz="4"/>
             </w:tcBorders>
-            <w:shd w:fill="F6F8F7" w:color="auto" w:val="clear"/>
             <w:tcMar>
               <w:top w:type="dxa" w:w="80"/>
               <w:left w:type="dxa" w:w="120"/>
@@ -4569,6 +4685,7 @@
               <w:bottom w:val="single" w:color="D0D7D3" w:sz="4"/>
               <w:right w:val="single" w:color="D0D7D3" w:sz="4"/>
             </w:tcBorders>
+            <w:shd w:fill="F6F8F7" w:color="auto" w:val="clear"/>
             <w:tcMar>
               <w:top w:type="dxa" w:w="80"/>
               <w:left w:type="dxa" w:w="120"/>
@@ -4597,6 +4714,7 @@
               <w:bottom w:val="single" w:color="D0D7D3" w:sz="4"/>
               <w:right w:val="single" w:color="D0D7D3" w:sz="4"/>
             </w:tcBorders>
+            <w:shd w:fill="F6F8F7" w:color="auto" w:val="clear"/>
             <w:tcMar>
               <w:top w:type="dxa" w:w="80"/>
               <w:left w:type="dxa" w:w="120"/>
@@ -4627,7 +4745,6 @@
               <w:bottom w:val="single" w:color="D0D7D3" w:sz="4"/>
               <w:right w:val="single" w:color="D0D7D3" w:sz="4"/>
             </w:tcBorders>
-            <w:shd w:fill="F6F8F7" w:color="auto" w:val="clear"/>
             <w:tcMar>
               <w:top w:type="dxa" w:w="80"/>
               <w:left w:type="dxa" w:w="120"/>
@@ -4656,7 +4773,6 @@
               <w:bottom w:val="single" w:color="D0D7D3" w:sz="4"/>
               <w:right w:val="single" w:color="D0D7D3" w:sz="4"/>
             </w:tcBorders>
-            <w:shd w:fill="F6F8F7" w:color="auto" w:val="clear"/>
             <w:tcMar>
               <w:top w:type="dxa" w:w="80"/>
               <w:left w:type="dxa" w:w="120"/>
@@ -4687,6 +4803,7 @@
               <w:bottom w:val="single" w:color="D0D7D3" w:sz="4"/>
               <w:right w:val="single" w:color="D0D7D3" w:sz="4"/>
             </w:tcBorders>
+            <w:shd w:fill="F6F8F7" w:color="auto" w:val="clear"/>
             <w:tcMar>
               <w:top w:type="dxa" w:w="80"/>
               <w:left w:type="dxa" w:w="120"/>
@@ -4715,6 +4832,7 @@
               <w:bottom w:val="single" w:color="D0D7D3" w:sz="4"/>
               <w:right w:val="single" w:color="D0D7D3" w:sz="4"/>
             </w:tcBorders>
+            <w:shd w:fill="F6F8F7" w:color="auto" w:val="clear"/>
             <w:tcMar>
               <w:top w:type="dxa" w:w="80"/>
               <w:left w:type="dxa" w:w="120"/>
@@ -4745,7 +4863,6 @@
               <w:bottom w:val="single" w:color="D0D7D3" w:sz="4"/>
               <w:right w:val="single" w:color="D0D7D3" w:sz="4"/>
             </w:tcBorders>
-            <w:shd w:fill="F6F8F7" w:color="auto" w:val="clear"/>
             <w:tcMar>
               <w:top w:type="dxa" w:w="80"/>
               <w:left w:type="dxa" w:w="120"/>
@@ -4774,7 +4891,6 @@
               <w:bottom w:val="single" w:color="D0D7D3" w:sz="4"/>
               <w:right w:val="single" w:color="D0D7D3" w:sz="4"/>
             </w:tcBorders>
-            <w:shd w:fill="F6F8F7" w:color="auto" w:val="clear"/>
             <w:tcMar>
               <w:top w:type="dxa" w:w="80"/>
               <w:left w:type="dxa" w:w="120"/>
@@ -4805,6 +4921,7 @@
               <w:bottom w:val="single" w:color="D0D7D3" w:sz="4"/>
               <w:right w:val="single" w:color="D0D7D3" w:sz="4"/>
             </w:tcBorders>
+            <w:shd w:fill="F6F8F7" w:color="auto" w:val="clear"/>
             <w:tcMar>
               <w:top w:type="dxa" w:w="80"/>
               <w:left w:type="dxa" w:w="120"/>
@@ -4833,6 +4950,7 @@
               <w:bottom w:val="single" w:color="D0D7D3" w:sz="4"/>
               <w:right w:val="single" w:color="D0D7D3" w:sz="4"/>
             </w:tcBorders>
+            <w:shd w:fill="F6F8F7" w:color="auto" w:val="clear"/>
             <w:tcMar>
               <w:top w:type="dxa" w:w="80"/>
               <w:left w:type="dxa" w:w="120"/>
@@ -4863,7 +4981,6 @@
               <w:bottom w:val="single" w:color="D0D7D3" w:sz="4"/>
               <w:right w:val="single" w:color="D0D7D3" w:sz="4"/>
             </w:tcBorders>
-            <w:shd w:fill="F6F8F7" w:color="auto" w:val="clear"/>
             <w:tcMar>
               <w:top w:type="dxa" w:w="80"/>
               <w:left w:type="dxa" w:w="120"/>
@@ -4892,7 +5009,6 @@
               <w:bottom w:val="single" w:color="D0D7D3" w:sz="4"/>
               <w:right w:val="single" w:color="D0D7D3" w:sz="4"/>
             </w:tcBorders>
-            <w:shd w:fill="F6F8F7" w:color="auto" w:val="clear"/>
             <w:tcMar>
               <w:top w:type="dxa" w:w="80"/>
               <w:left w:type="dxa" w:w="120"/>
@@ -4923,6 +5039,7 @@
               <w:bottom w:val="single" w:color="D0D7D3" w:sz="4"/>
               <w:right w:val="single" w:color="D0D7D3" w:sz="4"/>
             </w:tcBorders>
+            <w:shd w:fill="F6F8F7" w:color="auto" w:val="clear"/>
             <w:tcMar>
               <w:top w:type="dxa" w:w="80"/>
               <w:left w:type="dxa" w:w="120"/>
@@ -4951,6 +5068,7 @@
               <w:bottom w:val="single" w:color="D0D7D3" w:sz="4"/>
               <w:right w:val="single" w:color="D0D7D3" w:sz="4"/>
             </w:tcBorders>
+            <w:shd w:fill="F6F8F7" w:color="auto" w:val="clear"/>
             <w:tcMar>
               <w:top w:type="dxa" w:w="80"/>
               <w:left w:type="dxa" w:w="120"/>
@@ -4981,7 +5099,6 @@
               <w:bottom w:val="single" w:color="D0D7D3" w:sz="4"/>
               <w:right w:val="single" w:color="D0D7D3" w:sz="4"/>
             </w:tcBorders>
-            <w:shd w:fill="F6F8F7" w:color="auto" w:val="clear"/>
             <w:tcMar>
               <w:top w:type="dxa" w:w="80"/>
               <w:left w:type="dxa" w:w="120"/>
@@ -5010,7 +5127,6 @@
               <w:bottom w:val="single" w:color="D0D7D3" w:sz="4"/>
               <w:right w:val="single" w:color="D0D7D3" w:sz="4"/>
             </w:tcBorders>
-            <w:shd w:fill="F6F8F7" w:color="auto" w:val="clear"/>
             <w:tcMar>
               <w:top w:type="dxa" w:w="80"/>
               <w:left w:type="dxa" w:w="120"/>
@@ -5041,6 +5157,7 @@
               <w:bottom w:val="single" w:color="D0D7D3" w:sz="4"/>
               <w:right w:val="single" w:color="D0D7D3" w:sz="4"/>
             </w:tcBorders>
+            <w:shd w:fill="F6F8F7" w:color="auto" w:val="clear"/>
             <w:tcMar>
               <w:top w:type="dxa" w:w="80"/>
               <w:left w:type="dxa" w:w="120"/>
@@ -5069,6 +5186,7 @@
               <w:bottom w:val="single" w:color="D0D7D3" w:sz="4"/>
               <w:right w:val="single" w:color="D0D7D3" w:sz="4"/>
             </w:tcBorders>
+            <w:shd w:fill="F6F8F7" w:color="auto" w:val="clear"/>
             <w:tcMar>
               <w:top w:type="dxa" w:w="80"/>
               <w:left w:type="dxa" w:w="120"/>
@@ -5099,7 +5217,6 @@
               <w:bottom w:val="single" w:color="D0D7D3" w:sz="4"/>
               <w:right w:val="single" w:color="D0D7D3" w:sz="4"/>
             </w:tcBorders>
-            <w:shd w:fill="F6F8F7" w:color="auto" w:val="clear"/>
             <w:tcMar>
               <w:top w:type="dxa" w:w="80"/>
               <w:left w:type="dxa" w:w="120"/>
@@ -5128,7 +5245,6 @@
               <w:bottom w:val="single" w:color="D0D7D3" w:sz="4"/>
               <w:right w:val="single" w:color="D0D7D3" w:sz="4"/>
             </w:tcBorders>
-            <w:shd w:fill="F6F8F7" w:color="auto" w:val="clear"/>
             <w:tcMar>
               <w:top w:type="dxa" w:w="80"/>
               <w:left w:type="dxa" w:w="120"/>
@@ -5159,6 +5275,7 @@
               <w:bottom w:val="single" w:color="D0D7D3" w:sz="4"/>
               <w:right w:val="single" w:color="D0D7D3" w:sz="4"/>
             </w:tcBorders>
+            <w:shd w:fill="F6F8F7" w:color="auto" w:val="clear"/>
             <w:tcMar>
               <w:top w:type="dxa" w:w="80"/>
               <w:left w:type="dxa" w:w="120"/>
@@ -5187,6 +5304,7 @@
               <w:bottom w:val="single" w:color="D0D7D3" w:sz="4"/>
               <w:right w:val="single" w:color="D0D7D3" w:sz="4"/>
             </w:tcBorders>
+            <w:shd w:fill="F6F8F7" w:color="auto" w:val="clear"/>
             <w:tcMar>
               <w:top w:type="dxa" w:w="80"/>
               <w:left w:type="dxa" w:w="120"/>
@@ -5217,7 +5335,6 @@
               <w:bottom w:val="single" w:color="D0D7D3" w:sz="4"/>
               <w:right w:val="single" w:color="D0D7D3" w:sz="4"/>
             </w:tcBorders>
-            <w:shd w:fill="F6F8F7" w:color="auto" w:val="clear"/>
             <w:tcMar>
               <w:top w:type="dxa" w:w="80"/>
               <w:left w:type="dxa" w:w="120"/>
@@ -5246,7 +5363,6 @@
               <w:bottom w:val="single" w:color="D0D7D3" w:sz="4"/>
               <w:right w:val="single" w:color="D0D7D3" w:sz="4"/>
             </w:tcBorders>
-            <w:shd w:fill="F6F8F7" w:color="auto" w:val="clear"/>
             <w:tcMar>
               <w:top w:type="dxa" w:w="80"/>
               <w:left w:type="dxa" w:w="120"/>
@@ -5277,6 +5393,7 @@
               <w:bottom w:val="single" w:color="D0D7D3" w:sz="4"/>
               <w:right w:val="single" w:color="D0D7D3" w:sz="4"/>
             </w:tcBorders>
+            <w:shd w:fill="F6F8F7" w:color="auto" w:val="clear"/>
             <w:tcMar>
               <w:top w:type="dxa" w:w="80"/>
               <w:left w:type="dxa" w:w="120"/>
@@ -5305,6 +5422,7 @@
               <w:bottom w:val="single" w:color="D0D7D3" w:sz="4"/>
               <w:right w:val="single" w:color="D0D7D3" w:sz="4"/>
             </w:tcBorders>
+            <w:shd w:fill="F6F8F7" w:color="auto" w:val="clear"/>
             <w:tcMar>
               <w:top w:type="dxa" w:w="80"/>
               <w:left w:type="dxa" w:w="120"/>
@@ -5335,7 +5453,6 @@
               <w:bottom w:val="single" w:color="D0D7D3" w:sz="4"/>
               <w:right w:val="single" w:color="D0D7D3" w:sz="4"/>
             </w:tcBorders>
-            <w:shd w:fill="F6F8F7" w:color="auto" w:val="clear"/>
             <w:tcMar>
               <w:top w:type="dxa" w:w="80"/>
               <w:left w:type="dxa" w:w="120"/>
@@ -5364,7 +5481,6 @@
               <w:bottom w:val="single" w:color="D0D7D3" w:sz="4"/>
               <w:right w:val="single" w:color="D0D7D3" w:sz="4"/>
             </w:tcBorders>
-            <w:shd w:fill="F6F8F7" w:color="auto" w:val="clear"/>
             <w:tcMar>
               <w:top w:type="dxa" w:w="80"/>
               <w:left w:type="dxa" w:w="120"/>
@@ -5395,6 +5511,7 @@
               <w:bottom w:val="single" w:color="D0D7D3" w:sz="4"/>
               <w:right w:val="single" w:color="D0D7D3" w:sz="4"/>
             </w:tcBorders>
+            <w:shd w:fill="F6F8F7" w:color="auto" w:val="clear"/>
             <w:tcMar>
               <w:top w:type="dxa" w:w="80"/>
               <w:left w:type="dxa" w:w="120"/>
@@ -5423,6 +5540,7 @@
               <w:bottom w:val="single" w:color="D0D7D3" w:sz="4"/>
               <w:right w:val="single" w:color="D0D7D3" w:sz="4"/>
             </w:tcBorders>
+            <w:shd w:fill="F6F8F7" w:color="auto" w:val="clear"/>
             <w:tcMar>
               <w:top w:type="dxa" w:w="80"/>
               <w:left w:type="dxa" w:w="120"/>
@@ -5453,7 +5571,6 @@
               <w:bottom w:val="single" w:color="D0D7D3" w:sz="4"/>
               <w:right w:val="single" w:color="D0D7D3" w:sz="4"/>
             </w:tcBorders>
-            <w:shd w:fill="F6F8F7" w:color="auto" w:val="clear"/>
             <w:tcMar>
               <w:top w:type="dxa" w:w="80"/>
               <w:left w:type="dxa" w:w="120"/>
@@ -5482,7 +5599,6 @@
               <w:bottom w:val="single" w:color="D0D7D3" w:sz="4"/>
               <w:right w:val="single" w:color="D0D7D3" w:sz="4"/>
             </w:tcBorders>
-            <w:shd w:fill="F6F8F7" w:color="auto" w:val="clear"/>
             <w:tcMar>
               <w:top w:type="dxa" w:w="80"/>
               <w:left w:type="dxa" w:w="120"/>
@@ -5513,6 +5629,7 @@
               <w:bottom w:val="single" w:color="D0D7D3" w:sz="4"/>
               <w:right w:val="single" w:color="D0D7D3" w:sz="4"/>
             </w:tcBorders>
+            <w:shd w:fill="F6F8F7" w:color="auto" w:val="clear"/>
             <w:tcMar>
               <w:top w:type="dxa" w:w="80"/>
               <w:left w:type="dxa" w:w="120"/>
@@ -5541,6 +5658,7 @@
               <w:bottom w:val="single" w:color="D0D7D3" w:sz="4"/>
               <w:right w:val="single" w:color="D0D7D3" w:sz="4"/>
             </w:tcBorders>
+            <w:shd w:fill="F6F8F7" w:color="auto" w:val="clear"/>
             <w:tcMar>
               <w:top w:type="dxa" w:w="80"/>
               <w:left w:type="dxa" w:w="120"/>
@@ -5571,7 +5689,6 @@
               <w:bottom w:val="single" w:color="D0D7D3" w:sz="4"/>
               <w:right w:val="single" w:color="D0D7D3" w:sz="4"/>
             </w:tcBorders>
-            <w:shd w:fill="F6F8F7" w:color="auto" w:val="clear"/>
             <w:tcMar>
               <w:top w:type="dxa" w:w="80"/>
               <w:left w:type="dxa" w:w="120"/>
@@ -5600,7 +5717,6 @@
               <w:bottom w:val="single" w:color="D0D7D3" w:sz="4"/>
               <w:right w:val="single" w:color="D0D7D3" w:sz="4"/>
             </w:tcBorders>
-            <w:shd w:fill="F6F8F7" w:color="auto" w:val="clear"/>
             <w:tcMar>
               <w:top w:type="dxa" w:w="80"/>
               <w:left w:type="dxa" w:w="120"/>
@@ -5631,6 +5747,7 @@
               <w:bottom w:val="single" w:color="D0D7D3" w:sz="4"/>
               <w:right w:val="single" w:color="D0D7D3" w:sz="4"/>
             </w:tcBorders>
+            <w:shd w:fill="F6F8F7" w:color="auto" w:val="clear"/>
             <w:tcMar>
               <w:top w:type="dxa" w:w="80"/>
               <w:left w:type="dxa" w:w="120"/>
@@ -5659,6 +5776,7 @@
               <w:bottom w:val="single" w:color="D0D7D3" w:sz="4"/>
               <w:right w:val="single" w:color="D0D7D3" w:sz="4"/>
             </w:tcBorders>
+            <w:shd w:fill="F6F8F7" w:color="auto" w:val="clear"/>
             <w:tcMar>
               <w:top w:type="dxa" w:w="80"/>
               <w:left w:type="dxa" w:w="120"/>
@@ -5689,7 +5807,6 @@
               <w:bottom w:val="single" w:color="D0D7D3" w:sz="4"/>
               <w:right w:val="single" w:color="D0D7D3" w:sz="4"/>
             </w:tcBorders>
-            <w:shd w:fill="F6F8F7" w:color="auto" w:val="clear"/>
             <w:tcMar>
               <w:top w:type="dxa" w:w="80"/>
               <w:left w:type="dxa" w:w="120"/>
@@ -5718,7 +5835,6 @@
               <w:bottom w:val="single" w:color="D0D7D3" w:sz="4"/>
               <w:right w:val="single" w:color="D0D7D3" w:sz="4"/>
             </w:tcBorders>
-            <w:shd w:fill="F6F8F7" w:color="auto" w:val="clear"/>
             <w:tcMar>
               <w:top w:type="dxa" w:w="80"/>
               <w:left w:type="dxa" w:w="120"/>
@@ -5749,6 +5865,7 @@
               <w:bottom w:val="single" w:color="D0D7D3" w:sz="4"/>
               <w:right w:val="single" w:color="D0D7D3" w:sz="4"/>
             </w:tcBorders>
+            <w:shd w:fill="F6F8F7" w:color="auto" w:val="clear"/>
             <w:tcMar>
               <w:top w:type="dxa" w:w="80"/>
               <w:left w:type="dxa" w:w="120"/>
@@ -5777,6 +5894,7 @@
               <w:bottom w:val="single" w:color="D0D7D3" w:sz="4"/>
               <w:right w:val="single" w:color="D0D7D3" w:sz="4"/>
             </w:tcBorders>
+            <w:shd w:fill="F6F8F7" w:color="auto" w:val="clear"/>
             <w:tcMar>
               <w:top w:type="dxa" w:w="80"/>
               <w:left w:type="dxa" w:w="120"/>
@@ -5807,7 +5925,6 @@
               <w:bottom w:val="single" w:color="D0D7D3" w:sz="4"/>
               <w:right w:val="single" w:color="D0D7D3" w:sz="4"/>
             </w:tcBorders>
-            <w:shd w:fill="F6F8F7" w:color="auto" w:val="clear"/>
             <w:tcMar>
               <w:top w:type="dxa" w:w="80"/>
               <w:left w:type="dxa" w:w="120"/>
@@ -5836,7 +5953,6 @@
               <w:bottom w:val="single" w:color="D0D7D3" w:sz="4"/>
               <w:right w:val="single" w:color="D0D7D3" w:sz="4"/>
             </w:tcBorders>
-            <w:shd w:fill="F6F8F7" w:color="auto" w:val="clear"/>
             <w:tcMar>
               <w:top w:type="dxa" w:w="80"/>
               <w:left w:type="dxa" w:w="120"/>
@@ -5867,6 +5983,7 @@
               <w:bottom w:val="single" w:color="D0D7D3" w:sz="4"/>
               <w:right w:val="single" w:color="D0D7D3" w:sz="4"/>
             </w:tcBorders>
+            <w:shd w:fill="F6F8F7" w:color="auto" w:val="clear"/>
             <w:tcMar>
               <w:top w:type="dxa" w:w="80"/>
               <w:left w:type="dxa" w:w="120"/>
@@ -5895,6 +6012,7 @@
               <w:bottom w:val="single" w:color="D0D7D3" w:sz="4"/>
               <w:right w:val="single" w:color="D0D7D3" w:sz="4"/>
             </w:tcBorders>
+            <w:shd w:fill="F6F8F7" w:color="auto" w:val="clear"/>
             <w:tcMar>
               <w:top w:type="dxa" w:w="80"/>
               <w:left w:type="dxa" w:w="120"/>
@@ -5925,7 +6043,6 @@
               <w:bottom w:val="single" w:color="D0D7D3" w:sz="4"/>
               <w:right w:val="single" w:color="D0D7D3" w:sz="4"/>
             </w:tcBorders>
-            <w:shd w:fill="F6F8F7" w:color="auto" w:val="clear"/>
             <w:tcMar>
               <w:top w:type="dxa" w:w="80"/>
               <w:left w:type="dxa" w:w="120"/>
@@ -5954,7 +6071,6 @@
               <w:bottom w:val="single" w:color="D0D7D3" w:sz="4"/>
               <w:right w:val="single" w:color="D0D7D3" w:sz="4"/>
             </w:tcBorders>
-            <w:shd w:fill="F6F8F7" w:color="auto" w:val="clear"/>
             <w:tcMar>
               <w:top w:type="dxa" w:w="80"/>
               <w:left w:type="dxa" w:w="120"/>
@@ -5985,6 +6101,7 @@
               <w:bottom w:val="single" w:color="D0D7D3" w:sz="4"/>
               <w:right w:val="single" w:color="D0D7D3" w:sz="4"/>
             </w:tcBorders>
+            <w:shd w:fill="F6F8F7" w:color="auto" w:val="clear"/>
             <w:tcMar>
               <w:top w:type="dxa" w:w="80"/>
               <w:left w:type="dxa" w:w="120"/>
@@ -6013,6 +6130,7 @@
               <w:bottom w:val="single" w:color="D0D7D3" w:sz="4"/>
               <w:right w:val="single" w:color="D0D7D3" w:sz="4"/>
             </w:tcBorders>
+            <w:shd w:fill="F6F8F7" w:color="auto" w:val="clear"/>
             <w:tcMar>
               <w:top w:type="dxa" w:w="80"/>
               <w:left w:type="dxa" w:w="120"/>
@@ -6043,7 +6161,6 @@
               <w:bottom w:val="single" w:color="D0D7D3" w:sz="4"/>
               <w:right w:val="single" w:color="D0D7D3" w:sz="4"/>
             </w:tcBorders>
-            <w:shd w:fill="F6F8F7" w:color="auto" w:val="clear"/>
             <w:tcMar>
               <w:top w:type="dxa" w:w="80"/>
               <w:left w:type="dxa" w:w="120"/>
@@ -6072,7 +6189,6 @@
               <w:bottom w:val="single" w:color="D0D7D3" w:sz="4"/>
               <w:right w:val="single" w:color="D0D7D3" w:sz="4"/>
             </w:tcBorders>
-            <w:shd w:fill="F6F8F7" w:color="auto" w:val="clear"/>
             <w:tcMar>
               <w:top w:type="dxa" w:w="80"/>
               <w:left w:type="dxa" w:w="120"/>
@@ -6103,6 +6219,7 @@
               <w:bottom w:val="single" w:color="D0D7D3" w:sz="4"/>
               <w:right w:val="single" w:color="D0D7D3" w:sz="4"/>
             </w:tcBorders>
+            <w:shd w:fill="F6F8F7" w:color="auto" w:val="clear"/>
             <w:tcMar>
               <w:top w:type="dxa" w:w="80"/>
               <w:left w:type="dxa" w:w="120"/>
@@ -6131,6 +6248,7 @@
               <w:bottom w:val="single" w:color="D0D7D3" w:sz="4"/>
               <w:right w:val="single" w:color="D0D7D3" w:sz="4"/>
             </w:tcBorders>
+            <w:shd w:fill="F6F8F7" w:color="auto" w:val="clear"/>
             <w:tcMar>
               <w:top w:type="dxa" w:w="80"/>
               <w:left w:type="dxa" w:w="120"/>
@@ -6161,7 +6279,6 @@
               <w:bottom w:val="single" w:color="D0D7D3" w:sz="4"/>
               <w:right w:val="single" w:color="D0D7D3" w:sz="4"/>
             </w:tcBorders>
-            <w:shd w:fill="F6F8F7" w:color="auto" w:val="clear"/>
             <w:tcMar>
               <w:top w:type="dxa" w:w="80"/>
               <w:left w:type="dxa" w:w="120"/>
@@ -6190,7 +6307,6 @@
               <w:bottom w:val="single" w:color="D0D7D3" w:sz="4"/>
               <w:right w:val="single" w:color="D0D7D3" w:sz="4"/>
             </w:tcBorders>
-            <w:shd w:fill="F6F8F7" w:color="auto" w:val="clear"/>
             <w:tcMar>
               <w:top w:type="dxa" w:w="80"/>
               <w:left w:type="dxa" w:w="120"/>
@@ -6221,6 +6337,7 @@
               <w:bottom w:val="single" w:color="D0D7D3" w:sz="4"/>
               <w:right w:val="single" w:color="D0D7D3" w:sz="4"/>
             </w:tcBorders>
+            <w:shd w:fill="F6F8F7" w:color="auto" w:val="clear"/>
             <w:tcMar>
               <w:top w:type="dxa" w:w="80"/>
               <w:left w:type="dxa" w:w="120"/>
@@ -6249,6 +6366,7 @@
               <w:bottom w:val="single" w:color="D0D7D3" w:sz="4"/>
               <w:right w:val="single" w:color="D0D7D3" w:sz="4"/>
             </w:tcBorders>
+            <w:shd w:fill="F6F8F7" w:color="auto" w:val="clear"/>
             <w:tcMar>
               <w:top w:type="dxa" w:w="80"/>
               <w:left w:type="dxa" w:w="120"/>
@@ -6279,7 +6397,6 @@
               <w:bottom w:val="single" w:color="D0D7D3" w:sz="4"/>
               <w:right w:val="single" w:color="D0D7D3" w:sz="4"/>
             </w:tcBorders>
-            <w:shd w:fill="F6F8F7" w:color="auto" w:val="clear"/>
             <w:tcMar>
               <w:top w:type="dxa" w:w="80"/>
               <w:left w:type="dxa" w:w="120"/>
@@ -6308,7 +6425,6 @@
               <w:bottom w:val="single" w:color="D0D7D3" w:sz="4"/>
               <w:right w:val="single" w:color="D0D7D3" w:sz="4"/>
             </w:tcBorders>
-            <w:shd w:fill="F6F8F7" w:color="auto" w:val="clear"/>
             <w:tcMar>
               <w:top w:type="dxa" w:w="80"/>
               <w:left w:type="dxa" w:w="120"/>
@@ -6339,6 +6455,7 @@
               <w:bottom w:val="single" w:color="D0D7D3" w:sz="4"/>
               <w:right w:val="single" w:color="D0D7D3" w:sz="4"/>
             </w:tcBorders>
+            <w:shd w:fill="F6F8F7" w:color="auto" w:val="clear"/>
             <w:tcMar>
               <w:top w:type="dxa" w:w="80"/>
               <w:left w:type="dxa" w:w="120"/>
@@ -6367,6 +6484,7 @@
               <w:bottom w:val="single" w:color="D0D7D3" w:sz="4"/>
               <w:right w:val="single" w:color="D0D7D3" w:sz="4"/>
             </w:tcBorders>
+            <w:shd w:fill="F6F8F7" w:color="auto" w:val="clear"/>
             <w:tcMar>
               <w:top w:type="dxa" w:w="80"/>
               <w:left w:type="dxa" w:w="120"/>
@@ -6397,7 +6515,6 @@
               <w:bottom w:val="single" w:color="D0D7D3" w:sz="4"/>
               <w:right w:val="single" w:color="D0D7D3" w:sz="4"/>
             </w:tcBorders>
-            <w:shd w:fill="F6F8F7" w:color="auto" w:val="clear"/>
             <w:tcMar>
               <w:top w:type="dxa" w:w="80"/>
               <w:left w:type="dxa" w:w="120"/>
@@ -6426,7 +6543,6 @@
               <w:bottom w:val="single" w:color="D0D7D3" w:sz="4"/>
               <w:right w:val="single" w:color="D0D7D3" w:sz="4"/>
             </w:tcBorders>
-            <w:shd w:fill="F6F8F7" w:color="auto" w:val="clear"/>
             <w:tcMar>
               <w:top w:type="dxa" w:w="80"/>
               <w:left w:type="dxa" w:w="120"/>
@@ -6457,6 +6573,7 @@
               <w:bottom w:val="single" w:color="D0D7D3" w:sz="4"/>
               <w:right w:val="single" w:color="D0D7D3" w:sz="4"/>
             </w:tcBorders>
+            <w:shd w:fill="F6F8F7" w:color="auto" w:val="clear"/>
             <w:tcMar>
               <w:top w:type="dxa" w:w="80"/>
               <w:left w:type="dxa" w:w="120"/>
@@ -6485,6 +6602,7 @@
               <w:bottom w:val="single" w:color="D0D7D3" w:sz="4"/>
               <w:right w:val="single" w:color="D0D7D3" w:sz="4"/>
             </w:tcBorders>
+            <w:shd w:fill="F6F8F7" w:color="auto" w:val="clear"/>
             <w:tcMar>
               <w:top w:type="dxa" w:w="80"/>
               <w:left w:type="dxa" w:w="120"/>
@@ -6515,7 +6633,6 @@
               <w:bottom w:val="single" w:color="D0D7D3" w:sz="4"/>
               <w:right w:val="single" w:color="D0D7D3" w:sz="4"/>
             </w:tcBorders>
-            <w:shd w:fill="F6F8F7" w:color="auto" w:val="clear"/>
             <w:tcMar>
               <w:top w:type="dxa" w:w="80"/>
               <w:left w:type="dxa" w:w="120"/>
@@ -6544,7 +6661,6 @@
               <w:bottom w:val="single" w:color="D0D7D3" w:sz="4"/>
               <w:right w:val="single" w:color="D0D7D3" w:sz="4"/>
             </w:tcBorders>
-            <w:shd w:fill="F6F8F7" w:color="auto" w:val="clear"/>
             <w:tcMar>
               <w:top w:type="dxa" w:w="80"/>
               <w:left w:type="dxa" w:w="120"/>
@@ -6575,6 +6691,7 @@
               <w:bottom w:val="single" w:color="D0D7D3" w:sz="4"/>
               <w:right w:val="single" w:color="D0D7D3" w:sz="4"/>
             </w:tcBorders>
+            <w:shd w:fill="F6F8F7" w:color="auto" w:val="clear"/>
             <w:tcMar>
               <w:top w:type="dxa" w:w="80"/>
               <w:left w:type="dxa" w:w="120"/>
@@ -6603,6 +6720,7 @@
               <w:bottom w:val="single" w:color="D0D7D3" w:sz="4"/>
               <w:right w:val="single" w:color="D0D7D3" w:sz="4"/>
             </w:tcBorders>
+            <w:shd w:fill="F6F8F7" w:color="auto" w:val="clear"/>
             <w:tcMar>
               <w:top w:type="dxa" w:w="80"/>
               <w:left w:type="dxa" w:w="120"/>
@@ -6633,7 +6751,6 @@
               <w:bottom w:val="single" w:color="D0D7D3" w:sz="4"/>
               <w:right w:val="single" w:color="D0D7D3" w:sz="4"/>
             </w:tcBorders>
-            <w:shd w:fill="F6F8F7" w:color="auto" w:val="clear"/>
             <w:tcMar>
               <w:top w:type="dxa" w:w="80"/>
               <w:left w:type="dxa" w:w="120"/>
@@ -6662,7 +6779,6 @@
               <w:bottom w:val="single" w:color="D0D7D3" w:sz="4"/>
               <w:right w:val="single" w:color="D0D7D3" w:sz="4"/>
             </w:tcBorders>
-            <w:shd w:fill="F6F8F7" w:color="auto" w:val="clear"/>
             <w:tcMar>
               <w:top w:type="dxa" w:w="80"/>
               <w:left w:type="dxa" w:w="120"/>
@@ -6693,6 +6809,7 @@
               <w:bottom w:val="single" w:color="D0D7D3" w:sz="4"/>
               <w:right w:val="single" w:color="D0D7D3" w:sz="4"/>
             </w:tcBorders>
+            <w:shd w:fill="F6F8F7" w:color="auto" w:val="clear"/>
             <w:tcMar>
               <w:top w:type="dxa" w:w="80"/>
               <w:left w:type="dxa" w:w="120"/>
@@ -6721,6 +6838,7 @@
               <w:bottom w:val="single" w:color="D0D7D3" w:sz="4"/>
               <w:right w:val="single" w:color="D0D7D3" w:sz="4"/>
             </w:tcBorders>
+            <w:shd w:fill="F6F8F7" w:color="auto" w:val="clear"/>
             <w:tcMar>
               <w:top w:type="dxa" w:w="80"/>
               <w:left w:type="dxa" w:w="120"/>
@@ -6751,7 +6869,6 @@
               <w:bottom w:val="single" w:color="D0D7D3" w:sz="4"/>
               <w:right w:val="single" w:color="D0D7D3" w:sz="4"/>
             </w:tcBorders>
-            <w:shd w:fill="F6F8F7" w:color="auto" w:val="clear"/>
             <w:tcMar>
               <w:top w:type="dxa" w:w="80"/>
               <w:left w:type="dxa" w:w="120"/>
@@ -6780,7 +6897,6 @@
               <w:bottom w:val="single" w:color="D0D7D3" w:sz="4"/>
               <w:right w:val="single" w:color="D0D7D3" w:sz="4"/>
             </w:tcBorders>
-            <w:shd w:fill="F6F8F7" w:color="auto" w:val="clear"/>
             <w:tcMar>
               <w:top w:type="dxa" w:w="80"/>
               <w:left w:type="dxa" w:w="120"/>
@@ -6811,6 +6927,7 @@
               <w:bottom w:val="single" w:color="D0D7D3" w:sz="4"/>
               <w:right w:val="single" w:color="D0D7D3" w:sz="4"/>
             </w:tcBorders>
+            <w:shd w:fill="F6F8F7" w:color="auto" w:val="clear"/>
             <w:tcMar>
               <w:top w:type="dxa" w:w="80"/>
               <w:left w:type="dxa" w:w="120"/>
@@ -6839,6 +6956,7 @@
               <w:bottom w:val="single" w:color="D0D7D3" w:sz="4"/>
               <w:right w:val="single" w:color="D0D7D3" w:sz="4"/>
             </w:tcBorders>
+            <w:shd w:fill="F6F8F7" w:color="auto" w:val="clear"/>
             <w:tcMar>
               <w:top w:type="dxa" w:w="80"/>
               <w:left w:type="dxa" w:w="120"/>
@@ -6869,7 +6987,6 @@
               <w:bottom w:val="single" w:color="D0D7D3" w:sz="4"/>
               <w:right w:val="single" w:color="D0D7D3" w:sz="4"/>
             </w:tcBorders>
-            <w:shd w:fill="F6F8F7" w:color="auto" w:val="clear"/>
             <w:tcMar>
               <w:top w:type="dxa" w:w="80"/>
               <w:left w:type="dxa" w:w="120"/>
@@ -6898,7 +7015,6 @@
               <w:bottom w:val="single" w:color="D0D7D3" w:sz="4"/>
               <w:right w:val="single" w:color="D0D7D3" w:sz="4"/>
             </w:tcBorders>
-            <w:shd w:fill="F6F8F7" w:color="auto" w:val="clear"/>
             <w:tcMar>
               <w:top w:type="dxa" w:w="80"/>
               <w:left w:type="dxa" w:w="120"/>
@@ -6929,6 +7045,7 @@
               <w:bottom w:val="single" w:color="D0D7D3" w:sz="4"/>
               <w:right w:val="single" w:color="D0D7D3" w:sz="4"/>
             </w:tcBorders>
+            <w:shd w:fill="F6F8F7" w:color="auto" w:val="clear"/>
             <w:tcMar>
               <w:top w:type="dxa" w:w="80"/>
               <w:left w:type="dxa" w:w="120"/>
@@ -6957,6 +7074,7 @@
               <w:bottom w:val="single" w:color="D0D7D3" w:sz="4"/>
               <w:right w:val="single" w:color="D0D7D3" w:sz="4"/>
             </w:tcBorders>
+            <w:shd w:fill="F6F8F7" w:color="auto" w:val="clear"/>
             <w:tcMar>
               <w:top w:type="dxa" w:w="80"/>
               <w:left w:type="dxa" w:w="120"/>
@@ -6987,7 +7105,6 @@
               <w:bottom w:val="single" w:color="D0D7D3" w:sz="4"/>
               <w:right w:val="single" w:color="D0D7D3" w:sz="4"/>
             </w:tcBorders>
-            <w:shd w:fill="F6F8F7" w:color="auto" w:val="clear"/>
             <w:tcMar>
               <w:top w:type="dxa" w:w="80"/>
               <w:left w:type="dxa" w:w="120"/>
@@ -7016,7 +7133,6 @@
               <w:bottom w:val="single" w:color="D0D7D3" w:sz="4"/>
               <w:right w:val="single" w:color="D0D7D3" w:sz="4"/>
             </w:tcBorders>
-            <w:shd w:fill="F6F8F7" w:color="auto" w:val="clear"/>
             <w:tcMar>
               <w:top w:type="dxa" w:w="80"/>
               <w:left w:type="dxa" w:w="120"/>

</xml_diff>

<commit_message>
End-of-session pack: the school year in one workbook
</commit_message>
<xml_diff>
--- a/docs/product/WardPay - what it does.docx
+++ b/docs/product/WardPay - what it does.docx
@@ -264,6 +264,65 @@
                 <w:sz w:val="20"/>
                 <w:szCs w:val="20"/>
               </w:rPr>
+              <w:t xml:space="preserve">An end-of-session pack: the year’s summary, each term, money in and out, debtors, cash book and journal in one file</w:t>
+            </w:r>
+          </w:p>
+        </w:tc>
+        <w:tc>
+          <w:tcPr>
+            <w:tcW w:type="dxa" w:w="4238"/>
+            <w:tcBorders>
+              <w:top w:val="single" w:color="D0D7D3" w:sz="4"/>
+              <w:left w:val="single" w:color="D0D7D3" w:sz="4"/>
+              <w:bottom w:val="single" w:color="D0D7D3" w:sz="4"/>
+              <w:right w:val="single" w:color="D0D7D3" w:sz="4"/>
+            </w:tcBorders>
+            <w:shd w:fill="F6F8F7" w:color="auto" w:val="clear"/>
+            <w:tcMar>
+              <w:top w:type="dxa" w:w="80"/>
+              <w:left w:type="dxa" w:w="120"/>
+              <w:bottom w:type="dxa" w:w="80"/>
+              <w:right w:type="dxa" w:w="120"/>
+            </w:tcMar>
+          </w:tcPr>
+          <w:p>
+            <w:r>
+              <w:rPr>
+                <w:b w:val="false"/>
+                <w:bCs w:val="false"/>
+                <w:sz w:val="20"/>
+                <w:szCs w:val="20"/>
+              </w:rPr>
+              <w:t xml:space="preserve">Close the year in one download, for the accountant, the board or the auditor</w:t>
+            </w:r>
+          </w:p>
+        </w:tc>
+      </w:tr>
+      <w:tr>
+        <w:tc>
+          <w:tcPr>
+            <w:tcW w:type="dxa" w:w="5400"/>
+            <w:tcBorders>
+              <w:top w:val="single" w:color="D0D7D3" w:sz="4"/>
+              <w:left w:val="single" w:color="D0D7D3" w:sz="4"/>
+              <w:bottom w:val="single" w:color="D0D7D3" w:sz="4"/>
+              <w:right w:val="single" w:color="D0D7D3" w:sz="4"/>
+            </w:tcBorders>
+            <w:tcMar>
+              <w:top w:type="dxa" w:w="80"/>
+              <w:left w:type="dxa" w:w="120"/>
+              <w:bottom w:type="dxa" w:w="80"/>
+              <w:right w:type="dxa" w:w="120"/>
+            </w:tcMar>
+          </w:tcPr>
+          <w:p>
+            <w:r>
+              <w:rPr>
+                <w:b w:val="false"/>
+                <w:bCs w:val="false"/>
+                <w:sz w:val="20"/>
+                <w:szCs w:val="20"/>
+              </w:rPr>
               <w:t xml:space="preserve">A general journal for your accountant: every bill, payment, banking and approved expense as double entries, in Excel or CSV</w:t>
             </w:r>
           </w:p>
@@ -277,7 +336,6 @@
               <w:bottom w:val="single" w:color="D0D7D3" w:sz="4"/>
               <w:right w:val="single" w:color="D0D7D3" w:sz="4"/>
             </w:tcBorders>
-            <w:shd w:fill="F6F8F7" w:color="auto" w:val="clear"/>
             <w:tcMar>
               <w:top w:type="dxa" w:w="80"/>
               <w:left w:type="dxa" w:w="120"/>
@@ -308,6 +366,7 @@
               <w:bottom w:val="single" w:color="D0D7D3" w:sz="4"/>
               <w:right w:val="single" w:color="D0D7D3" w:sz="4"/>
             </w:tcBorders>
+            <w:shd w:fill="F6F8F7" w:color="auto" w:val="clear"/>
             <w:tcMar>
               <w:top w:type="dxa" w:w="80"/>
               <w:left w:type="dxa" w:w="120"/>
@@ -336,6 +395,7 @@
               <w:bottom w:val="single" w:color="D0D7D3" w:sz="4"/>
               <w:right w:val="single" w:color="D0D7D3" w:sz="4"/>
             </w:tcBorders>
+            <w:shd w:fill="F6F8F7" w:color="auto" w:val="clear"/>
             <w:tcMar>
               <w:top w:type="dxa" w:w="80"/>
               <w:left w:type="dxa" w:w="120"/>
@@ -366,7 +426,6 @@
               <w:bottom w:val="single" w:color="D0D7D3" w:sz="4"/>
               <w:right w:val="single" w:color="D0D7D3" w:sz="4"/>
             </w:tcBorders>
-            <w:shd w:fill="F6F8F7" w:color="auto" w:val="clear"/>
             <w:tcMar>
               <w:top w:type="dxa" w:w="80"/>
               <w:left w:type="dxa" w:w="120"/>
@@ -395,7 +454,6 @@
               <w:bottom w:val="single" w:color="D0D7D3" w:sz="4"/>
               <w:right w:val="single" w:color="D0D7D3" w:sz="4"/>
             </w:tcBorders>
-            <w:shd w:fill="F6F8F7" w:color="auto" w:val="clear"/>
             <w:tcMar>
               <w:top w:type="dxa" w:w="80"/>
               <w:left w:type="dxa" w:w="120"/>
@@ -426,6 +484,7 @@
               <w:bottom w:val="single" w:color="D0D7D3" w:sz="4"/>
               <w:right w:val="single" w:color="D0D7D3" w:sz="4"/>
             </w:tcBorders>
+            <w:shd w:fill="F6F8F7" w:color="auto" w:val="clear"/>
             <w:tcMar>
               <w:top w:type="dxa" w:w="80"/>
               <w:left w:type="dxa" w:w="120"/>
@@ -454,6 +513,7 @@
               <w:bottom w:val="single" w:color="D0D7D3" w:sz="4"/>
               <w:right w:val="single" w:color="D0D7D3" w:sz="4"/>
             </w:tcBorders>
+            <w:shd w:fill="F6F8F7" w:color="auto" w:val="clear"/>
             <w:tcMar>
               <w:top w:type="dxa" w:w="80"/>
               <w:left w:type="dxa" w:w="120"/>
@@ -484,7 +544,6 @@
               <w:bottom w:val="single" w:color="D0D7D3" w:sz="4"/>
               <w:right w:val="single" w:color="D0D7D3" w:sz="4"/>
             </w:tcBorders>
-            <w:shd w:fill="F6F8F7" w:color="auto" w:val="clear"/>
             <w:tcMar>
               <w:top w:type="dxa" w:w="80"/>
               <w:left w:type="dxa" w:w="120"/>
@@ -513,7 +572,6 @@
               <w:bottom w:val="single" w:color="D0D7D3" w:sz="4"/>
               <w:right w:val="single" w:color="D0D7D3" w:sz="4"/>
             </w:tcBorders>
-            <w:shd w:fill="F6F8F7" w:color="auto" w:val="clear"/>
             <w:tcMar>
               <w:top w:type="dxa" w:w="80"/>
               <w:left w:type="dxa" w:w="120"/>
@@ -544,6 +602,7 @@
               <w:bottom w:val="single" w:color="D0D7D3" w:sz="4"/>
               <w:right w:val="single" w:color="D0D7D3" w:sz="4"/>
             </w:tcBorders>
+            <w:shd w:fill="F6F8F7" w:color="auto" w:val="clear"/>
             <w:tcMar>
               <w:top w:type="dxa" w:w="80"/>
               <w:left w:type="dxa" w:w="120"/>
@@ -572,6 +631,7 @@
               <w:bottom w:val="single" w:color="D0D7D3" w:sz="4"/>
               <w:right w:val="single" w:color="D0D7D3" w:sz="4"/>
             </w:tcBorders>
+            <w:shd w:fill="F6F8F7" w:color="auto" w:val="clear"/>
             <w:tcMar>
               <w:top w:type="dxa" w:w="80"/>
               <w:left w:type="dxa" w:w="120"/>
@@ -602,7 +662,6 @@
               <w:bottom w:val="single" w:color="D0D7D3" w:sz="4"/>
               <w:right w:val="single" w:color="D0D7D3" w:sz="4"/>
             </w:tcBorders>
-            <w:shd w:fill="F6F8F7" w:color="auto" w:val="clear"/>
             <w:tcMar>
               <w:top w:type="dxa" w:w="80"/>
               <w:left w:type="dxa" w:w="120"/>
@@ -631,7 +690,6 @@
               <w:bottom w:val="single" w:color="D0D7D3" w:sz="4"/>
               <w:right w:val="single" w:color="D0D7D3" w:sz="4"/>
             </w:tcBorders>
-            <w:shd w:fill="F6F8F7" w:color="auto" w:val="clear"/>
             <w:tcMar>
               <w:top w:type="dxa" w:w="80"/>
               <w:left w:type="dxa" w:w="120"/>
@@ -662,6 +720,7 @@
               <w:bottom w:val="single" w:color="D0D7D3" w:sz="4"/>
               <w:right w:val="single" w:color="D0D7D3" w:sz="4"/>
             </w:tcBorders>
+            <w:shd w:fill="F6F8F7" w:color="auto" w:val="clear"/>
             <w:tcMar>
               <w:top w:type="dxa" w:w="80"/>
               <w:left w:type="dxa" w:w="120"/>
@@ -690,6 +749,7 @@
               <w:bottom w:val="single" w:color="D0D7D3" w:sz="4"/>
               <w:right w:val="single" w:color="D0D7D3" w:sz="4"/>
             </w:tcBorders>
+            <w:shd w:fill="F6F8F7" w:color="auto" w:val="clear"/>
             <w:tcMar>
               <w:top w:type="dxa" w:w="80"/>
               <w:left w:type="dxa" w:w="120"/>
@@ -4552,6 +4612,66 @@
                 <w:sz w:val="20"/>
                 <w:szCs w:val="20"/>
               </w:rPr>
+              <w:t xml:space="preserve">End-of-session pack: the whole school year in one Excel file</w:t>
+            </w:r>
+          </w:p>
+        </w:tc>
+      </w:tr>
+      <w:tr>
+        <w:tc>
+          <w:tcPr>
+            <w:tcW w:type="dxa" w:w="1800"/>
+            <w:tcBorders>
+              <w:top w:val="single" w:color="D0D7D3" w:sz="4"/>
+              <w:left w:val="single" w:color="D0D7D3" w:sz="4"/>
+              <w:bottom w:val="single" w:color="D0D7D3" w:sz="4"/>
+              <w:right w:val="single" w:color="D0D7D3" w:sz="4"/>
+            </w:tcBorders>
+            <w:shd w:fill="F6F8F7" w:color="auto" w:val="clear"/>
+            <w:tcMar>
+              <w:top w:type="dxa" w:w="80"/>
+              <w:left w:type="dxa" w:w="120"/>
+              <w:bottom w:type="dxa" w:w="80"/>
+              <w:right w:type="dxa" w:w="120"/>
+            </w:tcMar>
+          </w:tcPr>
+          <w:p>
+            <w:r>
+              <w:rPr>
+                <w:b w:val="false"/>
+                <w:bCs w:val="false"/>
+                <w:sz w:val="20"/>
+                <w:szCs w:val="20"/>
+              </w:rPr>
+              <w:t xml:space="preserve">24 Oct 2026</w:t>
+            </w:r>
+          </w:p>
+        </w:tc>
+        <w:tc>
+          <w:tcPr>
+            <w:tcW w:type="dxa" w:w="7838"/>
+            <w:tcBorders>
+              <w:top w:val="single" w:color="D0D7D3" w:sz="4"/>
+              <w:left w:val="single" w:color="D0D7D3" w:sz="4"/>
+              <w:bottom w:val="single" w:color="D0D7D3" w:sz="4"/>
+              <w:right w:val="single" w:color="D0D7D3" w:sz="4"/>
+            </w:tcBorders>
+            <w:shd w:fill="F6F8F7" w:color="auto" w:val="clear"/>
+            <w:tcMar>
+              <w:top w:type="dxa" w:w="80"/>
+              <w:left w:type="dxa" w:w="120"/>
+              <w:bottom w:type="dxa" w:w="80"/>
+              <w:right w:type="dxa" w:w="120"/>
+            </w:tcMar>
+          </w:tcPr>
+          <w:p>
+            <w:r>
+              <w:rPr>
+                <w:b w:val="false"/>
+                <w:bCs w:val="false"/>
+                <w:sz w:val="20"/>
+                <w:szCs w:val="20"/>
+              </w:rPr>
               <w:t xml:space="preserve">A general journal for the accountant (Excel or CSV) with the school’s own account codes</w:t>
             </w:r>
           </w:p>
@@ -4567,7 +4687,6 @@
               <w:bottom w:val="single" w:color="D0D7D3" w:sz="4"/>
               <w:right w:val="single" w:color="D0D7D3" w:sz="4"/>
             </w:tcBorders>
-            <w:shd w:fill="F6F8F7" w:color="auto" w:val="clear"/>
             <w:tcMar>
               <w:top w:type="dxa" w:w="80"/>
               <w:left w:type="dxa" w:w="120"/>
@@ -4596,7 +4715,6 @@
               <w:bottom w:val="single" w:color="D0D7D3" w:sz="4"/>
               <w:right w:val="single" w:color="D0D7D3" w:sz="4"/>
             </w:tcBorders>
-            <w:shd w:fill="F6F8F7" w:color="auto" w:val="clear"/>
             <w:tcMar>
               <w:top w:type="dxa" w:w="80"/>
               <w:left w:type="dxa" w:w="120"/>
@@ -4627,6 +4745,7 @@
               <w:bottom w:val="single" w:color="D0D7D3" w:sz="4"/>
               <w:right w:val="single" w:color="D0D7D3" w:sz="4"/>
             </w:tcBorders>
+            <w:shd w:fill="F6F8F7" w:color="auto" w:val="clear"/>
             <w:tcMar>
               <w:top w:type="dxa" w:w="80"/>
               <w:left w:type="dxa" w:w="120"/>
@@ -4655,6 +4774,7 @@
               <w:bottom w:val="single" w:color="D0D7D3" w:sz="4"/>
               <w:right w:val="single" w:color="D0D7D3" w:sz="4"/>
             </w:tcBorders>
+            <w:shd w:fill="F6F8F7" w:color="auto" w:val="clear"/>
             <w:tcMar>
               <w:top w:type="dxa" w:w="80"/>
               <w:left w:type="dxa" w:w="120"/>
@@ -4685,7 +4805,6 @@
               <w:bottom w:val="single" w:color="D0D7D3" w:sz="4"/>
               <w:right w:val="single" w:color="D0D7D3" w:sz="4"/>
             </w:tcBorders>
-            <w:shd w:fill="F6F8F7" w:color="auto" w:val="clear"/>
             <w:tcMar>
               <w:top w:type="dxa" w:w="80"/>
               <w:left w:type="dxa" w:w="120"/>
@@ -4714,7 +4833,6 @@
               <w:bottom w:val="single" w:color="D0D7D3" w:sz="4"/>
               <w:right w:val="single" w:color="D0D7D3" w:sz="4"/>
             </w:tcBorders>
-            <w:shd w:fill="F6F8F7" w:color="auto" w:val="clear"/>
             <w:tcMar>
               <w:top w:type="dxa" w:w="80"/>
               <w:left w:type="dxa" w:w="120"/>
@@ -4745,6 +4863,7 @@
               <w:bottom w:val="single" w:color="D0D7D3" w:sz="4"/>
               <w:right w:val="single" w:color="D0D7D3" w:sz="4"/>
             </w:tcBorders>
+            <w:shd w:fill="F6F8F7" w:color="auto" w:val="clear"/>
             <w:tcMar>
               <w:top w:type="dxa" w:w="80"/>
               <w:left w:type="dxa" w:w="120"/>
@@ -4773,6 +4892,7 @@
               <w:bottom w:val="single" w:color="D0D7D3" w:sz="4"/>
               <w:right w:val="single" w:color="D0D7D3" w:sz="4"/>
             </w:tcBorders>
+            <w:shd w:fill="F6F8F7" w:color="auto" w:val="clear"/>
             <w:tcMar>
               <w:top w:type="dxa" w:w="80"/>
               <w:left w:type="dxa" w:w="120"/>
@@ -4803,7 +4923,6 @@
               <w:bottom w:val="single" w:color="D0D7D3" w:sz="4"/>
               <w:right w:val="single" w:color="D0D7D3" w:sz="4"/>
             </w:tcBorders>
-            <w:shd w:fill="F6F8F7" w:color="auto" w:val="clear"/>
             <w:tcMar>
               <w:top w:type="dxa" w:w="80"/>
               <w:left w:type="dxa" w:w="120"/>
@@ -4832,7 +4951,6 @@
               <w:bottom w:val="single" w:color="D0D7D3" w:sz="4"/>
               <w:right w:val="single" w:color="D0D7D3" w:sz="4"/>
             </w:tcBorders>
-            <w:shd w:fill="F6F8F7" w:color="auto" w:val="clear"/>
             <w:tcMar>
               <w:top w:type="dxa" w:w="80"/>
               <w:left w:type="dxa" w:w="120"/>
@@ -4863,6 +4981,7 @@
               <w:bottom w:val="single" w:color="D0D7D3" w:sz="4"/>
               <w:right w:val="single" w:color="D0D7D3" w:sz="4"/>
             </w:tcBorders>
+            <w:shd w:fill="F6F8F7" w:color="auto" w:val="clear"/>
             <w:tcMar>
               <w:top w:type="dxa" w:w="80"/>
               <w:left w:type="dxa" w:w="120"/>
@@ -4891,6 +5010,7 @@
               <w:bottom w:val="single" w:color="D0D7D3" w:sz="4"/>
               <w:right w:val="single" w:color="D0D7D3" w:sz="4"/>
             </w:tcBorders>
+            <w:shd w:fill="F6F8F7" w:color="auto" w:val="clear"/>
             <w:tcMar>
               <w:top w:type="dxa" w:w="80"/>
               <w:left w:type="dxa" w:w="120"/>
@@ -4921,7 +5041,6 @@
               <w:bottom w:val="single" w:color="D0D7D3" w:sz="4"/>
               <w:right w:val="single" w:color="D0D7D3" w:sz="4"/>
             </w:tcBorders>
-            <w:shd w:fill="F6F8F7" w:color="auto" w:val="clear"/>
             <w:tcMar>
               <w:top w:type="dxa" w:w="80"/>
               <w:left w:type="dxa" w:w="120"/>
@@ -4950,7 +5069,6 @@
               <w:bottom w:val="single" w:color="D0D7D3" w:sz="4"/>
               <w:right w:val="single" w:color="D0D7D3" w:sz="4"/>
             </w:tcBorders>
-            <w:shd w:fill="F6F8F7" w:color="auto" w:val="clear"/>
             <w:tcMar>
               <w:top w:type="dxa" w:w="80"/>
               <w:left w:type="dxa" w:w="120"/>
@@ -4981,6 +5099,7 @@
               <w:bottom w:val="single" w:color="D0D7D3" w:sz="4"/>
               <w:right w:val="single" w:color="D0D7D3" w:sz="4"/>
             </w:tcBorders>
+            <w:shd w:fill="F6F8F7" w:color="auto" w:val="clear"/>
             <w:tcMar>
               <w:top w:type="dxa" w:w="80"/>
               <w:left w:type="dxa" w:w="120"/>
@@ -5009,6 +5128,7 @@
               <w:bottom w:val="single" w:color="D0D7D3" w:sz="4"/>
               <w:right w:val="single" w:color="D0D7D3" w:sz="4"/>
             </w:tcBorders>
+            <w:shd w:fill="F6F8F7" w:color="auto" w:val="clear"/>
             <w:tcMar>
               <w:top w:type="dxa" w:w="80"/>
               <w:left w:type="dxa" w:w="120"/>
@@ -5039,7 +5159,6 @@
               <w:bottom w:val="single" w:color="D0D7D3" w:sz="4"/>
               <w:right w:val="single" w:color="D0D7D3" w:sz="4"/>
             </w:tcBorders>
-            <w:shd w:fill="F6F8F7" w:color="auto" w:val="clear"/>
             <w:tcMar>
               <w:top w:type="dxa" w:w="80"/>
               <w:left w:type="dxa" w:w="120"/>
@@ -5068,7 +5187,6 @@
               <w:bottom w:val="single" w:color="D0D7D3" w:sz="4"/>
               <w:right w:val="single" w:color="D0D7D3" w:sz="4"/>
             </w:tcBorders>
-            <w:shd w:fill="F6F8F7" w:color="auto" w:val="clear"/>
             <w:tcMar>
               <w:top w:type="dxa" w:w="80"/>
               <w:left w:type="dxa" w:w="120"/>
@@ -5099,6 +5217,7 @@
               <w:bottom w:val="single" w:color="D0D7D3" w:sz="4"/>
               <w:right w:val="single" w:color="D0D7D3" w:sz="4"/>
             </w:tcBorders>
+            <w:shd w:fill="F6F8F7" w:color="auto" w:val="clear"/>
             <w:tcMar>
               <w:top w:type="dxa" w:w="80"/>
               <w:left w:type="dxa" w:w="120"/>
@@ -5127,6 +5246,7 @@
               <w:bottom w:val="single" w:color="D0D7D3" w:sz="4"/>
               <w:right w:val="single" w:color="D0D7D3" w:sz="4"/>
             </w:tcBorders>
+            <w:shd w:fill="F6F8F7" w:color="auto" w:val="clear"/>
             <w:tcMar>
               <w:top w:type="dxa" w:w="80"/>
               <w:left w:type="dxa" w:w="120"/>
@@ -5157,7 +5277,6 @@
               <w:bottom w:val="single" w:color="D0D7D3" w:sz="4"/>
               <w:right w:val="single" w:color="D0D7D3" w:sz="4"/>
             </w:tcBorders>
-            <w:shd w:fill="F6F8F7" w:color="auto" w:val="clear"/>
             <w:tcMar>
               <w:top w:type="dxa" w:w="80"/>
               <w:left w:type="dxa" w:w="120"/>
@@ -5186,7 +5305,6 @@
               <w:bottom w:val="single" w:color="D0D7D3" w:sz="4"/>
               <w:right w:val="single" w:color="D0D7D3" w:sz="4"/>
             </w:tcBorders>
-            <w:shd w:fill="F6F8F7" w:color="auto" w:val="clear"/>
             <w:tcMar>
               <w:top w:type="dxa" w:w="80"/>
               <w:left w:type="dxa" w:w="120"/>
@@ -5217,6 +5335,7 @@
               <w:bottom w:val="single" w:color="D0D7D3" w:sz="4"/>
               <w:right w:val="single" w:color="D0D7D3" w:sz="4"/>
             </w:tcBorders>
+            <w:shd w:fill="F6F8F7" w:color="auto" w:val="clear"/>
             <w:tcMar>
               <w:top w:type="dxa" w:w="80"/>
               <w:left w:type="dxa" w:w="120"/>
@@ -5245,6 +5364,7 @@
               <w:bottom w:val="single" w:color="D0D7D3" w:sz="4"/>
               <w:right w:val="single" w:color="D0D7D3" w:sz="4"/>
             </w:tcBorders>
+            <w:shd w:fill="F6F8F7" w:color="auto" w:val="clear"/>
             <w:tcMar>
               <w:top w:type="dxa" w:w="80"/>
               <w:left w:type="dxa" w:w="120"/>
@@ -5275,7 +5395,6 @@
               <w:bottom w:val="single" w:color="D0D7D3" w:sz="4"/>
               <w:right w:val="single" w:color="D0D7D3" w:sz="4"/>
             </w:tcBorders>
-            <w:shd w:fill="F6F8F7" w:color="auto" w:val="clear"/>
             <w:tcMar>
               <w:top w:type="dxa" w:w="80"/>
               <w:left w:type="dxa" w:w="120"/>
@@ -5304,7 +5423,6 @@
               <w:bottom w:val="single" w:color="D0D7D3" w:sz="4"/>
               <w:right w:val="single" w:color="D0D7D3" w:sz="4"/>
             </w:tcBorders>
-            <w:shd w:fill="F6F8F7" w:color="auto" w:val="clear"/>
             <w:tcMar>
               <w:top w:type="dxa" w:w="80"/>
               <w:left w:type="dxa" w:w="120"/>
@@ -5335,6 +5453,7 @@
               <w:bottom w:val="single" w:color="D0D7D3" w:sz="4"/>
               <w:right w:val="single" w:color="D0D7D3" w:sz="4"/>
             </w:tcBorders>
+            <w:shd w:fill="F6F8F7" w:color="auto" w:val="clear"/>
             <w:tcMar>
               <w:top w:type="dxa" w:w="80"/>
               <w:left w:type="dxa" w:w="120"/>
@@ -5363,6 +5482,7 @@
               <w:bottom w:val="single" w:color="D0D7D3" w:sz="4"/>
               <w:right w:val="single" w:color="D0D7D3" w:sz="4"/>
             </w:tcBorders>
+            <w:shd w:fill="F6F8F7" w:color="auto" w:val="clear"/>
             <w:tcMar>
               <w:top w:type="dxa" w:w="80"/>
               <w:left w:type="dxa" w:w="120"/>
@@ -5393,7 +5513,6 @@
               <w:bottom w:val="single" w:color="D0D7D3" w:sz="4"/>
               <w:right w:val="single" w:color="D0D7D3" w:sz="4"/>
             </w:tcBorders>
-            <w:shd w:fill="F6F8F7" w:color="auto" w:val="clear"/>
             <w:tcMar>
               <w:top w:type="dxa" w:w="80"/>
               <w:left w:type="dxa" w:w="120"/>
@@ -5422,7 +5541,6 @@
               <w:bottom w:val="single" w:color="D0D7D3" w:sz="4"/>
               <w:right w:val="single" w:color="D0D7D3" w:sz="4"/>
             </w:tcBorders>
-            <w:shd w:fill="F6F8F7" w:color="auto" w:val="clear"/>
             <w:tcMar>
               <w:top w:type="dxa" w:w="80"/>
               <w:left w:type="dxa" w:w="120"/>
@@ -5453,6 +5571,7 @@
               <w:bottom w:val="single" w:color="D0D7D3" w:sz="4"/>
               <w:right w:val="single" w:color="D0D7D3" w:sz="4"/>
             </w:tcBorders>
+            <w:shd w:fill="F6F8F7" w:color="auto" w:val="clear"/>
             <w:tcMar>
               <w:top w:type="dxa" w:w="80"/>
               <w:left w:type="dxa" w:w="120"/>
@@ -5481,6 +5600,7 @@
               <w:bottom w:val="single" w:color="D0D7D3" w:sz="4"/>
               <w:right w:val="single" w:color="D0D7D3" w:sz="4"/>
             </w:tcBorders>
+            <w:shd w:fill="F6F8F7" w:color="auto" w:val="clear"/>
             <w:tcMar>
               <w:top w:type="dxa" w:w="80"/>
               <w:left w:type="dxa" w:w="120"/>
@@ -5511,7 +5631,6 @@
               <w:bottom w:val="single" w:color="D0D7D3" w:sz="4"/>
               <w:right w:val="single" w:color="D0D7D3" w:sz="4"/>
             </w:tcBorders>
-            <w:shd w:fill="F6F8F7" w:color="auto" w:val="clear"/>
             <w:tcMar>
               <w:top w:type="dxa" w:w="80"/>
               <w:left w:type="dxa" w:w="120"/>
@@ -5540,7 +5659,6 @@
               <w:bottom w:val="single" w:color="D0D7D3" w:sz="4"/>
               <w:right w:val="single" w:color="D0D7D3" w:sz="4"/>
             </w:tcBorders>
-            <w:shd w:fill="F6F8F7" w:color="auto" w:val="clear"/>
             <w:tcMar>
               <w:top w:type="dxa" w:w="80"/>
               <w:left w:type="dxa" w:w="120"/>
@@ -5571,6 +5689,7 @@
               <w:bottom w:val="single" w:color="D0D7D3" w:sz="4"/>
               <w:right w:val="single" w:color="D0D7D3" w:sz="4"/>
             </w:tcBorders>
+            <w:shd w:fill="F6F8F7" w:color="auto" w:val="clear"/>
             <w:tcMar>
               <w:top w:type="dxa" w:w="80"/>
               <w:left w:type="dxa" w:w="120"/>
@@ -5599,6 +5718,7 @@
               <w:bottom w:val="single" w:color="D0D7D3" w:sz="4"/>
               <w:right w:val="single" w:color="D0D7D3" w:sz="4"/>
             </w:tcBorders>
+            <w:shd w:fill="F6F8F7" w:color="auto" w:val="clear"/>
             <w:tcMar>
               <w:top w:type="dxa" w:w="80"/>
               <w:left w:type="dxa" w:w="120"/>
@@ -5629,7 +5749,6 @@
               <w:bottom w:val="single" w:color="D0D7D3" w:sz="4"/>
               <w:right w:val="single" w:color="D0D7D3" w:sz="4"/>
             </w:tcBorders>
-            <w:shd w:fill="F6F8F7" w:color="auto" w:val="clear"/>
             <w:tcMar>
               <w:top w:type="dxa" w:w="80"/>
               <w:left w:type="dxa" w:w="120"/>
@@ -5658,7 +5777,6 @@
               <w:bottom w:val="single" w:color="D0D7D3" w:sz="4"/>
               <w:right w:val="single" w:color="D0D7D3" w:sz="4"/>
             </w:tcBorders>
-            <w:shd w:fill="F6F8F7" w:color="auto" w:val="clear"/>
             <w:tcMar>
               <w:top w:type="dxa" w:w="80"/>
               <w:left w:type="dxa" w:w="120"/>
@@ -5689,6 +5807,7 @@
               <w:bottom w:val="single" w:color="D0D7D3" w:sz="4"/>
               <w:right w:val="single" w:color="D0D7D3" w:sz="4"/>
             </w:tcBorders>
+            <w:shd w:fill="F6F8F7" w:color="auto" w:val="clear"/>
             <w:tcMar>
               <w:top w:type="dxa" w:w="80"/>
               <w:left w:type="dxa" w:w="120"/>
@@ -5717,6 +5836,7 @@
               <w:bottom w:val="single" w:color="D0D7D3" w:sz="4"/>
               <w:right w:val="single" w:color="D0D7D3" w:sz="4"/>
             </w:tcBorders>
+            <w:shd w:fill="F6F8F7" w:color="auto" w:val="clear"/>
             <w:tcMar>
               <w:top w:type="dxa" w:w="80"/>
               <w:left w:type="dxa" w:w="120"/>
@@ -5747,7 +5867,6 @@
               <w:bottom w:val="single" w:color="D0D7D3" w:sz="4"/>
               <w:right w:val="single" w:color="D0D7D3" w:sz="4"/>
             </w:tcBorders>
-            <w:shd w:fill="F6F8F7" w:color="auto" w:val="clear"/>
             <w:tcMar>
               <w:top w:type="dxa" w:w="80"/>
               <w:left w:type="dxa" w:w="120"/>
@@ -5776,7 +5895,6 @@
               <w:bottom w:val="single" w:color="D0D7D3" w:sz="4"/>
               <w:right w:val="single" w:color="D0D7D3" w:sz="4"/>
             </w:tcBorders>
-            <w:shd w:fill="F6F8F7" w:color="auto" w:val="clear"/>
             <w:tcMar>
               <w:top w:type="dxa" w:w="80"/>
               <w:left w:type="dxa" w:w="120"/>
@@ -5807,6 +5925,7 @@
               <w:bottom w:val="single" w:color="D0D7D3" w:sz="4"/>
               <w:right w:val="single" w:color="D0D7D3" w:sz="4"/>
             </w:tcBorders>
+            <w:shd w:fill="F6F8F7" w:color="auto" w:val="clear"/>
             <w:tcMar>
               <w:top w:type="dxa" w:w="80"/>
               <w:left w:type="dxa" w:w="120"/>
@@ -5835,6 +5954,7 @@
               <w:bottom w:val="single" w:color="D0D7D3" w:sz="4"/>
               <w:right w:val="single" w:color="D0D7D3" w:sz="4"/>
             </w:tcBorders>
+            <w:shd w:fill="F6F8F7" w:color="auto" w:val="clear"/>
             <w:tcMar>
               <w:top w:type="dxa" w:w="80"/>
               <w:left w:type="dxa" w:w="120"/>
@@ -5865,7 +5985,6 @@
               <w:bottom w:val="single" w:color="D0D7D3" w:sz="4"/>
               <w:right w:val="single" w:color="D0D7D3" w:sz="4"/>
             </w:tcBorders>
-            <w:shd w:fill="F6F8F7" w:color="auto" w:val="clear"/>
             <w:tcMar>
               <w:top w:type="dxa" w:w="80"/>
               <w:left w:type="dxa" w:w="120"/>
@@ -5894,7 +6013,6 @@
               <w:bottom w:val="single" w:color="D0D7D3" w:sz="4"/>
               <w:right w:val="single" w:color="D0D7D3" w:sz="4"/>
             </w:tcBorders>
-            <w:shd w:fill="F6F8F7" w:color="auto" w:val="clear"/>
             <w:tcMar>
               <w:top w:type="dxa" w:w="80"/>
               <w:left w:type="dxa" w:w="120"/>
@@ -5925,6 +6043,7 @@
               <w:bottom w:val="single" w:color="D0D7D3" w:sz="4"/>
               <w:right w:val="single" w:color="D0D7D3" w:sz="4"/>
             </w:tcBorders>
+            <w:shd w:fill="F6F8F7" w:color="auto" w:val="clear"/>
             <w:tcMar>
               <w:top w:type="dxa" w:w="80"/>
               <w:left w:type="dxa" w:w="120"/>
@@ -5953,6 +6072,7 @@
               <w:bottom w:val="single" w:color="D0D7D3" w:sz="4"/>
               <w:right w:val="single" w:color="D0D7D3" w:sz="4"/>
             </w:tcBorders>
+            <w:shd w:fill="F6F8F7" w:color="auto" w:val="clear"/>
             <w:tcMar>
               <w:top w:type="dxa" w:w="80"/>
               <w:left w:type="dxa" w:w="120"/>
@@ -5983,7 +6103,6 @@
               <w:bottom w:val="single" w:color="D0D7D3" w:sz="4"/>
               <w:right w:val="single" w:color="D0D7D3" w:sz="4"/>
             </w:tcBorders>
-            <w:shd w:fill="F6F8F7" w:color="auto" w:val="clear"/>
             <w:tcMar>
               <w:top w:type="dxa" w:w="80"/>
               <w:left w:type="dxa" w:w="120"/>
@@ -6012,7 +6131,6 @@
               <w:bottom w:val="single" w:color="D0D7D3" w:sz="4"/>
               <w:right w:val="single" w:color="D0D7D3" w:sz="4"/>
             </w:tcBorders>
-            <w:shd w:fill="F6F8F7" w:color="auto" w:val="clear"/>
             <w:tcMar>
               <w:top w:type="dxa" w:w="80"/>
               <w:left w:type="dxa" w:w="120"/>
@@ -6043,6 +6161,7 @@
               <w:bottom w:val="single" w:color="D0D7D3" w:sz="4"/>
               <w:right w:val="single" w:color="D0D7D3" w:sz="4"/>
             </w:tcBorders>
+            <w:shd w:fill="F6F8F7" w:color="auto" w:val="clear"/>
             <w:tcMar>
               <w:top w:type="dxa" w:w="80"/>
               <w:left w:type="dxa" w:w="120"/>
@@ -6071,6 +6190,7 @@
               <w:bottom w:val="single" w:color="D0D7D3" w:sz="4"/>
               <w:right w:val="single" w:color="D0D7D3" w:sz="4"/>
             </w:tcBorders>
+            <w:shd w:fill="F6F8F7" w:color="auto" w:val="clear"/>
             <w:tcMar>
               <w:top w:type="dxa" w:w="80"/>
               <w:left w:type="dxa" w:w="120"/>
@@ -6101,7 +6221,6 @@
               <w:bottom w:val="single" w:color="D0D7D3" w:sz="4"/>
               <w:right w:val="single" w:color="D0D7D3" w:sz="4"/>
             </w:tcBorders>
-            <w:shd w:fill="F6F8F7" w:color="auto" w:val="clear"/>
             <w:tcMar>
               <w:top w:type="dxa" w:w="80"/>
               <w:left w:type="dxa" w:w="120"/>
@@ -6130,7 +6249,6 @@
               <w:bottom w:val="single" w:color="D0D7D3" w:sz="4"/>
               <w:right w:val="single" w:color="D0D7D3" w:sz="4"/>
             </w:tcBorders>
-            <w:shd w:fill="F6F8F7" w:color="auto" w:val="clear"/>
             <w:tcMar>
               <w:top w:type="dxa" w:w="80"/>
               <w:left w:type="dxa" w:w="120"/>
@@ -6161,6 +6279,7 @@
               <w:bottom w:val="single" w:color="D0D7D3" w:sz="4"/>
               <w:right w:val="single" w:color="D0D7D3" w:sz="4"/>
             </w:tcBorders>
+            <w:shd w:fill="F6F8F7" w:color="auto" w:val="clear"/>
             <w:tcMar>
               <w:top w:type="dxa" w:w="80"/>
               <w:left w:type="dxa" w:w="120"/>
@@ -6189,6 +6308,7 @@
               <w:bottom w:val="single" w:color="D0D7D3" w:sz="4"/>
               <w:right w:val="single" w:color="D0D7D3" w:sz="4"/>
             </w:tcBorders>
+            <w:shd w:fill="F6F8F7" w:color="auto" w:val="clear"/>
             <w:tcMar>
               <w:top w:type="dxa" w:w="80"/>
               <w:left w:type="dxa" w:w="120"/>
@@ -6219,7 +6339,6 @@
               <w:bottom w:val="single" w:color="D0D7D3" w:sz="4"/>
               <w:right w:val="single" w:color="D0D7D3" w:sz="4"/>
             </w:tcBorders>
-            <w:shd w:fill="F6F8F7" w:color="auto" w:val="clear"/>
             <w:tcMar>
               <w:top w:type="dxa" w:w="80"/>
               <w:left w:type="dxa" w:w="120"/>
@@ -6248,7 +6367,6 @@
               <w:bottom w:val="single" w:color="D0D7D3" w:sz="4"/>
               <w:right w:val="single" w:color="D0D7D3" w:sz="4"/>
             </w:tcBorders>
-            <w:shd w:fill="F6F8F7" w:color="auto" w:val="clear"/>
             <w:tcMar>
               <w:top w:type="dxa" w:w="80"/>
               <w:left w:type="dxa" w:w="120"/>
@@ -6279,6 +6397,7 @@
               <w:bottom w:val="single" w:color="D0D7D3" w:sz="4"/>
               <w:right w:val="single" w:color="D0D7D3" w:sz="4"/>
             </w:tcBorders>
+            <w:shd w:fill="F6F8F7" w:color="auto" w:val="clear"/>
             <w:tcMar>
               <w:top w:type="dxa" w:w="80"/>
               <w:left w:type="dxa" w:w="120"/>
@@ -6307,6 +6426,7 @@
               <w:bottom w:val="single" w:color="D0D7D3" w:sz="4"/>
               <w:right w:val="single" w:color="D0D7D3" w:sz="4"/>
             </w:tcBorders>
+            <w:shd w:fill="F6F8F7" w:color="auto" w:val="clear"/>
             <w:tcMar>
               <w:top w:type="dxa" w:w="80"/>
               <w:left w:type="dxa" w:w="120"/>
@@ -6337,7 +6457,6 @@
               <w:bottom w:val="single" w:color="D0D7D3" w:sz="4"/>
               <w:right w:val="single" w:color="D0D7D3" w:sz="4"/>
             </w:tcBorders>
-            <w:shd w:fill="F6F8F7" w:color="auto" w:val="clear"/>
             <w:tcMar>
               <w:top w:type="dxa" w:w="80"/>
               <w:left w:type="dxa" w:w="120"/>
@@ -6366,7 +6485,6 @@
               <w:bottom w:val="single" w:color="D0D7D3" w:sz="4"/>
               <w:right w:val="single" w:color="D0D7D3" w:sz="4"/>
             </w:tcBorders>
-            <w:shd w:fill="F6F8F7" w:color="auto" w:val="clear"/>
             <w:tcMar>
               <w:top w:type="dxa" w:w="80"/>
               <w:left w:type="dxa" w:w="120"/>
@@ -6397,6 +6515,7 @@
               <w:bottom w:val="single" w:color="D0D7D3" w:sz="4"/>
               <w:right w:val="single" w:color="D0D7D3" w:sz="4"/>
             </w:tcBorders>
+            <w:shd w:fill="F6F8F7" w:color="auto" w:val="clear"/>
             <w:tcMar>
               <w:top w:type="dxa" w:w="80"/>
               <w:left w:type="dxa" w:w="120"/>
@@ -6425,6 +6544,7 @@
               <w:bottom w:val="single" w:color="D0D7D3" w:sz="4"/>
               <w:right w:val="single" w:color="D0D7D3" w:sz="4"/>
             </w:tcBorders>
+            <w:shd w:fill="F6F8F7" w:color="auto" w:val="clear"/>
             <w:tcMar>
               <w:top w:type="dxa" w:w="80"/>
               <w:left w:type="dxa" w:w="120"/>
@@ -6455,7 +6575,6 @@
               <w:bottom w:val="single" w:color="D0D7D3" w:sz="4"/>
               <w:right w:val="single" w:color="D0D7D3" w:sz="4"/>
             </w:tcBorders>
-            <w:shd w:fill="F6F8F7" w:color="auto" w:val="clear"/>
             <w:tcMar>
               <w:top w:type="dxa" w:w="80"/>
               <w:left w:type="dxa" w:w="120"/>
@@ -6484,7 +6603,6 @@
               <w:bottom w:val="single" w:color="D0D7D3" w:sz="4"/>
               <w:right w:val="single" w:color="D0D7D3" w:sz="4"/>
             </w:tcBorders>
-            <w:shd w:fill="F6F8F7" w:color="auto" w:val="clear"/>
             <w:tcMar>
               <w:top w:type="dxa" w:w="80"/>
               <w:left w:type="dxa" w:w="120"/>
@@ -6515,6 +6633,7 @@
               <w:bottom w:val="single" w:color="D0D7D3" w:sz="4"/>
               <w:right w:val="single" w:color="D0D7D3" w:sz="4"/>
             </w:tcBorders>
+            <w:shd w:fill="F6F8F7" w:color="auto" w:val="clear"/>
             <w:tcMar>
               <w:top w:type="dxa" w:w="80"/>
               <w:left w:type="dxa" w:w="120"/>
@@ -6543,6 +6662,7 @@
               <w:bottom w:val="single" w:color="D0D7D3" w:sz="4"/>
               <w:right w:val="single" w:color="D0D7D3" w:sz="4"/>
             </w:tcBorders>
+            <w:shd w:fill="F6F8F7" w:color="auto" w:val="clear"/>
             <w:tcMar>
               <w:top w:type="dxa" w:w="80"/>
               <w:left w:type="dxa" w:w="120"/>
@@ -6573,7 +6693,6 @@
               <w:bottom w:val="single" w:color="D0D7D3" w:sz="4"/>
               <w:right w:val="single" w:color="D0D7D3" w:sz="4"/>
             </w:tcBorders>
-            <w:shd w:fill="F6F8F7" w:color="auto" w:val="clear"/>
             <w:tcMar>
               <w:top w:type="dxa" w:w="80"/>
               <w:left w:type="dxa" w:w="120"/>
@@ -6602,7 +6721,6 @@
               <w:bottom w:val="single" w:color="D0D7D3" w:sz="4"/>
               <w:right w:val="single" w:color="D0D7D3" w:sz="4"/>
             </w:tcBorders>
-            <w:shd w:fill="F6F8F7" w:color="auto" w:val="clear"/>
             <w:tcMar>
               <w:top w:type="dxa" w:w="80"/>
               <w:left w:type="dxa" w:w="120"/>
@@ -6633,6 +6751,7 @@
               <w:bottom w:val="single" w:color="D0D7D3" w:sz="4"/>
               <w:right w:val="single" w:color="D0D7D3" w:sz="4"/>
             </w:tcBorders>
+            <w:shd w:fill="F6F8F7" w:color="auto" w:val="clear"/>
             <w:tcMar>
               <w:top w:type="dxa" w:w="80"/>
               <w:left w:type="dxa" w:w="120"/>
@@ -6661,6 +6780,7 @@
               <w:bottom w:val="single" w:color="D0D7D3" w:sz="4"/>
               <w:right w:val="single" w:color="D0D7D3" w:sz="4"/>
             </w:tcBorders>
+            <w:shd w:fill="F6F8F7" w:color="auto" w:val="clear"/>
             <w:tcMar>
               <w:top w:type="dxa" w:w="80"/>
               <w:left w:type="dxa" w:w="120"/>
@@ -6691,7 +6811,6 @@
               <w:bottom w:val="single" w:color="D0D7D3" w:sz="4"/>
               <w:right w:val="single" w:color="D0D7D3" w:sz="4"/>
             </w:tcBorders>
-            <w:shd w:fill="F6F8F7" w:color="auto" w:val="clear"/>
             <w:tcMar>
               <w:top w:type="dxa" w:w="80"/>
               <w:left w:type="dxa" w:w="120"/>
@@ -6720,7 +6839,6 @@
               <w:bottom w:val="single" w:color="D0D7D3" w:sz="4"/>
               <w:right w:val="single" w:color="D0D7D3" w:sz="4"/>
             </w:tcBorders>
-            <w:shd w:fill="F6F8F7" w:color="auto" w:val="clear"/>
             <w:tcMar>
               <w:top w:type="dxa" w:w="80"/>
               <w:left w:type="dxa" w:w="120"/>
@@ -6751,6 +6869,7 @@
               <w:bottom w:val="single" w:color="D0D7D3" w:sz="4"/>
               <w:right w:val="single" w:color="D0D7D3" w:sz="4"/>
             </w:tcBorders>
+            <w:shd w:fill="F6F8F7" w:color="auto" w:val="clear"/>
             <w:tcMar>
               <w:top w:type="dxa" w:w="80"/>
               <w:left w:type="dxa" w:w="120"/>
@@ -6779,6 +6898,7 @@
               <w:bottom w:val="single" w:color="D0D7D3" w:sz="4"/>
               <w:right w:val="single" w:color="D0D7D3" w:sz="4"/>
             </w:tcBorders>
+            <w:shd w:fill="F6F8F7" w:color="auto" w:val="clear"/>
             <w:tcMar>
               <w:top w:type="dxa" w:w="80"/>
               <w:left w:type="dxa" w:w="120"/>
@@ -6809,7 +6929,6 @@
               <w:bottom w:val="single" w:color="D0D7D3" w:sz="4"/>
               <w:right w:val="single" w:color="D0D7D3" w:sz="4"/>
             </w:tcBorders>
-            <w:shd w:fill="F6F8F7" w:color="auto" w:val="clear"/>
             <w:tcMar>
               <w:top w:type="dxa" w:w="80"/>
               <w:left w:type="dxa" w:w="120"/>
@@ -6838,7 +6957,6 @@
               <w:bottom w:val="single" w:color="D0D7D3" w:sz="4"/>
               <w:right w:val="single" w:color="D0D7D3" w:sz="4"/>
             </w:tcBorders>
-            <w:shd w:fill="F6F8F7" w:color="auto" w:val="clear"/>
             <w:tcMar>
               <w:top w:type="dxa" w:w="80"/>
               <w:left w:type="dxa" w:w="120"/>
@@ -6869,6 +6987,7 @@
               <w:bottom w:val="single" w:color="D0D7D3" w:sz="4"/>
               <w:right w:val="single" w:color="D0D7D3" w:sz="4"/>
             </w:tcBorders>
+            <w:shd w:fill="F6F8F7" w:color="auto" w:val="clear"/>
             <w:tcMar>
               <w:top w:type="dxa" w:w="80"/>
               <w:left w:type="dxa" w:w="120"/>
@@ -6897,6 +7016,7 @@
               <w:bottom w:val="single" w:color="D0D7D3" w:sz="4"/>
               <w:right w:val="single" w:color="D0D7D3" w:sz="4"/>
             </w:tcBorders>
+            <w:shd w:fill="F6F8F7" w:color="auto" w:val="clear"/>
             <w:tcMar>
               <w:top w:type="dxa" w:w="80"/>
               <w:left w:type="dxa" w:w="120"/>
@@ -6927,7 +7047,6 @@
               <w:bottom w:val="single" w:color="D0D7D3" w:sz="4"/>
               <w:right w:val="single" w:color="D0D7D3" w:sz="4"/>
             </w:tcBorders>
-            <w:shd w:fill="F6F8F7" w:color="auto" w:val="clear"/>
             <w:tcMar>
               <w:top w:type="dxa" w:w="80"/>
               <w:left w:type="dxa" w:w="120"/>
@@ -6956,7 +7075,6 @@
               <w:bottom w:val="single" w:color="D0D7D3" w:sz="4"/>
               <w:right w:val="single" w:color="D0D7D3" w:sz="4"/>
             </w:tcBorders>
-            <w:shd w:fill="F6F8F7" w:color="auto" w:val="clear"/>
             <w:tcMar>
               <w:top w:type="dxa" w:w="80"/>
               <w:left w:type="dxa" w:w="120"/>
@@ -6987,6 +7105,7 @@
               <w:bottom w:val="single" w:color="D0D7D3" w:sz="4"/>
               <w:right w:val="single" w:color="D0D7D3" w:sz="4"/>
             </w:tcBorders>
+            <w:shd w:fill="F6F8F7" w:color="auto" w:val="clear"/>
             <w:tcMar>
               <w:top w:type="dxa" w:w="80"/>
               <w:left w:type="dxa" w:w="120"/>
@@ -7015,6 +7134,7 @@
               <w:bottom w:val="single" w:color="D0D7D3" w:sz="4"/>
               <w:right w:val="single" w:color="D0D7D3" w:sz="4"/>
             </w:tcBorders>
+            <w:shd w:fill="F6F8F7" w:color="auto" w:val="clear"/>
             <w:tcMar>
               <w:top w:type="dxa" w:w="80"/>
               <w:left w:type="dxa" w:w="120"/>
@@ -7045,7 +7165,6 @@
               <w:bottom w:val="single" w:color="D0D7D3" w:sz="4"/>
               <w:right w:val="single" w:color="D0D7D3" w:sz="4"/>
             </w:tcBorders>
-            <w:shd w:fill="F6F8F7" w:color="auto" w:val="clear"/>
             <w:tcMar>
               <w:top w:type="dxa" w:w="80"/>
               <w:left w:type="dxa" w:w="120"/>
@@ -7074,7 +7193,6 @@
               <w:bottom w:val="single" w:color="D0D7D3" w:sz="4"/>
               <w:right w:val="single" w:color="D0D7D3" w:sz="4"/>
             </w:tcBorders>
-            <w:shd w:fill="F6F8F7" w:color="auto" w:val="clear"/>
             <w:tcMar>
               <w:top w:type="dxa" w:w="80"/>
               <w:left w:type="dxa" w:w="120"/>
@@ -7105,6 +7223,7 @@
               <w:bottom w:val="single" w:color="D0D7D3" w:sz="4"/>
               <w:right w:val="single" w:color="D0D7D3" w:sz="4"/>
             </w:tcBorders>
+            <w:shd w:fill="F6F8F7" w:color="auto" w:val="clear"/>
             <w:tcMar>
               <w:top w:type="dxa" w:w="80"/>
               <w:left w:type="dxa" w:w="120"/>
@@ -7133,6 +7252,7 @@
               <w:bottom w:val="single" w:color="D0D7D3" w:sz="4"/>
               <w:right w:val="single" w:color="D0D7D3" w:sz="4"/>
             </w:tcBorders>
+            <w:shd w:fill="F6F8F7" w:color="auto" w:val="clear"/>
             <w:tcMar>
               <w:top w:type="dxa" w:w="80"/>
               <w:left w:type="dxa" w:w="120"/>

</xml_diff>

<commit_message>
Close a term so nothing can be backdated into it; the proprietor re-opens with a reason
</commit_message>
<xml_diff>
--- a/docs/product/WardPay - what it does.docx
+++ b/docs/product/WardPay - what it does.docx
@@ -264,6 +264,65 @@
                 <w:sz w:val="20"/>
                 <w:szCs w:val="20"/>
               </w:rPr>
+              <w:t xml:space="preserve">Close a term once its figures are reported: nothing can be backdated into it, and only you can re-open it, with a reason</w:t>
+            </w:r>
+          </w:p>
+        </w:tc>
+        <w:tc>
+          <w:tcPr>
+            <w:tcW w:type="dxa" w:w="4238"/>
+            <w:tcBorders>
+              <w:top w:val="single" w:color="D0D7D3" w:sz="4"/>
+              <w:left w:val="single" w:color="D0D7D3" w:sz="4"/>
+              <w:bottom w:val="single" w:color="D0D7D3" w:sz="4"/>
+              <w:right w:val="single" w:color="D0D7D3" w:sz="4"/>
+            </w:tcBorders>
+            <w:shd w:fill="F6F8F7" w:color="auto" w:val="clear"/>
+            <w:tcMar>
+              <w:top w:type="dxa" w:w="80"/>
+              <w:left w:type="dxa" w:w="120"/>
+              <w:bottom w:type="dxa" w:w="80"/>
+              <w:right w:type="dxa" w:w="120"/>
+            </w:tcMar>
+          </w:tcPr>
+          <w:p>
+            <w:r>
+              <w:rPr>
+                <w:b w:val="false"/>
+                <w:bCs w:val="false"/>
+                <w:sz w:val="20"/>
+                <w:szCs w:val="20"/>
+              </w:rPr>
+              <w:t xml:space="preserve">The figures you reported to the board or the accountant stay the figures</w:t>
+            </w:r>
+          </w:p>
+        </w:tc>
+      </w:tr>
+      <w:tr>
+        <w:tc>
+          <w:tcPr>
+            <w:tcW w:type="dxa" w:w="5400"/>
+            <w:tcBorders>
+              <w:top w:val="single" w:color="D0D7D3" w:sz="4"/>
+              <w:left w:val="single" w:color="D0D7D3" w:sz="4"/>
+              <w:bottom w:val="single" w:color="D0D7D3" w:sz="4"/>
+              <w:right w:val="single" w:color="D0D7D3" w:sz="4"/>
+            </w:tcBorders>
+            <w:tcMar>
+              <w:top w:type="dxa" w:w="80"/>
+              <w:left w:type="dxa" w:w="120"/>
+              <w:bottom w:type="dxa" w:w="80"/>
+              <w:right w:type="dxa" w:w="120"/>
+            </w:tcMar>
+          </w:tcPr>
+          <w:p>
+            <w:r>
+              <w:rPr>
+                <w:b w:val="false"/>
+                <w:bCs w:val="false"/>
+                <w:sz w:val="20"/>
+                <w:szCs w:val="20"/>
+              </w:rPr>
               <w:t xml:space="preserve">An end-of-session pack: the year’s summary, each term, money in and out, debtors, cash book and journal in one file</w:t>
             </w:r>
           </w:p>
@@ -277,7 +336,6 @@
               <w:bottom w:val="single" w:color="D0D7D3" w:sz="4"/>
               <w:right w:val="single" w:color="D0D7D3" w:sz="4"/>
             </w:tcBorders>
-            <w:shd w:fill="F6F8F7" w:color="auto" w:val="clear"/>
             <w:tcMar>
               <w:top w:type="dxa" w:w="80"/>
               <w:left w:type="dxa" w:w="120"/>
@@ -308,6 +366,7 @@
               <w:bottom w:val="single" w:color="D0D7D3" w:sz="4"/>
               <w:right w:val="single" w:color="D0D7D3" w:sz="4"/>
             </w:tcBorders>
+            <w:shd w:fill="F6F8F7" w:color="auto" w:val="clear"/>
             <w:tcMar>
               <w:top w:type="dxa" w:w="80"/>
               <w:left w:type="dxa" w:w="120"/>
@@ -336,6 +395,7 @@
               <w:bottom w:val="single" w:color="D0D7D3" w:sz="4"/>
               <w:right w:val="single" w:color="D0D7D3" w:sz="4"/>
             </w:tcBorders>
+            <w:shd w:fill="F6F8F7" w:color="auto" w:val="clear"/>
             <w:tcMar>
               <w:top w:type="dxa" w:w="80"/>
               <w:left w:type="dxa" w:w="120"/>
@@ -366,7 +426,6 @@
               <w:bottom w:val="single" w:color="D0D7D3" w:sz="4"/>
               <w:right w:val="single" w:color="D0D7D3" w:sz="4"/>
             </w:tcBorders>
-            <w:shd w:fill="F6F8F7" w:color="auto" w:val="clear"/>
             <w:tcMar>
               <w:top w:type="dxa" w:w="80"/>
               <w:left w:type="dxa" w:w="120"/>
@@ -395,7 +454,6 @@
               <w:bottom w:val="single" w:color="D0D7D3" w:sz="4"/>
               <w:right w:val="single" w:color="D0D7D3" w:sz="4"/>
             </w:tcBorders>
-            <w:shd w:fill="F6F8F7" w:color="auto" w:val="clear"/>
             <w:tcMar>
               <w:top w:type="dxa" w:w="80"/>
               <w:left w:type="dxa" w:w="120"/>
@@ -426,6 +484,7 @@
               <w:bottom w:val="single" w:color="D0D7D3" w:sz="4"/>
               <w:right w:val="single" w:color="D0D7D3" w:sz="4"/>
             </w:tcBorders>
+            <w:shd w:fill="F6F8F7" w:color="auto" w:val="clear"/>
             <w:tcMar>
               <w:top w:type="dxa" w:w="80"/>
               <w:left w:type="dxa" w:w="120"/>
@@ -454,6 +513,7 @@
               <w:bottom w:val="single" w:color="D0D7D3" w:sz="4"/>
               <w:right w:val="single" w:color="D0D7D3" w:sz="4"/>
             </w:tcBorders>
+            <w:shd w:fill="F6F8F7" w:color="auto" w:val="clear"/>
             <w:tcMar>
               <w:top w:type="dxa" w:w="80"/>
               <w:left w:type="dxa" w:w="120"/>
@@ -484,7 +544,6 @@
               <w:bottom w:val="single" w:color="D0D7D3" w:sz="4"/>
               <w:right w:val="single" w:color="D0D7D3" w:sz="4"/>
             </w:tcBorders>
-            <w:shd w:fill="F6F8F7" w:color="auto" w:val="clear"/>
             <w:tcMar>
               <w:top w:type="dxa" w:w="80"/>
               <w:left w:type="dxa" w:w="120"/>
@@ -513,7 +572,6 @@
               <w:bottom w:val="single" w:color="D0D7D3" w:sz="4"/>
               <w:right w:val="single" w:color="D0D7D3" w:sz="4"/>
             </w:tcBorders>
-            <w:shd w:fill="F6F8F7" w:color="auto" w:val="clear"/>
             <w:tcMar>
               <w:top w:type="dxa" w:w="80"/>
               <w:left w:type="dxa" w:w="120"/>
@@ -544,6 +602,7 @@
               <w:bottom w:val="single" w:color="D0D7D3" w:sz="4"/>
               <w:right w:val="single" w:color="D0D7D3" w:sz="4"/>
             </w:tcBorders>
+            <w:shd w:fill="F6F8F7" w:color="auto" w:val="clear"/>
             <w:tcMar>
               <w:top w:type="dxa" w:w="80"/>
               <w:left w:type="dxa" w:w="120"/>
@@ -572,6 +631,7 @@
               <w:bottom w:val="single" w:color="D0D7D3" w:sz="4"/>
               <w:right w:val="single" w:color="D0D7D3" w:sz="4"/>
             </w:tcBorders>
+            <w:shd w:fill="F6F8F7" w:color="auto" w:val="clear"/>
             <w:tcMar>
               <w:top w:type="dxa" w:w="80"/>
               <w:left w:type="dxa" w:w="120"/>
@@ -602,7 +662,6 @@
               <w:bottom w:val="single" w:color="D0D7D3" w:sz="4"/>
               <w:right w:val="single" w:color="D0D7D3" w:sz="4"/>
             </w:tcBorders>
-            <w:shd w:fill="F6F8F7" w:color="auto" w:val="clear"/>
             <w:tcMar>
               <w:top w:type="dxa" w:w="80"/>
               <w:left w:type="dxa" w:w="120"/>
@@ -631,7 +690,6 @@
               <w:bottom w:val="single" w:color="D0D7D3" w:sz="4"/>
               <w:right w:val="single" w:color="D0D7D3" w:sz="4"/>
             </w:tcBorders>
-            <w:shd w:fill="F6F8F7" w:color="auto" w:val="clear"/>
             <w:tcMar>
               <w:top w:type="dxa" w:w="80"/>
               <w:left w:type="dxa" w:w="120"/>
@@ -662,6 +720,7 @@
               <w:bottom w:val="single" w:color="D0D7D3" w:sz="4"/>
               <w:right w:val="single" w:color="D0D7D3" w:sz="4"/>
             </w:tcBorders>
+            <w:shd w:fill="F6F8F7" w:color="auto" w:val="clear"/>
             <w:tcMar>
               <w:top w:type="dxa" w:w="80"/>
               <w:left w:type="dxa" w:w="120"/>
@@ -690,6 +749,7 @@
               <w:bottom w:val="single" w:color="D0D7D3" w:sz="4"/>
               <w:right w:val="single" w:color="D0D7D3" w:sz="4"/>
             </w:tcBorders>
+            <w:shd w:fill="F6F8F7" w:color="auto" w:val="clear"/>
             <w:tcMar>
               <w:top w:type="dxa" w:w="80"/>
               <w:left w:type="dxa" w:w="120"/>
@@ -720,7 +780,6 @@
               <w:bottom w:val="single" w:color="D0D7D3" w:sz="4"/>
               <w:right w:val="single" w:color="D0D7D3" w:sz="4"/>
             </w:tcBorders>
-            <w:shd w:fill="F6F8F7" w:color="auto" w:val="clear"/>
             <w:tcMar>
               <w:top w:type="dxa" w:w="80"/>
               <w:left w:type="dxa" w:w="120"/>
@@ -749,7 +808,6 @@
               <w:bottom w:val="single" w:color="D0D7D3" w:sz="4"/>
               <w:right w:val="single" w:color="D0D7D3" w:sz="4"/>
             </w:tcBorders>
-            <w:shd w:fill="F6F8F7" w:color="auto" w:val="clear"/>
             <w:tcMar>
               <w:top w:type="dxa" w:w="80"/>
               <w:left w:type="dxa" w:w="120"/>
@@ -4612,6 +4670,66 @@
                 <w:sz w:val="20"/>
                 <w:szCs w:val="20"/>
               </w:rPr>
+              <w:t xml:space="preserve">Closing a term: nothing can be backdated into reported figures; only the proprietor re-opens</w:t>
+            </w:r>
+          </w:p>
+        </w:tc>
+      </w:tr>
+      <w:tr>
+        <w:tc>
+          <w:tcPr>
+            <w:tcW w:type="dxa" w:w="1800"/>
+            <w:tcBorders>
+              <w:top w:val="single" w:color="D0D7D3" w:sz="4"/>
+              <w:left w:val="single" w:color="D0D7D3" w:sz="4"/>
+              <w:bottom w:val="single" w:color="D0D7D3" w:sz="4"/>
+              <w:right w:val="single" w:color="D0D7D3" w:sz="4"/>
+            </w:tcBorders>
+            <w:shd w:fill="F6F8F7" w:color="auto" w:val="clear"/>
+            <w:tcMar>
+              <w:top w:type="dxa" w:w="80"/>
+              <w:left w:type="dxa" w:w="120"/>
+              <w:bottom w:type="dxa" w:w="80"/>
+              <w:right w:type="dxa" w:w="120"/>
+            </w:tcMar>
+          </w:tcPr>
+          <w:p>
+            <w:r>
+              <w:rPr>
+                <w:b w:val="false"/>
+                <w:bCs w:val="false"/>
+                <w:sz w:val="20"/>
+                <w:szCs w:val="20"/>
+              </w:rPr>
+              <w:t xml:space="preserve">24 Oct 2026</w:t>
+            </w:r>
+          </w:p>
+        </w:tc>
+        <w:tc>
+          <w:tcPr>
+            <w:tcW w:type="dxa" w:w="7838"/>
+            <w:tcBorders>
+              <w:top w:val="single" w:color="D0D7D3" w:sz="4"/>
+              <w:left w:val="single" w:color="D0D7D3" w:sz="4"/>
+              <w:bottom w:val="single" w:color="D0D7D3" w:sz="4"/>
+              <w:right w:val="single" w:color="D0D7D3" w:sz="4"/>
+            </w:tcBorders>
+            <w:shd w:fill="F6F8F7" w:color="auto" w:val="clear"/>
+            <w:tcMar>
+              <w:top w:type="dxa" w:w="80"/>
+              <w:left w:type="dxa" w:w="120"/>
+              <w:bottom w:type="dxa" w:w="80"/>
+              <w:right w:type="dxa" w:w="120"/>
+            </w:tcMar>
+          </w:tcPr>
+          <w:p>
+            <w:r>
+              <w:rPr>
+                <w:b w:val="false"/>
+                <w:bCs w:val="false"/>
+                <w:sz w:val="20"/>
+                <w:szCs w:val="20"/>
+              </w:rPr>
               <w:t xml:space="preserve">End-of-session pack: the whole school year in one Excel file</w:t>
             </w:r>
           </w:p>
@@ -4627,7 +4745,6 @@
               <w:bottom w:val="single" w:color="D0D7D3" w:sz="4"/>
               <w:right w:val="single" w:color="D0D7D3" w:sz="4"/>
             </w:tcBorders>
-            <w:shd w:fill="F6F8F7" w:color="auto" w:val="clear"/>
             <w:tcMar>
               <w:top w:type="dxa" w:w="80"/>
               <w:left w:type="dxa" w:w="120"/>
@@ -4656,7 +4773,6 @@
               <w:bottom w:val="single" w:color="D0D7D3" w:sz="4"/>
               <w:right w:val="single" w:color="D0D7D3" w:sz="4"/>
             </w:tcBorders>
-            <w:shd w:fill="F6F8F7" w:color="auto" w:val="clear"/>
             <w:tcMar>
               <w:top w:type="dxa" w:w="80"/>
               <w:left w:type="dxa" w:w="120"/>
@@ -4687,6 +4803,7 @@
               <w:bottom w:val="single" w:color="D0D7D3" w:sz="4"/>
               <w:right w:val="single" w:color="D0D7D3" w:sz="4"/>
             </w:tcBorders>
+            <w:shd w:fill="F6F8F7" w:color="auto" w:val="clear"/>
             <w:tcMar>
               <w:top w:type="dxa" w:w="80"/>
               <w:left w:type="dxa" w:w="120"/>
@@ -4715,6 +4832,7 @@
               <w:bottom w:val="single" w:color="D0D7D3" w:sz="4"/>
               <w:right w:val="single" w:color="D0D7D3" w:sz="4"/>
             </w:tcBorders>
+            <w:shd w:fill="F6F8F7" w:color="auto" w:val="clear"/>
             <w:tcMar>
               <w:top w:type="dxa" w:w="80"/>
               <w:left w:type="dxa" w:w="120"/>
@@ -4745,7 +4863,6 @@
               <w:bottom w:val="single" w:color="D0D7D3" w:sz="4"/>
               <w:right w:val="single" w:color="D0D7D3" w:sz="4"/>
             </w:tcBorders>
-            <w:shd w:fill="F6F8F7" w:color="auto" w:val="clear"/>
             <w:tcMar>
               <w:top w:type="dxa" w:w="80"/>
               <w:left w:type="dxa" w:w="120"/>
@@ -4774,7 +4891,6 @@
               <w:bottom w:val="single" w:color="D0D7D3" w:sz="4"/>
               <w:right w:val="single" w:color="D0D7D3" w:sz="4"/>
             </w:tcBorders>
-            <w:shd w:fill="F6F8F7" w:color="auto" w:val="clear"/>
             <w:tcMar>
               <w:top w:type="dxa" w:w="80"/>
               <w:left w:type="dxa" w:w="120"/>
@@ -4805,6 +4921,7 @@
               <w:bottom w:val="single" w:color="D0D7D3" w:sz="4"/>
               <w:right w:val="single" w:color="D0D7D3" w:sz="4"/>
             </w:tcBorders>
+            <w:shd w:fill="F6F8F7" w:color="auto" w:val="clear"/>
             <w:tcMar>
               <w:top w:type="dxa" w:w="80"/>
               <w:left w:type="dxa" w:w="120"/>
@@ -4833,6 +4950,7 @@
               <w:bottom w:val="single" w:color="D0D7D3" w:sz="4"/>
               <w:right w:val="single" w:color="D0D7D3" w:sz="4"/>
             </w:tcBorders>
+            <w:shd w:fill="F6F8F7" w:color="auto" w:val="clear"/>
             <w:tcMar>
               <w:top w:type="dxa" w:w="80"/>
               <w:left w:type="dxa" w:w="120"/>
@@ -4863,7 +4981,6 @@
               <w:bottom w:val="single" w:color="D0D7D3" w:sz="4"/>
               <w:right w:val="single" w:color="D0D7D3" w:sz="4"/>
             </w:tcBorders>
-            <w:shd w:fill="F6F8F7" w:color="auto" w:val="clear"/>
             <w:tcMar>
               <w:top w:type="dxa" w:w="80"/>
               <w:left w:type="dxa" w:w="120"/>
@@ -4892,7 +5009,6 @@
               <w:bottom w:val="single" w:color="D0D7D3" w:sz="4"/>
               <w:right w:val="single" w:color="D0D7D3" w:sz="4"/>
             </w:tcBorders>
-            <w:shd w:fill="F6F8F7" w:color="auto" w:val="clear"/>
             <w:tcMar>
               <w:top w:type="dxa" w:w="80"/>
               <w:left w:type="dxa" w:w="120"/>
@@ -4923,6 +5039,7 @@
               <w:bottom w:val="single" w:color="D0D7D3" w:sz="4"/>
               <w:right w:val="single" w:color="D0D7D3" w:sz="4"/>
             </w:tcBorders>
+            <w:shd w:fill="F6F8F7" w:color="auto" w:val="clear"/>
             <w:tcMar>
               <w:top w:type="dxa" w:w="80"/>
               <w:left w:type="dxa" w:w="120"/>
@@ -4951,6 +5068,7 @@
               <w:bottom w:val="single" w:color="D0D7D3" w:sz="4"/>
               <w:right w:val="single" w:color="D0D7D3" w:sz="4"/>
             </w:tcBorders>
+            <w:shd w:fill="F6F8F7" w:color="auto" w:val="clear"/>
             <w:tcMar>
               <w:top w:type="dxa" w:w="80"/>
               <w:left w:type="dxa" w:w="120"/>
@@ -4981,7 +5099,6 @@
               <w:bottom w:val="single" w:color="D0D7D3" w:sz="4"/>
               <w:right w:val="single" w:color="D0D7D3" w:sz="4"/>
             </w:tcBorders>
-            <w:shd w:fill="F6F8F7" w:color="auto" w:val="clear"/>
             <w:tcMar>
               <w:top w:type="dxa" w:w="80"/>
               <w:left w:type="dxa" w:w="120"/>
@@ -5010,7 +5127,6 @@
               <w:bottom w:val="single" w:color="D0D7D3" w:sz="4"/>
               <w:right w:val="single" w:color="D0D7D3" w:sz="4"/>
             </w:tcBorders>
-            <w:shd w:fill="F6F8F7" w:color="auto" w:val="clear"/>
             <w:tcMar>
               <w:top w:type="dxa" w:w="80"/>
               <w:left w:type="dxa" w:w="120"/>
@@ -5041,6 +5157,7 @@
               <w:bottom w:val="single" w:color="D0D7D3" w:sz="4"/>
               <w:right w:val="single" w:color="D0D7D3" w:sz="4"/>
             </w:tcBorders>
+            <w:shd w:fill="F6F8F7" w:color="auto" w:val="clear"/>
             <w:tcMar>
               <w:top w:type="dxa" w:w="80"/>
               <w:left w:type="dxa" w:w="120"/>
@@ -5069,6 +5186,7 @@
               <w:bottom w:val="single" w:color="D0D7D3" w:sz="4"/>
               <w:right w:val="single" w:color="D0D7D3" w:sz="4"/>
             </w:tcBorders>
+            <w:shd w:fill="F6F8F7" w:color="auto" w:val="clear"/>
             <w:tcMar>
               <w:top w:type="dxa" w:w="80"/>
               <w:left w:type="dxa" w:w="120"/>
@@ -5099,7 +5217,6 @@
               <w:bottom w:val="single" w:color="D0D7D3" w:sz="4"/>
               <w:right w:val="single" w:color="D0D7D3" w:sz="4"/>
             </w:tcBorders>
-            <w:shd w:fill="F6F8F7" w:color="auto" w:val="clear"/>
             <w:tcMar>
               <w:top w:type="dxa" w:w="80"/>
               <w:left w:type="dxa" w:w="120"/>
@@ -5128,7 +5245,6 @@
               <w:bottom w:val="single" w:color="D0D7D3" w:sz="4"/>
               <w:right w:val="single" w:color="D0D7D3" w:sz="4"/>
             </w:tcBorders>
-            <w:shd w:fill="F6F8F7" w:color="auto" w:val="clear"/>
             <w:tcMar>
               <w:top w:type="dxa" w:w="80"/>
               <w:left w:type="dxa" w:w="120"/>
@@ -5159,6 +5275,7 @@
               <w:bottom w:val="single" w:color="D0D7D3" w:sz="4"/>
               <w:right w:val="single" w:color="D0D7D3" w:sz="4"/>
             </w:tcBorders>
+            <w:shd w:fill="F6F8F7" w:color="auto" w:val="clear"/>
             <w:tcMar>
               <w:top w:type="dxa" w:w="80"/>
               <w:left w:type="dxa" w:w="120"/>
@@ -5187,6 +5304,7 @@
               <w:bottom w:val="single" w:color="D0D7D3" w:sz="4"/>
               <w:right w:val="single" w:color="D0D7D3" w:sz="4"/>
             </w:tcBorders>
+            <w:shd w:fill="F6F8F7" w:color="auto" w:val="clear"/>
             <w:tcMar>
               <w:top w:type="dxa" w:w="80"/>
               <w:left w:type="dxa" w:w="120"/>
@@ -5217,7 +5335,6 @@
               <w:bottom w:val="single" w:color="D0D7D3" w:sz="4"/>
               <w:right w:val="single" w:color="D0D7D3" w:sz="4"/>
             </w:tcBorders>
-            <w:shd w:fill="F6F8F7" w:color="auto" w:val="clear"/>
             <w:tcMar>
               <w:top w:type="dxa" w:w="80"/>
               <w:left w:type="dxa" w:w="120"/>
@@ -5246,7 +5363,6 @@
               <w:bottom w:val="single" w:color="D0D7D3" w:sz="4"/>
               <w:right w:val="single" w:color="D0D7D3" w:sz="4"/>
             </w:tcBorders>
-            <w:shd w:fill="F6F8F7" w:color="auto" w:val="clear"/>
             <w:tcMar>
               <w:top w:type="dxa" w:w="80"/>
               <w:left w:type="dxa" w:w="120"/>
@@ -5277,6 +5393,7 @@
               <w:bottom w:val="single" w:color="D0D7D3" w:sz="4"/>
               <w:right w:val="single" w:color="D0D7D3" w:sz="4"/>
             </w:tcBorders>
+            <w:shd w:fill="F6F8F7" w:color="auto" w:val="clear"/>
             <w:tcMar>
               <w:top w:type="dxa" w:w="80"/>
               <w:left w:type="dxa" w:w="120"/>
@@ -5305,6 +5422,7 @@
               <w:bottom w:val="single" w:color="D0D7D3" w:sz="4"/>
               <w:right w:val="single" w:color="D0D7D3" w:sz="4"/>
             </w:tcBorders>
+            <w:shd w:fill="F6F8F7" w:color="auto" w:val="clear"/>
             <w:tcMar>
               <w:top w:type="dxa" w:w="80"/>
               <w:left w:type="dxa" w:w="120"/>
@@ -5335,7 +5453,6 @@
               <w:bottom w:val="single" w:color="D0D7D3" w:sz="4"/>
               <w:right w:val="single" w:color="D0D7D3" w:sz="4"/>
             </w:tcBorders>
-            <w:shd w:fill="F6F8F7" w:color="auto" w:val="clear"/>
             <w:tcMar>
               <w:top w:type="dxa" w:w="80"/>
               <w:left w:type="dxa" w:w="120"/>
@@ -5364,7 +5481,6 @@
               <w:bottom w:val="single" w:color="D0D7D3" w:sz="4"/>
               <w:right w:val="single" w:color="D0D7D3" w:sz="4"/>
             </w:tcBorders>
-            <w:shd w:fill="F6F8F7" w:color="auto" w:val="clear"/>
             <w:tcMar>
               <w:top w:type="dxa" w:w="80"/>
               <w:left w:type="dxa" w:w="120"/>
@@ -5395,6 +5511,7 @@
               <w:bottom w:val="single" w:color="D0D7D3" w:sz="4"/>
               <w:right w:val="single" w:color="D0D7D3" w:sz="4"/>
             </w:tcBorders>
+            <w:shd w:fill="F6F8F7" w:color="auto" w:val="clear"/>
             <w:tcMar>
               <w:top w:type="dxa" w:w="80"/>
               <w:left w:type="dxa" w:w="120"/>
@@ -5423,6 +5540,7 @@
               <w:bottom w:val="single" w:color="D0D7D3" w:sz="4"/>
               <w:right w:val="single" w:color="D0D7D3" w:sz="4"/>
             </w:tcBorders>
+            <w:shd w:fill="F6F8F7" w:color="auto" w:val="clear"/>
             <w:tcMar>
               <w:top w:type="dxa" w:w="80"/>
               <w:left w:type="dxa" w:w="120"/>
@@ -5453,7 +5571,6 @@
               <w:bottom w:val="single" w:color="D0D7D3" w:sz="4"/>
               <w:right w:val="single" w:color="D0D7D3" w:sz="4"/>
             </w:tcBorders>
-            <w:shd w:fill="F6F8F7" w:color="auto" w:val="clear"/>
             <w:tcMar>
               <w:top w:type="dxa" w:w="80"/>
               <w:left w:type="dxa" w:w="120"/>
@@ -5482,7 +5599,6 @@
               <w:bottom w:val="single" w:color="D0D7D3" w:sz="4"/>
               <w:right w:val="single" w:color="D0D7D3" w:sz="4"/>
             </w:tcBorders>
-            <w:shd w:fill="F6F8F7" w:color="auto" w:val="clear"/>
             <w:tcMar>
               <w:top w:type="dxa" w:w="80"/>
               <w:left w:type="dxa" w:w="120"/>
@@ -5513,6 +5629,7 @@
               <w:bottom w:val="single" w:color="D0D7D3" w:sz="4"/>
               <w:right w:val="single" w:color="D0D7D3" w:sz="4"/>
             </w:tcBorders>
+            <w:shd w:fill="F6F8F7" w:color="auto" w:val="clear"/>
             <w:tcMar>
               <w:top w:type="dxa" w:w="80"/>
               <w:left w:type="dxa" w:w="120"/>
@@ -5541,6 +5658,7 @@
               <w:bottom w:val="single" w:color="D0D7D3" w:sz="4"/>
               <w:right w:val="single" w:color="D0D7D3" w:sz="4"/>
             </w:tcBorders>
+            <w:shd w:fill="F6F8F7" w:color="auto" w:val="clear"/>
             <w:tcMar>
               <w:top w:type="dxa" w:w="80"/>
               <w:left w:type="dxa" w:w="120"/>
@@ -5571,7 +5689,6 @@
               <w:bottom w:val="single" w:color="D0D7D3" w:sz="4"/>
               <w:right w:val="single" w:color="D0D7D3" w:sz="4"/>
             </w:tcBorders>
-            <w:shd w:fill="F6F8F7" w:color="auto" w:val="clear"/>
             <w:tcMar>
               <w:top w:type="dxa" w:w="80"/>
               <w:left w:type="dxa" w:w="120"/>
@@ -5600,7 +5717,6 @@
               <w:bottom w:val="single" w:color="D0D7D3" w:sz="4"/>
               <w:right w:val="single" w:color="D0D7D3" w:sz="4"/>
             </w:tcBorders>
-            <w:shd w:fill="F6F8F7" w:color="auto" w:val="clear"/>
             <w:tcMar>
               <w:top w:type="dxa" w:w="80"/>
               <w:left w:type="dxa" w:w="120"/>
@@ -5631,6 +5747,7 @@
               <w:bottom w:val="single" w:color="D0D7D3" w:sz="4"/>
               <w:right w:val="single" w:color="D0D7D3" w:sz="4"/>
             </w:tcBorders>
+            <w:shd w:fill="F6F8F7" w:color="auto" w:val="clear"/>
             <w:tcMar>
               <w:top w:type="dxa" w:w="80"/>
               <w:left w:type="dxa" w:w="120"/>
@@ -5659,6 +5776,7 @@
               <w:bottom w:val="single" w:color="D0D7D3" w:sz="4"/>
               <w:right w:val="single" w:color="D0D7D3" w:sz="4"/>
             </w:tcBorders>
+            <w:shd w:fill="F6F8F7" w:color="auto" w:val="clear"/>
             <w:tcMar>
               <w:top w:type="dxa" w:w="80"/>
               <w:left w:type="dxa" w:w="120"/>
@@ -5689,7 +5807,6 @@
               <w:bottom w:val="single" w:color="D0D7D3" w:sz="4"/>
               <w:right w:val="single" w:color="D0D7D3" w:sz="4"/>
             </w:tcBorders>
-            <w:shd w:fill="F6F8F7" w:color="auto" w:val="clear"/>
             <w:tcMar>
               <w:top w:type="dxa" w:w="80"/>
               <w:left w:type="dxa" w:w="120"/>
@@ -5718,7 +5835,6 @@
               <w:bottom w:val="single" w:color="D0D7D3" w:sz="4"/>
               <w:right w:val="single" w:color="D0D7D3" w:sz="4"/>
             </w:tcBorders>
-            <w:shd w:fill="F6F8F7" w:color="auto" w:val="clear"/>
             <w:tcMar>
               <w:top w:type="dxa" w:w="80"/>
               <w:left w:type="dxa" w:w="120"/>
@@ -5749,6 +5865,7 @@
               <w:bottom w:val="single" w:color="D0D7D3" w:sz="4"/>
               <w:right w:val="single" w:color="D0D7D3" w:sz="4"/>
             </w:tcBorders>
+            <w:shd w:fill="F6F8F7" w:color="auto" w:val="clear"/>
             <w:tcMar>
               <w:top w:type="dxa" w:w="80"/>
               <w:left w:type="dxa" w:w="120"/>
@@ -5777,6 +5894,7 @@
               <w:bottom w:val="single" w:color="D0D7D3" w:sz="4"/>
               <w:right w:val="single" w:color="D0D7D3" w:sz="4"/>
             </w:tcBorders>
+            <w:shd w:fill="F6F8F7" w:color="auto" w:val="clear"/>
             <w:tcMar>
               <w:top w:type="dxa" w:w="80"/>
               <w:left w:type="dxa" w:w="120"/>
@@ -5807,7 +5925,6 @@
               <w:bottom w:val="single" w:color="D0D7D3" w:sz="4"/>
               <w:right w:val="single" w:color="D0D7D3" w:sz="4"/>
             </w:tcBorders>
-            <w:shd w:fill="F6F8F7" w:color="auto" w:val="clear"/>
             <w:tcMar>
               <w:top w:type="dxa" w:w="80"/>
               <w:left w:type="dxa" w:w="120"/>
@@ -5836,7 +5953,6 @@
               <w:bottom w:val="single" w:color="D0D7D3" w:sz="4"/>
               <w:right w:val="single" w:color="D0D7D3" w:sz="4"/>
             </w:tcBorders>
-            <w:shd w:fill="F6F8F7" w:color="auto" w:val="clear"/>
             <w:tcMar>
               <w:top w:type="dxa" w:w="80"/>
               <w:left w:type="dxa" w:w="120"/>
@@ -5867,6 +5983,7 @@
               <w:bottom w:val="single" w:color="D0D7D3" w:sz="4"/>
               <w:right w:val="single" w:color="D0D7D3" w:sz="4"/>
             </w:tcBorders>
+            <w:shd w:fill="F6F8F7" w:color="auto" w:val="clear"/>
             <w:tcMar>
               <w:top w:type="dxa" w:w="80"/>
               <w:left w:type="dxa" w:w="120"/>
@@ -5895,6 +6012,7 @@
               <w:bottom w:val="single" w:color="D0D7D3" w:sz="4"/>
               <w:right w:val="single" w:color="D0D7D3" w:sz="4"/>
             </w:tcBorders>
+            <w:shd w:fill="F6F8F7" w:color="auto" w:val="clear"/>
             <w:tcMar>
               <w:top w:type="dxa" w:w="80"/>
               <w:left w:type="dxa" w:w="120"/>
@@ -5925,7 +6043,6 @@
               <w:bottom w:val="single" w:color="D0D7D3" w:sz="4"/>
               <w:right w:val="single" w:color="D0D7D3" w:sz="4"/>
             </w:tcBorders>
-            <w:shd w:fill="F6F8F7" w:color="auto" w:val="clear"/>
             <w:tcMar>
               <w:top w:type="dxa" w:w="80"/>
               <w:left w:type="dxa" w:w="120"/>
@@ -5954,7 +6071,6 @@
               <w:bottom w:val="single" w:color="D0D7D3" w:sz="4"/>
               <w:right w:val="single" w:color="D0D7D3" w:sz="4"/>
             </w:tcBorders>
-            <w:shd w:fill="F6F8F7" w:color="auto" w:val="clear"/>
             <w:tcMar>
               <w:top w:type="dxa" w:w="80"/>
               <w:left w:type="dxa" w:w="120"/>
@@ -5985,6 +6101,7 @@
               <w:bottom w:val="single" w:color="D0D7D3" w:sz="4"/>
               <w:right w:val="single" w:color="D0D7D3" w:sz="4"/>
             </w:tcBorders>
+            <w:shd w:fill="F6F8F7" w:color="auto" w:val="clear"/>
             <w:tcMar>
               <w:top w:type="dxa" w:w="80"/>
               <w:left w:type="dxa" w:w="120"/>
@@ -6013,6 +6130,7 @@
               <w:bottom w:val="single" w:color="D0D7D3" w:sz="4"/>
               <w:right w:val="single" w:color="D0D7D3" w:sz="4"/>
             </w:tcBorders>
+            <w:shd w:fill="F6F8F7" w:color="auto" w:val="clear"/>
             <w:tcMar>
               <w:top w:type="dxa" w:w="80"/>
               <w:left w:type="dxa" w:w="120"/>
@@ -6043,7 +6161,6 @@
               <w:bottom w:val="single" w:color="D0D7D3" w:sz="4"/>
               <w:right w:val="single" w:color="D0D7D3" w:sz="4"/>
             </w:tcBorders>
-            <w:shd w:fill="F6F8F7" w:color="auto" w:val="clear"/>
             <w:tcMar>
               <w:top w:type="dxa" w:w="80"/>
               <w:left w:type="dxa" w:w="120"/>
@@ -6072,7 +6189,6 @@
               <w:bottom w:val="single" w:color="D0D7D3" w:sz="4"/>
               <w:right w:val="single" w:color="D0D7D3" w:sz="4"/>
             </w:tcBorders>
-            <w:shd w:fill="F6F8F7" w:color="auto" w:val="clear"/>
             <w:tcMar>
               <w:top w:type="dxa" w:w="80"/>
               <w:left w:type="dxa" w:w="120"/>
@@ -6103,6 +6219,7 @@
               <w:bottom w:val="single" w:color="D0D7D3" w:sz="4"/>
               <w:right w:val="single" w:color="D0D7D3" w:sz="4"/>
             </w:tcBorders>
+            <w:shd w:fill="F6F8F7" w:color="auto" w:val="clear"/>
             <w:tcMar>
               <w:top w:type="dxa" w:w="80"/>
               <w:left w:type="dxa" w:w="120"/>
@@ -6131,6 +6248,7 @@
               <w:bottom w:val="single" w:color="D0D7D3" w:sz="4"/>
               <w:right w:val="single" w:color="D0D7D3" w:sz="4"/>
             </w:tcBorders>
+            <w:shd w:fill="F6F8F7" w:color="auto" w:val="clear"/>
             <w:tcMar>
               <w:top w:type="dxa" w:w="80"/>
               <w:left w:type="dxa" w:w="120"/>
@@ -6161,7 +6279,6 @@
               <w:bottom w:val="single" w:color="D0D7D3" w:sz="4"/>
               <w:right w:val="single" w:color="D0D7D3" w:sz="4"/>
             </w:tcBorders>
-            <w:shd w:fill="F6F8F7" w:color="auto" w:val="clear"/>
             <w:tcMar>
               <w:top w:type="dxa" w:w="80"/>
               <w:left w:type="dxa" w:w="120"/>
@@ -6190,7 +6307,6 @@
               <w:bottom w:val="single" w:color="D0D7D3" w:sz="4"/>
               <w:right w:val="single" w:color="D0D7D3" w:sz="4"/>
             </w:tcBorders>
-            <w:shd w:fill="F6F8F7" w:color="auto" w:val="clear"/>
             <w:tcMar>
               <w:top w:type="dxa" w:w="80"/>
               <w:left w:type="dxa" w:w="120"/>
@@ -6221,6 +6337,7 @@
               <w:bottom w:val="single" w:color="D0D7D3" w:sz="4"/>
               <w:right w:val="single" w:color="D0D7D3" w:sz="4"/>
             </w:tcBorders>
+            <w:shd w:fill="F6F8F7" w:color="auto" w:val="clear"/>
             <w:tcMar>
               <w:top w:type="dxa" w:w="80"/>
               <w:left w:type="dxa" w:w="120"/>
@@ -6249,6 +6366,7 @@
               <w:bottom w:val="single" w:color="D0D7D3" w:sz="4"/>
               <w:right w:val="single" w:color="D0D7D3" w:sz="4"/>
             </w:tcBorders>
+            <w:shd w:fill="F6F8F7" w:color="auto" w:val="clear"/>
             <w:tcMar>
               <w:top w:type="dxa" w:w="80"/>
               <w:left w:type="dxa" w:w="120"/>
@@ -6279,7 +6397,6 @@
               <w:bottom w:val="single" w:color="D0D7D3" w:sz="4"/>
               <w:right w:val="single" w:color="D0D7D3" w:sz="4"/>
             </w:tcBorders>
-            <w:shd w:fill="F6F8F7" w:color="auto" w:val="clear"/>
             <w:tcMar>
               <w:top w:type="dxa" w:w="80"/>
               <w:left w:type="dxa" w:w="120"/>
@@ -6308,7 +6425,6 @@
               <w:bottom w:val="single" w:color="D0D7D3" w:sz="4"/>
               <w:right w:val="single" w:color="D0D7D3" w:sz="4"/>
             </w:tcBorders>
-            <w:shd w:fill="F6F8F7" w:color="auto" w:val="clear"/>
             <w:tcMar>
               <w:top w:type="dxa" w:w="80"/>
               <w:left w:type="dxa" w:w="120"/>
@@ -6339,6 +6455,7 @@
               <w:bottom w:val="single" w:color="D0D7D3" w:sz="4"/>
               <w:right w:val="single" w:color="D0D7D3" w:sz="4"/>
             </w:tcBorders>
+            <w:shd w:fill="F6F8F7" w:color="auto" w:val="clear"/>
             <w:tcMar>
               <w:top w:type="dxa" w:w="80"/>
               <w:left w:type="dxa" w:w="120"/>
@@ -6367,6 +6484,7 @@
               <w:bottom w:val="single" w:color="D0D7D3" w:sz="4"/>
               <w:right w:val="single" w:color="D0D7D3" w:sz="4"/>
             </w:tcBorders>
+            <w:shd w:fill="F6F8F7" w:color="auto" w:val="clear"/>
             <w:tcMar>
               <w:top w:type="dxa" w:w="80"/>
               <w:left w:type="dxa" w:w="120"/>
@@ -6397,7 +6515,6 @@
               <w:bottom w:val="single" w:color="D0D7D3" w:sz="4"/>
               <w:right w:val="single" w:color="D0D7D3" w:sz="4"/>
             </w:tcBorders>
-            <w:shd w:fill="F6F8F7" w:color="auto" w:val="clear"/>
             <w:tcMar>
               <w:top w:type="dxa" w:w="80"/>
               <w:left w:type="dxa" w:w="120"/>
@@ -6426,7 +6543,6 @@
               <w:bottom w:val="single" w:color="D0D7D3" w:sz="4"/>
               <w:right w:val="single" w:color="D0D7D3" w:sz="4"/>
             </w:tcBorders>
-            <w:shd w:fill="F6F8F7" w:color="auto" w:val="clear"/>
             <w:tcMar>
               <w:top w:type="dxa" w:w="80"/>
               <w:left w:type="dxa" w:w="120"/>
@@ -6457,6 +6573,7 @@
               <w:bottom w:val="single" w:color="D0D7D3" w:sz="4"/>
               <w:right w:val="single" w:color="D0D7D3" w:sz="4"/>
             </w:tcBorders>
+            <w:shd w:fill="F6F8F7" w:color="auto" w:val="clear"/>
             <w:tcMar>
               <w:top w:type="dxa" w:w="80"/>
               <w:left w:type="dxa" w:w="120"/>
@@ -6485,6 +6602,7 @@
               <w:bottom w:val="single" w:color="D0D7D3" w:sz="4"/>
               <w:right w:val="single" w:color="D0D7D3" w:sz="4"/>
             </w:tcBorders>
+            <w:shd w:fill="F6F8F7" w:color="auto" w:val="clear"/>
             <w:tcMar>
               <w:top w:type="dxa" w:w="80"/>
               <w:left w:type="dxa" w:w="120"/>
@@ -6515,7 +6633,6 @@
               <w:bottom w:val="single" w:color="D0D7D3" w:sz="4"/>
               <w:right w:val="single" w:color="D0D7D3" w:sz="4"/>
             </w:tcBorders>
-            <w:shd w:fill="F6F8F7" w:color="auto" w:val="clear"/>
             <w:tcMar>
               <w:top w:type="dxa" w:w="80"/>
               <w:left w:type="dxa" w:w="120"/>
@@ -6544,7 +6661,6 @@
               <w:bottom w:val="single" w:color="D0D7D3" w:sz="4"/>
               <w:right w:val="single" w:color="D0D7D3" w:sz="4"/>
             </w:tcBorders>
-            <w:shd w:fill="F6F8F7" w:color="auto" w:val="clear"/>
             <w:tcMar>
               <w:top w:type="dxa" w:w="80"/>
               <w:left w:type="dxa" w:w="120"/>
@@ -6575,6 +6691,7 @@
               <w:bottom w:val="single" w:color="D0D7D3" w:sz="4"/>
               <w:right w:val="single" w:color="D0D7D3" w:sz="4"/>
             </w:tcBorders>
+            <w:shd w:fill="F6F8F7" w:color="auto" w:val="clear"/>
             <w:tcMar>
               <w:top w:type="dxa" w:w="80"/>
               <w:left w:type="dxa" w:w="120"/>
@@ -6603,6 +6720,7 @@
               <w:bottom w:val="single" w:color="D0D7D3" w:sz="4"/>
               <w:right w:val="single" w:color="D0D7D3" w:sz="4"/>
             </w:tcBorders>
+            <w:shd w:fill="F6F8F7" w:color="auto" w:val="clear"/>
             <w:tcMar>
               <w:top w:type="dxa" w:w="80"/>
               <w:left w:type="dxa" w:w="120"/>
@@ -6633,7 +6751,6 @@
               <w:bottom w:val="single" w:color="D0D7D3" w:sz="4"/>
               <w:right w:val="single" w:color="D0D7D3" w:sz="4"/>
             </w:tcBorders>
-            <w:shd w:fill="F6F8F7" w:color="auto" w:val="clear"/>
             <w:tcMar>
               <w:top w:type="dxa" w:w="80"/>
               <w:left w:type="dxa" w:w="120"/>
@@ -6662,7 +6779,6 @@
               <w:bottom w:val="single" w:color="D0D7D3" w:sz="4"/>
               <w:right w:val="single" w:color="D0D7D3" w:sz="4"/>
             </w:tcBorders>
-            <w:shd w:fill="F6F8F7" w:color="auto" w:val="clear"/>
             <w:tcMar>
               <w:top w:type="dxa" w:w="80"/>
               <w:left w:type="dxa" w:w="120"/>
@@ -6693,6 +6809,7 @@
               <w:bottom w:val="single" w:color="D0D7D3" w:sz="4"/>
               <w:right w:val="single" w:color="D0D7D3" w:sz="4"/>
             </w:tcBorders>
+            <w:shd w:fill="F6F8F7" w:color="auto" w:val="clear"/>
             <w:tcMar>
               <w:top w:type="dxa" w:w="80"/>
               <w:left w:type="dxa" w:w="120"/>
@@ -6721,6 +6838,7 @@
               <w:bottom w:val="single" w:color="D0D7D3" w:sz="4"/>
               <w:right w:val="single" w:color="D0D7D3" w:sz="4"/>
             </w:tcBorders>
+            <w:shd w:fill="F6F8F7" w:color="auto" w:val="clear"/>
             <w:tcMar>
               <w:top w:type="dxa" w:w="80"/>
               <w:left w:type="dxa" w:w="120"/>
@@ -6751,7 +6869,6 @@
               <w:bottom w:val="single" w:color="D0D7D3" w:sz="4"/>
               <w:right w:val="single" w:color="D0D7D3" w:sz="4"/>
             </w:tcBorders>
-            <w:shd w:fill="F6F8F7" w:color="auto" w:val="clear"/>
             <w:tcMar>
               <w:top w:type="dxa" w:w="80"/>
               <w:left w:type="dxa" w:w="120"/>
@@ -6780,7 +6897,6 @@
               <w:bottom w:val="single" w:color="D0D7D3" w:sz="4"/>
               <w:right w:val="single" w:color="D0D7D3" w:sz="4"/>
             </w:tcBorders>
-            <w:shd w:fill="F6F8F7" w:color="auto" w:val="clear"/>
             <w:tcMar>
               <w:top w:type="dxa" w:w="80"/>
               <w:left w:type="dxa" w:w="120"/>
@@ -6811,6 +6927,7 @@
               <w:bottom w:val="single" w:color="D0D7D3" w:sz="4"/>
               <w:right w:val="single" w:color="D0D7D3" w:sz="4"/>
             </w:tcBorders>
+            <w:shd w:fill="F6F8F7" w:color="auto" w:val="clear"/>
             <w:tcMar>
               <w:top w:type="dxa" w:w="80"/>
               <w:left w:type="dxa" w:w="120"/>
@@ -6839,6 +6956,7 @@
               <w:bottom w:val="single" w:color="D0D7D3" w:sz="4"/>
               <w:right w:val="single" w:color="D0D7D3" w:sz="4"/>
             </w:tcBorders>
+            <w:shd w:fill="F6F8F7" w:color="auto" w:val="clear"/>
             <w:tcMar>
               <w:top w:type="dxa" w:w="80"/>
               <w:left w:type="dxa" w:w="120"/>
@@ -6869,7 +6987,6 @@
               <w:bottom w:val="single" w:color="D0D7D3" w:sz="4"/>
               <w:right w:val="single" w:color="D0D7D3" w:sz="4"/>
             </w:tcBorders>
-            <w:shd w:fill="F6F8F7" w:color="auto" w:val="clear"/>
             <w:tcMar>
               <w:top w:type="dxa" w:w="80"/>
               <w:left w:type="dxa" w:w="120"/>
@@ -6898,7 +7015,6 @@
               <w:bottom w:val="single" w:color="D0D7D3" w:sz="4"/>
               <w:right w:val="single" w:color="D0D7D3" w:sz="4"/>
             </w:tcBorders>
-            <w:shd w:fill="F6F8F7" w:color="auto" w:val="clear"/>
             <w:tcMar>
               <w:top w:type="dxa" w:w="80"/>
               <w:left w:type="dxa" w:w="120"/>
@@ -6929,6 +7045,7 @@
               <w:bottom w:val="single" w:color="D0D7D3" w:sz="4"/>
               <w:right w:val="single" w:color="D0D7D3" w:sz="4"/>
             </w:tcBorders>
+            <w:shd w:fill="F6F8F7" w:color="auto" w:val="clear"/>
             <w:tcMar>
               <w:top w:type="dxa" w:w="80"/>
               <w:left w:type="dxa" w:w="120"/>
@@ -6957,6 +7074,7 @@
               <w:bottom w:val="single" w:color="D0D7D3" w:sz="4"/>
               <w:right w:val="single" w:color="D0D7D3" w:sz="4"/>
             </w:tcBorders>
+            <w:shd w:fill="F6F8F7" w:color="auto" w:val="clear"/>
             <w:tcMar>
               <w:top w:type="dxa" w:w="80"/>
               <w:left w:type="dxa" w:w="120"/>
@@ -6987,7 +7105,6 @@
               <w:bottom w:val="single" w:color="D0D7D3" w:sz="4"/>
               <w:right w:val="single" w:color="D0D7D3" w:sz="4"/>
             </w:tcBorders>
-            <w:shd w:fill="F6F8F7" w:color="auto" w:val="clear"/>
             <w:tcMar>
               <w:top w:type="dxa" w:w="80"/>
               <w:left w:type="dxa" w:w="120"/>
@@ -7016,7 +7133,6 @@
               <w:bottom w:val="single" w:color="D0D7D3" w:sz="4"/>
               <w:right w:val="single" w:color="D0D7D3" w:sz="4"/>
             </w:tcBorders>
-            <w:shd w:fill="F6F8F7" w:color="auto" w:val="clear"/>
             <w:tcMar>
               <w:top w:type="dxa" w:w="80"/>
               <w:left w:type="dxa" w:w="120"/>
@@ -7047,6 +7163,7 @@
               <w:bottom w:val="single" w:color="D0D7D3" w:sz="4"/>
               <w:right w:val="single" w:color="D0D7D3" w:sz="4"/>
             </w:tcBorders>
+            <w:shd w:fill="F6F8F7" w:color="auto" w:val="clear"/>
             <w:tcMar>
               <w:top w:type="dxa" w:w="80"/>
               <w:left w:type="dxa" w:w="120"/>
@@ -7075,6 +7192,7 @@
               <w:bottom w:val="single" w:color="D0D7D3" w:sz="4"/>
               <w:right w:val="single" w:color="D0D7D3" w:sz="4"/>
             </w:tcBorders>
+            <w:shd w:fill="F6F8F7" w:color="auto" w:val="clear"/>
             <w:tcMar>
               <w:top w:type="dxa" w:w="80"/>
               <w:left w:type="dxa" w:w="120"/>
@@ -7105,7 +7223,6 @@
               <w:bottom w:val="single" w:color="D0D7D3" w:sz="4"/>
               <w:right w:val="single" w:color="D0D7D3" w:sz="4"/>
             </w:tcBorders>
-            <w:shd w:fill="F6F8F7" w:color="auto" w:val="clear"/>
             <w:tcMar>
               <w:top w:type="dxa" w:w="80"/>
               <w:left w:type="dxa" w:w="120"/>
@@ -7134,7 +7251,6 @@
               <w:bottom w:val="single" w:color="D0D7D3" w:sz="4"/>
               <w:right w:val="single" w:color="D0D7D3" w:sz="4"/>
             </w:tcBorders>
-            <w:shd w:fill="F6F8F7" w:color="auto" w:val="clear"/>
             <w:tcMar>
               <w:top w:type="dxa" w:w="80"/>
               <w:left w:type="dxa" w:w="120"/>
@@ -7165,6 +7281,7 @@
               <w:bottom w:val="single" w:color="D0D7D3" w:sz="4"/>
               <w:right w:val="single" w:color="D0D7D3" w:sz="4"/>
             </w:tcBorders>
+            <w:shd w:fill="F6F8F7" w:color="auto" w:val="clear"/>
             <w:tcMar>
               <w:top w:type="dxa" w:w="80"/>
               <w:left w:type="dxa" w:w="120"/>
@@ -7193,6 +7310,7 @@
               <w:bottom w:val="single" w:color="D0D7D3" w:sz="4"/>
               <w:right w:val="single" w:color="D0D7D3" w:sz="4"/>
             </w:tcBorders>
+            <w:shd w:fill="F6F8F7" w:color="auto" w:val="clear"/>
             <w:tcMar>
               <w:top w:type="dxa" w:w="80"/>
               <w:left w:type="dxa" w:w="120"/>
@@ -7223,7 +7341,6 @@
               <w:bottom w:val="single" w:color="D0D7D3" w:sz="4"/>
               <w:right w:val="single" w:color="D0D7D3" w:sz="4"/>
             </w:tcBorders>
-            <w:shd w:fill="F6F8F7" w:color="auto" w:val="clear"/>
             <w:tcMar>
               <w:top w:type="dxa" w:w="80"/>
               <w:left w:type="dxa" w:w="120"/>
@@ -7252,7 +7369,6 @@
               <w:bottom w:val="single" w:color="D0D7D3" w:sz="4"/>
               <w:right w:val="single" w:color="D0D7D3" w:sz="4"/>
             </w:tcBorders>
-            <w:shd w:fill="F6F8F7" w:color="auto" w:val="clear"/>
             <w:tcMar>
               <w:top w:type="dxa" w:w="80"/>
               <w:left w:type="dxa" w:w="120"/>

</xml_diff>

<commit_message>
Paid into the bank: Paystack payouts matched to payments, with charges and anything missing
</commit_message>
<xml_diff>
--- a/docs/product/WardPay - what it does.docx
+++ b/docs/product/WardPay - what it does.docx
@@ -264,6 +264,65 @@
                 <w:sz w:val="20"/>
                 <w:szCs w:val="20"/>
               </w:rPr>
+              <w:t xml:space="preserve">See what Paystack paid into your bank each day, the charges taken, and any payment it hasn’t paid out</w:t>
+            </w:r>
+          </w:p>
+        </w:tc>
+        <w:tc>
+          <w:tcPr>
+            <w:tcW w:type="dxa" w:w="4238"/>
+            <w:tcBorders>
+              <w:top w:val="single" w:color="D0D7D3" w:sz="4"/>
+              <w:left w:val="single" w:color="D0D7D3" w:sz="4"/>
+              <w:bottom w:val="single" w:color="D0D7D3" w:sz="4"/>
+              <w:right w:val="single" w:color="D0D7D3" w:sz="4"/>
+            </w:tcBorders>
+            <w:shd w:fill="F6F8F7" w:color="auto" w:val="clear"/>
+            <w:tcMar>
+              <w:top w:type="dxa" w:w="80"/>
+              <w:left w:type="dxa" w:w="120"/>
+              <w:bottom w:type="dxa" w:w="80"/>
+              <w:right w:type="dxa" w:w="120"/>
+            </w:tcMar>
+          </w:tcPr>
+          <w:p>
+            <w:r>
+              <w:rPr>
+                <w:b w:val="false"/>
+                <w:bCs w:val="false"/>
+                <w:sz w:val="20"/>
+                <w:szCs w:val="20"/>
+              </w:rPr>
+              <w:t xml:space="preserve">Know the money parents paid actually reached the bank, without reading statements line by line</w:t>
+            </w:r>
+          </w:p>
+        </w:tc>
+      </w:tr>
+      <w:tr>
+        <w:tc>
+          <w:tcPr>
+            <w:tcW w:type="dxa" w:w="5400"/>
+            <w:tcBorders>
+              <w:top w:val="single" w:color="D0D7D3" w:sz="4"/>
+              <w:left w:val="single" w:color="D0D7D3" w:sz="4"/>
+              <w:bottom w:val="single" w:color="D0D7D3" w:sz="4"/>
+              <w:right w:val="single" w:color="D0D7D3" w:sz="4"/>
+            </w:tcBorders>
+            <w:tcMar>
+              <w:top w:type="dxa" w:w="80"/>
+              <w:left w:type="dxa" w:w="120"/>
+              <w:bottom w:type="dxa" w:w="80"/>
+              <w:right w:type="dxa" w:w="120"/>
+            </w:tcMar>
+          </w:tcPr>
+          <w:p>
+            <w:r>
+              <w:rPr>
+                <w:b w:val="false"/>
+                <w:bCs w:val="false"/>
+                <w:sz w:val="20"/>
+                <w:szCs w:val="20"/>
+              </w:rPr>
               <w:t xml:space="preserve">Close a term once its figures are reported: nothing can be backdated into it, and only you can re-open it, with a reason</w:t>
             </w:r>
           </w:p>
@@ -277,7 +336,6 @@
               <w:bottom w:val="single" w:color="D0D7D3" w:sz="4"/>
               <w:right w:val="single" w:color="D0D7D3" w:sz="4"/>
             </w:tcBorders>
-            <w:shd w:fill="F6F8F7" w:color="auto" w:val="clear"/>
             <w:tcMar>
               <w:top w:type="dxa" w:w="80"/>
               <w:left w:type="dxa" w:w="120"/>
@@ -308,6 +366,7 @@
               <w:bottom w:val="single" w:color="D0D7D3" w:sz="4"/>
               <w:right w:val="single" w:color="D0D7D3" w:sz="4"/>
             </w:tcBorders>
+            <w:shd w:fill="F6F8F7" w:color="auto" w:val="clear"/>
             <w:tcMar>
               <w:top w:type="dxa" w:w="80"/>
               <w:left w:type="dxa" w:w="120"/>
@@ -336,6 +395,7 @@
               <w:bottom w:val="single" w:color="D0D7D3" w:sz="4"/>
               <w:right w:val="single" w:color="D0D7D3" w:sz="4"/>
             </w:tcBorders>
+            <w:shd w:fill="F6F8F7" w:color="auto" w:val="clear"/>
             <w:tcMar>
               <w:top w:type="dxa" w:w="80"/>
               <w:left w:type="dxa" w:w="120"/>
@@ -366,7 +426,6 @@
               <w:bottom w:val="single" w:color="D0D7D3" w:sz="4"/>
               <w:right w:val="single" w:color="D0D7D3" w:sz="4"/>
             </w:tcBorders>
-            <w:shd w:fill="F6F8F7" w:color="auto" w:val="clear"/>
             <w:tcMar>
               <w:top w:type="dxa" w:w="80"/>
               <w:left w:type="dxa" w:w="120"/>
@@ -395,7 +454,6 @@
               <w:bottom w:val="single" w:color="D0D7D3" w:sz="4"/>
               <w:right w:val="single" w:color="D0D7D3" w:sz="4"/>
             </w:tcBorders>
-            <w:shd w:fill="F6F8F7" w:color="auto" w:val="clear"/>
             <w:tcMar>
               <w:top w:type="dxa" w:w="80"/>
               <w:left w:type="dxa" w:w="120"/>
@@ -426,6 +484,7 @@
               <w:bottom w:val="single" w:color="D0D7D3" w:sz="4"/>
               <w:right w:val="single" w:color="D0D7D3" w:sz="4"/>
             </w:tcBorders>
+            <w:shd w:fill="F6F8F7" w:color="auto" w:val="clear"/>
             <w:tcMar>
               <w:top w:type="dxa" w:w="80"/>
               <w:left w:type="dxa" w:w="120"/>
@@ -454,6 +513,7 @@
               <w:bottom w:val="single" w:color="D0D7D3" w:sz="4"/>
               <w:right w:val="single" w:color="D0D7D3" w:sz="4"/>
             </w:tcBorders>
+            <w:shd w:fill="F6F8F7" w:color="auto" w:val="clear"/>
             <w:tcMar>
               <w:top w:type="dxa" w:w="80"/>
               <w:left w:type="dxa" w:w="120"/>
@@ -484,7 +544,6 @@
               <w:bottom w:val="single" w:color="D0D7D3" w:sz="4"/>
               <w:right w:val="single" w:color="D0D7D3" w:sz="4"/>
             </w:tcBorders>
-            <w:shd w:fill="F6F8F7" w:color="auto" w:val="clear"/>
             <w:tcMar>
               <w:top w:type="dxa" w:w="80"/>
               <w:left w:type="dxa" w:w="120"/>
@@ -513,7 +572,6 @@
               <w:bottom w:val="single" w:color="D0D7D3" w:sz="4"/>
               <w:right w:val="single" w:color="D0D7D3" w:sz="4"/>
             </w:tcBorders>
-            <w:shd w:fill="F6F8F7" w:color="auto" w:val="clear"/>
             <w:tcMar>
               <w:top w:type="dxa" w:w="80"/>
               <w:left w:type="dxa" w:w="120"/>
@@ -544,6 +602,7 @@
               <w:bottom w:val="single" w:color="D0D7D3" w:sz="4"/>
               <w:right w:val="single" w:color="D0D7D3" w:sz="4"/>
             </w:tcBorders>
+            <w:shd w:fill="F6F8F7" w:color="auto" w:val="clear"/>
             <w:tcMar>
               <w:top w:type="dxa" w:w="80"/>
               <w:left w:type="dxa" w:w="120"/>
@@ -572,6 +631,7 @@
               <w:bottom w:val="single" w:color="D0D7D3" w:sz="4"/>
               <w:right w:val="single" w:color="D0D7D3" w:sz="4"/>
             </w:tcBorders>
+            <w:shd w:fill="F6F8F7" w:color="auto" w:val="clear"/>
             <w:tcMar>
               <w:top w:type="dxa" w:w="80"/>
               <w:left w:type="dxa" w:w="120"/>
@@ -602,7 +662,6 @@
               <w:bottom w:val="single" w:color="D0D7D3" w:sz="4"/>
               <w:right w:val="single" w:color="D0D7D3" w:sz="4"/>
             </w:tcBorders>
-            <w:shd w:fill="F6F8F7" w:color="auto" w:val="clear"/>
             <w:tcMar>
               <w:top w:type="dxa" w:w="80"/>
               <w:left w:type="dxa" w:w="120"/>
@@ -631,7 +690,6 @@
               <w:bottom w:val="single" w:color="D0D7D3" w:sz="4"/>
               <w:right w:val="single" w:color="D0D7D3" w:sz="4"/>
             </w:tcBorders>
-            <w:shd w:fill="F6F8F7" w:color="auto" w:val="clear"/>
             <w:tcMar>
               <w:top w:type="dxa" w:w="80"/>
               <w:left w:type="dxa" w:w="120"/>
@@ -662,6 +720,7 @@
               <w:bottom w:val="single" w:color="D0D7D3" w:sz="4"/>
               <w:right w:val="single" w:color="D0D7D3" w:sz="4"/>
             </w:tcBorders>
+            <w:shd w:fill="F6F8F7" w:color="auto" w:val="clear"/>
             <w:tcMar>
               <w:top w:type="dxa" w:w="80"/>
               <w:left w:type="dxa" w:w="120"/>
@@ -690,6 +749,7 @@
               <w:bottom w:val="single" w:color="D0D7D3" w:sz="4"/>
               <w:right w:val="single" w:color="D0D7D3" w:sz="4"/>
             </w:tcBorders>
+            <w:shd w:fill="F6F8F7" w:color="auto" w:val="clear"/>
             <w:tcMar>
               <w:top w:type="dxa" w:w="80"/>
               <w:left w:type="dxa" w:w="120"/>
@@ -720,7 +780,6 @@
               <w:bottom w:val="single" w:color="D0D7D3" w:sz="4"/>
               <w:right w:val="single" w:color="D0D7D3" w:sz="4"/>
             </w:tcBorders>
-            <w:shd w:fill="F6F8F7" w:color="auto" w:val="clear"/>
             <w:tcMar>
               <w:top w:type="dxa" w:w="80"/>
               <w:left w:type="dxa" w:w="120"/>
@@ -749,7 +808,6 @@
               <w:bottom w:val="single" w:color="D0D7D3" w:sz="4"/>
               <w:right w:val="single" w:color="D0D7D3" w:sz="4"/>
             </w:tcBorders>
-            <w:shd w:fill="F6F8F7" w:color="auto" w:val="clear"/>
             <w:tcMar>
               <w:top w:type="dxa" w:w="80"/>
               <w:left w:type="dxa" w:w="120"/>
@@ -780,6 +838,7 @@
               <w:bottom w:val="single" w:color="D0D7D3" w:sz="4"/>
               <w:right w:val="single" w:color="D0D7D3" w:sz="4"/>
             </w:tcBorders>
+            <w:shd w:fill="F6F8F7" w:color="auto" w:val="clear"/>
             <w:tcMar>
               <w:top w:type="dxa" w:w="80"/>
               <w:left w:type="dxa" w:w="120"/>
@@ -808,6 +867,7 @@
               <w:bottom w:val="single" w:color="D0D7D3" w:sz="4"/>
               <w:right w:val="single" w:color="D0D7D3" w:sz="4"/>
             </w:tcBorders>
+            <w:shd w:fill="F6F8F7" w:color="auto" w:val="clear"/>
             <w:tcMar>
               <w:top w:type="dxa" w:w="80"/>
               <w:left w:type="dxa" w:w="120"/>
@@ -4670,6 +4730,66 @@
                 <w:sz w:val="20"/>
                 <w:szCs w:val="20"/>
               </w:rPr>
+              <w:t xml:space="preserve">Paid into the bank: Paystack payouts matched to payments, with charges and anything missing</w:t>
+            </w:r>
+          </w:p>
+        </w:tc>
+      </w:tr>
+      <w:tr>
+        <w:tc>
+          <w:tcPr>
+            <w:tcW w:type="dxa" w:w="1800"/>
+            <w:tcBorders>
+              <w:top w:val="single" w:color="D0D7D3" w:sz="4"/>
+              <w:left w:val="single" w:color="D0D7D3" w:sz="4"/>
+              <w:bottom w:val="single" w:color="D0D7D3" w:sz="4"/>
+              <w:right w:val="single" w:color="D0D7D3" w:sz="4"/>
+            </w:tcBorders>
+            <w:shd w:fill="F6F8F7" w:color="auto" w:val="clear"/>
+            <w:tcMar>
+              <w:top w:type="dxa" w:w="80"/>
+              <w:left w:type="dxa" w:w="120"/>
+              <w:bottom w:type="dxa" w:w="80"/>
+              <w:right w:type="dxa" w:w="120"/>
+            </w:tcMar>
+          </w:tcPr>
+          <w:p>
+            <w:r>
+              <w:rPr>
+                <w:b w:val="false"/>
+                <w:bCs w:val="false"/>
+                <w:sz w:val="20"/>
+                <w:szCs w:val="20"/>
+              </w:rPr>
+              <w:t xml:space="preserve">24 Oct 2026</w:t>
+            </w:r>
+          </w:p>
+        </w:tc>
+        <w:tc>
+          <w:tcPr>
+            <w:tcW w:type="dxa" w:w="7838"/>
+            <w:tcBorders>
+              <w:top w:val="single" w:color="D0D7D3" w:sz="4"/>
+              <w:left w:val="single" w:color="D0D7D3" w:sz="4"/>
+              <w:bottom w:val="single" w:color="D0D7D3" w:sz="4"/>
+              <w:right w:val="single" w:color="D0D7D3" w:sz="4"/>
+            </w:tcBorders>
+            <w:shd w:fill="F6F8F7" w:color="auto" w:val="clear"/>
+            <w:tcMar>
+              <w:top w:type="dxa" w:w="80"/>
+              <w:left w:type="dxa" w:w="120"/>
+              <w:bottom w:type="dxa" w:w="80"/>
+              <w:right w:type="dxa" w:w="120"/>
+            </w:tcMar>
+          </w:tcPr>
+          <w:p>
+            <w:r>
+              <w:rPr>
+                <w:b w:val="false"/>
+                <w:bCs w:val="false"/>
+                <w:sz w:val="20"/>
+                <w:szCs w:val="20"/>
+              </w:rPr>
               <w:t xml:space="preserve">Closing a term: nothing can be backdated into reported figures; only the proprietor re-opens</w:t>
             </w:r>
           </w:p>
@@ -4685,7 +4805,6 @@
               <w:bottom w:val="single" w:color="D0D7D3" w:sz="4"/>
               <w:right w:val="single" w:color="D0D7D3" w:sz="4"/>
             </w:tcBorders>
-            <w:shd w:fill="F6F8F7" w:color="auto" w:val="clear"/>
             <w:tcMar>
               <w:top w:type="dxa" w:w="80"/>
               <w:left w:type="dxa" w:w="120"/>
@@ -4714,7 +4833,6 @@
               <w:bottom w:val="single" w:color="D0D7D3" w:sz="4"/>
               <w:right w:val="single" w:color="D0D7D3" w:sz="4"/>
             </w:tcBorders>
-            <w:shd w:fill="F6F8F7" w:color="auto" w:val="clear"/>
             <w:tcMar>
               <w:top w:type="dxa" w:w="80"/>
               <w:left w:type="dxa" w:w="120"/>
@@ -4745,6 +4863,7 @@
               <w:bottom w:val="single" w:color="D0D7D3" w:sz="4"/>
               <w:right w:val="single" w:color="D0D7D3" w:sz="4"/>
             </w:tcBorders>
+            <w:shd w:fill="F6F8F7" w:color="auto" w:val="clear"/>
             <w:tcMar>
               <w:top w:type="dxa" w:w="80"/>
               <w:left w:type="dxa" w:w="120"/>
@@ -4773,6 +4892,7 @@
               <w:bottom w:val="single" w:color="D0D7D3" w:sz="4"/>
               <w:right w:val="single" w:color="D0D7D3" w:sz="4"/>
             </w:tcBorders>
+            <w:shd w:fill="F6F8F7" w:color="auto" w:val="clear"/>
             <w:tcMar>
               <w:top w:type="dxa" w:w="80"/>
               <w:left w:type="dxa" w:w="120"/>
@@ -4803,7 +4923,6 @@
               <w:bottom w:val="single" w:color="D0D7D3" w:sz="4"/>
               <w:right w:val="single" w:color="D0D7D3" w:sz="4"/>
             </w:tcBorders>
-            <w:shd w:fill="F6F8F7" w:color="auto" w:val="clear"/>
             <w:tcMar>
               <w:top w:type="dxa" w:w="80"/>
               <w:left w:type="dxa" w:w="120"/>
@@ -4832,7 +4951,6 @@
               <w:bottom w:val="single" w:color="D0D7D3" w:sz="4"/>
               <w:right w:val="single" w:color="D0D7D3" w:sz="4"/>
             </w:tcBorders>
-            <w:shd w:fill="F6F8F7" w:color="auto" w:val="clear"/>
             <w:tcMar>
               <w:top w:type="dxa" w:w="80"/>
               <w:left w:type="dxa" w:w="120"/>
@@ -4863,6 +4981,7 @@
               <w:bottom w:val="single" w:color="D0D7D3" w:sz="4"/>
               <w:right w:val="single" w:color="D0D7D3" w:sz="4"/>
             </w:tcBorders>
+            <w:shd w:fill="F6F8F7" w:color="auto" w:val="clear"/>
             <w:tcMar>
               <w:top w:type="dxa" w:w="80"/>
               <w:left w:type="dxa" w:w="120"/>
@@ -4891,6 +5010,7 @@
               <w:bottom w:val="single" w:color="D0D7D3" w:sz="4"/>
               <w:right w:val="single" w:color="D0D7D3" w:sz="4"/>
             </w:tcBorders>
+            <w:shd w:fill="F6F8F7" w:color="auto" w:val="clear"/>
             <w:tcMar>
               <w:top w:type="dxa" w:w="80"/>
               <w:left w:type="dxa" w:w="120"/>
@@ -4921,7 +5041,6 @@
               <w:bottom w:val="single" w:color="D0D7D3" w:sz="4"/>
               <w:right w:val="single" w:color="D0D7D3" w:sz="4"/>
             </w:tcBorders>
-            <w:shd w:fill="F6F8F7" w:color="auto" w:val="clear"/>
             <w:tcMar>
               <w:top w:type="dxa" w:w="80"/>
               <w:left w:type="dxa" w:w="120"/>
@@ -4950,7 +5069,6 @@
               <w:bottom w:val="single" w:color="D0D7D3" w:sz="4"/>
               <w:right w:val="single" w:color="D0D7D3" w:sz="4"/>
             </w:tcBorders>
-            <w:shd w:fill="F6F8F7" w:color="auto" w:val="clear"/>
             <w:tcMar>
               <w:top w:type="dxa" w:w="80"/>
               <w:left w:type="dxa" w:w="120"/>
@@ -4981,6 +5099,7 @@
               <w:bottom w:val="single" w:color="D0D7D3" w:sz="4"/>
               <w:right w:val="single" w:color="D0D7D3" w:sz="4"/>
             </w:tcBorders>
+            <w:shd w:fill="F6F8F7" w:color="auto" w:val="clear"/>
             <w:tcMar>
               <w:top w:type="dxa" w:w="80"/>
               <w:left w:type="dxa" w:w="120"/>
@@ -5009,6 +5128,7 @@
               <w:bottom w:val="single" w:color="D0D7D3" w:sz="4"/>
               <w:right w:val="single" w:color="D0D7D3" w:sz="4"/>
             </w:tcBorders>
+            <w:shd w:fill="F6F8F7" w:color="auto" w:val="clear"/>
             <w:tcMar>
               <w:top w:type="dxa" w:w="80"/>
               <w:left w:type="dxa" w:w="120"/>
@@ -5039,7 +5159,6 @@
               <w:bottom w:val="single" w:color="D0D7D3" w:sz="4"/>
               <w:right w:val="single" w:color="D0D7D3" w:sz="4"/>
             </w:tcBorders>
-            <w:shd w:fill="F6F8F7" w:color="auto" w:val="clear"/>
             <w:tcMar>
               <w:top w:type="dxa" w:w="80"/>
               <w:left w:type="dxa" w:w="120"/>
@@ -5068,7 +5187,6 @@
               <w:bottom w:val="single" w:color="D0D7D3" w:sz="4"/>
               <w:right w:val="single" w:color="D0D7D3" w:sz="4"/>
             </w:tcBorders>
-            <w:shd w:fill="F6F8F7" w:color="auto" w:val="clear"/>
             <w:tcMar>
               <w:top w:type="dxa" w:w="80"/>
               <w:left w:type="dxa" w:w="120"/>
@@ -5099,6 +5217,7 @@
               <w:bottom w:val="single" w:color="D0D7D3" w:sz="4"/>
               <w:right w:val="single" w:color="D0D7D3" w:sz="4"/>
             </w:tcBorders>
+            <w:shd w:fill="F6F8F7" w:color="auto" w:val="clear"/>
             <w:tcMar>
               <w:top w:type="dxa" w:w="80"/>
               <w:left w:type="dxa" w:w="120"/>
@@ -5127,6 +5246,7 @@
               <w:bottom w:val="single" w:color="D0D7D3" w:sz="4"/>
               <w:right w:val="single" w:color="D0D7D3" w:sz="4"/>
             </w:tcBorders>
+            <w:shd w:fill="F6F8F7" w:color="auto" w:val="clear"/>
             <w:tcMar>
               <w:top w:type="dxa" w:w="80"/>
               <w:left w:type="dxa" w:w="120"/>
@@ -5157,7 +5277,6 @@
               <w:bottom w:val="single" w:color="D0D7D3" w:sz="4"/>
               <w:right w:val="single" w:color="D0D7D3" w:sz="4"/>
             </w:tcBorders>
-            <w:shd w:fill="F6F8F7" w:color="auto" w:val="clear"/>
             <w:tcMar>
               <w:top w:type="dxa" w:w="80"/>
               <w:left w:type="dxa" w:w="120"/>
@@ -5186,7 +5305,6 @@
               <w:bottom w:val="single" w:color="D0D7D3" w:sz="4"/>
               <w:right w:val="single" w:color="D0D7D3" w:sz="4"/>
             </w:tcBorders>
-            <w:shd w:fill="F6F8F7" w:color="auto" w:val="clear"/>
             <w:tcMar>
               <w:top w:type="dxa" w:w="80"/>
               <w:left w:type="dxa" w:w="120"/>
@@ -5217,6 +5335,7 @@
               <w:bottom w:val="single" w:color="D0D7D3" w:sz="4"/>
               <w:right w:val="single" w:color="D0D7D3" w:sz="4"/>
             </w:tcBorders>
+            <w:shd w:fill="F6F8F7" w:color="auto" w:val="clear"/>
             <w:tcMar>
               <w:top w:type="dxa" w:w="80"/>
               <w:left w:type="dxa" w:w="120"/>
@@ -5245,6 +5364,7 @@
               <w:bottom w:val="single" w:color="D0D7D3" w:sz="4"/>
               <w:right w:val="single" w:color="D0D7D3" w:sz="4"/>
             </w:tcBorders>
+            <w:shd w:fill="F6F8F7" w:color="auto" w:val="clear"/>
             <w:tcMar>
               <w:top w:type="dxa" w:w="80"/>
               <w:left w:type="dxa" w:w="120"/>
@@ -5275,7 +5395,6 @@
               <w:bottom w:val="single" w:color="D0D7D3" w:sz="4"/>
               <w:right w:val="single" w:color="D0D7D3" w:sz="4"/>
             </w:tcBorders>
-            <w:shd w:fill="F6F8F7" w:color="auto" w:val="clear"/>
             <w:tcMar>
               <w:top w:type="dxa" w:w="80"/>
               <w:left w:type="dxa" w:w="120"/>
@@ -5304,7 +5423,6 @@
               <w:bottom w:val="single" w:color="D0D7D3" w:sz="4"/>
               <w:right w:val="single" w:color="D0D7D3" w:sz="4"/>
             </w:tcBorders>
-            <w:shd w:fill="F6F8F7" w:color="auto" w:val="clear"/>
             <w:tcMar>
               <w:top w:type="dxa" w:w="80"/>
               <w:left w:type="dxa" w:w="120"/>
@@ -5335,6 +5453,7 @@
               <w:bottom w:val="single" w:color="D0D7D3" w:sz="4"/>
               <w:right w:val="single" w:color="D0D7D3" w:sz="4"/>
             </w:tcBorders>
+            <w:shd w:fill="F6F8F7" w:color="auto" w:val="clear"/>
             <w:tcMar>
               <w:top w:type="dxa" w:w="80"/>
               <w:left w:type="dxa" w:w="120"/>
@@ -5363,6 +5482,7 @@
               <w:bottom w:val="single" w:color="D0D7D3" w:sz="4"/>
               <w:right w:val="single" w:color="D0D7D3" w:sz="4"/>
             </w:tcBorders>
+            <w:shd w:fill="F6F8F7" w:color="auto" w:val="clear"/>
             <w:tcMar>
               <w:top w:type="dxa" w:w="80"/>
               <w:left w:type="dxa" w:w="120"/>
@@ -5393,7 +5513,6 @@
               <w:bottom w:val="single" w:color="D0D7D3" w:sz="4"/>
               <w:right w:val="single" w:color="D0D7D3" w:sz="4"/>
             </w:tcBorders>
-            <w:shd w:fill="F6F8F7" w:color="auto" w:val="clear"/>
             <w:tcMar>
               <w:top w:type="dxa" w:w="80"/>
               <w:left w:type="dxa" w:w="120"/>
@@ -5422,7 +5541,6 @@
               <w:bottom w:val="single" w:color="D0D7D3" w:sz="4"/>
               <w:right w:val="single" w:color="D0D7D3" w:sz="4"/>
             </w:tcBorders>
-            <w:shd w:fill="F6F8F7" w:color="auto" w:val="clear"/>
             <w:tcMar>
               <w:top w:type="dxa" w:w="80"/>
               <w:left w:type="dxa" w:w="120"/>
@@ -5453,6 +5571,7 @@
               <w:bottom w:val="single" w:color="D0D7D3" w:sz="4"/>
               <w:right w:val="single" w:color="D0D7D3" w:sz="4"/>
             </w:tcBorders>
+            <w:shd w:fill="F6F8F7" w:color="auto" w:val="clear"/>
             <w:tcMar>
               <w:top w:type="dxa" w:w="80"/>
               <w:left w:type="dxa" w:w="120"/>
@@ -5481,6 +5600,7 @@
               <w:bottom w:val="single" w:color="D0D7D3" w:sz="4"/>
               <w:right w:val="single" w:color="D0D7D3" w:sz="4"/>
             </w:tcBorders>
+            <w:shd w:fill="F6F8F7" w:color="auto" w:val="clear"/>
             <w:tcMar>
               <w:top w:type="dxa" w:w="80"/>
               <w:left w:type="dxa" w:w="120"/>
@@ -5511,7 +5631,6 @@
               <w:bottom w:val="single" w:color="D0D7D3" w:sz="4"/>
               <w:right w:val="single" w:color="D0D7D3" w:sz="4"/>
             </w:tcBorders>
-            <w:shd w:fill="F6F8F7" w:color="auto" w:val="clear"/>
             <w:tcMar>
               <w:top w:type="dxa" w:w="80"/>
               <w:left w:type="dxa" w:w="120"/>
@@ -5540,7 +5659,6 @@
               <w:bottom w:val="single" w:color="D0D7D3" w:sz="4"/>
               <w:right w:val="single" w:color="D0D7D3" w:sz="4"/>
             </w:tcBorders>
-            <w:shd w:fill="F6F8F7" w:color="auto" w:val="clear"/>
             <w:tcMar>
               <w:top w:type="dxa" w:w="80"/>
               <w:left w:type="dxa" w:w="120"/>
@@ -5571,6 +5689,7 @@
               <w:bottom w:val="single" w:color="D0D7D3" w:sz="4"/>
               <w:right w:val="single" w:color="D0D7D3" w:sz="4"/>
             </w:tcBorders>
+            <w:shd w:fill="F6F8F7" w:color="auto" w:val="clear"/>
             <w:tcMar>
               <w:top w:type="dxa" w:w="80"/>
               <w:left w:type="dxa" w:w="120"/>
@@ -5599,6 +5718,7 @@
               <w:bottom w:val="single" w:color="D0D7D3" w:sz="4"/>
               <w:right w:val="single" w:color="D0D7D3" w:sz="4"/>
             </w:tcBorders>
+            <w:shd w:fill="F6F8F7" w:color="auto" w:val="clear"/>
             <w:tcMar>
               <w:top w:type="dxa" w:w="80"/>
               <w:left w:type="dxa" w:w="120"/>
@@ -5629,7 +5749,6 @@
               <w:bottom w:val="single" w:color="D0D7D3" w:sz="4"/>
               <w:right w:val="single" w:color="D0D7D3" w:sz="4"/>
             </w:tcBorders>
-            <w:shd w:fill="F6F8F7" w:color="auto" w:val="clear"/>
             <w:tcMar>
               <w:top w:type="dxa" w:w="80"/>
               <w:left w:type="dxa" w:w="120"/>
@@ -5658,7 +5777,6 @@
               <w:bottom w:val="single" w:color="D0D7D3" w:sz="4"/>
               <w:right w:val="single" w:color="D0D7D3" w:sz="4"/>
             </w:tcBorders>
-            <w:shd w:fill="F6F8F7" w:color="auto" w:val="clear"/>
             <w:tcMar>
               <w:top w:type="dxa" w:w="80"/>
               <w:left w:type="dxa" w:w="120"/>
@@ -5689,6 +5807,7 @@
               <w:bottom w:val="single" w:color="D0D7D3" w:sz="4"/>
               <w:right w:val="single" w:color="D0D7D3" w:sz="4"/>
             </w:tcBorders>
+            <w:shd w:fill="F6F8F7" w:color="auto" w:val="clear"/>
             <w:tcMar>
               <w:top w:type="dxa" w:w="80"/>
               <w:left w:type="dxa" w:w="120"/>
@@ -5717,6 +5836,7 @@
               <w:bottom w:val="single" w:color="D0D7D3" w:sz="4"/>
               <w:right w:val="single" w:color="D0D7D3" w:sz="4"/>
             </w:tcBorders>
+            <w:shd w:fill="F6F8F7" w:color="auto" w:val="clear"/>
             <w:tcMar>
               <w:top w:type="dxa" w:w="80"/>
               <w:left w:type="dxa" w:w="120"/>
@@ -5747,7 +5867,6 @@
               <w:bottom w:val="single" w:color="D0D7D3" w:sz="4"/>
               <w:right w:val="single" w:color="D0D7D3" w:sz="4"/>
             </w:tcBorders>
-            <w:shd w:fill="F6F8F7" w:color="auto" w:val="clear"/>
             <w:tcMar>
               <w:top w:type="dxa" w:w="80"/>
               <w:left w:type="dxa" w:w="120"/>
@@ -5776,7 +5895,6 @@
               <w:bottom w:val="single" w:color="D0D7D3" w:sz="4"/>
               <w:right w:val="single" w:color="D0D7D3" w:sz="4"/>
             </w:tcBorders>
-            <w:shd w:fill="F6F8F7" w:color="auto" w:val="clear"/>
             <w:tcMar>
               <w:top w:type="dxa" w:w="80"/>
               <w:left w:type="dxa" w:w="120"/>
@@ -5807,6 +5925,7 @@
               <w:bottom w:val="single" w:color="D0D7D3" w:sz="4"/>
               <w:right w:val="single" w:color="D0D7D3" w:sz="4"/>
             </w:tcBorders>
+            <w:shd w:fill="F6F8F7" w:color="auto" w:val="clear"/>
             <w:tcMar>
               <w:top w:type="dxa" w:w="80"/>
               <w:left w:type="dxa" w:w="120"/>
@@ -5835,6 +5954,7 @@
               <w:bottom w:val="single" w:color="D0D7D3" w:sz="4"/>
               <w:right w:val="single" w:color="D0D7D3" w:sz="4"/>
             </w:tcBorders>
+            <w:shd w:fill="F6F8F7" w:color="auto" w:val="clear"/>
             <w:tcMar>
               <w:top w:type="dxa" w:w="80"/>
               <w:left w:type="dxa" w:w="120"/>
@@ -5865,7 +5985,6 @@
               <w:bottom w:val="single" w:color="D0D7D3" w:sz="4"/>
               <w:right w:val="single" w:color="D0D7D3" w:sz="4"/>
             </w:tcBorders>
-            <w:shd w:fill="F6F8F7" w:color="auto" w:val="clear"/>
             <w:tcMar>
               <w:top w:type="dxa" w:w="80"/>
               <w:left w:type="dxa" w:w="120"/>
@@ -5894,7 +6013,6 @@
               <w:bottom w:val="single" w:color="D0D7D3" w:sz="4"/>
               <w:right w:val="single" w:color="D0D7D3" w:sz="4"/>
             </w:tcBorders>
-            <w:shd w:fill="F6F8F7" w:color="auto" w:val="clear"/>
             <w:tcMar>
               <w:top w:type="dxa" w:w="80"/>
               <w:left w:type="dxa" w:w="120"/>
@@ -5925,6 +6043,7 @@
               <w:bottom w:val="single" w:color="D0D7D3" w:sz="4"/>
               <w:right w:val="single" w:color="D0D7D3" w:sz="4"/>
             </w:tcBorders>
+            <w:shd w:fill="F6F8F7" w:color="auto" w:val="clear"/>
             <w:tcMar>
               <w:top w:type="dxa" w:w="80"/>
               <w:left w:type="dxa" w:w="120"/>
@@ -5953,6 +6072,7 @@
               <w:bottom w:val="single" w:color="D0D7D3" w:sz="4"/>
               <w:right w:val="single" w:color="D0D7D3" w:sz="4"/>
             </w:tcBorders>
+            <w:shd w:fill="F6F8F7" w:color="auto" w:val="clear"/>
             <w:tcMar>
               <w:top w:type="dxa" w:w="80"/>
               <w:left w:type="dxa" w:w="120"/>
@@ -5983,7 +6103,6 @@
               <w:bottom w:val="single" w:color="D0D7D3" w:sz="4"/>
               <w:right w:val="single" w:color="D0D7D3" w:sz="4"/>
             </w:tcBorders>
-            <w:shd w:fill="F6F8F7" w:color="auto" w:val="clear"/>
             <w:tcMar>
               <w:top w:type="dxa" w:w="80"/>
               <w:left w:type="dxa" w:w="120"/>
@@ -6012,7 +6131,6 @@
               <w:bottom w:val="single" w:color="D0D7D3" w:sz="4"/>
               <w:right w:val="single" w:color="D0D7D3" w:sz="4"/>
             </w:tcBorders>
-            <w:shd w:fill="F6F8F7" w:color="auto" w:val="clear"/>
             <w:tcMar>
               <w:top w:type="dxa" w:w="80"/>
               <w:left w:type="dxa" w:w="120"/>
@@ -6043,6 +6161,7 @@
               <w:bottom w:val="single" w:color="D0D7D3" w:sz="4"/>
               <w:right w:val="single" w:color="D0D7D3" w:sz="4"/>
             </w:tcBorders>
+            <w:shd w:fill="F6F8F7" w:color="auto" w:val="clear"/>
             <w:tcMar>
               <w:top w:type="dxa" w:w="80"/>
               <w:left w:type="dxa" w:w="120"/>
@@ -6071,6 +6190,7 @@
               <w:bottom w:val="single" w:color="D0D7D3" w:sz="4"/>
               <w:right w:val="single" w:color="D0D7D3" w:sz="4"/>
             </w:tcBorders>
+            <w:shd w:fill="F6F8F7" w:color="auto" w:val="clear"/>
             <w:tcMar>
               <w:top w:type="dxa" w:w="80"/>
               <w:left w:type="dxa" w:w="120"/>
@@ -6101,7 +6221,6 @@
               <w:bottom w:val="single" w:color="D0D7D3" w:sz="4"/>
               <w:right w:val="single" w:color="D0D7D3" w:sz="4"/>
             </w:tcBorders>
-            <w:shd w:fill="F6F8F7" w:color="auto" w:val="clear"/>
             <w:tcMar>
               <w:top w:type="dxa" w:w="80"/>
               <w:left w:type="dxa" w:w="120"/>
@@ -6130,7 +6249,6 @@
               <w:bottom w:val="single" w:color="D0D7D3" w:sz="4"/>
               <w:right w:val="single" w:color="D0D7D3" w:sz="4"/>
             </w:tcBorders>
-            <w:shd w:fill="F6F8F7" w:color="auto" w:val="clear"/>
             <w:tcMar>
               <w:top w:type="dxa" w:w="80"/>
               <w:left w:type="dxa" w:w="120"/>
@@ -6161,6 +6279,7 @@
               <w:bottom w:val="single" w:color="D0D7D3" w:sz="4"/>
               <w:right w:val="single" w:color="D0D7D3" w:sz="4"/>
             </w:tcBorders>
+            <w:shd w:fill="F6F8F7" w:color="auto" w:val="clear"/>
             <w:tcMar>
               <w:top w:type="dxa" w:w="80"/>
               <w:left w:type="dxa" w:w="120"/>
@@ -6189,6 +6308,7 @@
               <w:bottom w:val="single" w:color="D0D7D3" w:sz="4"/>
               <w:right w:val="single" w:color="D0D7D3" w:sz="4"/>
             </w:tcBorders>
+            <w:shd w:fill="F6F8F7" w:color="auto" w:val="clear"/>
             <w:tcMar>
               <w:top w:type="dxa" w:w="80"/>
               <w:left w:type="dxa" w:w="120"/>
@@ -6219,7 +6339,6 @@
               <w:bottom w:val="single" w:color="D0D7D3" w:sz="4"/>
               <w:right w:val="single" w:color="D0D7D3" w:sz="4"/>
             </w:tcBorders>
-            <w:shd w:fill="F6F8F7" w:color="auto" w:val="clear"/>
             <w:tcMar>
               <w:top w:type="dxa" w:w="80"/>
               <w:left w:type="dxa" w:w="120"/>
@@ -6248,7 +6367,6 @@
               <w:bottom w:val="single" w:color="D0D7D3" w:sz="4"/>
               <w:right w:val="single" w:color="D0D7D3" w:sz="4"/>
             </w:tcBorders>
-            <w:shd w:fill="F6F8F7" w:color="auto" w:val="clear"/>
             <w:tcMar>
               <w:top w:type="dxa" w:w="80"/>
               <w:left w:type="dxa" w:w="120"/>
@@ -6279,6 +6397,7 @@
               <w:bottom w:val="single" w:color="D0D7D3" w:sz="4"/>
               <w:right w:val="single" w:color="D0D7D3" w:sz="4"/>
             </w:tcBorders>
+            <w:shd w:fill="F6F8F7" w:color="auto" w:val="clear"/>
             <w:tcMar>
               <w:top w:type="dxa" w:w="80"/>
               <w:left w:type="dxa" w:w="120"/>
@@ -6307,6 +6426,7 @@
               <w:bottom w:val="single" w:color="D0D7D3" w:sz="4"/>
               <w:right w:val="single" w:color="D0D7D3" w:sz="4"/>
             </w:tcBorders>
+            <w:shd w:fill="F6F8F7" w:color="auto" w:val="clear"/>
             <w:tcMar>
               <w:top w:type="dxa" w:w="80"/>
               <w:left w:type="dxa" w:w="120"/>
@@ -6337,7 +6457,6 @@
               <w:bottom w:val="single" w:color="D0D7D3" w:sz="4"/>
               <w:right w:val="single" w:color="D0D7D3" w:sz="4"/>
             </w:tcBorders>
-            <w:shd w:fill="F6F8F7" w:color="auto" w:val="clear"/>
             <w:tcMar>
               <w:top w:type="dxa" w:w="80"/>
               <w:left w:type="dxa" w:w="120"/>
@@ -6366,7 +6485,6 @@
               <w:bottom w:val="single" w:color="D0D7D3" w:sz="4"/>
               <w:right w:val="single" w:color="D0D7D3" w:sz="4"/>
             </w:tcBorders>
-            <w:shd w:fill="F6F8F7" w:color="auto" w:val="clear"/>
             <w:tcMar>
               <w:top w:type="dxa" w:w="80"/>
               <w:left w:type="dxa" w:w="120"/>
@@ -6397,6 +6515,7 @@
               <w:bottom w:val="single" w:color="D0D7D3" w:sz="4"/>
               <w:right w:val="single" w:color="D0D7D3" w:sz="4"/>
             </w:tcBorders>
+            <w:shd w:fill="F6F8F7" w:color="auto" w:val="clear"/>
             <w:tcMar>
               <w:top w:type="dxa" w:w="80"/>
               <w:left w:type="dxa" w:w="120"/>
@@ -6425,6 +6544,7 @@
               <w:bottom w:val="single" w:color="D0D7D3" w:sz="4"/>
               <w:right w:val="single" w:color="D0D7D3" w:sz="4"/>
             </w:tcBorders>
+            <w:shd w:fill="F6F8F7" w:color="auto" w:val="clear"/>
             <w:tcMar>
               <w:top w:type="dxa" w:w="80"/>
               <w:left w:type="dxa" w:w="120"/>
@@ -6455,7 +6575,6 @@
               <w:bottom w:val="single" w:color="D0D7D3" w:sz="4"/>
               <w:right w:val="single" w:color="D0D7D3" w:sz="4"/>
             </w:tcBorders>
-            <w:shd w:fill="F6F8F7" w:color="auto" w:val="clear"/>
             <w:tcMar>
               <w:top w:type="dxa" w:w="80"/>
               <w:left w:type="dxa" w:w="120"/>
@@ -6484,7 +6603,6 @@
               <w:bottom w:val="single" w:color="D0D7D3" w:sz="4"/>
               <w:right w:val="single" w:color="D0D7D3" w:sz="4"/>
             </w:tcBorders>
-            <w:shd w:fill="F6F8F7" w:color="auto" w:val="clear"/>
             <w:tcMar>
               <w:top w:type="dxa" w:w="80"/>
               <w:left w:type="dxa" w:w="120"/>
@@ -6515,6 +6633,7 @@
               <w:bottom w:val="single" w:color="D0D7D3" w:sz="4"/>
               <w:right w:val="single" w:color="D0D7D3" w:sz="4"/>
             </w:tcBorders>
+            <w:shd w:fill="F6F8F7" w:color="auto" w:val="clear"/>
             <w:tcMar>
               <w:top w:type="dxa" w:w="80"/>
               <w:left w:type="dxa" w:w="120"/>
@@ -6543,6 +6662,7 @@
               <w:bottom w:val="single" w:color="D0D7D3" w:sz="4"/>
               <w:right w:val="single" w:color="D0D7D3" w:sz="4"/>
             </w:tcBorders>
+            <w:shd w:fill="F6F8F7" w:color="auto" w:val="clear"/>
             <w:tcMar>
               <w:top w:type="dxa" w:w="80"/>
               <w:left w:type="dxa" w:w="120"/>
@@ -6573,7 +6693,6 @@
               <w:bottom w:val="single" w:color="D0D7D3" w:sz="4"/>
               <w:right w:val="single" w:color="D0D7D3" w:sz="4"/>
             </w:tcBorders>
-            <w:shd w:fill="F6F8F7" w:color="auto" w:val="clear"/>
             <w:tcMar>
               <w:top w:type="dxa" w:w="80"/>
               <w:left w:type="dxa" w:w="120"/>
@@ -6602,7 +6721,6 @@
               <w:bottom w:val="single" w:color="D0D7D3" w:sz="4"/>
               <w:right w:val="single" w:color="D0D7D3" w:sz="4"/>
             </w:tcBorders>
-            <w:shd w:fill="F6F8F7" w:color="auto" w:val="clear"/>
             <w:tcMar>
               <w:top w:type="dxa" w:w="80"/>
               <w:left w:type="dxa" w:w="120"/>
@@ -6633,6 +6751,7 @@
               <w:bottom w:val="single" w:color="D0D7D3" w:sz="4"/>
               <w:right w:val="single" w:color="D0D7D3" w:sz="4"/>
             </w:tcBorders>
+            <w:shd w:fill="F6F8F7" w:color="auto" w:val="clear"/>
             <w:tcMar>
               <w:top w:type="dxa" w:w="80"/>
               <w:left w:type="dxa" w:w="120"/>
@@ -6661,6 +6780,7 @@
               <w:bottom w:val="single" w:color="D0D7D3" w:sz="4"/>
               <w:right w:val="single" w:color="D0D7D3" w:sz="4"/>
             </w:tcBorders>
+            <w:shd w:fill="F6F8F7" w:color="auto" w:val="clear"/>
             <w:tcMar>
               <w:top w:type="dxa" w:w="80"/>
               <w:left w:type="dxa" w:w="120"/>
@@ -6691,7 +6811,6 @@
               <w:bottom w:val="single" w:color="D0D7D3" w:sz="4"/>
               <w:right w:val="single" w:color="D0D7D3" w:sz="4"/>
             </w:tcBorders>
-            <w:shd w:fill="F6F8F7" w:color="auto" w:val="clear"/>
             <w:tcMar>
               <w:top w:type="dxa" w:w="80"/>
               <w:left w:type="dxa" w:w="120"/>
@@ -6720,7 +6839,6 @@
               <w:bottom w:val="single" w:color="D0D7D3" w:sz="4"/>
               <w:right w:val="single" w:color="D0D7D3" w:sz="4"/>
             </w:tcBorders>
-            <w:shd w:fill="F6F8F7" w:color="auto" w:val="clear"/>
             <w:tcMar>
               <w:top w:type="dxa" w:w="80"/>
               <w:left w:type="dxa" w:w="120"/>
@@ -6751,6 +6869,7 @@
               <w:bottom w:val="single" w:color="D0D7D3" w:sz="4"/>
               <w:right w:val="single" w:color="D0D7D3" w:sz="4"/>
             </w:tcBorders>
+            <w:shd w:fill="F6F8F7" w:color="auto" w:val="clear"/>
             <w:tcMar>
               <w:top w:type="dxa" w:w="80"/>
               <w:left w:type="dxa" w:w="120"/>
@@ -6779,6 +6898,7 @@
               <w:bottom w:val="single" w:color="D0D7D3" w:sz="4"/>
               <w:right w:val="single" w:color="D0D7D3" w:sz="4"/>
             </w:tcBorders>
+            <w:shd w:fill="F6F8F7" w:color="auto" w:val="clear"/>
             <w:tcMar>
               <w:top w:type="dxa" w:w="80"/>
               <w:left w:type="dxa" w:w="120"/>
@@ -6809,7 +6929,6 @@
               <w:bottom w:val="single" w:color="D0D7D3" w:sz="4"/>
               <w:right w:val="single" w:color="D0D7D3" w:sz="4"/>
             </w:tcBorders>
-            <w:shd w:fill="F6F8F7" w:color="auto" w:val="clear"/>
             <w:tcMar>
               <w:top w:type="dxa" w:w="80"/>
               <w:left w:type="dxa" w:w="120"/>
@@ -6838,7 +6957,6 @@
               <w:bottom w:val="single" w:color="D0D7D3" w:sz="4"/>
               <w:right w:val="single" w:color="D0D7D3" w:sz="4"/>
             </w:tcBorders>
-            <w:shd w:fill="F6F8F7" w:color="auto" w:val="clear"/>
             <w:tcMar>
               <w:top w:type="dxa" w:w="80"/>
               <w:left w:type="dxa" w:w="120"/>
@@ -6869,6 +6987,7 @@
               <w:bottom w:val="single" w:color="D0D7D3" w:sz="4"/>
               <w:right w:val="single" w:color="D0D7D3" w:sz="4"/>
             </w:tcBorders>
+            <w:shd w:fill="F6F8F7" w:color="auto" w:val="clear"/>
             <w:tcMar>
               <w:top w:type="dxa" w:w="80"/>
               <w:left w:type="dxa" w:w="120"/>
@@ -6897,6 +7016,7 @@
               <w:bottom w:val="single" w:color="D0D7D3" w:sz="4"/>
               <w:right w:val="single" w:color="D0D7D3" w:sz="4"/>
             </w:tcBorders>
+            <w:shd w:fill="F6F8F7" w:color="auto" w:val="clear"/>
             <w:tcMar>
               <w:top w:type="dxa" w:w="80"/>
               <w:left w:type="dxa" w:w="120"/>
@@ -6927,7 +7047,6 @@
               <w:bottom w:val="single" w:color="D0D7D3" w:sz="4"/>
               <w:right w:val="single" w:color="D0D7D3" w:sz="4"/>
             </w:tcBorders>
-            <w:shd w:fill="F6F8F7" w:color="auto" w:val="clear"/>
             <w:tcMar>
               <w:top w:type="dxa" w:w="80"/>
               <w:left w:type="dxa" w:w="120"/>
@@ -6956,7 +7075,6 @@
               <w:bottom w:val="single" w:color="D0D7D3" w:sz="4"/>
               <w:right w:val="single" w:color="D0D7D3" w:sz="4"/>
             </w:tcBorders>
-            <w:shd w:fill="F6F8F7" w:color="auto" w:val="clear"/>
             <w:tcMar>
               <w:top w:type="dxa" w:w="80"/>
               <w:left w:type="dxa" w:w="120"/>
@@ -6987,6 +7105,7 @@
               <w:bottom w:val="single" w:color="D0D7D3" w:sz="4"/>
               <w:right w:val="single" w:color="D0D7D3" w:sz="4"/>
             </w:tcBorders>
+            <w:shd w:fill="F6F8F7" w:color="auto" w:val="clear"/>
             <w:tcMar>
               <w:top w:type="dxa" w:w="80"/>
               <w:left w:type="dxa" w:w="120"/>
@@ -7015,6 +7134,7 @@
               <w:bottom w:val="single" w:color="D0D7D3" w:sz="4"/>
               <w:right w:val="single" w:color="D0D7D3" w:sz="4"/>
             </w:tcBorders>
+            <w:shd w:fill="F6F8F7" w:color="auto" w:val="clear"/>
             <w:tcMar>
               <w:top w:type="dxa" w:w="80"/>
               <w:left w:type="dxa" w:w="120"/>
@@ -7045,7 +7165,6 @@
               <w:bottom w:val="single" w:color="D0D7D3" w:sz="4"/>
               <w:right w:val="single" w:color="D0D7D3" w:sz="4"/>
             </w:tcBorders>
-            <w:shd w:fill="F6F8F7" w:color="auto" w:val="clear"/>
             <w:tcMar>
               <w:top w:type="dxa" w:w="80"/>
               <w:left w:type="dxa" w:w="120"/>
@@ -7074,7 +7193,6 @@
               <w:bottom w:val="single" w:color="D0D7D3" w:sz="4"/>
               <w:right w:val="single" w:color="D0D7D3" w:sz="4"/>
             </w:tcBorders>
-            <w:shd w:fill="F6F8F7" w:color="auto" w:val="clear"/>
             <w:tcMar>
               <w:top w:type="dxa" w:w="80"/>
               <w:left w:type="dxa" w:w="120"/>
@@ -7105,6 +7223,7 @@
               <w:bottom w:val="single" w:color="D0D7D3" w:sz="4"/>
               <w:right w:val="single" w:color="D0D7D3" w:sz="4"/>
             </w:tcBorders>
+            <w:shd w:fill="F6F8F7" w:color="auto" w:val="clear"/>
             <w:tcMar>
               <w:top w:type="dxa" w:w="80"/>
               <w:left w:type="dxa" w:w="120"/>
@@ -7133,6 +7252,7 @@
               <w:bottom w:val="single" w:color="D0D7D3" w:sz="4"/>
               <w:right w:val="single" w:color="D0D7D3" w:sz="4"/>
             </w:tcBorders>
+            <w:shd w:fill="F6F8F7" w:color="auto" w:val="clear"/>
             <w:tcMar>
               <w:top w:type="dxa" w:w="80"/>
               <w:left w:type="dxa" w:w="120"/>
@@ -7163,7 +7283,6 @@
               <w:bottom w:val="single" w:color="D0D7D3" w:sz="4"/>
               <w:right w:val="single" w:color="D0D7D3" w:sz="4"/>
             </w:tcBorders>
-            <w:shd w:fill="F6F8F7" w:color="auto" w:val="clear"/>
             <w:tcMar>
               <w:top w:type="dxa" w:w="80"/>
               <w:left w:type="dxa" w:w="120"/>
@@ -7192,7 +7311,6 @@
               <w:bottom w:val="single" w:color="D0D7D3" w:sz="4"/>
               <w:right w:val="single" w:color="D0D7D3" w:sz="4"/>
             </w:tcBorders>
-            <w:shd w:fill="F6F8F7" w:color="auto" w:val="clear"/>
             <w:tcMar>
               <w:top w:type="dxa" w:w="80"/>
               <w:left w:type="dxa" w:w="120"/>
@@ -7223,6 +7341,7 @@
               <w:bottom w:val="single" w:color="D0D7D3" w:sz="4"/>
               <w:right w:val="single" w:color="D0D7D3" w:sz="4"/>
             </w:tcBorders>
+            <w:shd w:fill="F6F8F7" w:color="auto" w:val="clear"/>
             <w:tcMar>
               <w:top w:type="dxa" w:w="80"/>
               <w:left w:type="dxa" w:w="120"/>
@@ -7251,6 +7370,7 @@
               <w:bottom w:val="single" w:color="D0D7D3" w:sz="4"/>
               <w:right w:val="single" w:color="D0D7D3" w:sz="4"/>
             </w:tcBorders>
+            <w:shd w:fill="F6F8F7" w:color="auto" w:val="clear"/>
             <w:tcMar>
               <w:top w:type="dxa" w:w="80"/>
               <w:left w:type="dxa" w:w="120"/>
@@ -7281,7 +7401,6 @@
               <w:bottom w:val="single" w:color="D0D7D3" w:sz="4"/>
               <w:right w:val="single" w:color="D0D7D3" w:sz="4"/>
             </w:tcBorders>
-            <w:shd w:fill="F6F8F7" w:color="auto" w:val="clear"/>
             <w:tcMar>
               <w:top w:type="dxa" w:w="80"/>
               <w:left w:type="dxa" w:w="120"/>
@@ -7310,7 +7429,6 @@
               <w:bottom w:val="single" w:color="D0D7D3" w:sz="4"/>
               <w:right w:val="single" w:color="D0D7D3" w:sz="4"/>
             </w:tcBorders>
-            <w:shd w:fill="F6F8F7" w:color="auto" w:val="clear"/>
             <w:tcMar>
               <w:top w:type="dxa" w:w="80"/>
               <w:left w:type="dxa" w:w="120"/>
@@ -7341,6 +7459,7 @@
               <w:bottom w:val="single" w:color="D0D7D3" w:sz="4"/>
               <w:right w:val="single" w:color="D0D7D3" w:sz="4"/>
             </w:tcBorders>
+            <w:shd w:fill="F6F8F7" w:color="auto" w:val="clear"/>
             <w:tcMar>
               <w:top w:type="dxa" w:w="80"/>
               <w:left w:type="dxa" w:w="120"/>
@@ -7369,6 +7488,7 @@
               <w:bottom w:val="single" w:color="D0D7D3" w:sz="4"/>
               <w:right w:val="single" w:color="D0D7D3" w:sz="4"/>
             </w:tcBorders>
+            <w:shd w:fill="F6F8F7" w:color="auto" w:val="clear"/>
             <w:tcMar>
               <w:top w:type="dxa" w:w="80"/>
               <w:left w:type="dxa" w:w="120"/>

</xml_diff>

<commit_message>
Write off debt the school won't collect: staff ask, only the proprietor approves
</commit_message>
<xml_diff>
--- a/docs/product/WardPay - what it does.docx
+++ b/docs/product/WardPay - what it does.docx
@@ -264,6 +264,65 @@
                 <w:sz w:val="20"/>
                 <w:szCs w:val="20"/>
               </w:rPr>
+              <w:t xml:space="preserve">Write off debt the school won’t collect: staff can ask, only you approve</w:t>
+            </w:r>
+          </w:p>
+        </w:tc>
+        <w:tc>
+          <w:tcPr>
+            <w:tcW w:type="dxa" w:w="4238"/>
+            <w:tcBorders>
+              <w:top w:val="single" w:color="D0D7D3" w:sz="4"/>
+              <w:left w:val="single" w:color="D0D7D3" w:sz="4"/>
+              <w:bottom w:val="single" w:color="D0D7D3" w:sz="4"/>
+              <w:right w:val="single" w:color="D0D7D3" w:sz="4"/>
+            </w:tcBorders>
+            <w:shd w:fill="F6F8F7" w:color="auto" w:val="clear"/>
+            <w:tcMar>
+              <w:top w:type="dxa" w:w="80"/>
+              <w:left w:type="dxa" w:w="120"/>
+              <w:bottom w:type="dxa" w:w="80"/>
+              <w:right w:type="dxa" w:w="120"/>
+            </w:tcMar>
+          </w:tcPr>
+          <w:p>
+            <w:r>
+              <w:rPr>
+                <w:b w:val="false"/>
+                <w:bCs w:val="false"/>
+                <w:sz w:val="20"/>
+                <w:szCs w:val="20"/>
+              </w:rPr>
+              <w:t xml:space="preserve">Bad debts leave the books cleanly, and nobody can quietly clear a debt they took cash for</w:t>
+            </w:r>
+          </w:p>
+        </w:tc>
+      </w:tr>
+      <w:tr>
+        <w:tc>
+          <w:tcPr>
+            <w:tcW w:type="dxa" w:w="5400"/>
+            <w:tcBorders>
+              <w:top w:val="single" w:color="D0D7D3" w:sz="4"/>
+              <w:left w:val="single" w:color="D0D7D3" w:sz="4"/>
+              <w:bottom w:val="single" w:color="D0D7D3" w:sz="4"/>
+              <w:right w:val="single" w:color="D0D7D3" w:sz="4"/>
+            </w:tcBorders>
+            <w:tcMar>
+              <w:top w:type="dxa" w:w="80"/>
+              <w:left w:type="dxa" w:w="120"/>
+              <w:bottom w:type="dxa" w:w="80"/>
+              <w:right w:type="dxa" w:w="120"/>
+            </w:tcMar>
+          </w:tcPr>
+          <w:p>
+            <w:r>
+              <w:rPr>
+                <w:b w:val="false"/>
+                <w:bCs w:val="false"/>
+                <w:sz w:val="20"/>
+                <w:szCs w:val="20"/>
+              </w:rPr>
               <w:t xml:space="preserve">See what Paystack paid into your bank each day, the charges taken, and any payment it hasn’t paid out</w:t>
             </w:r>
           </w:p>
@@ -277,7 +336,6 @@
               <w:bottom w:val="single" w:color="D0D7D3" w:sz="4"/>
               <w:right w:val="single" w:color="D0D7D3" w:sz="4"/>
             </w:tcBorders>
-            <w:shd w:fill="F6F8F7" w:color="auto" w:val="clear"/>
             <w:tcMar>
               <w:top w:type="dxa" w:w="80"/>
               <w:left w:type="dxa" w:w="120"/>
@@ -308,6 +366,7 @@
               <w:bottom w:val="single" w:color="D0D7D3" w:sz="4"/>
               <w:right w:val="single" w:color="D0D7D3" w:sz="4"/>
             </w:tcBorders>
+            <w:shd w:fill="F6F8F7" w:color="auto" w:val="clear"/>
             <w:tcMar>
               <w:top w:type="dxa" w:w="80"/>
               <w:left w:type="dxa" w:w="120"/>
@@ -336,6 +395,7 @@
               <w:bottom w:val="single" w:color="D0D7D3" w:sz="4"/>
               <w:right w:val="single" w:color="D0D7D3" w:sz="4"/>
             </w:tcBorders>
+            <w:shd w:fill="F6F8F7" w:color="auto" w:val="clear"/>
             <w:tcMar>
               <w:top w:type="dxa" w:w="80"/>
               <w:left w:type="dxa" w:w="120"/>
@@ -366,7 +426,6 @@
               <w:bottom w:val="single" w:color="D0D7D3" w:sz="4"/>
               <w:right w:val="single" w:color="D0D7D3" w:sz="4"/>
             </w:tcBorders>
-            <w:shd w:fill="F6F8F7" w:color="auto" w:val="clear"/>
             <w:tcMar>
               <w:top w:type="dxa" w:w="80"/>
               <w:left w:type="dxa" w:w="120"/>
@@ -395,7 +454,6 @@
               <w:bottom w:val="single" w:color="D0D7D3" w:sz="4"/>
               <w:right w:val="single" w:color="D0D7D3" w:sz="4"/>
             </w:tcBorders>
-            <w:shd w:fill="F6F8F7" w:color="auto" w:val="clear"/>
             <w:tcMar>
               <w:top w:type="dxa" w:w="80"/>
               <w:left w:type="dxa" w:w="120"/>
@@ -426,6 +484,7 @@
               <w:bottom w:val="single" w:color="D0D7D3" w:sz="4"/>
               <w:right w:val="single" w:color="D0D7D3" w:sz="4"/>
             </w:tcBorders>
+            <w:shd w:fill="F6F8F7" w:color="auto" w:val="clear"/>
             <w:tcMar>
               <w:top w:type="dxa" w:w="80"/>
               <w:left w:type="dxa" w:w="120"/>
@@ -454,6 +513,7 @@
               <w:bottom w:val="single" w:color="D0D7D3" w:sz="4"/>
               <w:right w:val="single" w:color="D0D7D3" w:sz="4"/>
             </w:tcBorders>
+            <w:shd w:fill="F6F8F7" w:color="auto" w:val="clear"/>
             <w:tcMar>
               <w:top w:type="dxa" w:w="80"/>
               <w:left w:type="dxa" w:w="120"/>
@@ -484,7 +544,6 @@
               <w:bottom w:val="single" w:color="D0D7D3" w:sz="4"/>
               <w:right w:val="single" w:color="D0D7D3" w:sz="4"/>
             </w:tcBorders>
-            <w:shd w:fill="F6F8F7" w:color="auto" w:val="clear"/>
             <w:tcMar>
               <w:top w:type="dxa" w:w="80"/>
               <w:left w:type="dxa" w:w="120"/>
@@ -513,7 +572,6 @@
               <w:bottom w:val="single" w:color="D0D7D3" w:sz="4"/>
               <w:right w:val="single" w:color="D0D7D3" w:sz="4"/>
             </w:tcBorders>
-            <w:shd w:fill="F6F8F7" w:color="auto" w:val="clear"/>
             <w:tcMar>
               <w:top w:type="dxa" w:w="80"/>
               <w:left w:type="dxa" w:w="120"/>
@@ -544,6 +602,7 @@
               <w:bottom w:val="single" w:color="D0D7D3" w:sz="4"/>
               <w:right w:val="single" w:color="D0D7D3" w:sz="4"/>
             </w:tcBorders>
+            <w:shd w:fill="F6F8F7" w:color="auto" w:val="clear"/>
             <w:tcMar>
               <w:top w:type="dxa" w:w="80"/>
               <w:left w:type="dxa" w:w="120"/>
@@ -572,6 +631,7 @@
               <w:bottom w:val="single" w:color="D0D7D3" w:sz="4"/>
               <w:right w:val="single" w:color="D0D7D3" w:sz="4"/>
             </w:tcBorders>
+            <w:shd w:fill="F6F8F7" w:color="auto" w:val="clear"/>
             <w:tcMar>
               <w:top w:type="dxa" w:w="80"/>
               <w:left w:type="dxa" w:w="120"/>
@@ -602,7 +662,6 @@
               <w:bottom w:val="single" w:color="D0D7D3" w:sz="4"/>
               <w:right w:val="single" w:color="D0D7D3" w:sz="4"/>
             </w:tcBorders>
-            <w:shd w:fill="F6F8F7" w:color="auto" w:val="clear"/>
             <w:tcMar>
               <w:top w:type="dxa" w:w="80"/>
               <w:left w:type="dxa" w:w="120"/>
@@ -631,7 +690,6 @@
               <w:bottom w:val="single" w:color="D0D7D3" w:sz="4"/>
               <w:right w:val="single" w:color="D0D7D3" w:sz="4"/>
             </w:tcBorders>
-            <w:shd w:fill="F6F8F7" w:color="auto" w:val="clear"/>
             <w:tcMar>
               <w:top w:type="dxa" w:w="80"/>
               <w:left w:type="dxa" w:w="120"/>
@@ -662,6 +720,7 @@
               <w:bottom w:val="single" w:color="D0D7D3" w:sz="4"/>
               <w:right w:val="single" w:color="D0D7D3" w:sz="4"/>
             </w:tcBorders>
+            <w:shd w:fill="F6F8F7" w:color="auto" w:val="clear"/>
             <w:tcMar>
               <w:top w:type="dxa" w:w="80"/>
               <w:left w:type="dxa" w:w="120"/>
@@ -690,6 +749,7 @@
               <w:bottom w:val="single" w:color="D0D7D3" w:sz="4"/>
               <w:right w:val="single" w:color="D0D7D3" w:sz="4"/>
             </w:tcBorders>
+            <w:shd w:fill="F6F8F7" w:color="auto" w:val="clear"/>
             <w:tcMar>
               <w:top w:type="dxa" w:w="80"/>
               <w:left w:type="dxa" w:w="120"/>
@@ -720,7 +780,6 @@
               <w:bottom w:val="single" w:color="D0D7D3" w:sz="4"/>
               <w:right w:val="single" w:color="D0D7D3" w:sz="4"/>
             </w:tcBorders>
-            <w:shd w:fill="F6F8F7" w:color="auto" w:val="clear"/>
             <w:tcMar>
               <w:top w:type="dxa" w:w="80"/>
               <w:left w:type="dxa" w:w="120"/>
@@ -749,7 +808,6 @@
               <w:bottom w:val="single" w:color="D0D7D3" w:sz="4"/>
               <w:right w:val="single" w:color="D0D7D3" w:sz="4"/>
             </w:tcBorders>
-            <w:shd w:fill="F6F8F7" w:color="auto" w:val="clear"/>
             <w:tcMar>
               <w:top w:type="dxa" w:w="80"/>
               <w:left w:type="dxa" w:w="120"/>
@@ -780,6 +838,7 @@
               <w:bottom w:val="single" w:color="D0D7D3" w:sz="4"/>
               <w:right w:val="single" w:color="D0D7D3" w:sz="4"/>
             </w:tcBorders>
+            <w:shd w:fill="F6F8F7" w:color="auto" w:val="clear"/>
             <w:tcMar>
               <w:top w:type="dxa" w:w="80"/>
               <w:left w:type="dxa" w:w="120"/>
@@ -808,6 +867,7 @@
               <w:bottom w:val="single" w:color="D0D7D3" w:sz="4"/>
               <w:right w:val="single" w:color="D0D7D3" w:sz="4"/>
             </w:tcBorders>
+            <w:shd w:fill="F6F8F7" w:color="auto" w:val="clear"/>
             <w:tcMar>
               <w:top w:type="dxa" w:w="80"/>
               <w:left w:type="dxa" w:w="120"/>
@@ -838,7 +898,6 @@
               <w:bottom w:val="single" w:color="D0D7D3" w:sz="4"/>
               <w:right w:val="single" w:color="D0D7D3" w:sz="4"/>
             </w:tcBorders>
-            <w:shd w:fill="F6F8F7" w:color="auto" w:val="clear"/>
             <w:tcMar>
               <w:top w:type="dxa" w:w="80"/>
               <w:left w:type="dxa" w:w="120"/>
@@ -867,7 +926,6 @@
               <w:bottom w:val="single" w:color="D0D7D3" w:sz="4"/>
               <w:right w:val="single" w:color="D0D7D3" w:sz="4"/>
             </w:tcBorders>
-            <w:shd w:fill="F6F8F7" w:color="auto" w:val="clear"/>
             <w:tcMar>
               <w:top w:type="dxa" w:w="80"/>
               <w:left w:type="dxa" w:w="120"/>
@@ -4730,6 +4788,66 @@
                 <w:sz w:val="20"/>
                 <w:szCs w:val="20"/>
               </w:rPr>
+              <w:t xml:space="preserve">Writing off debt the school won’t collect: staff ask, only the proprietor approves</w:t>
+            </w:r>
+          </w:p>
+        </w:tc>
+      </w:tr>
+      <w:tr>
+        <w:tc>
+          <w:tcPr>
+            <w:tcW w:type="dxa" w:w="1800"/>
+            <w:tcBorders>
+              <w:top w:val="single" w:color="D0D7D3" w:sz="4"/>
+              <w:left w:val="single" w:color="D0D7D3" w:sz="4"/>
+              <w:bottom w:val="single" w:color="D0D7D3" w:sz="4"/>
+              <w:right w:val="single" w:color="D0D7D3" w:sz="4"/>
+            </w:tcBorders>
+            <w:shd w:fill="F6F8F7" w:color="auto" w:val="clear"/>
+            <w:tcMar>
+              <w:top w:type="dxa" w:w="80"/>
+              <w:left w:type="dxa" w:w="120"/>
+              <w:bottom w:type="dxa" w:w="80"/>
+              <w:right w:type="dxa" w:w="120"/>
+            </w:tcMar>
+          </w:tcPr>
+          <w:p>
+            <w:r>
+              <w:rPr>
+                <w:b w:val="false"/>
+                <w:bCs w:val="false"/>
+                <w:sz w:val="20"/>
+                <w:szCs w:val="20"/>
+              </w:rPr>
+              <w:t xml:space="preserve">24 Oct 2026</w:t>
+            </w:r>
+          </w:p>
+        </w:tc>
+        <w:tc>
+          <w:tcPr>
+            <w:tcW w:type="dxa" w:w="7838"/>
+            <w:tcBorders>
+              <w:top w:val="single" w:color="D0D7D3" w:sz="4"/>
+              <w:left w:val="single" w:color="D0D7D3" w:sz="4"/>
+              <w:bottom w:val="single" w:color="D0D7D3" w:sz="4"/>
+              <w:right w:val="single" w:color="D0D7D3" w:sz="4"/>
+            </w:tcBorders>
+            <w:shd w:fill="F6F8F7" w:color="auto" w:val="clear"/>
+            <w:tcMar>
+              <w:top w:type="dxa" w:w="80"/>
+              <w:left w:type="dxa" w:w="120"/>
+              <w:bottom w:type="dxa" w:w="80"/>
+              <w:right w:type="dxa" w:w="120"/>
+            </w:tcMar>
+          </w:tcPr>
+          <w:p>
+            <w:r>
+              <w:rPr>
+                <w:b w:val="false"/>
+                <w:bCs w:val="false"/>
+                <w:sz w:val="20"/>
+                <w:szCs w:val="20"/>
+              </w:rPr>
               <w:t xml:space="preserve">Paid into the bank: Paystack payouts matched to payments, with charges and anything missing</w:t>
             </w:r>
           </w:p>
@@ -4745,7 +4863,6 @@
               <w:bottom w:val="single" w:color="D0D7D3" w:sz="4"/>
               <w:right w:val="single" w:color="D0D7D3" w:sz="4"/>
             </w:tcBorders>
-            <w:shd w:fill="F6F8F7" w:color="auto" w:val="clear"/>
             <w:tcMar>
               <w:top w:type="dxa" w:w="80"/>
               <w:left w:type="dxa" w:w="120"/>
@@ -4774,7 +4891,6 @@
               <w:bottom w:val="single" w:color="D0D7D3" w:sz="4"/>
               <w:right w:val="single" w:color="D0D7D3" w:sz="4"/>
             </w:tcBorders>
-            <w:shd w:fill="F6F8F7" w:color="auto" w:val="clear"/>
             <w:tcMar>
               <w:top w:type="dxa" w:w="80"/>
               <w:left w:type="dxa" w:w="120"/>
@@ -4805,6 +4921,7 @@
               <w:bottom w:val="single" w:color="D0D7D3" w:sz="4"/>
               <w:right w:val="single" w:color="D0D7D3" w:sz="4"/>
             </w:tcBorders>
+            <w:shd w:fill="F6F8F7" w:color="auto" w:val="clear"/>
             <w:tcMar>
               <w:top w:type="dxa" w:w="80"/>
               <w:left w:type="dxa" w:w="120"/>
@@ -4833,6 +4950,7 @@
               <w:bottom w:val="single" w:color="D0D7D3" w:sz="4"/>
               <w:right w:val="single" w:color="D0D7D3" w:sz="4"/>
             </w:tcBorders>
+            <w:shd w:fill="F6F8F7" w:color="auto" w:val="clear"/>
             <w:tcMar>
               <w:top w:type="dxa" w:w="80"/>
               <w:left w:type="dxa" w:w="120"/>
@@ -4863,7 +4981,6 @@
               <w:bottom w:val="single" w:color="D0D7D3" w:sz="4"/>
               <w:right w:val="single" w:color="D0D7D3" w:sz="4"/>
             </w:tcBorders>
-            <w:shd w:fill="F6F8F7" w:color="auto" w:val="clear"/>
             <w:tcMar>
               <w:top w:type="dxa" w:w="80"/>
               <w:left w:type="dxa" w:w="120"/>
@@ -4892,7 +5009,6 @@
               <w:bottom w:val="single" w:color="D0D7D3" w:sz="4"/>
               <w:right w:val="single" w:color="D0D7D3" w:sz="4"/>
             </w:tcBorders>
-            <w:shd w:fill="F6F8F7" w:color="auto" w:val="clear"/>
             <w:tcMar>
               <w:top w:type="dxa" w:w="80"/>
               <w:left w:type="dxa" w:w="120"/>
@@ -4923,6 +5039,7 @@
               <w:bottom w:val="single" w:color="D0D7D3" w:sz="4"/>
               <w:right w:val="single" w:color="D0D7D3" w:sz="4"/>
             </w:tcBorders>
+            <w:shd w:fill="F6F8F7" w:color="auto" w:val="clear"/>
             <w:tcMar>
               <w:top w:type="dxa" w:w="80"/>
               <w:left w:type="dxa" w:w="120"/>
@@ -4951,6 +5068,7 @@
               <w:bottom w:val="single" w:color="D0D7D3" w:sz="4"/>
               <w:right w:val="single" w:color="D0D7D3" w:sz="4"/>
             </w:tcBorders>
+            <w:shd w:fill="F6F8F7" w:color="auto" w:val="clear"/>
             <w:tcMar>
               <w:top w:type="dxa" w:w="80"/>
               <w:left w:type="dxa" w:w="120"/>
@@ -4981,7 +5099,6 @@
               <w:bottom w:val="single" w:color="D0D7D3" w:sz="4"/>
               <w:right w:val="single" w:color="D0D7D3" w:sz="4"/>
             </w:tcBorders>
-            <w:shd w:fill="F6F8F7" w:color="auto" w:val="clear"/>
             <w:tcMar>
               <w:top w:type="dxa" w:w="80"/>
               <w:left w:type="dxa" w:w="120"/>
@@ -5010,7 +5127,6 @@
               <w:bottom w:val="single" w:color="D0D7D3" w:sz="4"/>
               <w:right w:val="single" w:color="D0D7D3" w:sz="4"/>
             </w:tcBorders>
-            <w:shd w:fill="F6F8F7" w:color="auto" w:val="clear"/>
             <w:tcMar>
               <w:top w:type="dxa" w:w="80"/>
               <w:left w:type="dxa" w:w="120"/>
@@ -5041,6 +5157,7 @@
               <w:bottom w:val="single" w:color="D0D7D3" w:sz="4"/>
               <w:right w:val="single" w:color="D0D7D3" w:sz="4"/>
             </w:tcBorders>
+            <w:shd w:fill="F6F8F7" w:color="auto" w:val="clear"/>
             <w:tcMar>
               <w:top w:type="dxa" w:w="80"/>
               <w:left w:type="dxa" w:w="120"/>
@@ -5069,6 +5186,7 @@
               <w:bottom w:val="single" w:color="D0D7D3" w:sz="4"/>
               <w:right w:val="single" w:color="D0D7D3" w:sz="4"/>
             </w:tcBorders>
+            <w:shd w:fill="F6F8F7" w:color="auto" w:val="clear"/>
             <w:tcMar>
               <w:top w:type="dxa" w:w="80"/>
               <w:left w:type="dxa" w:w="120"/>
@@ -5099,7 +5217,6 @@
               <w:bottom w:val="single" w:color="D0D7D3" w:sz="4"/>
               <w:right w:val="single" w:color="D0D7D3" w:sz="4"/>
             </w:tcBorders>
-            <w:shd w:fill="F6F8F7" w:color="auto" w:val="clear"/>
             <w:tcMar>
               <w:top w:type="dxa" w:w="80"/>
               <w:left w:type="dxa" w:w="120"/>
@@ -5128,7 +5245,6 @@
               <w:bottom w:val="single" w:color="D0D7D3" w:sz="4"/>
               <w:right w:val="single" w:color="D0D7D3" w:sz="4"/>
             </w:tcBorders>
-            <w:shd w:fill="F6F8F7" w:color="auto" w:val="clear"/>
             <w:tcMar>
               <w:top w:type="dxa" w:w="80"/>
               <w:left w:type="dxa" w:w="120"/>
@@ -5159,6 +5275,7 @@
               <w:bottom w:val="single" w:color="D0D7D3" w:sz="4"/>
               <w:right w:val="single" w:color="D0D7D3" w:sz="4"/>
             </w:tcBorders>
+            <w:shd w:fill="F6F8F7" w:color="auto" w:val="clear"/>
             <w:tcMar>
               <w:top w:type="dxa" w:w="80"/>
               <w:left w:type="dxa" w:w="120"/>
@@ -5187,6 +5304,7 @@
               <w:bottom w:val="single" w:color="D0D7D3" w:sz="4"/>
               <w:right w:val="single" w:color="D0D7D3" w:sz="4"/>
             </w:tcBorders>
+            <w:shd w:fill="F6F8F7" w:color="auto" w:val="clear"/>
             <w:tcMar>
               <w:top w:type="dxa" w:w="80"/>
               <w:left w:type="dxa" w:w="120"/>
@@ -5217,7 +5335,6 @@
               <w:bottom w:val="single" w:color="D0D7D3" w:sz="4"/>
               <w:right w:val="single" w:color="D0D7D3" w:sz="4"/>
             </w:tcBorders>
-            <w:shd w:fill="F6F8F7" w:color="auto" w:val="clear"/>
             <w:tcMar>
               <w:top w:type="dxa" w:w="80"/>
               <w:left w:type="dxa" w:w="120"/>
@@ -5246,7 +5363,6 @@
               <w:bottom w:val="single" w:color="D0D7D3" w:sz="4"/>
               <w:right w:val="single" w:color="D0D7D3" w:sz="4"/>
             </w:tcBorders>
-            <w:shd w:fill="F6F8F7" w:color="auto" w:val="clear"/>
             <w:tcMar>
               <w:top w:type="dxa" w:w="80"/>
               <w:left w:type="dxa" w:w="120"/>
@@ -5277,6 +5393,7 @@
               <w:bottom w:val="single" w:color="D0D7D3" w:sz="4"/>
               <w:right w:val="single" w:color="D0D7D3" w:sz="4"/>
             </w:tcBorders>
+            <w:shd w:fill="F6F8F7" w:color="auto" w:val="clear"/>
             <w:tcMar>
               <w:top w:type="dxa" w:w="80"/>
               <w:left w:type="dxa" w:w="120"/>
@@ -5305,6 +5422,7 @@
               <w:bottom w:val="single" w:color="D0D7D3" w:sz="4"/>
               <w:right w:val="single" w:color="D0D7D3" w:sz="4"/>
             </w:tcBorders>
+            <w:shd w:fill="F6F8F7" w:color="auto" w:val="clear"/>
             <w:tcMar>
               <w:top w:type="dxa" w:w="80"/>
               <w:left w:type="dxa" w:w="120"/>
@@ -5335,7 +5453,6 @@
               <w:bottom w:val="single" w:color="D0D7D3" w:sz="4"/>
               <w:right w:val="single" w:color="D0D7D3" w:sz="4"/>
             </w:tcBorders>
-            <w:shd w:fill="F6F8F7" w:color="auto" w:val="clear"/>
             <w:tcMar>
               <w:top w:type="dxa" w:w="80"/>
               <w:left w:type="dxa" w:w="120"/>
@@ -5364,7 +5481,6 @@
               <w:bottom w:val="single" w:color="D0D7D3" w:sz="4"/>
               <w:right w:val="single" w:color="D0D7D3" w:sz="4"/>
             </w:tcBorders>
-            <w:shd w:fill="F6F8F7" w:color="auto" w:val="clear"/>
             <w:tcMar>
               <w:top w:type="dxa" w:w="80"/>
               <w:left w:type="dxa" w:w="120"/>
@@ -5395,6 +5511,7 @@
               <w:bottom w:val="single" w:color="D0D7D3" w:sz="4"/>
               <w:right w:val="single" w:color="D0D7D3" w:sz="4"/>
             </w:tcBorders>
+            <w:shd w:fill="F6F8F7" w:color="auto" w:val="clear"/>
             <w:tcMar>
               <w:top w:type="dxa" w:w="80"/>
               <w:left w:type="dxa" w:w="120"/>
@@ -5423,6 +5540,7 @@
               <w:bottom w:val="single" w:color="D0D7D3" w:sz="4"/>
               <w:right w:val="single" w:color="D0D7D3" w:sz="4"/>
             </w:tcBorders>
+            <w:shd w:fill="F6F8F7" w:color="auto" w:val="clear"/>
             <w:tcMar>
               <w:top w:type="dxa" w:w="80"/>
               <w:left w:type="dxa" w:w="120"/>
@@ -5453,7 +5571,6 @@
               <w:bottom w:val="single" w:color="D0D7D3" w:sz="4"/>
               <w:right w:val="single" w:color="D0D7D3" w:sz="4"/>
             </w:tcBorders>
-            <w:shd w:fill="F6F8F7" w:color="auto" w:val="clear"/>
             <w:tcMar>
               <w:top w:type="dxa" w:w="80"/>
               <w:left w:type="dxa" w:w="120"/>
@@ -5482,7 +5599,6 @@
               <w:bottom w:val="single" w:color="D0D7D3" w:sz="4"/>
               <w:right w:val="single" w:color="D0D7D3" w:sz="4"/>
             </w:tcBorders>
-            <w:shd w:fill="F6F8F7" w:color="auto" w:val="clear"/>
             <w:tcMar>
               <w:top w:type="dxa" w:w="80"/>
               <w:left w:type="dxa" w:w="120"/>
@@ -5513,6 +5629,7 @@
               <w:bottom w:val="single" w:color="D0D7D3" w:sz="4"/>
               <w:right w:val="single" w:color="D0D7D3" w:sz="4"/>
             </w:tcBorders>
+            <w:shd w:fill="F6F8F7" w:color="auto" w:val="clear"/>
             <w:tcMar>
               <w:top w:type="dxa" w:w="80"/>
               <w:left w:type="dxa" w:w="120"/>
@@ -5541,6 +5658,7 @@
               <w:bottom w:val="single" w:color="D0D7D3" w:sz="4"/>
               <w:right w:val="single" w:color="D0D7D3" w:sz="4"/>
             </w:tcBorders>
+            <w:shd w:fill="F6F8F7" w:color="auto" w:val="clear"/>
             <w:tcMar>
               <w:top w:type="dxa" w:w="80"/>
               <w:left w:type="dxa" w:w="120"/>
@@ -5571,7 +5689,6 @@
               <w:bottom w:val="single" w:color="D0D7D3" w:sz="4"/>
               <w:right w:val="single" w:color="D0D7D3" w:sz="4"/>
             </w:tcBorders>
-            <w:shd w:fill="F6F8F7" w:color="auto" w:val="clear"/>
             <w:tcMar>
               <w:top w:type="dxa" w:w="80"/>
               <w:left w:type="dxa" w:w="120"/>
@@ -5600,7 +5717,6 @@
               <w:bottom w:val="single" w:color="D0D7D3" w:sz="4"/>
               <w:right w:val="single" w:color="D0D7D3" w:sz="4"/>
             </w:tcBorders>
-            <w:shd w:fill="F6F8F7" w:color="auto" w:val="clear"/>
             <w:tcMar>
               <w:top w:type="dxa" w:w="80"/>
               <w:left w:type="dxa" w:w="120"/>
@@ -5631,6 +5747,7 @@
               <w:bottom w:val="single" w:color="D0D7D3" w:sz="4"/>
               <w:right w:val="single" w:color="D0D7D3" w:sz="4"/>
             </w:tcBorders>
+            <w:shd w:fill="F6F8F7" w:color="auto" w:val="clear"/>
             <w:tcMar>
               <w:top w:type="dxa" w:w="80"/>
               <w:left w:type="dxa" w:w="120"/>
@@ -5659,6 +5776,7 @@
               <w:bottom w:val="single" w:color="D0D7D3" w:sz="4"/>
               <w:right w:val="single" w:color="D0D7D3" w:sz="4"/>
             </w:tcBorders>
+            <w:shd w:fill="F6F8F7" w:color="auto" w:val="clear"/>
             <w:tcMar>
               <w:top w:type="dxa" w:w="80"/>
               <w:left w:type="dxa" w:w="120"/>
@@ -5689,7 +5807,6 @@
               <w:bottom w:val="single" w:color="D0D7D3" w:sz="4"/>
               <w:right w:val="single" w:color="D0D7D3" w:sz="4"/>
             </w:tcBorders>
-            <w:shd w:fill="F6F8F7" w:color="auto" w:val="clear"/>
             <w:tcMar>
               <w:top w:type="dxa" w:w="80"/>
               <w:left w:type="dxa" w:w="120"/>
@@ -5718,7 +5835,6 @@
               <w:bottom w:val="single" w:color="D0D7D3" w:sz="4"/>
               <w:right w:val="single" w:color="D0D7D3" w:sz="4"/>
             </w:tcBorders>
-            <w:shd w:fill="F6F8F7" w:color="auto" w:val="clear"/>
             <w:tcMar>
               <w:top w:type="dxa" w:w="80"/>
               <w:left w:type="dxa" w:w="120"/>
@@ -5749,6 +5865,7 @@
               <w:bottom w:val="single" w:color="D0D7D3" w:sz="4"/>
               <w:right w:val="single" w:color="D0D7D3" w:sz="4"/>
             </w:tcBorders>
+            <w:shd w:fill="F6F8F7" w:color="auto" w:val="clear"/>
             <w:tcMar>
               <w:top w:type="dxa" w:w="80"/>
               <w:left w:type="dxa" w:w="120"/>
@@ -5777,6 +5894,7 @@
               <w:bottom w:val="single" w:color="D0D7D3" w:sz="4"/>
               <w:right w:val="single" w:color="D0D7D3" w:sz="4"/>
             </w:tcBorders>
+            <w:shd w:fill="F6F8F7" w:color="auto" w:val="clear"/>
             <w:tcMar>
               <w:top w:type="dxa" w:w="80"/>
               <w:left w:type="dxa" w:w="120"/>
@@ -5807,7 +5925,6 @@
               <w:bottom w:val="single" w:color="D0D7D3" w:sz="4"/>
               <w:right w:val="single" w:color="D0D7D3" w:sz="4"/>
             </w:tcBorders>
-            <w:shd w:fill="F6F8F7" w:color="auto" w:val="clear"/>
             <w:tcMar>
               <w:top w:type="dxa" w:w="80"/>
               <w:left w:type="dxa" w:w="120"/>
@@ -5836,7 +5953,6 @@
               <w:bottom w:val="single" w:color="D0D7D3" w:sz="4"/>
               <w:right w:val="single" w:color="D0D7D3" w:sz="4"/>
             </w:tcBorders>
-            <w:shd w:fill="F6F8F7" w:color="auto" w:val="clear"/>
             <w:tcMar>
               <w:top w:type="dxa" w:w="80"/>
               <w:left w:type="dxa" w:w="120"/>
@@ -5867,6 +5983,7 @@
               <w:bottom w:val="single" w:color="D0D7D3" w:sz="4"/>
               <w:right w:val="single" w:color="D0D7D3" w:sz="4"/>
             </w:tcBorders>
+            <w:shd w:fill="F6F8F7" w:color="auto" w:val="clear"/>
             <w:tcMar>
               <w:top w:type="dxa" w:w="80"/>
               <w:left w:type="dxa" w:w="120"/>
@@ -5895,6 +6012,7 @@
               <w:bottom w:val="single" w:color="D0D7D3" w:sz="4"/>
               <w:right w:val="single" w:color="D0D7D3" w:sz="4"/>
             </w:tcBorders>
+            <w:shd w:fill="F6F8F7" w:color="auto" w:val="clear"/>
             <w:tcMar>
               <w:top w:type="dxa" w:w="80"/>
               <w:left w:type="dxa" w:w="120"/>
@@ -5925,7 +6043,6 @@
               <w:bottom w:val="single" w:color="D0D7D3" w:sz="4"/>
               <w:right w:val="single" w:color="D0D7D3" w:sz="4"/>
             </w:tcBorders>
-            <w:shd w:fill="F6F8F7" w:color="auto" w:val="clear"/>
             <w:tcMar>
               <w:top w:type="dxa" w:w="80"/>
               <w:left w:type="dxa" w:w="120"/>
@@ -5954,7 +6071,6 @@
               <w:bottom w:val="single" w:color="D0D7D3" w:sz="4"/>
               <w:right w:val="single" w:color="D0D7D3" w:sz="4"/>
             </w:tcBorders>
-            <w:shd w:fill="F6F8F7" w:color="auto" w:val="clear"/>
             <w:tcMar>
               <w:top w:type="dxa" w:w="80"/>
               <w:left w:type="dxa" w:w="120"/>
@@ -5985,6 +6101,7 @@
               <w:bottom w:val="single" w:color="D0D7D3" w:sz="4"/>
               <w:right w:val="single" w:color="D0D7D3" w:sz="4"/>
             </w:tcBorders>
+            <w:shd w:fill="F6F8F7" w:color="auto" w:val="clear"/>
             <w:tcMar>
               <w:top w:type="dxa" w:w="80"/>
               <w:left w:type="dxa" w:w="120"/>
@@ -6013,6 +6130,7 @@
               <w:bottom w:val="single" w:color="D0D7D3" w:sz="4"/>
               <w:right w:val="single" w:color="D0D7D3" w:sz="4"/>
             </w:tcBorders>
+            <w:shd w:fill="F6F8F7" w:color="auto" w:val="clear"/>
             <w:tcMar>
               <w:top w:type="dxa" w:w="80"/>
               <w:left w:type="dxa" w:w="120"/>
@@ -6043,7 +6161,6 @@
               <w:bottom w:val="single" w:color="D0D7D3" w:sz="4"/>
               <w:right w:val="single" w:color="D0D7D3" w:sz="4"/>
             </w:tcBorders>
-            <w:shd w:fill="F6F8F7" w:color="auto" w:val="clear"/>
             <w:tcMar>
               <w:top w:type="dxa" w:w="80"/>
               <w:left w:type="dxa" w:w="120"/>
@@ -6072,7 +6189,6 @@
               <w:bottom w:val="single" w:color="D0D7D3" w:sz="4"/>
               <w:right w:val="single" w:color="D0D7D3" w:sz="4"/>
             </w:tcBorders>
-            <w:shd w:fill="F6F8F7" w:color="auto" w:val="clear"/>
             <w:tcMar>
               <w:top w:type="dxa" w:w="80"/>
               <w:left w:type="dxa" w:w="120"/>
@@ -6103,6 +6219,7 @@
               <w:bottom w:val="single" w:color="D0D7D3" w:sz="4"/>
               <w:right w:val="single" w:color="D0D7D3" w:sz="4"/>
             </w:tcBorders>
+            <w:shd w:fill="F6F8F7" w:color="auto" w:val="clear"/>
             <w:tcMar>
               <w:top w:type="dxa" w:w="80"/>
               <w:left w:type="dxa" w:w="120"/>
@@ -6131,6 +6248,7 @@
               <w:bottom w:val="single" w:color="D0D7D3" w:sz="4"/>
               <w:right w:val="single" w:color="D0D7D3" w:sz="4"/>
             </w:tcBorders>
+            <w:shd w:fill="F6F8F7" w:color="auto" w:val="clear"/>
             <w:tcMar>
               <w:top w:type="dxa" w:w="80"/>
               <w:left w:type="dxa" w:w="120"/>
@@ -6161,7 +6279,6 @@
               <w:bottom w:val="single" w:color="D0D7D3" w:sz="4"/>
               <w:right w:val="single" w:color="D0D7D3" w:sz="4"/>
             </w:tcBorders>
-            <w:shd w:fill="F6F8F7" w:color="auto" w:val="clear"/>
             <w:tcMar>
               <w:top w:type="dxa" w:w="80"/>
               <w:left w:type="dxa" w:w="120"/>
@@ -6190,7 +6307,6 @@
               <w:bottom w:val="single" w:color="D0D7D3" w:sz="4"/>
               <w:right w:val="single" w:color="D0D7D3" w:sz="4"/>
             </w:tcBorders>
-            <w:shd w:fill="F6F8F7" w:color="auto" w:val="clear"/>
             <w:tcMar>
               <w:top w:type="dxa" w:w="80"/>
               <w:left w:type="dxa" w:w="120"/>
@@ -6221,6 +6337,7 @@
               <w:bottom w:val="single" w:color="D0D7D3" w:sz="4"/>
               <w:right w:val="single" w:color="D0D7D3" w:sz="4"/>
             </w:tcBorders>
+            <w:shd w:fill="F6F8F7" w:color="auto" w:val="clear"/>
             <w:tcMar>
               <w:top w:type="dxa" w:w="80"/>
               <w:left w:type="dxa" w:w="120"/>
@@ -6249,6 +6366,7 @@
               <w:bottom w:val="single" w:color="D0D7D3" w:sz="4"/>
               <w:right w:val="single" w:color="D0D7D3" w:sz="4"/>
             </w:tcBorders>
+            <w:shd w:fill="F6F8F7" w:color="auto" w:val="clear"/>
             <w:tcMar>
               <w:top w:type="dxa" w:w="80"/>
               <w:left w:type="dxa" w:w="120"/>
@@ -6279,7 +6397,6 @@
               <w:bottom w:val="single" w:color="D0D7D3" w:sz="4"/>
               <w:right w:val="single" w:color="D0D7D3" w:sz="4"/>
             </w:tcBorders>
-            <w:shd w:fill="F6F8F7" w:color="auto" w:val="clear"/>
             <w:tcMar>
               <w:top w:type="dxa" w:w="80"/>
               <w:left w:type="dxa" w:w="120"/>
@@ -6308,7 +6425,6 @@
               <w:bottom w:val="single" w:color="D0D7D3" w:sz="4"/>
               <w:right w:val="single" w:color="D0D7D3" w:sz="4"/>
             </w:tcBorders>
-            <w:shd w:fill="F6F8F7" w:color="auto" w:val="clear"/>
             <w:tcMar>
               <w:top w:type="dxa" w:w="80"/>
               <w:left w:type="dxa" w:w="120"/>
@@ -6339,6 +6455,7 @@
               <w:bottom w:val="single" w:color="D0D7D3" w:sz="4"/>
               <w:right w:val="single" w:color="D0D7D3" w:sz="4"/>
             </w:tcBorders>
+            <w:shd w:fill="F6F8F7" w:color="auto" w:val="clear"/>
             <w:tcMar>
               <w:top w:type="dxa" w:w="80"/>
               <w:left w:type="dxa" w:w="120"/>
@@ -6367,6 +6484,7 @@
               <w:bottom w:val="single" w:color="D0D7D3" w:sz="4"/>
               <w:right w:val="single" w:color="D0D7D3" w:sz="4"/>
             </w:tcBorders>
+            <w:shd w:fill="F6F8F7" w:color="auto" w:val="clear"/>
             <w:tcMar>
               <w:top w:type="dxa" w:w="80"/>
               <w:left w:type="dxa" w:w="120"/>
@@ -6397,7 +6515,6 @@
               <w:bottom w:val="single" w:color="D0D7D3" w:sz="4"/>
               <w:right w:val="single" w:color="D0D7D3" w:sz="4"/>
             </w:tcBorders>
-            <w:shd w:fill="F6F8F7" w:color="auto" w:val="clear"/>
             <w:tcMar>
               <w:top w:type="dxa" w:w="80"/>
               <w:left w:type="dxa" w:w="120"/>
@@ -6426,7 +6543,6 @@
               <w:bottom w:val="single" w:color="D0D7D3" w:sz="4"/>
               <w:right w:val="single" w:color="D0D7D3" w:sz="4"/>
             </w:tcBorders>
-            <w:shd w:fill="F6F8F7" w:color="auto" w:val="clear"/>
             <w:tcMar>
               <w:top w:type="dxa" w:w="80"/>
               <w:left w:type="dxa" w:w="120"/>
@@ -6457,6 +6573,7 @@
               <w:bottom w:val="single" w:color="D0D7D3" w:sz="4"/>
               <w:right w:val="single" w:color="D0D7D3" w:sz="4"/>
             </w:tcBorders>
+            <w:shd w:fill="F6F8F7" w:color="auto" w:val="clear"/>
             <w:tcMar>
               <w:top w:type="dxa" w:w="80"/>
               <w:left w:type="dxa" w:w="120"/>
@@ -6485,6 +6602,7 @@
               <w:bottom w:val="single" w:color="D0D7D3" w:sz="4"/>
               <w:right w:val="single" w:color="D0D7D3" w:sz="4"/>
             </w:tcBorders>
+            <w:shd w:fill="F6F8F7" w:color="auto" w:val="clear"/>
             <w:tcMar>
               <w:top w:type="dxa" w:w="80"/>
               <w:left w:type="dxa" w:w="120"/>
@@ -6515,7 +6633,6 @@
               <w:bottom w:val="single" w:color="D0D7D3" w:sz="4"/>
               <w:right w:val="single" w:color="D0D7D3" w:sz="4"/>
             </w:tcBorders>
-            <w:shd w:fill="F6F8F7" w:color="auto" w:val="clear"/>
             <w:tcMar>
               <w:top w:type="dxa" w:w="80"/>
               <w:left w:type="dxa" w:w="120"/>
@@ -6544,7 +6661,6 @@
               <w:bottom w:val="single" w:color="D0D7D3" w:sz="4"/>
               <w:right w:val="single" w:color="D0D7D3" w:sz="4"/>
             </w:tcBorders>
-            <w:shd w:fill="F6F8F7" w:color="auto" w:val="clear"/>
             <w:tcMar>
               <w:top w:type="dxa" w:w="80"/>
               <w:left w:type="dxa" w:w="120"/>
@@ -6575,6 +6691,7 @@
               <w:bottom w:val="single" w:color="D0D7D3" w:sz="4"/>
               <w:right w:val="single" w:color="D0D7D3" w:sz="4"/>
             </w:tcBorders>
+            <w:shd w:fill="F6F8F7" w:color="auto" w:val="clear"/>
             <w:tcMar>
               <w:top w:type="dxa" w:w="80"/>
               <w:left w:type="dxa" w:w="120"/>
@@ -6603,6 +6720,7 @@
               <w:bottom w:val="single" w:color="D0D7D3" w:sz="4"/>
               <w:right w:val="single" w:color="D0D7D3" w:sz="4"/>
             </w:tcBorders>
+            <w:shd w:fill="F6F8F7" w:color="auto" w:val="clear"/>
             <w:tcMar>
               <w:top w:type="dxa" w:w="80"/>
               <w:left w:type="dxa" w:w="120"/>
@@ -6633,7 +6751,6 @@
               <w:bottom w:val="single" w:color="D0D7D3" w:sz="4"/>
               <w:right w:val="single" w:color="D0D7D3" w:sz="4"/>
             </w:tcBorders>
-            <w:shd w:fill="F6F8F7" w:color="auto" w:val="clear"/>
             <w:tcMar>
               <w:top w:type="dxa" w:w="80"/>
               <w:left w:type="dxa" w:w="120"/>
@@ -6662,7 +6779,6 @@
               <w:bottom w:val="single" w:color="D0D7D3" w:sz="4"/>
               <w:right w:val="single" w:color="D0D7D3" w:sz="4"/>
             </w:tcBorders>
-            <w:shd w:fill="F6F8F7" w:color="auto" w:val="clear"/>
             <w:tcMar>
               <w:top w:type="dxa" w:w="80"/>
               <w:left w:type="dxa" w:w="120"/>
@@ -6693,6 +6809,7 @@
               <w:bottom w:val="single" w:color="D0D7D3" w:sz="4"/>
               <w:right w:val="single" w:color="D0D7D3" w:sz="4"/>
             </w:tcBorders>
+            <w:shd w:fill="F6F8F7" w:color="auto" w:val="clear"/>
             <w:tcMar>
               <w:top w:type="dxa" w:w="80"/>
               <w:left w:type="dxa" w:w="120"/>
@@ -6721,6 +6838,7 @@
               <w:bottom w:val="single" w:color="D0D7D3" w:sz="4"/>
               <w:right w:val="single" w:color="D0D7D3" w:sz="4"/>
             </w:tcBorders>
+            <w:shd w:fill="F6F8F7" w:color="auto" w:val="clear"/>
             <w:tcMar>
               <w:top w:type="dxa" w:w="80"/>
               <w:left w:type="dxa" w:w="120"/>
@@ -6751,7 +6869,6 @@
               <w:bottom w:val="single" w:color="D0D7D3" w:sz="4"/>
               <w:right w:val="single" w:color="D0D7D3" w:sz="4"/>
             </w:tcBorders>
-            <w:shd w:fill="F6F8F7" w:color="auto" w:val="clear"/>
             <w:tcMar>
               <w:top w:type="dxa" w:w="80"/>
               <w:left w:type="dxa" w:w="120"/>
@@ -6780,7 +6897,6 @@
               <w:bottom w:val="single" w:color="D0D7D3" w:sz="4"/>
               <w:right w:val="single" w:color="D0D7D3" w:sz="4"/>
             </w:tcBorders>
-            <w:shd w:fill="F6F8F7" w:color="auto" w:val="clear"/>
             <w:tcMar>
               <w:top w:type="dxa" w:w="80"/>
               <w:left w:type="dxa" w:w="120"/>
@@ -6811,6 +6927,7 @@
               <w:bottom w:val="single" w:color="D0D7D3" w:sz="4"/>
               <w:right w:val="single" w:color="D0D7D3" w:sz="4"/>
             </w:tcBorders>
+            <w:shd w:fill="F6F8F7" w:color="auto" w:val="clear"/>
             <w:tcMar>
               <w:top w:type="dxa" w:w="80"/>
               <w:left w:type="dxa" w:w="120"/>
@@ -6839,6 +6956,7 @@
               <w:bottom w:val="single" w:color="D0D7D3" w:sz="4"/>
               <w:right w:val="single" w:color="D0D7D3" w:sz="4"/>
             </w:tcBorders>
+            <w:shd w:fill="F6F8F7" w:color="auto" w:val="clear"/>
             <w:tcMar>
               <w:top w:type="dxa" w:w="80"/>
               <w:left w:type="dxa" w:w="120"/>
@@ -6869,7 +6987,6 @@
               <w:bottom w:val="single" w:color="D0D7D3" w:sz="4"/>
               <w:right w:val="single" w:color="D0D7D3" w:sz="4"/>
             </w:tcBorders>
-            <w:shd w:fill="F6F8F7" w:color="auto" w:val="clear"/>
             <w:tcMar>
               <w:top w:type="dxa" w:w="80"/>
               <w:left w:type="dxa" w:w="120"/>
@@ -6898,7 +7015,6 @@
               <w:bottom w:val="single" w:color="D0D7D3" w:sz="4"/>
               <w:right w:val="single" w:color="D0D7D3" w:sz="4"/>
             </w:tcBorders>
-            <w:shd w:fill="F6F8F7" w:color="auto" w:val="clear"/>
             <w:tcMar>
               <w:top w:type="dxa" w:w="80"/>
               <w:left w:type="dxa" w:w="120"/>
@@ -6929,6 +7045,7 @@
               <w:bottom w:val="single" w:color="D0D7D3" w:sz="4"/>
               <w:right w:val="single" w:color="D0D7D3" w:sz="4"/>
             </w:tcBorders>
+            <w:shd w:fill="F6F8F7" w:color="auto" w:val="clear"/>
             <w:tcMar>
               <w:top w:type="dxa" w:w="80"/>
               <w:left w:type="dxa" w:w="120"/>
@@ -6957,6 +7074,7 @@
               <w:bottom w:val="single" w:color="D0D7D3" w:sz="4"/>
               <w:right w:val="single" w:color="D0D7D3" w:sz="4"/>
             </w:tcBorders>
+            <w:shd w:fill="F6F8F7" w:color="auto" w:val="clear"/>
             <w:tcMar>
               <w:top w:type="dxa" w:w="80"/>
               <w:left w:type="dxa" w:w="120"/>
@@ -6987,7 +7105,6 @@
               <w:bottom w:val="single" w:color="D0D7D3" w:sz="4"/>
               <w:right w:val="single" w:color="D0D7D3" w:sz="4"/>
             </w:tcBorders>
-            <w:shd w:fill="F6F8F7" w:color="auto" w:val="clear"/>
             <w:tcMar>
               <w:top w:type="dxa" w:w="80"/>
               <w:left w:type="dxa" w:w="120"/>
@@ -7016,7 +7133,6 @@
               <w:bottom w:val="single" w:color="D0D7D3" w:sz="4"/>
               <w:right w:val="single" w:color="D0D7D3" w:sz="4"/>
             </w:tcBorders>
-            <w:shd w:fill="F6F8F7" w:color="auto" w:val="clear"/>
             <w:tcMar>
               <w:top w:type="dxa" w:w="80"/>
               <w:left w:type="dxa" w:w="120"/>
@@ -7047,6 +7163,7 @@
               <w:bottom w:val="single" w:color="D0D7D3" w:sz="4"/>
               <w:right w:val="single" w:color="D0D7D3" w:sz="4"/>
             </w:tcBorders>
+            <w:shd w:fill="F6F8F7" w:color="auto" w:val="clear"/>
             <w:tcMar>
               <w:top w:type="dxa" w:w="80"/>
               <w:left w:type="dxa" w:w="120"/>
@@ -7075,6 +7192,7 @@
               <w:bottom w:val="single" w:color="D0D7D3" w:sz="4"/>
               <w:right w:val="single" w:color="D0D7D3" w:sz="4"/>
             </w:tcBorders>
+            <w:shd w:fill="F6F8F7" w:color="auto" w:val="clear"/>
             <w:tcMar>
               <w:top w:type="dxa" w:w="80"/>
               <w:left w:type="dxa" w:w="120"/>
@@ -7105,7 +7223,6 @@
               <w:bottom w:val="single" w:color="D0D7D3" w:sz="4"/>
               <w:right w:val="single" w:color="D0D7D3" w:sz="4"/>
             </w:tcBorders>
-            <w:shd w:fill="F6F8F7" w:color="auto" w:val="clear"/>
             <w:tcMar>
               <w:top w:type="dxa" w:w="80"/>
               <w:left w:type="dxa" w:w="120"/>
@@ -7134,7 +7251,6 @@
               <w:bottom w:val="single" w:color="D0D7D3" w:sz="4"/>
               <w:right w:val="single" w:color="D0D7D3" w:sz="4"/>
             </w:tcBorders>
-            <w:shd w:fill="F6F8F7" w:color="auto" w:val="clear"/>
             <w:tcMar>
               <w:top w:type="dxa" w:w="80"/>
               <w:left w:type="dxa" w:w="120"/>
@@ -7165,6 +7281,7 @@
               <w:bottom w:val="single" w:color="D0D7D3" w:sz="4"/>
               <w:right w:val="single" w:color="D0D7D3" w:sz="4"/>
             </w:tcBorders>
+            <w:shd w:fill="F6F8F7" w:color="auto" w:val="clear"/>
             <w:tcMar>
               <w:top w:type="dxa" w:w="80"/>
               <w:left w:type="dxa" w:w="120"/>
@@ -7193,6 +7310,7 @@
               <w:bottom w:val="single" w:color="D0D7D3" w:sz="4"/>
               <w:right w:val="single" w:color="D0D7D3" w:sz="4"/>
             </w:tcBorders>
+            <w:shd w:fill="F6F8F7" w:color="auto" w:val="clear"/>
             <w:tcMar>
               <w:top w:type="dxa" w:w="80"/>
               <w:left w:type="dxa" w:w="120"/>
@@ -7223,7 +7341,6 @@
               <w:bottom w:val="single" w:color="D0D7D3" w:sz="4"/>
               <w:right w:val="single" w:color="D0D7D3" w:sz="4"/>
             </w:tcBorders>
-            <w:shd w:fill="F6F8F7" w:color="auto" w:val="clear"/>
             <w:tcMar>
               <w:top w:type="dxa" w:w="80"/>
               <w:left w:type="dxa" w:w="120"/>
@@ -7252,7 +7369,6 @@
               <w:bottom w:val="single" w:color="D0D7D3" w:sz="4"/>
               <w:right w:val="single" w:color="D0D7D3" w:sz="4"/>
             </w:tcBorders>
-            <w:shd w:fill="F6F8F7" w:color="auto" w:val="clear"/>
             <w:tcMar>
               <w:top w:type="dxa" w:w="80"/>
               <w:left w:type="dxa" w:w="120"/>
@@ -7283,6 +7399,7 @@
               <w:bottom w:val="single" w:color="D0D7D3" w:sz="4"/>
               <w:right w:val="single" w:color="D0D7D3" w:sz="4"/>
             </w:tcBorders>
+            <w:shd w:fill="F6F8F7" w:color="auto" w:val="clear"/>
             <w:tcMar>
               <w:top w:type="dxa" w:w="80"/>
               <w:left w:type="dxa" w:w="120"/>
@@ -7311,6 +7428,7 @@
               <w:bottom w:val="single" w:color="D0D7D3" w:sz="4"/>
               <w:right w:val="single" w:color="D0D7D3" w:sz="4"/>
             </w:tcBorders>
+            <w:shd w:fill="F6F8F7" w:color="auto" w:val="clear"/>
             <w:tcMar>
               <w:top w:type="dxa" w:w="80"/>
               <w:left w:type="dxa" w:w="120"/>
@@ -7341,7 +7459,6 @@
               <w:bottom w:val="single" w:color="D0D7D3" w:sz="4"/>
               <w:right w:val="single" w:color="D0D7D3" w:sz="4"/>
             </w:tcBorders>
-            <w:shd w:fill="F6F8F7" w:color="auto" w:val="clear"/>
             <w:tcMar>
               <w:top w:type="dxa" w:w="80"/>
               <w:left w:type="dxa" w:w="120"/>
@@ -7370,7 +7487,6 @@
               <w:bottom w:val="single" w:color="D0D7D3" w:sz="4"/>
               <w:right w:val="single" w:color="D0D7D3" w:sz="4"/>
             </w:tcBorders>
-            <w:shd w:fill="F6F8F7" w:color="auto" w:val="clear"/>
             <w:tcMar>
               <w:top w:type="dxa" w:w="80"/>
               <w:left w:type="dxa" w:w="120"/>
@@ -7401,6 +7517,7 @@
               <w:bottom w:val="single" w:color="D0D7D3" w:sz="4"/>
               <w:right w:val="single" w:color="D0D7D3" w:sz="4"/>
             </w:tcBorders>
+            <w:shd w:fill="F6F8F7" w:color="auto" w:val="clear"/>
             <w:tcMar>
               <w:top w:type="dxa" w:w="80"/>
               <w:left w:type="dxa" w:w="120"/>
@@ -7429,6 +7546,7 @@
               <w:bottom w:val="single" w:color="D0D7D3" w:sz="4"/>
               <w:right w:val="single" w:color="D0D7D3" w:sz="4"/>
             </w:tcBorders>
+            <w:shd w:fill="F6F8F7" w:color="auto" w:val="clear"/>
             <w:tcMar>
               <w:top w:type="dxa" w:w="80"/>
               <w:left w:type="dxa" w:w="120"/>
@@ -7459,7 +7577,6 @@
               <w:bottom w:val="single" w:color="D0D7D3" w:sz="4"/>
               <w:right w:val="single" w:color="D0D7D3" w:sz="4"/>
             </w:tcBorders>
-            <w:shd w:fill="F6F8F7" w:color="auto" w:val="clear"/>
             <w:tcMar>
               <w:top w:type="dxa" w:w="80"/>
               <w:left w:type="dxa" w:w="120"/>
@@ -7488,7 +7605,6 @@
               <w:bottom w:val="single" w:color="D0D7D3" w:sz="4"/>
               <w:right w:val="single" w:color="D0D7D3" w:sz="4"/>
             </w:tcBorders>
-            <w:shd w:fill="F6F8F7" w:color="auto" w:val="clear"/>
             <w:tcMar>
               <w:top w:type="dxa" w:w="80"/>
               <w:left w:type="dxa" w:w="120"/>

</xml_diff>

<commit_message>
Unusual activity for the proprietor: where school money usually goes missing, with who recorded it
</commit_message>
<xml_diff>
--- a/docs/product/WardPay - what it does.docx
+++ b/docs/product/WardPay - what it does.docx
@@ -264,6 +264,65 @@
                 <w:sz w:val="20"/>
                 <w:szCs w:val="20"/>
               </w:rPr>
+              <w:t xml:space="preserve">Unusual activity: reversals, cash entered late, short drawer counts, bills cut or voided, spending entered twice, each with who recorded it</w:t>
+            </w:r>
+          </w:p>
+        </w:tc>
+        <w:tc>
+          <w:tcPr>
+            <w:tcW w:type="dxa" w:w="4238"/>
+            <w:tcBorders>
+              <w:top w:val="single" w:color="D0D7D3" w:sz="4"/>
+              <w:left w:val="single" w:color="D0D7D3" w:sz="4"/>
+              <w:bottom w:val="single" w:color="D0D7D3" w:sz="4"/>
+              <w:right w:val="single" w:color="D0D7D3" w:sz="4"/>
+            </w:tcBorders>
+            <w:shd w:fill="F6F8F7" w:color="auto" w:val="clear"/>
+            <w:tcMar>
+              <w:top w:type="dxa" w:w="80"/>
+              <w:left w:type="dxa" w:w="120"/>
+              <w:bottom w:type="dxa" w:w="80"/>
+              <w:right w:type="dxa" w:w="120"/>
+            </w:tcMar>
+          </w:tcPr>
+          <w:p>
+            <w:r>
+              <w:rPr>
+                <w:b w:val="false"/>
+                <w:bCs w:val="false"/>
+                <w:sz w:val="20"/>
+                <w:szCs w:val="20"/>
+              </w:rPr>
+              <w:t xml:space="preserve">See the warning signs of missing money early, without auditing every entry yourself</w:t>
+            </w:r>
+          </w:p>
+        </w:tc>
+      </w:tr>
+      <w:tr>
+        <w:tc>
+          <w:tcPr>
+            <w:tcW w:type="dxa" w:w="5400"/>
+            <w:tcBorders>
+              <w:top w:val="single" w:color="D0D7D3" w:sz="4"/>
+              <w:left w:val="single" w:color="D0D7D3" w:sz="4"/>
+              <w:bottom w:val="single" w:color="D0D7D3" w:sz="4"/>
+              <w:right w:val="single" w:color="D0D7D3" w:sz="4"/>
+            </w:tcBorders>
+            <w:tcMar>
+              <w:top w:type="dxa" w:w="80"/>
+              <w:left w:type="dxa" w:w="120"/>
+              <w:bottom w:type="dxa" w:w="80"/>
+              <w:right w:type="dxa" w:w="120"/>
+            </w:tcMar>
+          </w:tcPr>
+          <w:p>
+            <w:r>
+              <w:rPr>
+                <w:b w:val="false"/>
+                <w:bCs w:val="false"/>
+                <w:sz w:val="20"/>
+                <w:szCs w:val="20"/>
+              </w:rPr>
               <w:t xml:space="preserve">Write off debt the school won’t collect: staff can ask, only you approve</w:t>
             </w:r>
           </w:p>
@@ -277,7 +336,6 @@
               <w:bottom w:val="single" w:color="D0D7D3" w:sz="4"/>
               <w:right w:val="single" w:color="D0D7D3" w:sz="4"/>
             </w:tcBorders>
-            <w:shd w:fill="F6F8F7" w:color="auto" w:val="clear"/>
             <w:tcMar>
               <w:top w:type="dxa" w:w="80"/>
               <w:left w:type="dxa" w:w="120"/>
@@ -308,6 +366,7 @@
               <w:bottom w:val="single" w:color="D0D7D3" w:sz="4"/>
               <w:right w:val="single" w:color="D0D7D3" w:sz="4"/>
             </w:tcBorders>
+            <w:shd w:fill="F6F8F7" w:color="auto" w:val="clear"/>
             <w:tcMar>
               <w:top w:type="dxa" w:w="80"/>
               <w:left w:type="dxa" w:w="120"/>
@@ -336,6 +395,7 @@
               <w:bottom w:val="single" w:color="D0D7D3" w:sz="4"/>
               <w:right w:val="single" w:color="D0D7D3" w:sz="4"/>
             </w:tcBorders>
+            <w:shd w:fill="F6F8F7" w:color="auto" w:val="clear"/>
             <w:tcMar>
               <w:top w:type="dxa" w:w="80"/>
               <w:left w:type="dxa" w:w="120"/>
@@ -366,7 +426,6 @@
               <w:bottom w:val="single" w:color="D0D7D3" w:sz="4"/>
               <w:right w:val="single" w:color="D0D7D3" w:sz="4"/>
             </w:tcBorders>
-            <w:shd w:fill="F6F8F7" w:color="auto" w:val="clear"/>
             <w:tcMar>
               <w:top w:type="dxa" w:w="80"/>
               <w:left w:type="dxa" w:w="120"/>
@@ -395,7 +454,6 @@
               <w:bottom w:val="single" w:color="D0D7D3" w:sz="4"/>
               <w:right w:val="single" w:color="D0D7D3" w:sz="4"/>
             </w:tcBorders>
-            <w:shd w:fill="F6F8F7" w:color="auto" w:val="clear"/>
             <w:tcMar>
               <w:top w:type="dxa" w:w="80"/>
               <w:left w:type="dxa" w:w="120"/>
@@ -426,6 +484,7 @@
               <w:bottom w:val="single" w:color="D0D7D3" w:sz="4"/>
               <w:right w:val="single" w:color="D0D7D3" w:sz="4"/>
             </w:tcBorders>
+            <w:shd w:fill="F6F8F7" w:color="auto" w:val="clear"/>
             <w:tcMar>
               <w:top w:type="dxa" w:w="80"/>
               <w:left w:type="dxa" w:w="120"/>
@@ -454,6 +513,7 @@
               <w:bottom w:val="single" w:color="D0D7D3" w:sz="4"/>
               <w:right w:val="single" w:color="D0D7D3" w:sz="4"/>
             </w:tcBorders>
+            <w:shd w:fill="F6F8F7" w:color="auto" w:val="clear"/>
             <w:tcMar>
               <w:top w:type="dxa" w:w="80"/>
               <w:left w:type="dxa" w:w="120"/>
@@ -484,7 +544,6 @@
               <w:bottom w:val="single" w:color="D0D7D3" w:sz="4"/>
               <w:right w:val="single" w:color="D0D7D3" w:sz="4"/>
             </w:tcBorders>
-            <w:shd w:fill="F6F8F7" w:color="auto" w:val="clear"/>
             <w:tcMar>
               <w:top w:type="dxa" w:w="80"/>
               <w:left w:type="dxa" w:w="120"/>
@@ -513,7 +572,6 @@
               <w:bottom w:val="single" w:color="D0D7D3" w:sz="4"/>
               <w:right w:val="single" w:color="D0D7D3" w:sz="4"/>
             </w:tcBorders>
-            <w:shd w:fill="F6F8F7" w:color="auto" w:val="clear"/>
             <w:tcMar>
               <w:top w:type="dxa" w:w="80"/>
               <w:left w:type="dxa" w:w="120"/>
@@ -544,6 +602,7 @@
               <w:bottom w:val="single" w:color="D0D7D3" w:sz="4"/>
               <w:right w:val="single" w:color="D0D7D3" w:sz="4"/>
             </w:tcBorders>
+            <w:shd w:fill="F6F8F7" w:color="auto" w:val="clear"/>
             <w:tcMar>
               <w:top w:type="dxa" w:w="80"/>
               <w:left w:type="dxa" w:w="120"/>
@@ -572,6 +631,7 @@
               <w:bottom w:val="single" w:color="D0D7D3" w:sz="4"/>
               <w:right w:val="single" w:color="D0D7D3" w:sz="4"/>
             </w:tcBorders>
+            <w:shd w:fill="F6F8F7" w:color="auto" w:val="clear"/>
             <w:tcMar>
               <w:top w:type="dxa" w:w="80"/>
               <w:left w:type="dxa" w:w="120"/>
@@ -602,7 +662,6 @@
               <w:bottom w:val="single" w:color="D0D7D3" w:sz="4"/>
               <w:right w:val="single" w:color="D0D7D3" w:sz="4"/>
             </w:tcBorders>
-            <w:shd w:fill="F6F8F7" w:color="auto" w:val="clear"/>
             <w:tcMar>
               <w:top w:type="dxa" w:w="80"/>
               <w:left w:type="dxa" w:w="120"/>
@@ -631,7 +690,6 @@
               <w:bottom w:val="single" w:color="D0D7D3" w:sz="4"/>
               <w:right w:val="single" w:color="D0D7D3" w:sz="4"/>
             </w:tcBorders>
-            <w:shd w:fill="F6F8F7" w:color="auto" w:val="clear"/>
             <w:tcMar>
               <w:top w:type="dxa" w:w="80"/>
               <w:left w:type="dxa" w:w="120"/>
@@ -662,6 +720,7 @@
               <w:bottom w:val="single" w:color="D0D7D3" w:sz="4"/>
               <w:right w:val="single" w:color="D0D7D3" w:sz="4"/>
             </w:tcBorders>
+            <w:shd w:fill="F6F8F7" w:color="auto" w:val="clear"/>
             <w:tcMar>
               <w:top w:type="dxa" w:w="80"/>
               <w:left w:type="dxa" w:w="120"/>
@@ -690,6 +749,7 @@
               <w:bottom w:val="single" w:color="D0D7D3" w:sz="4"/>
               <w:right w:val="single" w:color="D0D7D3" w:sz="4"/>
             </w:tcBorders>
+            <w:shd w:fill="F6F8F7" w:color="auto" w:val="clear"/>
             <w:tcMar>
               <w:top w:type="dxa" w:w="80"/>
               <w:left w:type="dxa" w:w="120"/>
@@ -720,7 +780,6 @@
               <w:bottom w:val="single" w:color="D0D7D3" w:sz="4"/>
               <w:right w:val="single" w:color="D0D7D3" w:sz="4"/>
             </w:tcBorders>
-            <w:shd w:fill="F6F8F7" w:color="auto" w:val="clear"/>
             <w:tcMar>
               <w:top w:type="dxa" w:w="80"/>
               <w:left w:type="dxa" w:w="120"/>
@@ -749,7 +808,6 @@
               <w:bottom w:val="single" w:color="D0D7D3" w:sz="4"/>
               <w:right w:val="single" w:color="D0D7D3" w:sz="4"/>
             </w:tcBorders>
-            <w:shd w:fill="F6F8F7" w:color="auto" w:val="clear"/>
             <w:tcMar>
               <w:top w:type="dxa" w:w="80"/>
               <w:left w:type="dxa" w:w="120"/>
@@ -780,6 +838,7 @@
               <w:bottom w:val="single" w:color="D0D7D3" w:sz="4"/>
               <w:right w:val="single" w:color="D0D7D3" w:sz="4"/>
             </w:tcBorders>
+            <w:shd w:fill="F6F8F7" w:color="auto" w:val="clear"/>
             <w:tcMar>
               <w:top w:type="dxa" w:w="80"/>
               <w:left w:type="dxa" w:w="120"/>
@@ -808,6 +867,7 @@
               <w:bottom w:val="single" w:color="D0D7D3" w:sz="4"/>
               <w:right w:val="single" w:color="D0D7D3" w:sz="4"/>
             </w:tcBorders>
+            <w:shd w:fill="F6F8F7" w:color="auto" w:val="clear"/>
             <w:tcMar>
               <w:top w:type="dxa" w:w="80"/>
               <w:left w:type="dxa" w:w="120"/>
@@ -838,7 +898,6 @@
               <w:bottom w:val="single" w:color="D0D7D3" w:sz="4"/>
               <w:right w:val="single" w:color="D0D7D3" w:sz="4"/>
             </w:tcBorders>
-            <w:shd w:fill="F6F8F7" w:color="auto" w:val="clear"/>
             <w:tcMar>
               <w:top w:type="dxa" w:w="80"/>
               <w:left w:type="dxa" w:w="120"/>
@@ -867,7 +926,6 @@
               <w:bottom w:val="single" w:color="D0D7D3" w:sz="4"/>
               <w:right w:val="single" w:color="D0D7D3" w:sz="4"/>
             </w:tcBorders>
-            <w:shd w:fill="F6F8F7" w:color="auto" w:val="clear"/>
             <w:tcMar>
               <w:top w:type="dxa" w:w="80"/>
               <w:left w:type="dxa" w:w="120"/>
@@ -898,6 +956,7 @@
               <w:bottom w:val="single" w:color="D0D7D3" w:sz="4"/>
               <w:right w:val="single" w:color="D0D7D3" w:sz="4"/>
             </w:tcBorders>
+            <w:shd w:fill="F6F8F7" w:color="auto" w:val="clear"/>
             <w:tcMar>
               <w:top w:type="dxa" w:w="80"/>
               <w:left w:type="dxa" w:w="120"/>
@@ -926,6 +985,7 @@
               <w:bottom w:val="single" w:color="D0D7D3" w:sz="4"/>
               <w:right w:val="single" w:color="D0D7D3" w:sz="4"/>
             </w:tcBorders>
+            <w:shd w:fill="F6F8F7" w:color="auto" w:val="clear"/>
             <w:tcMar>
               <w:top w:type="dxa" w:w="80"/>
               <w:left w:type="dxa" w:w="120"/>
@@ -4788,6 +4848,66 @@
                 <w:sz w:val="20"/>
                 <w:szCs w:val="20"/>
               </w:rPr>
+              <w:t xml:space="preserve">Unusual activity for the proprietor: reversals, late cash, short counts, cut bills, write-offs and more, with who recorded them</w:t>
+            </w:r>
+          </w:p>
+        </w:tc>
+      </w:tr>
+      <w:tr>
+        <w:tc>
+          <w:tcPr>
+            <w:tcW w:type="dxa" w:w="1800"/>
+            <w:tcBorders>
+              <w:top w:val="single" w:color="D0D7D3" w:sz="4"/>
+              <w:left w:val="single" w:color="D0D7D3" w:sz="4"/>
+              <w:bottom w:val="single" w:color="D0D7D3" w:sz="4"/>
+              <w:right w:val="single" w:color="D0D7D3" w:sz="4"/>
+            </w:tcBorders>
+            <w:shd w:fill="F6F8F7" w:color="auto" w:val="clear"/>
+            <w:tcMar>
+              <w:top w:type="dxa" w:w="80"/>
+              <w:left w:type="dxa" w:w="120"/>
+              <w:bottom w:type="dxa" w:w="80"/>
+              <w:right w:type="dxa" w:w="120"/>
+            </w:tcMar>
+          </w:tcPr>
+          <w:p>
+            <w:r>
+              <w:rPr>
+                <w:b w:val="false"/>
+                <w:bCs w:val="false"/>
+                <w:sz w:val="20"/>
+                <w:szCs w:val="20"/>
+              </w:rPr>
+              <w:t xml:space="preserve">24 Oct 2026</w:t>
+            </w:r>
+          </w:p>
+        </w:tc>
+        <w:tc>
+          <w:tcPr>
+            <w:tcW w:type="dxa" w:w="7838"/>
+            <w:tcBorders>
+              <w:top w:val="single" w:color="D0D7D3" w:sz="4"/>
+              <w:left w:val="single" w:color="D0D7D3" w:sz="4"/>
+              <w:bottom w:val="single" w:color="D0D7D3" w:sz="4"/>
+              <w:right w:val="single" w:color="D0D7D3" w:sz="4"/>
+            </w:tcBorders>
+            <w:shd w:fill="F6F8F7" w:color="auto" w:val="clear"/>
+            <w:tcMar>
+              <w:top w:type="dxa" w:w="80"/>
+              <w:left w:type="dxa" w:w="120"/>
+              <w:bottom w:type="dxa" w:w="80"/>
+              <w:right w:type="dxa" w:w="120"/>
+            </w:tcMar>
+          </w:tcPr>
+          <w:p>
+            <w:r>
+              <w:rPr>
+                <w:b w:val="false"/>
+                <w:bCs w:val="false"/>
+                <w:sz w:val="20"/>
+                <w:szCs w:val="20"/>
+              </w:rPr>
               <w:t xml:space="preserve">Writing off debt the school won’t collect: staff ask, only the proprietor approves</w:t>
             </w:r>
           </w:p>
@@ -4803,7 +4923,6 @@
               <w:bottom w:val="single" w:color="D0D7D3" w:sz="4"/>
               <w:right w:val="single" w:color="D0D7D3" w:sz="4"/>
             </w:tcBorders>
-            <w:shd w:fill="F6F8F7" w:color="auto" w:val="clear"/>
             <w:tcMar>
               <w:top w:type="dxa" w:w="80"/>
               <w:left w:type="dxa" w:w="120"/>
@@ -4832,7 +4951,6 @@
               <w:bottom w:val="single" w:color="D0D7D3" w:sz="4"/>
               <w:right w:val="single" w:color="D0D7D3" w:sz="4"/>
             </w:tcBorders>
-            <w:shd w:fill="F6F8F7" w:color="auto" w:val="clear"/>
             <w:tcMar>
               <w:top w:type="dxa" w:w="80"/>
               <w:left w:type="dxa" w:w="120"/>
@@ -4863,6 +4981,7 @@
               <w:bottom w:val="single" w:color="D0D7D3" w:sz="4"/>
               <w:right w:val="single" w:color="D0D7D3" w:sz="4"/>
             </w:tcBorders>
+            <w:shd w:fill="F6F8F7" w:color="auto" w:val="clear"/>
             <w:tcMar>
               <w:top w:type="dxa" w:w="80"/>
               <w:left w:type="dxa" w:w="120"/>
@@ -4891,6 +5010,7 @@
               <w:bottom w:val="single" w:color="D0D7D3" w:sz="4"/>
               <w:right w:val="single" w:color="D0D7D3" w:sz="4"/>
             </w:tcBorders>
+            <w:shd w:fill="F6F8F7" w:color="auto" w:val="clear"/>
             <w:tcMar>
               <w:top w:type="dxa" w:w="80"/>
               <w:left w:type="dxa" w:w="120"/>
@@ -4921,7 +5041,6 @@
               <w:bottom w:val="single" w:color="D0D7D3" w:sz="4"/>
               <w:right w:val="single" w:color="D0D7D3" w:sz="4"/>
             </w:tcBorders>
-            <w:shd w:fill="F6F8F7" w:color="auto" w:val="clear"/>
             <w:tcMar>
               <w:top w:type="dxa" w:w="80"/>
               <w:left w:type="dxa" w:w="120"/>
@@ -4950,7 +5069,6 @@
               <w:bottom w:val="single" w:color="D0D7D3" w:sz="4"/>
               <w:right w:val="single" w:color="D0D7D3" w:sz="4"/>
             </w:tcBorders>
-            <w:shd w:fill="F6F8F7" w:color="auto" w:val="clear"/>
             <w:tcMar>
               <w:top w:type="dxa" w:w="80"/>
               <w:left w:type="dxa" w:w="120"/>
@@ -4981,6 +5099,7 @@
               <w:bottom w:val="single" w:color="D0D7D3" w:sz="4"/>
               <w:right w:val="single" w:color="D0D7D3" w:sz="4"/>
             </w:tcBorders>
+            <w:shd w:fill="F6F8F7" w:color="auto" w:val="clear"/>
             <w:tcMar>
               <w:top w:type="dxa" w:w="80"/>
               <w:left w:type="dxa" w:w="120"/>
@@ -5009,6 +5128,7 @@
               <w:bottom w:val="single" w:color="D0D7D3" w:sz="4"/>
               <w:right w:val="single" w:color="D0D7D3" w:sz="4"/>
             </w:tcBorders>
+            <w:shd w:fill="F6F8F7" w:color="auto" w:val="clear"/>
             <w:tcMar>
               <w:top w:type="dxa" w:w="80"/>
               <w:left w:type="dxa" w:w="120"/>
@@ -5039,7 +5159,6 @@
               <w:bottom w:val="single" w:color="D0D7D3" w:sz="4"/>
               <w:right w:val="single" w:color="D0D7D3" w:sz="4"/>
             </w:tcBorders>
-            <w:shd w:fill="F6F8F7" w:color="auto" w:val="clear"/>
             <w:tcMar>
               <w:top w:type="dxa" w:w="80"/>
               <w:left w:type="dxa" w:w="120"/>
@@ -5068,7 +5187,6 @@
               <w:bottom w:val="single" w:color="D0D7D3" w:sz="4"/>
               <w:right w:val="single" w:color="D0D7D3" w:sz="4"/>
             </w:tcBorders>
-            <w:shd w:fill="F6F8F7" w:color="auto" w:val="clear"/>
             <w:tcMar>
               <w:top w:type="dxa" w:w="80"/>
               <w:left w:type="dxa" w:w="120"/>
@@ -5099,6 +5217,7 @@
               <w:bottom w:val="single" w:color="D0D7D3" w:sz="4"/>
               <w:right w:val="single" w:color="D0D7D3" w:sz="4"/>
             </w:tcBorders>
+            <w:shd w:fill="F6F8F7" w:color="auto" w:val="clear"/>
             <w:tcMar>
               <w:top w:type="dxa" w:w="80"/>
               <w:left w:type="dxa" w:w="120"/>
@@ -5127,6 +5246,7 @@
               <w:bottom w:val="single" w:color="D0D7D3" w:sz="4"/>
               <w:right w:val="single" w:color="D0D7D3" w:sz="4"/>
             </w:tcBorders>
+            <w:shd w:fill="F6F8F7" w:color="auto" w:val="clear"/>
             <w:tcMar>
               <w:top w:type="dxa" w:w="80"/>
               <w:left w:type="dxa" w:w="120"/>
@@ -5157,7 +5277,6 @@
               <w:bottom w:val="single" w:color="D0D7D3" w:sz="4"/>
               <w:right w:val="single" w:color="D0D7D3" w:sz="4"/>
             </w:tcBorders>
-            <w:shd w:fill="F6F8F7" w:color="auto" w:val="clear"/>
             <w:tcMar>
               <w:top w:type="dxa" w:w="80"/>
               <w:left w:type="dxa" w:w="120"/>
@@ -5186,7 +5305,6 @@
               <w:bottom w:val="single" w:color="D0D7D3" w:sz="4"/>
               <w:right w:val="single" w:color="D0D7D3" w:sz="4"/>
             </w:tcBorders>
-            <w:shd w:fill="F6F8F7" w:color="auto" w:val="clear"/>
             <w:tcMar>
               <w:top w:type="dxa" w:w="80"/>
               <w:left w:type="dxa" w:w="120"/>
@@ -5217,6 +5335,7 @@
               <w:bottom w:val="single" w:color="D0D7D3" w:sz="4"/>
               <w:right w:val="single" w:color="D0D7D3" w:sz="4"/>
             </w:tcBorders>
+            <w:shd w:fill="F6F8F7" w:color="auto" w:val="clear"/>
             <w:tcMar>
               <w:top w:type="dxa" w:w="80"/>
               <w:left w:type="dxa" w:w="120"/>
@@ -5245,6 +5364,7 @@
               <w:bottom w:val="single" w:color="D0D7D3" w:sz="4"/>
               <w:right w:val="single" w:color="D0D7D3" w:sz="4"/>
             </w:tcBorders>
+            <w:shd w:fill="F6F8F7" w:color="auto" w:val="clear"/>
             <w:tcMar>
               <w:top w:type="dxa" w:w="80"/>
               <w:left w:type="dxa" w:w="120"/>
@@ -5275,7 +5395,6 @@
               <w:bottom w:val="single" w:color="D0D7D3" w:sz="4"/>
               <w:right w:val="single" w:color="D0D7D3" w:sz="4"/>
             </w:tcBorders>
-            <w:shd w:fill="F6F8F7" w:color="auto" w:val="clear"/>
             <w:tcMar>
               <w:top w:type="dxa" w:w="80"/>
               <w:left w:type="dxa" w:w="120"/>
@@ -5304,7 +5423,6 @@
               <w:bottom w:val="single" w:color="D0D7D3" w:sz="4"/>
               <w:right w:val="single" w:color="D0D7D3" w:sz="4"/>
             </w:tcBorders>
-            <w:shd w:fill="F6F8F7" w:color="auto" w:val="clear"/>
             <w:tcMar>
               <w:top w:type="dxa" w:w="80"/>
               <w:left w:type="dxa" w:w="120"/>
@@ -5335,6 +5453,7 @@
               <w:bottom w:val="single" w:color="D0D7D3" w:sz="4"/>
               <w:right w:val="single" w:color="D0D7D3" w:sz="4"/>
             </w:tcBorders>
+            <w:shd w:fill="F6F8F7" w:color="auto" w:val="clear"/>
             <w:tcMar>
               <w:top w:type="dxa" w:w="80"/>
               <w:left w:type="dxa" w:w="120"/>
@@ -5363,6 +5482,7 @@
               <w:bottom w:val="single" w:color="D0D7D3" w:sz="4"/>
               <w:right w:val="single" w:color="D0D7D3" w:sz="4"/>
             </w:tcBorders>
+            <w:shd w:fill="F6F8F7" w:color="auto" w:val="clear"/>
             <w:tcMar>
               <w:top w:type="dxa" w:w="80"/>
               <w:left w:type="dxa" w:w="120"/>
@@ -5393,7 +5513,6 @@
               <w:bottom w:val="single" w:color="D0D7D3" w:sz="4"/>
               <w:right w:val="single" w:color="D0D7D3" w:sz="4"/>
             </w:tcBorders>
-            <w:shd w:fill="F6F8F7" w:color="auto" w:val="clear"/>
             <w:tcMar>
               <w:top w:type="dxa" w:w="80"/>
               <w:left w:type="dxa" w:w="120"/>
@@ -5422,7 +5541,6 @@
               <w:bottom w:val="single" w:color="D0D7D3" w:sz="4"/>
               <w:right w:val="single" w:color="D0D7D3" w:sz="4"/>
             </w:tcBorders>
-            <w:shd w:fill="F6F8F7" w:color="auto" w:val="clear"/>
             <w:tcMar>
               <w:top w:type="dxa" w:w="80"/>
               <w:left w:type="dxa" w:w="120"/>
@@ -5453,6 +5571,7 @@
               <w:bottom w:val="single" w:color="D0D7D3" w:sz="4"/>
               <w:right w:val="single" w:color="D0D7D3" w:sz="4"/>
             </w:tcBorders>
+            <w:shd w:fill="F6F8F7" w:color="auto" w:val="clear"/>
             <w:tcMar>
               <w:top w:type="dxa" w:w="80"/>
               <w:left w:type="dxa" w:w="120"/>
@@ -5481,6 +5600,7 @@
               <w:bottom w:val="single" w:color="D0D7D3" w:sz="4"/>
               <w:right w:val="single" w:color="D0D7D3" w:sz="4"/>
             </w:tcBorders>
+            <w:shd w:fill="F6F8F7" w:color="auto" w:val="clear"/>
             <w:tcMar>
               <w:top w:type="dxa" w:w="80"/>
               <w:left w:type="dxa" w:w="120"/>
@@ -5511,7 +5631,6 @@
               <w:bottom w:val="single" w:color="D0D7D3" w:sz="4"/>
               <w:right w:val="single" w:color="D0D7D3" w:sz="4"/>
             </w:tcBorders>
-            <w:shd w:fill="F6F8F7" w:color="auto" w:val="clear"/>
             <w:tcMar>
               <w:top w:type="dxa" w:w="80"/>
               <w:left w:type="dxa" w:w="120"/>
@@ -5540,7 +5659,6 @@
               <w:bottom w:val="single" w:color="D0D7D3" w:sz="4"/>
               <w:right w:val="single" w:color="D0D7D3" w:sz="4"/>
             </w:tcBorders>
-            <w:shd w:fill="F6F8F7" w:color="auto" w:val="clear"/>
             <w:tcMar>
               <w:top w:type="dxa" w:w="80"/>
               <w:left w:type="dxa" w:w="120"/>
@@ -5571,6 +5689,7 @@
               <w:bottom w:val="single" w:color="D0D7D3" w:sz="4"/>
               <w:right w:val="single" w:color="D0D7D3" w:sz="4"/>
             </w:tcBorders>
+            <w:shd w:fill="F6F8F7" w:color="auto" w:val="clear"/>
             <w:tcMar>
               <w:top w:type="dxa" w:w="80"/>
               <w:left w:type="dxa" w:w="120"/>
@@ -5599,6 +5718,7 @@
               <w:bottom w:val="single" w:color="D0D7D3" w:sz="4"/>
               <w:right w:val="single" w:color="D0D7D3" w:sz="4"/>
             </w:tcBorders>
+            <w:shd w:fill="F6F8F7" w:color="auto" w:val="clear"/>
             <w:tcMar>
               <w:top w:type="dxa" w:w="80"/>
               <w:left w:type="dxa" w:w="120"/>
@@ -5629,7 +5749,6 @@
               <w:bottom w:val="single" w:color="D0D7D3" w:sz="4"/>
               <w:right w:val="single" w:color="D0D7D3" w:sz="4"/>
             </w:tcBorders>
-            <w:shd w:fill="F6F8F7" w:color="auto" w:val="clear"/>
             <w:tcMar>
               <w:top w:type="dxa" w:w="80"/>
               <w:left w:type="dxa" w:w="120"/>
@@ -5658,7 +5777,6 @@
               <w:bottom w:val="single" w:color="D0D7D3" w:sz="4"/>
               <w:right w:val="single" w:color="D0D7D3" w:sz="4"/>
             </w:tcBorders>
-            <w:shd w:fill="F6F8F7" w:color="auto" w:val="clear"/>
             <w:tcMar>
               <w:top w:type="dxa" w:w="80"/>
               <w:left w:type="dxa" w:w="120"/>
@@ -5689,6 +5807,7 @@
               <w:bottom w:val="single" w:color="D0D7D3" w:sz="4"/>
               <w:right w:val="single" w:color="D0D7D3" w:sz="4"/>
             </w:tcBorders>
+            <w:shd w:fill="F6F8F7" w:color="auto" w:val="clear"/>
             <w:tcMar>
               <w:top w:type="dxa" w:w="80"/>
               <w:left w:type="dxa" w:w="120"/>
@@ -5717,6 +5836,7 @@
               <w:bottom w:val="single" w:color="D0D7D3" w:sz="4"/>
               <w:right w:val="single" w:color="D0D7D3" w:sz="4"/>
             </w:tcBorders>
+            <w:shd w:fill="F6F8F7" w:color="auto" w:val="clear"/>
             <w:tcMar>
               <w:top w:type="dxa" w:w="80"/>
               <w:left w:type="dxa" w:w="120"/>
@@ -5747,7 +5867,6 @@
               <w:bottom w:val="single" w:color="D0D7D3" w:sz="4"/>
               <w:right w:val="single" w:color="D0D7D3" w:sz="4"/>
             </w:tcBorders>
-            <w:shd w:fill="F6F8F7" w:color="auto" w:val="clear"/>
             <w:tcMar>
               <w:top w:type="dxa" w:w="80"/>
               <w:left w:type="dxa" w:w="120"/>
@@ -5776,7 +5895,6 @@
               <w:bottom w:val="single" w:color="D0D7D3" w:sz="4"/>
               <w:right w:val="single" w:color="D0D7D3" w:sz="4"/>
             </w:tcBorders>
-            <w:shd w:fill="F6F8F7" w:color="auto" w:val="clear"/>
             <w:tcMar>
               <w:top w:type="dxa" w:w="80"/>
               <w:left w:type="dxa" w:w="120"/>
@@ -5807,6 +5925,7 @@
               <w:bottom w:val="single" w:color="D0D7D3" w:sz="4"/>
               <w:right w:val="single" w:color="D0D7D3" w:sz="4"/>
             </w:tcBorders>
+            <w:shd w:fill="F6F8F7" w:color="auto" w:val="clear"/>
             <w:tcMar>
               <w:top w:type="dxa" w:w="80"/>
               <w:left w:type="dxa" w:w="120"/>
@@ -5835,6 +5954,7 @@
               <w:bottom w:val="single" w:color="D0D7D3" w:sz="4"/>
               <w:right w:val="single" w:color="D0D7D3" w:sz="4"/>
             </w:tcBorders>
+            <w:shd w:fill="F6F8F7" w:color="auto" w:val="clear"/>
             <w:tcMar>
               <w:top w:type="dxa" w:w="80"/>
               <w:left w:type="dxa" w:w="120"/>
@@ -5865,7 +5985,6 @@
               <w:bottom w:val="single" w:color="D0D7D3" w:sz="4"/>
               <w:right w:val="single" w:color="D0D7D3" w:sz="4"/>
             </w:tcBorders>
-            <w:shd w:fill="F6F8F7" w:color="auto" w:val="clear"/>
             <w:tcMar>
               <w:top w:type="dxa" w:w="80"/>
               <w:left w:type="dxa" w:w="120"/>
@@ -5894,7 +6013,6 @@
               <w:bottom w:val="single" w:color="D0D7D3" w:sz="4"/>
               <w:right w:val="single" w:color="D0D7D3" w:sz="4"/>
             </w:tcBorders>
-            <w:shd w:fill="F6F8F7" w:color="auto" w:val="clear"/>
             <w:tcMar>
               <w:top w:type="dxa" w:w="80"/>
               <w:left w:type="dxa" w:w="120"/>
@@ -5925,6 +6043,7 @@
               <w:bottom w:val="single" w:color="D0D7D3" w:sz="4"/>
               <w:right w:val="single" w:color="D0D7D3" w:sz="4"/>
             </w:tcBorders>
+            <w:shd w:fill="F6F8F7" w:color="auto" w:val="clear"/>
             <w:tcMar>
               <w:top w:type="dxa" w:w="80"/>
               <w:left w:type="dxa" w:w="120"/>
@@ -5953,6 +6072,7 @@
               <w:bottom w:val="single" w:color="D0D7D3" w:sz="4"/>
               <w:right w:val="single" w:color="D0D7D3" w:sz="4"/>
             </w:tcBorders>
+            <w:shd w:fill="F6F8F7" w:color="auto" w:val="clear"/>
             <w:tcMar>
               <w:top w:type="dxa" w:w="80"/>
               <w:left w:type="dxa" w:w="120"/>
@@ -5983,7 +6103,6 @@
               <w:bottom w:val="single" w:color="D0D7D3" w:sz="4"/>
               <w:right w:val="single" w:color="D0D7D3" w:sz="4"/>
             </w:tcBorders>
-            <w:shd w:fill="F6F8F7" w:color="auto" w:val="clear"/>
             <w:tcMar>
               <w:top w:type="dxa" w:w="80"/>
               <w:left w:type="dxa" w:w="120"/>
@@ -6012,7 +6131,6 @@
               <w:bottom w:val="single" w:color="D0D7D3" w:sz="4"/>
               <w:right w:val="single" w:color="D0D7D3" w:sz="4"/>
             </w:tcBorders>
-            <w:shd w:fill="F6F8F7" w:color="auto" w:val="clear"/>
             <w:tcMar>
               <w:top w:type="dxa" w:w="80"/>
               <w:left w:type="dxa" w:w="120"/>
@@ -6043,6 +6161,7 @@
               <w:bottom w:val="single" w:color="D0D7D3" w:sz="4"/>
               <w:right w:val="single" w:color="D0D7D3" w:sz="4"/>
             </w:tcBorders>
+            <w:shd w:fill="F6F8F7" w:color="auto" w:val="clear"/>
             <w:tcMar>
               <w:top w:type="dxa" w:w="80"/>
               <w:left w:type="dxa" w:w="120"/>
@@ -6071,6 +6190,7 @@
               <w:bottom w:val="single" w:color="D0D7D3" w:sz="4"/>
               <w:right w:val="single" w:color="D0D7D3" w:sz="4"/>
             </w:tcBorders>
+            <w:shd w:fill="F6F8F7" w:color="auto" w:val="clear"/>
             <w:tcMar>
               <w:top w:type="dxa" w:w="80"/>
               <w:left w:type="dxa" w:w="120"/>
@@ -6101,7 +6221,6 @@
               <w:bottom w:val="single" w:color="D0D7D3" w:sz="4"/>
               <w:right w:val="single" w:color="D0D7D3" w:sz="4"/>
             </w:tcBorders>
-            <w:shd w:fill="F6F8F7" w:color="auto" w:val="clear"/>
             <w:tcMar>
               <w:top w:type="dxa" w:w="80"/>
               <w:left w:type="dxa" w:w="120"/>
@@ -6130,7 +6249,6 @@
               <w:bottom w:val="single" w:color="D0D7D3" w:sz="4"/>
               <w:right w:val="single" w:color="D0D7D3" w:sz="4"/>
             </w:tcBorders>
-            <w:shd w:fill="F6F8F7" w:color="auto" w:val="clear"/>
             <w:tcMar>
               <w:top w:type="dxa" w:w="80"/>
               <w:left w:type="dxa" w:w="120"/>
@@ -6161,6 +6279,7 @@
               <w:bottom w:val="single" w:color="D0D7D3" w:sz="4"/>
               <w:right w:val="single" w:color="D0D7D3" w:sz="4"/>
             </w:tcBorders>
+            <w:shd w:fill="F6F8F7" w:color="auto" w:val="clear"/>
             <w:tcMar>
               <w:top w:type="dxa" w:w="80"/>
               <w:left w:type="dxa" w:w="120"/>
@@ -6189,6 +6308,7 @@
               <w:bottom w:val="single" w:color="D0D7D3" w:sz="4"/>
               <w:right w:val="single" w:color="D0D7D3" w:sz="4"/>
             </w:tcBorders>
+            <w:shd w:fill="F6F8F7" w:color="auto" w:val="clear"/>
             <w:tcMar>
               <w:top w:type="dxa" w:w="80"/>
               <w:left w:type="dxa" w:w="120"/>
@@ -6219,7 +6339,6 @@
               <w:bottom w:val="single" w:color="D0D7D3" w:sz="4"/>
               <w:right w:val="single" w:color="D0D7D3" w:sz="4"/>
             </w:tcBorders>
-            <w:shd w:fill="F6F8F7" w:color="auto" w:val="clear"/>
             <w:tcMar>
               <w:top w:type="dxa" w:w="80"/>
               <w:left w:type="dxa" w:w="120"/>
@@ -6248,7 +6367,6 @@
               <w:bottom w:val="single" w:color="D0D7D3" w:sz="4"/>
               <w:right w:val="single" w:color="D0D7D3" w:sz="4"/>
             </w:tcBorders>
-            <w:shd w:fill="F6F8F7" w:color="auto" w:val="clear"/>
             <w:tcMar>
               <w:top w:type="dxa" w:w="80"/>
               <w:left w:type="dxa" w:w="120"/>
@@ -6279,6 +6397,7 @@
               <w:bottom w:val="single" w:color="D0D7D3" w:sz="4"/>
               <w:right w:val="single" w:color="D0D7D3" w:sz="4"/>
             </w:tcBorders>
+            <w:shd w:fill="F6F8F7" w:color="auto" w:val="clear"/>
             <w:tcMar>
               <w:top w:type="dxa" w:w="80"/>
               <w:left w:type="dxa" w:w="120"/>
@@ -6307,6 +6426,7 @@
               <w:bottom w:val="single" w:color="D0D7D3" w:sz="4"/>
               <w:right w:val="single" w:color="D0D7D3" w:sz="4"/>
             </w:tcBorders>
+            <w:shd w:fill="F6F8F7" w:color="auto" w:val="clear"/>
             <w:tcMar>
               <w:top w:type="dxa" w:w="80"/>
               <w:left w:type="dxa" w:w="120"/>
@@ -6337,7 +6457,6 @@
               <w:bottom w:val="single" w:color="D0D7D3" w:sz="4"/>
               <w:right w:val="single" w:color="D0D7D3" w:sz="4"/>
             </w:tcBorders>
-            <w:shd w:fill="F6F8F7" w:color="auto" w:val="clear"/>
             <w:tcMar>
               <w:top w:type="dxa" w:w="80"/>
               <w:left w:type="dxa" w:w="120"/>
@@ -6366,7 +6485,6 @@
               <w:bottom w:val="single" w:color="D0D7D3" w:sz="4"/>
               <w:right w:val="single" w:color="D0D7D3" w:sz="4"/>
             </w:tcBorders>
-            <w:shd w:fill="F6F8F7" w:color="auto" w:val="clear"/>
             <w:tcMar>
               <w:top w:type="dxa" w:w="80"/>
               <w:left w:type="dxa" w:w="120"/>
@@ -6397,6 +6515,7 @@
               <w:bottom w:val="single" w:color="D0D7D3" w:sz="4"/>
               <w:right w:val="single" w:color="D0D7D3" w:sz="4"/>
             </w:tcBorders>
+            <w:shd w:fill="F6F8F7" w:color="auto" w:val="clear"/>
             <w:tcMar>
               <w:top w:type="dxa" w:w="80"/>
               <w:left w:type="dxa" w:w="120"/>
@@ -6425,6 +6544,7 @@
               <w:bottom w:val="single" w:color="D0D7D3" w:sz="4"/>
               <w:right w:val="single" w:color="D0D7D3" w:sz="4"/>
             </w:tcBorders>
+            <w:shd w:fill="F6F8F7" w:color="auto" w:val="clear"/>
             <w:tcMar>
               <w:top w:type="dxa" w:w="80"/>
               <w:left w:type="dxa" w:w="120"/>
@@ -6455,7 +6575,6 @@
               <w:bottom w:val="single" w:color="D0D7D3" w:sz="4"/>
               <w:right w:val="single" w:color="D0D7D3" w:sz="4"/>
             </w:tcBorders>
-            <w:shd w:fill="F6F8F7" w:color="auto" w:val="clear"/>
             <w:tcMar>
               <w:top w:type="dxa" w:w="80"/>
               <w:left w:type="dxa" w:w="120"/>
@@ -6484,7 +6603,6 @@
               <w:bottom w:val="single" w:color="D0D7D3" w:sz="4"/>
               <w:right w:val="single" w:color="D0D7D3" w:sz="4"/>
             </w:tcBorders>
-            <w:shd w:fill="F6F8F7" w:color="auto" w:val="clear"/>
             <w:tcMar>
               <w:top w:type="dxa" w:w="80"/>
               <w:left w:type="dxa" w:w="120"/>
@@ -6515,6 +6633,7 @@
               <w:bottom w:val="single" w:color="D0D7D3" w:sz="4"/>
               <w:right w:val="single" w:color="D0D7D3" w:sz="4"/>
             </w:tcBorders>
+            <w:shd w:fill="F6F8F7" w:color="auto" w:val="clear"/>
             <w:tcMar>
               <w:top w:type="dxa" w:w="80"/>
               <w:left w:type="dxa" w:w="120"/>
@@ -6543,6 +6662,7 @@
               <w:bottom w:val="single" w:color="D0D7D3" w:sz="4"/>
               <w:right w:val="single" w:color="D0D7D3" w:sz="4"/>
             </w:tcBorders>
+            <w:shd w:fill="F6F8F7" w:color="auto" w:val="clear"/>
             <w:tcMar>
               <w:top w:type="dxa" w:w="80"/>
               <w:left w:type="dxa" w:w="120"/>
@@ -6573,7 +6693,6 @@
               <w:bottom w:val="single" w:color="D0D7D3" w:sz="4"/>
               <w:right w:val="single" w:color="D0D7D3" w:sz="4"/>
             </w:tcBorders>
-            <w:shd w:fill="F6F8F7" w:color="auto" w:val="clear"/>
             <w:tcMar>
               <w:top w:type="dxa" w:w="80"/>
               <w:left w:type="dxa" w:w="120"/>
@@ -6602,7 +6721,6 @@
               <w:bottom w:val="single" w:color="D0D7D3" w:sz="4"/>
               <w:right w:val="single" w:color="D0D7D3" w:sz="4"/>
             </w:tcBorders>
-            <w:shd w:fill="F6F8F7" w:color="auto" w:val="clear"/>
             <w:tcMar>
               <w:top w:type="dxa" w:w="80"/>
               <w:left w:type="dxa" w:w="120"/>
@@ -6633,6 +6751,7 @@
               <w:bottom w:val="single" w:color="D0D7D3" w:sz="4"/>
               <w:right w:val="single" w:color="D0D7D3" w:sz="4"/>
             </w:tcBorders>
+            <w:shd w:fill="F6F8F7" w:color="auto" w:val="clear"/>
             <w:tcMar>
               <w:top w:type="dxa" w:w="80"/>
               <w:left w:type="dxa" w:w="120"/>
@@ -6661,6 +6780,7 @@
               <w:bottom w:val="single" w:color="D0D7D3" w:sz="4"/>
               <w:right w:val="single" w:color="D0D7D3" w:sz="4"/>
             </w:tcBorders>
+            <w:shd w:fill="F6F8F7" w:color="auto" w:val="clear"/>
             <w:tcMar>
               <w:top w:type="dxa" w:w="80"/>
               <w:left w:type="dxa" w:w="120"/>
@@ -6691,7 +6811,6 @@
               <w:bottom w:val="single" w:color="D0D7D3" w:sz="4"/>
               <w:right w:val="single" w:color="D0D7D3" w:sz="4"/>
             </w:tcBorders>
-            <w:shd w:fill="F6F8F7" w:color="auto" w:val="clear"/>
             <w:tcMar>
               <w:top w:type="dxa" w:w="80"/>
               <w:left w:type="dxa" w:w="120"/>
@@ -6720,7 +6839,6 @@
               <w:bottom w:val="single" w:color="D0D7D3" w:sz="4"/>
               <w:right w:val="single" w:color="D0D7D3" w:sz="4"/>
             </w:tcBorders>
-            <w:shd w:fill="F6F8F7" w:color="auto" w:val="clear"/>
             <w:tcMar>
               <w:top w:type="dxa" w:w="80"/>
               <w:left w:type="dxa" w:w="120"/>
@@ -6751,6 +6869,7 @@
               <w:bottom w:val="single" w:color="D0D7D3" w:sz="4"/>
               <w:right w:val="single" w:color="D0D7D3" w:sz="4"/>
             </w:tcBorders>
+            <w:shd w:fill="F6F8F7" w:color="auto" w:val="clear"/>
             <w:tcMar>
               <w:top w:type="dxa" w:w="80"/>
               <w:left w:type="dxa" w:w="120"/>
@@ -6779,6 +6898,7 @@
               <w:bottom w:val="single" w:color="D0D7D3" w:sz="4"/>
               <w:right w:val="single" w:color="D0D7D3" w:sz="4"/>
             </w:tcBorders>
+            <w:shd w:fill="F6F8F7" w:color="auto" w:val="clear"/>
             <w:tcMar>
               <w:top w:type="dxa" w:w="80"/>
               <w:left w:type="dxa" w:w="120"/>
@@ -6809,7 +6929,6 @@
               <w:bottom w:val="single" w:color="D0D7D3" w:sz="4"/>
               <w:right w:val="single" w:color="D0D7D3" w:sz="4"/>
             </w:tcBorders>
-            <w:shd w:fill="F6F8F7" w:color="auto" w:val="clear"/>
             <w:tcMar>
               <w:top w:type="dxa" w:w="80"/>
               <w:left w:type="dxa" w:w="120"/>
@@ -6838,7 +6957,6 @@
               <w:bottom w:val="single" w:color="D0D7D3" w:sz="4"/>
               <w:right w:val="single" w:color="D0D7D3" w:sz="4"/>
             </w:tcBorders>
-            <w:shd w:fill="F6F8F7" w:color="auto" w:val="clear"/>
             <w:tcMar>
               <w:top w:type="dxa" w:w="80"/>
               <w:left w:type="dxa" w:w="120"/>
@@ -6869,6 +6987,7 @@
               <w:bottom w:val="single" w:color="D0D7D3" w:sz="4"/>
               <w:right w:val="single" w:color="D0D7D3" w:sz="4"/>
             </w:tcBorders>
+            <w:shd w:fill="F6F8F7" w:color="auto" w:val="clear"/>
             <w:tcMar>
               <w:top w:type="dxa" w:w="80"/>
               <w:left w:type="dxa" w:w="120"/>
@@ -6897,6 +7016,7 @@
               <w:bottom w:val="single" w:color="D0D7D3" w:sz="4"/>
               <w:right w:val="single" w:color="D0D7D3" w:sz="4"/>
             </w:tcBorders>
+            <w:shd w:fill="F6F8F7" w:color="auto" w:val="clear"/>
             <w:tcMar>
               <w:top w:type="dxa" w:w="80"/>
               <w:left w:type="dxa" w:w="120"/>
@@ -6927,7 +7047,6 @@
               <w:bottom w:val="single" w:color="D0D7D3" w:sz="4"/>
               <w:right w:val="single" w:color="D0D7D3" w:sz="4"/>
             </w:tcBorders>
-            <w:shd w:fill="F6F8F7" w:color="auto" w:val="clear"/>
             <w:tcMar>
               <w:top w:type="dxa" w:w="80"/>
               <w:left w:type="dxa" w:w="120"/>
@@ -6956,7 +7075,6 @@
               <w:bottom w:val="single" w:color="D0D7D3" w:sz="4"/>
               <w:right w:val="single" w:color="D0D7D3" w:sz="4"/>
             </w:tcBorders>
-            <w:shd w:fill="F6F8F7" w:color="auto" w:val="clear"/>
             <w:tcMar>
               <w:top w:type="dxa" w:w="80"/>
               <w:left w:type="dxa" w:w="120"/>
@@ -6987,6 +7105,7 @@
               <w:bottom w:val="single" w:color="D0D7D3" w:sz="4"/>
               <w:right w:val="single" w:color="D0D7D3" w:sz="4"/>
             </w:tcBorders>
+            <w:shd w:fill="F6F8F7" w:color="auto" w:val="clear"/>
             <w:tcMar>
               <w:top w:type="dxa" w:w="80"/>
               <w:left w:type="dxa" w:w="120"/>
@@ -7015,6 +7134,7 @@
               <w:bottom w:val="single" w:color="D0D7D3" w:sz="4"/>
               <w:right w:val="single" w:color="D0D7D3" w:sz="4"/>
             </w:tcBorders>
+            <w:shd w:fill="F6F8F7" w:color="auto" w:val="clear"/>
             <w:tcMar>
               <w:top w:type="dxa" w:w="80"/>
               <w:left w:type="dxa" w:w="120"/>
@@ -7045,7 +7165,6 @@
               <w:bottom w:val="single" w:color="D0D7D3" w:sz="4"/>
               <w:right w:val="single" w:color="D0D7D3" w:sz="4"/>
             </w:tcBorders>
-            <w:shd w:fill="F6F8F7" w:color="auto" w:val="clear"/>
             <w:tcMar>
               <w:top w:type="dxa" w:w="80"/>
               <w:left w:type="dxa" w:w="120"/>
@@ -7074,7 +7193,6 @@
               <w:bottom w:val="single" w:color="D0D7D3" w:sz="4"/>
               <w:right w:val="single" w:color="D0D7D3" w:sz="4"/>
             </w:tcBorders>
-            <w:shd w:fill="F6F8F7" w:color="auto" w:val="clear"/>
             <w:tcMar>
               <w:top w:type="dxa" w:w="80"/>
               <w:left w:type="dxa" w:w="120"/>
@@ -7105,6 +7223,7 @@
               <w:bottom w:val="single" w:color="D0D7D3" w:sz="4"/>
               <w:right w:val="single" w:color="D0D7D3" w:sz="4"/>
             </w:tcBorders>
+            <w:shd w:fill="F6F8F7" w:color="auto" w:val="clear"/>
             <w:tcMar>
               <w:top w:type="dxa" w:w="80"/>
               <w:left w:type="dxa" w:w="120"/>
@@ -7133,6 +7252,7 @@
               <w:bottom w:val="single" w:color="D0D7D3" w:sz="4"/>
               <w:right w:val="single" w:color="D0D7D3" w:sz="4"/>
             </w:tcBorders>
+            <w:shd w:fill="F6F8F7" w:color="auto" w:val="clear"/>
             <w:tcMar>
               <w:top w:type="dxa" w:w="80"/>
               <w:left w:type="dxa" w:w="120"/>
@@ -7163,7 +7283,6 @@
               <w:bottom w:val="single" w:color="D0D7D3" w:sz="4"/>
               <w:right w:val="single" w:color="D0D7D3" w:sz="4"/>
             </w:tcBorders>
-            <w:shd w:fill="F6F8F7" w:color="auto" w:val="clear"/>
             <w:tcMar>
               <w:top w:type="dxa" w:w="80"/>
               <w:left w:type="dxa" w:w="120"/>
@@ -7192,7 +7311,6 @@
               <w:bottom w:val="single" w:color="D0D7D3" w:sz="4"/>
               <w:right w:val="single" w:color="D0D7D3" w:sz="4"/>
             </w:tcBorders>
-            <w:shd w:fill="F6F8F7" w:color="auto" w:val="clear"/>
             <w:tcMar>
               <w:top w:type="dxa" w:w="80"/>
               <w:left w:type="dxa" w:w="120"/>
@@ -7223,6 +7341,7 @@
               <w:bottom w:val="single" w:color="D0D7D3" w:sz="4"/>
               <w:right w:val="single" w:color="D0D7D3" w:sz="4"/>
             </w:tcBorders>
+            <w:shd w:fill="F6F8F7" w:color="auto" w:val="clear"/>
             <w:tcMar>
               <w:top w:type="dxa" w:w="80"/>
               <w:left w:type="dxa" w:w="120"/>
@@ -7251,6 +7370,7 @@
               <w:bottom w:val="single" w:color="D0D7D3" w:sz="4"/>
               <w:right w:val="single" w:color="D0D7D3" w:sz="4"/>
             </w:tcBorders>
+            <w:shd w:fill="F6F8F7" w:color="auto" w:val="clear"/>
             <w:tcMar>
               <w:top w:type="dxa" w:w="80"/>
               <w:left w:type="dxa" w:w="120"/>
@@ -7281,7 +7401,6 @@
               <w:bottom w:val="single" w:color="D0D7D3" w:sz="4"/>
               <w:right w:val="single" w:color="D0D7D3" w:sz="4"/>
             </w:tcBorders>
-            <w:shd w:fill="F6F8F7" w:color="auto" w:val="clear"/>
             <w:tcMar>
               <w:top w:type="dxa" w:w="80"/>
               <w:left w:type="dxa" w:w="120"/>
@@ -7310,7 +7429,6 @@
               <w:bottom w:val="single" w:color="D0D7D3" w:sz="4"/>
               <w:right w:val="single" w:color="D0D7D3" w:sz="4"/>
             </w:tcBorders>
-            <w:shd w:fill="F6F8F7" w:color="auto" w:val="clear"/>
             <w:tcMar>
               <w:top w:type="dxa" w:w="80"/>
               <w:left w:type="dxa" w:w="120"/>
@@ -7341,6 +7459,7 @@
               <w:bottom w:val="single" w:color="D0D7D3" w:sz="4"/>
               <w:right w:val="single" w:color="D0D7D3" w:sz="4"/>
             </w:tcBorders>
+            <w:shd w:fill="F6F8F7" w:color="auto" w:val="clear"/>
             <w:tcMar>
               <w:top w:type="dxa" w:w="80"/>
               <w:left w:type="dxa" w:w="120"/>
@@ -7369,6 +7488,7 @@
               <w:bottom w:val="single" w:color="D0D7D3" w:sz="4"/>
               <w:right w:val="single" w:color="D0D7D3" w:sz="4"/>
             </w:tcBorders>
+            <w:shd w:fill="F6F8F7" w:color="auto" w:val="clear"/>
             <w:tcMar>
               <w:top w:type="dxa" w:w="80"/>
               <w:left w:type="dxa" w:w="120"/>
@@ -7399,7 +7519,6 @@
               <w:bottom w:val="single" w:color="D0D7D3" w:sz="4"/>
               <w:right w:val="single" w:color="D0D7D3" w:sz="4"/>
             </w:tcBorders>
-            <w:shd w:fill="F6F8F7" w:color="auto" w:val="clear"/>
             <w:tcMar>
               <w:top w:type="dxa" w:w="80"/>
               <w:left w:type="dxa" w:w="120"/>
@@ -7428,7 +7547,6 @@
               <w:bottom w:val="single" w:color="D0D7D3" w:sz="4"/>
               <w:right w:val="single" w:color="D0D7D3" w:sz="4"/>
             </w:tcBorders>
-            <w:shd w:fill="F6F8F7" w:color="auto" w:val="clear"/>
             <w:tcMar>
               <w:top w:type="dxa" w:w="80"/>
               <w:left w:type="dxa" w:w="120"/>
@@ -7459,6 +7577,7 @@
               <w:bottom w:val="single" w:color="D0D7D3" w:sz="4"/>
               <w:right w:val="single" w:color="D0D7D3" w:sz="4"/>
             </w:tcBorders>
+            <w:shd w:fill="F6F8F7" w:color="auto" w:val="clear"/>
             <w:tcMar>
               <w:top w:type="dxa" w:w="80"/>
               <w:left w:type="dxa" w:w="120"/>
@@ -7487,6 +7606,7 @@
               <w:bottom w:val="single" w:color="D0D7D3" w:sz="4"/>
               <w:right w:val="single" w:color="D0D7D3" w:sz="4"/>
             </w:tcBorders>
+            <w:shd w:fill="F6F8F7" w:color="auto" w:val="clear"/>
             <w:tcMar>
               <w:top w:type="dxa" w:w="80"/>
               <w:left w:type="dxa" w:w="120"/>
@@ -7517,7 +7637,6 @@
               <w:bottom w:val="single" w:color="D0D7D3" w:sz="4"/>
               <w:right w:val="single" w:color="D0D7D3" w:sz="4"/>
             </w:tcBorders>
-            <w:shd w:fill="F6F8F7" w:color="auto" w:val="clear"/>
             <w:tcMar>
               <w:top w:type="dxa" w:w="80"/>
               <w:left w:type="dxa" w:w="120"/>
@@ -7546,7 +7665,6 @@
               <w:bottom w:val="single" w:color="D0D7D3" w:sz="4"/>
               <w:right w:val="single" w:color="D0D7D3" w:sz="4"/>
             </w:tcBorders>
-            <w:shd w:fill="F6F8F7" w:color="auto" w:val="clear"/>
             <w:tcMar>
               <w:top w:type="dxa" w:w="80"/>
               <w:left w:type="dxa" w:w="120"/>
@@ -7577,6 +7695,7 @@
               <w:bottom w:val="single" w:color="D0D7D3" w:sz="4"/>
               <w:right w:val="single" w:color="D0D7D3" w:sz="4"/>
             </w:tcBorders>
+            <w:shd w:fill="F6F8F7" w:color="auto" w:val="clear"/>
             <w:tcMar>
               <w:top w:type="dxa" w:w="80"/>
               <w:left w:type="dxa" w:w="120"/>
@@ -7605,6 +7724,7 @@
               <w:bottom w:val="single" w:color="D0D7D3" w:sz="4"/>
               <w:right w:val="single" w:color="D0D7D3" w:sz="4"/>
             </w:tcBorders>
+            <w:shd w:fill="F6F8F7" w:color="auto" w:val="clear"/>
             <w:tcMar>
               <w:top w:type="dxa" w:w="80"/>
               <w:left w:type="dxa" w:w="120"/>

</xml_diff>